<commit_message>
update with Noah Barcomb's content inventory
</commit_message>
<xml_diff>
--- a/documents/IA_ID.docx
+++ b/documents/IA_ID.docx
@@ -7,7 +7,7 @@
         <w:shd w:val="clear" w:color="auto" w:fill="F8F9FA"/>
         <w:jc w:val="center"/>
         <w:rPr>
-          <w:rFonts w:ascii="Roboto" w:hAnsi="Roboto" w:eastAsia="Roboto" w:cs="Roboto"/>
+          <w:rFonts w:ascii="Roboto" w:eastAsia="Roboto" w:hAnsi="Roboto" w:cs="Roboto"/>
           <w:color w:val="1D2125"/>
           <w:sz w:val="24"/>
           <w:szCs w:val="24"/>
@@ -15,7 +15,7 @@
       </w:pPr>
       <w:r>
         <w:rPr>
-          <w:rFonts w:ascii="Roboto" w:hAnsi="Roboto" w:eastAsia="Roboto" w:cs="Roboto"/>
+          <w:rFonts w:ascii="Roboto" w:eastAsia="Roboto" w:hAnsi="Roboto" w:cs="Roboto"/>
           <w:b/>
           <w:bCs/>
           <w:color w:val="1D2125"/>
@@ -30,7 +30,7 @@
         <w:shd w:val="clear" w:color="auto" w:fill="F8F9FA"/>
         <w:jc w:val="center"/>
         <w:rPr>
-          <w:rFonts w:ascii="Roboto" w:hAnsi="Roboto" w:eastAsia="Roboto" w:cs="Roboto"/>
+          <w:rFonts w:ascii="Roboto" w:eastAsia="Roboto" w:hAnsi="Roboto" w:cs="Roboto"/>
           <w:b/>
           <w:bCs/>
           <w:color w:val="1D2125"/>
@@ -40,7 +40,7 @@
       </w:pPr>
       <w:r>
         <w:rPr>
-          <w:rFonts w:ascii="Roboto" w:hAnsi="Roboto" w:eastAsia="Roboto" w:cs="Roboto"/>
+          <w:rFonts w:ascii="Roboto" w:eastAsia="Roboto" w:hAnsi="Roboto" w:cs="Roboto"/>
           <w:b/>
           <w:bCs/>
           <w:color w:val="1D2125"/>
@@ -51,7 +51,7 @@
       </w:r>
       <w:r>
         <w:rPr>
-          <w:rFonts w:ascii="Roboto" w:hAnsi="Roboto" w:eastAsia="Roboto" w:cs="Roboto"/>
+          <w:rFonts w:ascii="Roboto" w:eastAsia="Roboto" w:hAnsi="Roboto" w:cs="Roboto"/>
           <w:b/>
           <w:bCs/>
           <w:color w:val="1D2125"/>
@@ -66,7 +66,7 @@
         <w:shd w:val="clear" w:color="auto" w:fill="F8F9FA"/>
         <w:jc w:val="center"/>
         <w:rPr>
-          <w:rFonts w:ascii="Roboto" w:hAnsi="Roboto" w:eastAsia="Roboto" w:cs="Roboto"/>
+          <w:rFonts w:ascii="Roboto" w:eastAsia="Roboto" w:hAnsi="Roboto" w:cs="Roboto"/>
           <w:b/>
           <w:bCs/>
           <w:color w:val="1D2125"/>
@@ -76,7 +76,7 @@
       </w:pPr>
       <w:r>
         <w:rPr>
-          <w:rFonts w:ascii="Roboto" w:hAnsi="Roboto" w:eastAsia="Roboto" w:cs="Roboto"/>
+          <w:rFonts w:ascii="Roboto" w:eastAsia="Roboto" w:hAnsi="Roboto" w:cs="Roboto"/>
           <w:b/>
           <w:bCs/>
           <w:color w:val="1D2125"/>
@@ -91,7 +91,7 @@
         <w:shd w:val="clear" w:color="auto" w:fill="F8F9FA"/>
         <w:jc w:val="center"/>
         <w:rPr>
-          <w:rFonts w:ascii="Roboto" w:hAnsi="Roboto" w:eastAsia="Roboto" w:cs="Roboto"/>
+          <w:rFonts w:ascii="Roboto" w:eastAsia="Roboto" w:hAnsi="Roboto" w:cs="Roboto"/>
           <w:b/>
           <w:bCs/>
           <w:color w:val="1D2125"/>
@@ -101,7 +101,7 @@
       </w:pPr>
       <w:r>
         <w:rPr>
-          <w:rFonts w:ascii="Roboto" w:hAnsi="Roboto" w:eastAsia="Roboto" w:cs="Roboto"/>
+          <w:rFonts w:ascii="Roboto" w:eastAsia="Roboto" w:hAnsi="Roboto" w:cs="Roboto"/>
           <w:b/>
           <w:bCs/>
           <w:color w:val="1D2125"/>
@@ -116,7 +116,7 @@
         <w:shd w:val="clear" w:color="auto" w:fill="F8F9FA"/>
         <w:jc w:val="center"/>
         <w:rPr>
-          <w:rFonts w:ascii="Roboto" w:hAnsi="Roboto" w:eastAsia="Roboto" w:cs="Roboto"/>
+          <w:rFonts w:ascii="Roboto" w:eastAsia="Roboto" w:hAnsi="Roboto" w:cs="Roboto"/>
           <w:b/>
           <w:bCs/>
           <w:color w:val="1D2125"/>
@@ -126,7 +126,7 @@
       </w:pPr>
       <w:r>
         <w:rPr>
-          <w:rFonts w:ascii="Roboto" w:hAnsi="Roboto" w:eastAsia="Roboto" w:cs="Roboto"/>
+          <w:rFonts w:ascii="Roboto" w:eastAsia="Roboto" w:hAnsi="Roboto" w:cs="Roboto"/>
           <w:b/>
           <w:bCs/>
           <w:color w:val="1D2125"/>
@@ -137,7 +137,7 @@
       </w:r>
       <w:r>
         <w:rPr>
-          <w:rFonts w:ascii="Roboto" w:hAnsi="Roboto" w:eastAsia="Roboto" w:cs="Roboto"/>
+          <w:rFonts w:ascii="Roboto" w:eastAsia="Roboto" w:hAnsi="Roboto" w:cs="Roboto"/>
           <w:b/>
           <w:bCs/>
           <w:color w:val="1D2125"/>
@@ -152,7 +152,7 @@
         <w:shd w:val="clear" w:color="auto" w:fill="F8F9FA"/>
         <w:jc w:val="center"/>
         <w:rPr>
-          <w:rFonts w:ascii="Roboto" w:hAnsi="Roboto" w:eastAsia="Roboto" w:cs="Roboto"/>
+          <w:rFonts w:ascii="Roboto" w:eastAsia="Roboto" w:hAnsi="Roboto" w:cs="Roboto"/>
           <w:b/>
           <w:bCs/>
           <w:color w:val="1D2125"/>
@@ -162,7 +162,7 @@
       </w:pPr>
       <w:r>
         <w:rPr>
-          <w:rFonts w:ascii="Roboto" w:hAnsi="Roboto" w:eastAsia="Roboto" w:cs="Roboto"/>
+          <w:rFonts w:ascii="Roboto" w:eastAsia="Roboto" w:hAnsi="Roboto" w:cs="Roboto"/>
           <w:b/>
           <w:bCs/>
           <w:color w:val="1D2125"/>
@@ -176,7 +176,7 @@
       <w:pPr>
         <w:shd w:val="clear" w:color="auto" w:fill="F8F9FA"/>
         <w:rPr>
-          <w:rFonts w:ascii="Roboto" w:hAnsi="Roboto" w:eastAsia="Roboto" w:cs="Roboto"/>
+          <w:rFonts w:ascii="Roboto" w:eastAsia="Roboto" w:hAnsi="Roboto" w:cs="Roboto"/>
           <w:b/>
           <w:bCs/>
           <w:color w:val="1D2125"/>
@@ -186,31 +186,53 @@
       </w:pPr>
       <w:r>
         <w:rPr>
-          <w:rFonts w:ascii="Roboto" w:hAnsi="Roboto" w:eastAsia="Roboto" w:cs="Roboto"/>
+          <w:rFonts w:ascii="Roboto" w:eastAsia="Roboto" w:hAnsi="Roboto" w:cs="Roboto"/>
           <w:b/>
           <w:bCs/>
           <w:color w:val="1D2125"/>
           <w:sz w:val="24"/>
           <w:szCs w:val="24"/>
         </w:rPr>
-        <w:t xml:space="preserve">Project Name: </w:t>
+        <w:t>Project Name:</w:t>
       </w:r>
-    </w:p>
-    <w:p>
-      <w:pPr>
-        <w:shd w:val="clear" w:color="auto" w:fill="F8F9FA"/>
+      <w:r>
         <w:rPr>
-          <w:rFonts w:ascii="Roboto" w:hAnsi="Roboto" w:eastAsia="Roboto" w:cs="Roboto"/>
+          <w:rFonts w:ascii="Roboto" w:eastAsia="Roboto" w:hAnsi="Roboto" w:cs="Roboto"/>
           <w:b/>
           <w:bCs/>
           <w:color w:val="1D2125"/>
           <w:sz w:val="24"/>
           <w:szCs w:val="24"/>
         </w:rPr>
-      </w:pPr>
+        <w:t xml:space="preserve"> Healthcare Services in Carrolton</w:t>
+      </w:r>
       <w:r>
         <w:rPr>
-          <w:rFonts w:ascii="Roboto" w:hAnsi="Roboto" w:eastAsia="Roboto" w:cs="Roboto"/>
+          <w:rFonts w:ascii="Roboto" w:eastAsia="Roboto" w:hAnsi="Roboto" w:cs="Roboto"/>
+          <w:b/>
+          <w:bCs/>
+          <w:color w:val="1D2125"/>
+          <w:sz w:val="24"/>
+          <w:szCs w:val="24"/>
+        </w:rPr>
+        <w:t xml:space="preserve"> </w:t>
+      </w:r>
+    </w:p>
+    <w:p>
+      <w:pPr>
+        <w:shd w:val="clear" w:color="auto" w:fill="F8F9FA"/>
+        <w:rPr>
+          <w:rFonts w:ascii="Roboto" w:eastAsia="Roboto" w:hAnsi="Roboto" w:cs="Roboto"/>
+          <w:b/>
+          <w:bCs/>
+          <w:color w:val="1D2125"/>
+          <w:sz w:val="24"/>
+          <w:szCs w:val="24"/>
+        </w:rPr>
+      </w:pPr>
+      <w:r>
+        <w:rPr>
+          <w:rFonts w:ascii="Roboto" w:eastAsia="Roboto" w:hAnsi="Roboto" w:cs="Roboto"/>
           <w:b/>
           <w:bCs/>
           <w:color w:val="1D2125"/>
@@ -219,12 +241,79 @@
         </w:rPr>
         <w:t>Team Name:</w:t>
       </w:r>
+      <w:r>
+        <w:rPr>
+          <w:rFonts w:ascii="Roboto" w:eastAsia="Roboto" w:hAnsi="Roboto" w:cs="Roboto"/>
+          <w:b/>
+          <w:bCs/>
+          <w:color w:val="1D2125"/>
+          <w:sz w:val="24"/>
+          <w:szCs w:val="24"/>
+        </w:rPr>
+        <w:t xml:space="preserve"> Wolves</w:t>
+      </w:r>
     </w:p>
     <w:p>
       <w:pPr>
+        <w:pStyle w:val="BodyA"/>
+        <w:rPr>
+          <w:rFonts w:ascii="Roboto" w:eastAsia="Roboto" w:hAnsi="Roboto" w:cs="Roboto"/>
+          <w:b/>
+          <w:bCs/>
+          <w:color w:val="1D2125"/>
+          <w:sz w:val="24"/>
+          <w:szCs w:val="24"/>
+          <w:u w:color="1D2125"/>
+        </w:rPr>
+      </w:pPr>
+      <w:r>
+        <w:rPr>
+          <w:rFonts w:ascii="Roboto" w:eastAsia="Roboto" w:hAnsi="Roboto" w:cs="Roboto"/>
+          <w:b/>
+          <w:bCs/>
+          <w:color w:val="1D2125"/>
+          <w:sz w:val="24"/>
+          <w:szCs w:val="24"/>
+        </w:rPr>
+        <w:t>Trello board URL:</w:t>
+      </w:r>
+      <w:r>
+        <w:rPr>
+          <w:rFonts w:ascii="Roboto" w:eastAsia="Roboto" w:hAnsi="Roboto" w:cs="Roboto"/>
+          <w:b/>
+          <w:bCs/>
+          <w:color w:val="1D2125"/>
+          <w:sz w:val="24"/>
+          <w:szCs w:val="24"/>
+        </w:rPr>
+        <w:t xml:space="preserve"> </w:t>
+      </w:r>
+      <w:r>
+        <w:rPr>
+          <w:rFonts w:ascii="Roboto" w:eastAsia="Roboto" w:hAnsi="Roboto" w:cs="Roboto"/>
+          <w:b/>
+          <w:bCs/>
+          <w:color w:val="1D2125"/>
+          <w:sz w:val="24"/>
+          <w:szCs w:val="24"/>
+          <w:u w:color="1D2125"/>
+        </w:rPr>
+        <w:t xml:space="preserve">: </w:t>
+      </w:r>
+      <w:hyperlink r:id="rId5" w:history="1">
+        <w:r>
+          <w:rPr>
+            <w:rStyle w:val="Hyperlink0"/>
+          </w:rPr>
+          <w:t>https://trello.com/b/l3h0oAN5/team-wolves-healthcare-services-in-carrollton</w:t>
+        </w:r>
+      </w:hyperlink>
+    </w:p>
+    <w:p>
+      <w:pPr>
         <w:shd w:val="clear" w:color="auto" w:fill="F8F9FA"/>
         <w:rPr>
-          <w:rFonts w:ascii="Roboto" w:hAnsi="Roboto" w:eastAsia="Roboto" w:cs="Roboto"/>
+          <w:rFonts w:ascii="Roboto" w:eastAsia="Roboto" w:hAnsi="Roboto" w:cs="Roboto"/>
           <w:b/>
           <w:bCs/>
           <w:color w:val="1D2125"/>
@@ -235,33 +324,7 @@
       </w:pPr>
       <w:r>
         <w:rPr>
-          <w:rFonts w:ascii="Roboto" w:hAnsi="Roboto" w:eastAsia="Roboto" w:cs="Roboto"/>
-          <w:b/>
-          <w:bCs/>
-          <w:color w:val="1D2125"/>
-          <w:sz w:val="24"/>
-          <w:szCs w:val="24"/>
-          <w:lang w:val="en-US"/>
-        </w:rPr>
-        <w:t>Trello board URL:</w:t>
-      </w:r>
-    </w:p>
-    <w:p>
-      <w:pPr>
-        <w:shd w:val="clear" w:color="auto" w:fill="F8F9FA"/>
-        <w:rPr>
-          <w:rFonts w:ascii="Roboto" w:hAnsi="Roboto" w:eastAsia="Roboto" w:cs="Roboto"/>
-          <w:b/>
-          <w:bCs/>
-          <w:color w:val="1D2125"/>
-          <w:sz w:val="24"/>
-          <w:szCs w:val="24"/>
-          <w:lang w:val="en-US"/>
-        </w:rPr>
-      </w:pPr>
-      <w:r>
-        <w:rPr>
-          <w:rFonts w:ascii="Roboto" w:hAnsi="Roboto" w:eastAsia="Roboto" w:cs="Roboto"/>
+          <w:rFonts w:ascii="Roboto" w:eastAsia="Roboto" w:hAnsi="Roboto" w:cs="Roboto"/>
           <w:b/>
           <w:bCs/>
           <w:color w:val="1D2125"/>
@@ -271,6 +334,14 @@
         </w:rPr>
         <w:t xml:space="preserve">Github repo URL: </w:t>
       </w:r>
+      <w:hyperlink r:id="rId6" w:history="1">
+        <w:r>
+          <w:rPr>
+            <w:rStyle w:val="Hyperlink0"/>
+          </w:rPr>
+          <w:t>https://github.com/KevinBennett00/Team-Wolves---Healthcare-Services-in-Carrollton-GA-Website</w:t>
+        </w:r>
+      </w:hyperlink>
     </w:p>
     <w:p>
       <w:pPr>
@@ -293,10 +364,10 @@
         <w:tblStyle w:val="TableGrid"/>
         <w:tblW w:w="0" w:type="auto"/>
         <w:tblBorders>
-          <w:top w:val="single" w:color="auto" w:sz="6" w:space="0"/>
-          <w:left w:val="single" w:color="auto" w:sz="6" w:space="0"/>
-          <w:bottom w:val="single" w:color="auto" w:sz="6" w:space="0"/>
-          <w:right w:val="single" w:color="auto" w:sz="6" w:space="0"/>
+          <w:top w:val="single" w:sz="6" w:space="0" w:color="auto"/>
+          <w:left w:val="single" w:sz="6" w:space="0" w:color="auto"/>
+          <w:bottom w:val="single" w:sz="6" w:space="0" w:color="auto"/>
+          <w:right w:val="single" w:sz="6" w:space="0" w:color="auto"/>
         </w:tblBorders>
         <w:tblLayout w:type="fixed"/>
         <w:tblLook w:val="06A0" w:firstRow="1" w:lastRow="0" w:firstColumn="1" w:lastColumn="0" w:noHBand="1" w:noVBand="1"/>
@@ -374,7 +445,6 @@
           </w:tcPr>
           <w:p>
             <w:r>
-              <w:rPr/>
               <w:t>Kevin Bennett - 917592484</w:t>
             </w:r>
           </w:p>
@@ -395,6 +465,39 @@
           <w:p>
             <w:r>
               <w:t>2</w:t>
+            </w:r>
+          </w:p>
+        </w:tc>
+        <w:tc>
+          <w:tcPr>
+            <w:tcW w:w="3060" w:type="dxa"/>
+            <w:tcMar>
+              <w:left w:w="105" w:type="dxa"/>
+              <w:right w:w="105" w:type="dxa"/>
+            </w:tcMar>
+          </w:tcPr>
+          <w:p>
+            <w:r>
+              <w:t>Noah Barcomb - 917655806</w:t>
+            </w:r>
+          </w:p>
+        </w:tc>
+      </w:tr>
+      <w:tr>
+        <w:trPr>
+          <w:trHeight w:val="300"/>
+        </w:trPr>
+        <w:tc>
+          <w:tcPr>
+            <w:tcW w:w="525" w:type="dxa"/>
+            <w:tcMar>
+              <w:left w:w="105" w:type="dxa"/>
+              <w:right w:w="105" w:type="dxa"/>
+            </w:tcMar>
+          </w:tcPr>
+          <w:p>
+            <w:r>
+              <w:t>3</w:t>
             </w:r>
           </w:p>
         </w:tc>
@@ -423,35 +526,6 @@
           </w:tcPr>
           <w:p>
             <w:r>
-              <w:t>3</w:t>
-            </w:r>
-          </w:p>
-        </w:tc>
-        <w:tc>
-          <w:tcPr>
-            <w:tcW w:w="3060" w:type="dxa"/>
-            <w:tcMar>
-              <w:left w:w="105" w:type="dxa"/>
-              <w:right w:w="105" w:type="dxa"/>
-            </w:tcMar>
-          </w:tcPr>
-          <w:p/>
-        </w:tc>
-      </w:tr>
-      <w:tr>
-        <w:trPr>
-          <w:trHeight w:val="300"/>
-        </w:trPr>
-        <w:tc>
-          <w:tcPr>
-            <w:tcW w:w="525" w:type="dxa"/>
-            <w:tcMar>
-              <w:left w:w="105" w:type="dxa"/>
-              <w:right w:w="105" w:type="dxa"/>
-            </w:tcMar>
-          </w:tcPr>
-          <w:p>
-            <w:r>
               <w:t>4</w:t>
             </w:r>
           </w:p>
@@ -481,7 +555,7 @@
       <w:pPr>
         <w:shd w:val="clear" w:color="auto" w:fill="F8F9FA"/>
         <w:rPr>
-          <w:rFonts w:ascii="Roboto" w:hAnsi="Roboto" w:eastAsia="Roboto" w:cs="Roboto"/>
+          <w:rFonts w:ascii="Roboto" w:eastAsia="Roboto" w:hAnsi="Roboto" w:cs="Roboto"/>
           <w:b/>
           <w:bCs/>
           <w:color w:val="1D2125"/>
@@ -492,7 +566,7 @@
       </w:pPr>
       <w:r>
         <w:rPr>
-          <w:rFonts w:ascii="Roboto" w:hAnsi="Roboto" w:eastAsia="Roboto" w:cs="Roboto"/>
+          <w:rFonts w:ascii="Roboto" w:eastAsia="Roboto" w:hAnsi="Roboto" w:cs="Roboto"/>
           <w:b/>
           <w:bCs/>
           <w:color w:val="1D2125"/>
@@ -504,7 +578,7 @@
       </w:r>
       <w:r>
         <w:rPr>
-          <w:rFonts w:ascii="Roboto" w:hAnsi="Roboto" w:eastAsia="Roboto" w:cs="Roboto"/>
+          <w:rFonts w:ascii="Roboto" w:eastAsia="Roboto" w:hAnsi="Roboto" w:cs="Roboto"/>
           <w:b/>
           <w:bCs/>
           <w:color w:val="1D2125"/>
@@ -533,7 +607,6 @@
         <w:tc>
           <w:tcPr>
             <w:tcW w:w="9360" w:type="dxa"/>
-            <w:tcMar/>
           </w:tcPr>
           <w:p>
             <w:pPr>
@@ -541,7 +614,7 @@
             </w:pPr>
             <w:r>
               <w:rPr>
-                <w:rFonts w:ascii="Roboto" w:hAnsi="Roboto" w:eastAsia="Roboto" w:cs="Roboto"/>
+                <w:rFonts w:ascii="Roboto" w:eastAsia="Roboto" w:hAnsi="Roboto" w:cs="Roboto"/>
                 <w:b/>
                 <w:bCs/>
                 <w:color w:val="1D2125"/>
@@ -556,7 +629,7 @@
             <w:pPr>
               <w:jc w:val="center"/>
               <w:rPr>
-                <w:rFonts w:ascii="Roboto" w:hAnsi="Roboto" w:eastAsia="Roboto" w:cs="Roboto"/>
+                <w:rFonts w:ascii="Roboto" w:eastAsia="Roboto" w:hAnsi="Roboto" w:cs="Roboto"/>
                 <w:b/>
                 <w:bCs/>
                 <w:color w:val="1D2125"/>
@@ -570,7 +643,6 @@
         <w:tc>
           <w:tcPr>
             <w:tcW w:w="360" w:type="dxa"/>
-            <w:tcMar/>
           </w:tcPr>
           <w:p/>
         </w:tc>
@@ -578,27 +650,22 @@
       <w:tr>
         <w:trPr>
           <w:gridAfter w:val="1"/>
+          <w:wAfter w:w="355" w:type="dxa"/>
           <w:trHeight w:val="300"/>
         </w:trPr>
         <w:tc>
           <w:tcPr>
             <w:tcW w:w="9360" w:type="dxa"/>
-            <w:tcMar/>
           </w:tcPr>
           <w:p>
             <w:pPr>
-              <w:pStyle w:val="Normal"/>
-              <w:suppressLineNumbers w:val="0"/>
-              <w:bidi w:val="0"/>
-              <w:spacing w:before="0" w:beforeAutospacing="off" w:after="0" w:afterAutospacing="off" w:line="240" w:lineRule="auto"/>
-              <w:ind w:left="0" w:right="0"/>
               <w:jc w:val="center"/>
             </w:pPr>
             <w:r>
               <w:rPr>
-                <w:rFonts w:ascii="Roboto" w:hAnsi="Roboto" w:eastAsia="Roboto" w:cs="Roboto"/>
-                <w:b w:val="1"/>
-                <w:bCs w:val="1"/>
+                <w:rFonts w:ascii="Roboto" w:eastAsia="Roboto" w:hAnsi="Roboto" w:cs="Roboto"/>
+                <w:b/>
+                <w:bCs/>
                 <w:color w:val="1D2125"/>
                 <w:sz w:val="24"/>
                 <w:szCs w:val="24"/>
@@ -612,34 +679,30 @@
       <w:tr>
         <w:trPr>
           <w:gridAfter w:val="1"/>
+          <w:wAfter w:w="355" w:type="dxa"/>
           <w:trHeight w:val="795"/>
         </w:trPr>
         <w:tc>
           <w:tcPr>
             <w:tcW w:w="9360" w:type="dxa"/>
-            <w:tcMar/>
           </w:tcPr>
           <w:p>
             <w:pPr>
               <w:rPr>
-                <w:rFonts w:ascii="Roboto" w:hAnsi="Roboto" w:eastAsia="Roboto" w:cs="Roboto"/>
-                <w:b w:val="1"/>
-                <w:bCs w:val="1"/>
-                <w:i w:val="0"/>
-                <w:iCs w:val="0"/>
-                <w:color w:val="1D2125"/>
-                <w:sz w:val="24"/>
-                <w:szCs w:val="24"/>
-                <w:lang w:val="en-US"/>
-              </w:rPr>
-            </w:pPr>
-            <w:r>
-              <w:rPr>
-                <w:rFonts w:ascii="Roboto" w:hAnsi="Roboto" w:eastAsia="Roboto" w:cs="Roboto"/>
-                <w:b w:val="1"/>
-                <w:bCs w:val="1"/>
-                <w:i w:val="0"/>
-                <w:iCs w:val="0"/>
+                <w:rFonts w:ascii="Roboto" w:eastAsia="Roboto" w:hAnsi="Roboto" w:cs="Roboto"/>
+                <w:b/>
+                <w:bCs/>
+                <w:color w:val="1D2125"/>
+                <w:sz w:val="24"/>
+                <w:szCs w:val="24"/>
+                <w:lang w:val="en-US"/>
+              </w:rPr>
+            </w:pPr>
+            <w:r>
+              <w:rPr>
+                <w:rFonts w:ascii="Roboto" w:eastAsia="Roboto" w:hAnsi="Roboto" w:cs="Roboto"/>
+                <w:b/>
+                <w:bCs/>
                 <w:color w:val="1D2125"/>
                 <w:sz w:val="24"/>
                 <w:szCs w:val="24"/>
@@ -651,20 +714,16 @@
           <w:p>
             <w:pPr>
               <w:rPr>
-                <w:rFonts w:ascii="Roboto" w:hAnsi="Roboto" w:eastAsia="Roboto" w:cs="Roboto"/>
-                <w:i w:val="0"/>
-                <w:iCs w:val="0"/>
-                <w:color w:val="1D2125"/>
-                <w:sz w:val="24"/>
-                <w:szCs w:val="24"/>
-                <w:lang w:val="en-US"/>
-              </w:rPr>
-            </w:pPr>
-            <w:r>
-              <w:rPr>
-                <w:rFonts w:ascii="Roboto" w:hAnsi="Roboto" w:eastAsia="Roboto" w:cs="Roboto"/>
-                <w:i w:val="0"/>
-                <w:iCs w:val="0"/>
+                <w:rFonts w:ascii="Roboto" w:eastAsia="Roboto" w:hAnsi="Roboto" w:cs="Roboto"/>
+                <w:color w:val="1D2125"/>
+                <w:sz w:val="24"/>
+                <w:szCs w:val="24"/>
+                <w:lang w:val="en-US"/>
+              </w:rPr>
+            </w:pPr>
+            <w:r>
+              <w:rPr>
+                <w:rFonts w:ascii="Roboto" w:eastAsia="Roboto" w:hAnsi="Roboto" w:cs="Roboto"/>
                 <w:color w:val="1D2125"/>
                 <w:sz w:val="24"/>
                 <w:szCs w:val="24"/>
@@ -674,9 +733,7 @@
             </w:r>
             <w:r>
               <w:rPr>
-                <w:rFonts w:ascii="Roboto" w:hAnsi="Roboto" w:eastAsia="Roboto" w:cs="Roboto"/>
-                <w:i w:val="0"/>
-                <w:iCs w:val="0"/>
+                <w:rFonts w:ascii="Roboto" w:eastAsia="Roboto" w:hAnsi="Roboto" w:cs="Roboto"/>
                 <w:color w:val="1D2125"/>
                 <w:sz w:val="24"/>
                 <w:szCs w:val="24"/>
@@ -686,9 +743,7 @@
             </w:r>
             <w:r>
               <w:rPr>
-                <w:rFonts w:ascii="Roboto" w:hAnsi="Roboto" w:eastAsia="Roboto" w:cs="Roboto"/>
-                <w:i w:val="0"/>
-                <w:iCs w:val="0"/>
+                <w:rFonts w:ascii="Roboto" w:eastAsia="Roboto" w:hAnsi="Roboto" w:cs="Roboto"/>
                 <w:color w:val="1D2125"/>
                 <w:sz w:val="24"/>
                 <w:szCs w:val="24"/>
@@ -701,11 +756,9 @@
             </w:r>
             <w:r>
               <w:rPr>
-                <w:rFonts w:ascii="Roboto" w:hAnsi="Roboto" w:eastAsia="Roboto" w:cs="Roboto"/>
-                <w:b w:val="1"/>
-                <w:bCs w:val="1"/>
-                <w:i w:val="0"/>
-                <w:iCs w:val="0"/>
+                <w:rFonts w:ascii="Roboto" w:eastAsia="Roboto" w:hAnsi="Roboto" w:cs="Roboto"/>
+                <w:b/>
+                <w:bCs/>
                 <w:color w:val="1D2125"/>
                 <w:sz w:val="24"/>
                 <w:szCs w:val="24"/>
@@ -718,45 +771,17 @@
             </w:r>
             <w:r>
               <w:rPr>
-                <w:rFonts w:ascii="Roboto" w:hAnsi="Roboto" w:eastAsia="Roboto" w:cs="Roboto"/>
-                <w:i w:val="0"/>
-                <w:iCs w:val="0"/>
-                <w:color w:val="1D2125"/>
-                <w:sz w:val="24"/>
-                <w:szCs w:val="24"/>
-                <w:lang w:val="en-US"/>
-              </w:rPr>
-              <w:t xml:space="preserve">Search bar, Filter by specialization (dental, eye doctor, cardiologist </w:t>
-            </w:r>
-            <w:r>
-              <w:rPr>
-                <w:rFonts w:ascii="Roboto" w:hAnsi="Roboto" w:eastAsia="Roboto" w:cs="Roboto"/>
-                <w:i w:val="0"/>
-                <w:iCs w:val="0"/>
-                <w:color w:val="1D2125"/>
-                <w:sz w:val="24"/>
-                <w:szCs w:val="24"/>
-                <w:lang w:val="en-US"/>
-              </w:rPr>
-              <w:t>etc</w:t>
-            </w:r>
-            <w:r>
-              <w:rPr>
-                <w:rFonts w:ascii="Roboto" w:hAnsi="Roboto" w:eastAsia="Roboto" w:cs="Roboto"/>
-                <w:i w:val="0"/>
-                <w:iCs w:val="0"/>
-                <w:color w:val="1D2125"/>
-                <w:sz w:val="24"/>
-                <w:szCs w:val="24"/>
-                <w:lang w:val="en-US"/>
-              </w:rPr>
-              <w:t xml:space="preserve">), </w:t>
-            </w:r>
-            <w:r>
-              <w:rPr>
-                <w:rFonts w:ascii="Roboto" w:hAnsi="Roboto" w:eastAsia="Roboto" w:cs="Roboto"/>
-                <w:i w:val="0"/>
-                <w:iCs w:val="0"/>
+                <w:rFonts w:ascii="Roboto" w:eastAsia="Roboto" w:hAnsi="Roboto" w:cs="Roboto"/>
+                <w:color w:val="1D2125"/>
+                <w:sz w:val="24"/>
+                <w:szCs w:val="24"/>
+                <w:lang w:val="en-US"/>
+              </w:rPr>
+              <w:t xml:space="preserve">Search bar, Filter by specialization (dental, eye doctor, cardiologist etc), </w:t>
+            </w:r>
+            <w:r>
+              <w:rPr>
+                <w:rFonts w:ascii="Roboto" w:eastAsia="Roboto" w:hAnsi="Roboto" w:cs="Roboto"/>
                 <w:color w:val="1D2125"/>
                 <w:sz w:val="24"/>
                 <w:szCs w:val="24"/>
@@ -766,9 +791,7 @@
             </w:r>
             <w:r>
               <w:rPr>
-                <w:rFonts w:ascii="Roboto" w:hAnsi="Roboto" w:eastAsia="Roboto" w:cs="Roboto"/>
-                <w:i w:val="0"/>
-                <w:iCs w:val="0"/>
+                <w:rFonts w:ascii="Roboto" w:eastAsia="Roboto" w:hAnsi="Roboto" w:cs="Roboto"/>
                 <w:color w:val="1D2125"/>
                 <w:sz w:val="24"/>
                 <w:szCs w:val="24"/>
@@ -778,9 +801,7 @@
             </w:r>
             <w:r>
               <w:rPr>
-                <w:rFonts w:ascii="Roboto" w:hAnsi="Roboto" w:eastAsia="Roboto" w:cs="Roboto"/>
-                <w:i w:val="0"/>
-                <w:iCs w:val="0"/>
+                <w:rFonts w:ascii="Roboto" w:eastAsia="Roboto" w:hAnsi="Roboto" w:cs="Roboto"/>
                 <w:color w:val="1D2125"/>
                 <w:sz w:val="24"/>
                 <w:szCs w:val="24"/>
@@ -793,11 +814,9 @@
             </w:r>
             <w:r>
               <w:rPr>
-                <w:rFonts w:ascii="Roboto" w:hAnsi="Roboto" w:eastAsia="Roboto" w:cs="Roboto"/>
-                <w:b w:val="1"/>
-                <w:bCs w:val="1"/>
-                <w:i w:val="0"/>
-                <w:iCs w:val="0"/>
+                <w:rFonts w:ascii="Roboto" w:eastAsia="Roboto" w:hAnsi="Roboto" w:cs="Roboto"/>
+                <w:b/>
+                <w:bCs/>
                 <w:color w:val="1D2125"/>
                 <w:sz w:val="24"/>
                 <w:szCs w:val="24"/>
@@ -809,24 +828,16 @@
           <w:p>
             <w:pPr>
               <w:rPr>
-                <w:rFonts w:ascii="Roboto" w:hAnsi="Roboto" w:eastAsia="Roboto" w:cs="Roboto"/>
-                <w:b w:val="0"/>
-                <w:bCs w:val="0"/>
-                <w:i w:val="0"/>
-                <w:iCs w:val="0"/>
-                <w:color w:val="1D2125"/>
-                <w:sz w:val="24"/>
-                <w:szCs w:val="24"/>
-                <w:lang w:val="en-US"/>
-              </w:rPr>
-            </w:pPr>
-            <w:r>
-              <w:rPr>
-                <w:rFonts w:ascii="Roboto" w:hAnsi="Roboto" w:eastAsia="Roboto" w:cs="Roboto"/>
-                <w:b w:val="0"/>
-                <w:bCs w:val="0"/>
-                <w:i w:val="0"/>
-                <w:iCs w:val="0"/>
+                <w:rFonts w:ascii="Roboto" w:eastAsia="Roboto" w:hAnsi="Roboto" w:cs="Roboto"/>
+                <w:color w:val="1D2125"/>
+                <w:sz w:val="24"/>
+                <w:szCs w:val="24"/>
+                <w:lang w:val="en-US"/>
+              </w:rPr>
+            </w:pPr>
+            <w:r>
+              <w:rPr>
+                <w:rFonts w:ascii="Roboto" w:eastAsia="Roboto" w:hAnsi="Roboto" w:cs="Roboto"/>
                 <w:color w:val="1D2125"/>
                 <w:sz w:val="24"/>
                 <w:szCs w:val="24"/>
@@ -838,24 +849,20 @@
           <w:p>
             <w:pPr>
               <w:rPr>
-                <w:rFonts w:ascii="Roboto" w:hAnsi="Roboto" w:eastAsia="Roboto" w:cs="Roboto"/>
-                <w:b w:val="1"/>
-                <w:bCs w:val="1"/>
-                <w:i w:val="0"/>
-                <w:iCs w:val="0"/>
-                <w:color w:val="1D2125"/>
-                <w:sz w:val="24"/>
-                <w:szCs w:val="24"/>
-                <w:lang w:val="en-US"/>
-              </w:rPr>
-            </w:pPr>
-            <w:r>
-              <w:rPr>
-                <w:rFonts w:ascii="Roboto" w:hAnsi="Roboto" w:eastAsia="Roboto" w:cs="Roboto"/>
-                <w:b w:val="1"/>
-                <w:bCs w:val="1"/>
-                <w:i w:val="0"/>
-                <w:iCs w:val="0"/>
+                <w:rFonts w:ascii="Roboto" w:eastAsia="Roboto" w:hAnsi="Roboto" w:cs="Roboto"/>
+                <w:b/>
+                <w:bCs/>
+                <w:color w:val="1D2125"/>
+                <w:sz w:val="24"/>
+                <w:szCs w:val="24"/>
+                <w:lang w:val="en-US"/>
+              </w:rPr>
+            </w:pPr>
+            <w:r>
+              <w:rPr>
+                <w:rFonts w:ascii="Roboto" w:eastAsia="Roboto" w:hAnsi="Roboto" w:cs="Roboto"/>
+                <w:b/>
+                <w:bCs/>
                 <w:color w:val="1D2125"/>
                 <w:sz w:val="24"/>
                 <w:szCs w:val="24"/>
@@ -867,80 +874,38 @@
           <w:p>
             <w:pPr>
               <w:rPr>
-                <w:rFonts w:ascii="Roboto" w:hAnsi="Roboto" w:eastAsia="Roboto" w:cs="Roboto"/>
-                <w:b w:val="1"/>
-                <w:bCs w:val="1"/>
-                <w:i w:val="0"/>
-                <w:iCs w:val="0"/>
-                <w:color w:val="1D2125"/>
-                <w:sz w:val="24"/>
-                <w:szCs w:val="24"/>
-                <w:lang w:val="en-US"/>
-              </w:rPr>
-            </w:pPr>
-            <w:r>
-              <w:rPr>
-                <w:rFonts w:ascii="Roboto" w:hAnsi="Roboto" w:eastAsia="Roboto" w:cs="Roboto"/>
-                <w:b w:val="0"/>
-                <w:bCs w:val="0"/>
-                <w:i w:val="0"/>
-                <w:iCs w:val="0"/>
-                <w:color w:val="1D2125"/>
-                <w:sz w:val="24"/>
-                <w:szCs w:val="24"/>
-                <w:lang w:val="en-US"/>
-              </w:rPr>
-              <w:t xml:space="preserve">Emergency contact </w:t>
-            </w:r>
-            <w:r>
-              <w:rPr>
-                <w:rFonts w:ascii="Roboto" w:hAnsi="Roboto" w:eastAsia="Roboto" w:cs="Roboto"/>
-                <w:b w:val="0"/>
-                <w:bCs w:val="0"/>
-                <w:i w:val="0"/>
-                <w:iCs w:val="0"/>
-                <w:color w:val="1D2125"/>
-                <w:sz w:val="24"/>
-                <w:szCs w:val="24"/>
-                <w:lang w:val="en-US"/>
-              </w:rPr>
-              <w:t>info</w:t>
-            </w:r>
-            <w:r>
-              <w:rPr>
-                <w:rFonts w:ascii="Roboto" w:hAnsi="Roboto" w:eastAsia="Roboto" w:cs="Roboto"/>
-                <w:b w:val="0"/>
-                <w:bCs w:val="0"/>
-                <w:i w:val="0"/>
-                <w:iCs w:val="0"/>
-                <w:color w:val="1D2125"/>
-                <w:sz w:val="24"/>
-                <w:szCs w:val="24"/>
-                <w:lang w:val="en-US"/>
-              </w:rPr>
-              <w:t>(</w:t>
-            </w:r>
-            <w:r>
-              <w:rPr>
-                <w:rFonts w:ascii="Roboto" w:hAnsi="Roboto" w:eastAsia="Roboto" w:cs="Roboto"/>
-                <w:b w:val="0"/>
-                <w:bCs w:val="0"/>
-                <w:i w:val="0"/>
-                <w:iCs w:val="0"/>
-                <w:color w:val="1D2125"/>
-                <w:sz w:val="24"/>
-                <w:szCs w:val="24"/>
-                <w:lang w:val="en-US"/>
-              </w:rPr>
-              <w:t>link to sites/phone numbers/location)</w:t>
-            </w:r>
-            <w:r>
-              <w:rPr>
-                <w:rFonts w:ascii="Roboto" w:hAnsi="Roboto" w:eastAsia="Roboto" w:cs="Roboto"/>
-                <w:b w:val="0"/>
-                <w:bCs w:val="0"/>
-                <w:i w:val="0"/>
-                <w:iCs w:val="0"/>
+                <w:rFonts w:ascii="Roboto" w:eastAsia="Roboto" w:hAnsi="Roboto" w:cs="Roboto"/>
+                <w:b/>
+                <w:bCs/>
+                <w:color w:val="1D2125"/>
+                <w:sz w:val="24"/>
+                <w:szCs w:val="24"/>
+                <w:lang w:val="en-US"/>
+              </w:rPr>
+            </w:pPr>
+            <w:r>
+              <w:rPr>
+                <w:rFonts w:ascii="Roboto" w:eastAsia="Roboto" w:hAnsi="Roboto" w:cs="Roboto"/>
+                <w:color w:val="1D2125"/>
+                <w:sz w:val="24"/>
+                <w:szCs w:val="24"/>
+                <w:lang w:val="en-US"/>
+              </w:rPr>
+              <w:t>Emergency contact info</w:t>
+            </w:r>
+            <w:r>
+              <w:rPr>
+                <w:rFonts w:ascii="Roboto" w:eastAsia="Roboto" w:hAnsi="Roboto" w:cs="Roboto"/>
+                <w:color w:val="1D2125"/>
+                <w:sz w:val="24"/>
+                <w:szCs w:val="24"/>
+                <w:lang w:val="en-US"/>
+              </w:rPr>
+              <w:t>(link to sites/phone numbers/location)</w:t>
+            </w:r>
+            <w:r>
+              <w:rPr>
+                <w:rFonts w:ascii="Roboto" w:eastAsia="Roboto" w:hAnsi="Roboto" w:cs="Roboto"/>
                 <w:color w:val="1D2125"/>
                 <w:sz w:val="24"/>
                 <w:szCs w:val="24"/>
@@ -950,11 +915,7 @@
             </w:r>
             <w:r>
               <w:rPr>
-                <w:rFonts w:ascii="Roboto" w:hAnsi="Roboto" w:eastAsia="Roboto" w:cs="Roboto"/>
-                <w:b w:val="0"/>
-                <w:bCs w:val="0"/>
-                <w:i w:val="0"/>
-                <w:iCs w:val="0"/>
+                <w:rFonts w:ascii="Roboto" w:eastAsia="Roboto" w:hAnsi="Roboto" w:cs="Roboto"/>
                 <w:color w:val="1D2125"/>
                 <w:sz w:val="24"/>
                 <w:szCs w:val="24"/>
@@ -967,11 +928,9 @@
             </w:r>
             <w:r>
               <w:rPr>
-                <w:rFonts w:ascii="Roboto" w:hAnsi="Roboto" w:eastAsia="Roboto" w:cs="Roboto"/>
-                <w:b w:val="1"/>
-                <w:bCs w:val="1"/>
-                <w:i w:val="0"/>
-                <w:iCs w:val="0"/>
+                <w:rFonts w:ascii="Roboto" w:eastAsia="Roboto" w:hAnsi="Roboto" w:cs="Roboto"/>
+                <w:b/>
+                <w:bCs/>
                 <w:color w:val="1D2125"/>
                 <w:sz w:val="24"/>
                 <w:szCs w:val="24"/>
@@ -983,24 +942,16 @@
           <w:p>
             <w:pPr>
               <w:rPr>
-                <w:rFonts w:ascii="Roboto" w:hAnsi="Roboto" w:eastAsia="Roboto" w:cs="Roboto"/>
-                <w:b w:val="0"/>
-                <w:bCs w:val="0"/>
-                <w:i w:val="0"/>
-                <w:iCs w:val="0"/>
-                <w:color w:val="1D2125"/>
-                <w:sz w:val="24"/>
-                <w:szCs w:val="24"/>
-                <w:lang w:val="en-US"/>
-              </w:rPr>
-            </w:pPr>
-            <w:r>
-              <w:rPr>
-                <w:rFonts w:ascii="Roboto" w:hAnsi="Roboto" w:eastAsia="Roboto" w:cs="Roboto"/>
-                <w:b w:val="0"/>
-                <w:bCs w:val="0"/>
-                <w:i w:val="0"/>
-                <w:iCs w:val="0"/>
+                <w:rFonts w:ascii="Roboto" w:eastAsia="Roboto" w:hAnsi="Roboto" w:cs="Roboto"/>
+                <w:color w:val="1D2125"/>
+                <w:sz w:val="24"/>
+                <w:szCs w:val="24"/>
+                <w:lang w:val="en-US"/>
+              </w:rPr>
+            </w:pPr>
+            <w:r>
+              <w:rPr>
+                <w:rFonts w:ascii="Roboto" w:eastAsia="Roboto" w:hAnsi="Roboto" w:cs="Roboto"/>
                 <w:color w:val="1D2125"/>
                 <w:sz w:val="24"/>
                 <w:szCs w:val="24"/>
@@ -1014,27 +965,22 @@
       <w:tr>
         <w:trPr>
           <w:gridAfter w:val="1"/>
+          <w:wAfter w:w="355" w:type="dxa"/>
           <w:trHeight w:val="300"/>
         </w:trPr>
         <w:tc>
           <w:tcPr>
             <w:tcW w:w="9360" w:type="dxa"/>
-            <w:tcMar/>
           </w:tcPr>
           <w:p>
             <w:pPr>
-              <w:pStyle w:val="Normal"/>
-              <w:suppressLineNumbers w:val="0"/>
-              <w:bidi w:val="0"/>
-              <w:spacing w:before="0" w:beforeAutospacing="off" w:after="0" w:afterAutospacing="off" w:line="240" w:lineRule="auto"/>
-              <w:ind w:left="0" w:right="0"/>
               <w:jc w:val="center"/>
             </w:pPr>
             <w:r>
               <w:rPr>
-                <w:rFonts w:ascii="Roboto" w:hAnsi="Roboto" w:eastAsia="Roboto" w:cs="Roboto"/>
-                <w:b w:val="1"/>
-                <w:bCs w:val="1"/>
+                <w:rFonts w:ascii="Roboto" w:eastAsia="Roboto" w:hAnsi="Roboto" w:cs="Roboto"/>
+                <w:b/>
+                <w:bCs/>
                 <w:color w:val="1D2125"/>
                 <w:sz w:val="24"/>
                 <w:szCs w:val="24"/>
@@ -1052,87 +998,212 @@
         <w:tc>
           <w:tcPr>
             <w:tcW w:w="9360" w:type="dxa"/>
-            <w:tcMar/>
           </w:tcPr>
           <w:p>
             <w:pPr>
-              <w:pStyle w:val="Normal"/>
-              <w:rPr>
-                <w:rFonts w:ascii="Roboto" w:hAnsi="Roboto" w:eastAsia="Roboto" w:cs="Roboto"/>
-                <w:i w:val="1"/>
-                <w:iCs w:val="1"/>
-                <w:color w:val="1D2125"/>
-                <w:sz w:val="24"/>
-                <w:szCs w:val="24"/>
-                <w:lang w:val="en-US"/>
-              </w:rPr>
-            </w:pPr>
-            <w:r>
-              <w:rPr>
-                <w:rFonts w:ascii="Roboto" w:hAnsi="Roboto" w:eastAsia="Roboto" w:cs="Roboto"/>
-                <w:i w:val="1"/>
-                <w:iCs w:val="1"/>
-                <w:color w:val="1D2125"/>
-                <w:sz w:val="24"/>
-                <w:szCs w:val="24"/>
-                <w:lang w:val="en-US"/>
-              </w:rPr>
-              <w:t xml:space="preserve">List all the content/services you will provide on the website the team is developing. Member 2 </w:t>
-            </w:r>
-            <w:r>
-              <w:rPr>
-                <w:rFonts w:ascii="Roboto" w:hAnsi="Roboto" w:eastAsia="Roboto" w:cs="Roboto"/>
-                <w:i w:val="1"/>
-                <w:iCs w:val="1"/>
-                <w:color w:val="1D2125"/>
-                <w:sz w:val="24"/>
-                <w:szCs w:val="24"/>
-                <w:lang w:val="en-US"/>
-              </w:rPr>
-              <w:t>has to</w:t>
-            </w:r>
-            <w:r>
-              <w:rPr>
-                <w:rFonts w:ascii="Roboto" w:hAnsi="Roboto" w:eastAsia="Roboto" w:cs="Roboto"/>
-                <w:i w:val="1"/>
-                <w:iCs w:val="1"/>
-                <w:color w:val="1D2125"/>
-                <w:sz w:val="24"/>
-                <w:szCs w:val="24"/>
-                <w:lang w:val="en-US"/>
-              </w:rPr>
-              <w:t xml:space="preserve"> put in his/her list of content here</w:t>
-            </w:r>
-            <w:r>
-              <w:rPr>
-                <w:rFonts w:ascii="Roboto" w:hAnsi="Roboto" w:eastAsia="Roboto" w:cs="Roboto"/>
-                <w:i w:val="1"/>
-                <w:iCs w:val="1"/>
-                <w:color w:val="1D2125"/>
-                <w:sz w:val="24"/>
-                <w:szCs w:val="24"/>
-                <w:lang w:val="en-US"/>
-              </w:rPr>
-              <w:t>.</w:t>
-            </w:r>
-            <w:r>
-              <w:rPr>
-                <w:rFonts w:ascii="Roboto" w:hAnsi="Roboto" w:eastAsia="Roboto" w:cs="Roboto"/>
-                <w:i w:val="1"/>
-                <w:iCs w:val="1"/>
-                <w:color w:val="1D2125"/>
-                <w:sz w:val="24"/>
-                <w:szCs w:val="24"/>
-                <w:lang w:val="en-US"/>
-              </w:rPr>
-              <w:t xml:space="preserve">   You must categorize the content.  </w:t>
+              <w:rPr>
+                <w:rFonts w:ascii="Roboto" w:eastAsia="Roboto" w:hAnsi="Roboto" w:cs="Roboto"/>
+                <w:i/>
+                <w:iCs/>
+                <w:color w:val="1D2125"/>
+                <w:sz w:val="24"/>
+                <w:szCs w:val="24"/>
+                <w:lang w:val="en-US"/>
+              </w:rPr>
+            </w:pPr>
+            <w:r>
+              <w:rPr>
+                <w:rFonts w:ascii="Roboto" w:eastAsia="Roboto" w:hAnsi="Roboto" w:cs="Roboto"/>
+                <w:i/>
+                <w:iCs/>
+                <w:color w:val="1D2125"/>
+                <w:sz w:val="24"/>
+                <w:szCs w:val="24"/>
+                <w:lang w:val="en-US"/>
+              </w:rPr>
+              <w:t>Pages:</w:t>
+            </w:r>
+          </w:p>
+          <w:p>
+            <w:pPr>
+              <w:rPr>
+                <w:rFonts w:ascii="Roboto" w:eastAsia="Roboto" w:hAnsi="Roboto" w:cs="Roboto"/>
+                <w:i/>
+                <w:iCs/>
+                <w:color w:val="1D2125"/>
+                <w:sz w:val="24"/>
+                <w:szCs w:val="24"/>
+                <w:lang w:val="en-US"/>
+              </w:rPr>
+            </w:pPr>
+            <w:r>
+              <w:rPr>
+                <w:rFonts w:ascii="Roboto" w:eastAsia="Roboto" w:hAnsi="Roboto" w:cs="Roboto"/>
+                <w:i/>
+                <w:iCs/>
+                <w:color w:val="1D2125"/>
+                <w:sz w:val="24"/>
+                <w:szCs w:val="24"/>
+                <w:lang w:val="en-US"/>
+              </w:rPr>
+              <w:t>Home, About, Contact, FAQ, Accessibility Statement</w:t>
+            </w:r>
+            <w:r>
+              <w:rPr>
+                <w:rFonts w:ascii="Roboto" w:eastAsia="Roboto" w:hAnsi="Roboto" w:cs="Roboto"/>
+                <w:i/>
+                <w:iCs/>
+                <w:color w:val="1D2125"/>
+                <w:sz w:val="24"/>
+                <w:szCs w:val="24"/>
+                <w:lang w:val="en-US"/>
+              </w:rPr>
+              <w:t xml:space="preserve">  </w:t>
+            </w:r>
+            <w:r>
+              <w:rPr>
+                <w:rFonts w:ascii="Roboto" w:eastAsia="Roboto" w:hAnsi="Roboto" w:cs="Roboto"/>
+                <w:i/>
+                <w:iCs/>
+                <w:color w:val="1D2125"/>
+                <w:sz w:val="24"/>
+                <w:szCs w:val="24"/>
+                <w:lang w:val="en-US"/>
+              </w:rPr>
+              <w:br/>
+              <w:t>Provider Search</w:t>
+            </w:r>
+            <w:r>
+              <w:rPr>
+                <w:rFonts w:ascii="Roboto" w:eastAsia="Roboto" w:hAnsi="Roboto" w:cs="Roboto"/>
+                <w:i/>
+                <w:iCs/>
+                <w:color w:val="1D2125"/>
+                <w:sz w:val="24"/>
+                <w:szCs w:val="24"/>
+                <w:lang w:val="en-US"/>
+              </w:rPr>
+              <w:br/>
+              <w:t>Search Bar, Filter by Primary Care Physician, Specialty, distance, ratings</w:t>
+            </w:r>
+            <w:r>
+              <w:rPr>
+                <w:rFonts w:ascii="Roboto" w:eastAsia="Roboto" w:hAnsi="Roboto" w:cs="Roboto"/>
+                <w:i/>
+                <w:iCs/>
+                <w:color w:val="1D2125"/>
+                <w:sz w:val="24"/>
+                <w:szCs w:val="24"/>
+                <w:lang w:val="en-US"/>
+              </w:rPr>
+              <w:t xml:space="preserve">  </w:t>
+            </w:r>
+          </w:p>
+          <w:p>
+            <w:pPr>
+              <w:rPr>
+                <w:rFonts w:ascii="Roboto" w:eastAsia="Roboto" w:hAnsi="Roboto" w:cs="Roboto"/>
+                <w:i/>
+                <w:iCs/>
+                <w:color w:val="1D2125"/>
+                <w:sz w:val="24"/>
+                <w:szCs w:val="24"/>
+                <w:lang w:val="en-US"/>
+              </w:rPr>
+            </w:pPr>
+            <w:r>
+              <w:rPr>
+                <w:rFonts w:ascii="Roboto" w:eastAsia="Roboto" w:hAnsi="Roboto" w:cs="Roboto"/>
+                <w:i/>
+                <w:iCs/>
+                <w:color w:val="1D2125"/>
+                <w:sz w:val="24"/>
+                <w:szCs w:val="24"/>
+                <w:lang w:val="en-US"/>
+              </w:rPr>
+              <w:t>Accessibility Features:</w:t>
+            </w:r>
+          </w:p>
+          <w:p>
+            <w:pPr>
+              <w:rPr>
+                <w:rFonts w:ascii="Roboto" w:eastAsia="Roboto" w:hAnsi="Roboto" w:cs="Roboto"/>
+                <w:i/>
+                <w:iCs/>
+                <w:color w:val="1D2125"/>
+                <w:sz w:val="24"/>
+                <w:szCs w:val="24"/>
+                <w:lang w:val="en-US"/>
+              </w:rPr>
+            </w:pPr>
+            <w:r>
+              <w:rPr>
+                <w:rFonts w:ascii="Roboto" w:eastAsia="Roboto" w:hAnsi="Roboto" w:cs="Roboto"/>
+                <w:i/>
+                <w:iCs/>
+                <w:color w:val="1D2125"/>
+                <w:sz w:val="24"/>
+                <w:szCs w:val="24"/>
+                <w:lang w:val="en-US"/>
+              </w:rPr>
+              <w:t>Adjustable text size, different color modes, keyboard navigation, screen reader</w:t>
+            </w:r>
+          </w:p>
+          <w:p>
+            <w:pPr>
+              <w:rPr>
+                <w:rFonts w:ascii="Roboto" w:eastAsia="Roboto" w:hAnsi="Roboto" w:cs="Roboto"/>
+                <w:i/>
+                <w:iCs/>
+                <w:color w:val="1D2125"/>
+                <w:sz w:val="24"/>
+                <w:szCs w:val="24"/>
+                <w:lang w:val="en-US"/>
+              </w:rPr>
+            </w:pPr>
+            <w:r>
+              <w:rPr>
+                <w:rFonts w:ascii="Roboto" w:eastAsia="Roboto" w:hAnsi="Roboto" w:cs="Roboto"/>
+                <w:i/>
+                <w:iCs/>
+                <w:color w:val="1D2125"/>
+                <w:sz w:val="24"/>
+                <w:szCs w:val="24"/>
+                <w:lang w:val="en-US"/>
+              </w:rPr>
+              <w:t>Emergency Services:</w:t>
+            </w:r>
+          </w:p>
+          <w:p>
+            <w:pPr>
+              <w:rPr>
+                <w:rFonts w:ascii="Roboto" w:eastAsia="Roboto" w:hAnsi="Roboto" w:cs="Roboto"/>
+                <w:i/>
+                <w:iCs/>
+                <w:color w:val="1D2125"/>
+                <w:sz w:val="24"/>
+                <w:szCs w:val="24"/>
+                <w:lang w:val="en-US"/>
+              </w:rPr>
+            </w:pPr>
+            <w:r>
+              <w:rPr>
+                <w:rFonts w:ascii="Roboto" w:eastAsia="Roboto" w:hAnsi="Roboto" w:cs="Roboto"/>
+                <w:i/>
+                <w:iCs/>
+                <w:color w:val="1D2125"/>
+                <w:sz w:val="24"/>
+                <w:szCs w:val="24"/>
+                <w:lang w:val="en-US"/>
+              </w:rPr>
+              <w:lastRenderedPageBreak/>
+              <w:t>911 guidance</w:t>
             </w:r>
           </w:p>
         </w:tc>
         <w:tc>
           <w:tcPr>
             <w:tcW w:w="360" w:type="dxa"/>
-            <w:tcMar/>
           </w:tcPr>
           <w:p/>
         </w:tc>
@@ -1144,64 +1215,39 @@
         <w:tc>
           <w:tcPr>
             <w:tcW w:w="9005" w:type="dxa"/>
-            <w:tcMar/>
           </w:tcPr>
           <w:p>
             <w:pPr>
-              <w:pStyle w:val="Normal"/>
               <w:jc w:val="center"/>
               <w:rPr>
-                <w:rFonts w:ascii="Roboto" w:hAnsi="Roboto" w:eastAsia="Roboto" w:cs="Roboto"/>
-                <w:b w:val="1"/>
-                <w:bCs w:val="1"/>
-                <w:i w:val="0"/>
-                <w:iCs w:val="0"/>
-                <w:color w:val="1D2125"/>
-                <w:sz w:val="24"/>
-                <w:szCs w:val="24"/>
-                <w:lang w:val="en-US"/>
-              </w:rPr>
-            </w:pPr>
-            <w:r>
-              <w:rPr>
-                <w:rFonts w:ascii="Roboto" w:hAnsi="Roboto" w:eastAsia="Roboto" w:cs="Roboto"/>
-                <w:b w:val="1"/>
-                <w:bCs w:val="1"/>
-                <w:i w:val="0"/>
-                <w:iCs w:val="0"/>
-                <w:color w:val="1D2125"/>
-                <w:sz w:val="24"/>
-                <w:szCs w:val="24"/>
-                <w:lang w:val="en-US"/>
-              </w:rPr>
-              <w:t xml:space="preserve">Bernard </w:t>
-            </w:r>
-            <w:r>
-              <w:rPr>
-                <w:rFonts w:ascii="Roboto" w:hAnsi="Roboto" w:eastAsia="Roboto" w:cs="Roboto"/>
-                <w:b w:val="1"/>
-                <w:bCs w:val="1"/>
-                <w:i w:val="0"/>
-                <w:iCs w:val="0"/>
-                <w:color w:val="1D2125"/>
-                <w:sz w:val="24"/>
-                <w:szCs w:val="24"/>
-                <w:lang w:val="en-US"/>
-              </w:rPr>
-              <w:t>Bawak</w:t>
+                <w:rFonts w:ascii="Roboto" w:eastAsia="Roboto" w:hAnsi="Roboto" w:cs="Roboto"/>
+                <w:b/>
+                <w:bCs/>
+                <w:color w:val="1D2125"/>
+                <w:sz w:val="24"/>
+                <w:szCs w:val="24"/>
+                <w:lang w:val="en-US"/>
+              </w:rPr>
+            </w:pPr>
+            <w:r>
+              <w:rPr>
+                <w:rFonts w:ascii="Roboto" w:eastAsia="Roboto" w:hAnsi="Roboto" w:cs="Roboto"/>
+                <w:b/>
+                <w:bCs/>
+                <w:color w:val="1D2125"/>
+                <w:sz w:val="24"/>
+                <w:szCs w:val="24"/>
+                <w:lang w:val="en-US"/>
+              </w:rPr>
+              <w:t>Bernard Bawak</w:t>
             </w:r>
           </w:p>
         </w:tc>
         <w:tc>
           <w:tcPr>
             <w:tcW w:w="355" w:type="dxa"/>
-            <w:tcMar/>
           </w:tcPr>
-          <w:p>
-            <w:pPr>
-              <w:pStyle w:val="Normal"/>
-            </w:pPr>
-          </w:p>
+          <w:p/>
         </w:tc>
       </w:tr>
       <w:tr>
@@ -1211,26 +1257,24 @@
         <w:tc>
           <w:tcPr>
             <w:tcW w:w="9005" w:type="dxa"/>
-            <w:tcMar/>
           </w:tcPr>
           <w:p>
             <w:pPr>
-              <w:pStyle w:val="Normal"/>
-              <w:rPr>
-                <w:rFonts w:ascii="Roboto" w:hAnsi="Roboto" w:eastAsia="Roboto" w:cs="Roboto"/>
-                <w:i w:val="1"/>
-                <w:iCs w:val="1"/>
-                <w:color w:val="1D2125"/>
-                <w:sz w:val="24"/>
-                <w:szCs w:val="24"/>
-                <w:lang w:val="en-US"/>
-              </w:rPr>
-            </w:pPr>
-            <w:r>
-              <w:rPr>
-                <w:rFonts w:ascii="Roboto" w:hAnsi="Roboto" w:eastAsia="Roboto" w:cs="Roboto"/>
-                <w:i w:val="1"/>
-                <w:iCs w:val="1"/>
+              <w:rPr>
+                <w:rFonts w:ascii="Roboto" w:eastAsia="Roboto" w:hAnsi="Roboto" w:cs="Roboto"/>
+                <w:i/>
+                <w:iCs/>
+                <w:color w:val="1D2125"/>
+                <w:sz w:val="24"/>
+                <w:szCs w:val="24"/>
+                <w:lang w:val="en-US"/>
+              </w:rPr>
+            </w:pPr>
+            <w:r>
+              <w:rPr>
+                <w:rFonts w:ascii="Roboto" w:eastAsia="Roboto" w:hAnsi="Roboto" w:cs="Roboto"/>
+                <w:i/>
+                <w:iCs/>
                 <w:color w:val="1D2125"/>
                 <w:sz w:val="24"/>
                 <w:szCs w:val="24"/>
@@ -1243,13 +1287,8 @@
         <w:tc>
           <w:tcPr>
             <w:tcW w:w="355" w:type="dxa"/>
-            <w:tcMar/>
           </w:tcPr>
-          <w:p>
-            <w:pPr>
-              <w:pStyle w:val="Normal"/>
-            </w:pPr>
-          </w:p>
+          <w:p/>
         </w:tc>
       </w:tr>
       <w:tr>
@@ -1259,24 +1298,23 @@
         <w:tc>
           <w:tcPr>
             <w:tcW w:w="9360" w:type="dxa"/>
-            <w:tcMar/>
           </w:tcPr>
           <w:p>
             <w:pPr>
               <w:jc w:val="center"/>
               <w:rPr>
-                <w:rFonts w:ascii="Roboto" w:hAnsi="Roboto" w:eastAsia="Roboto" w:cs="Roboto"/>
-                <w:b/>
-                <w:bCs/>
-                <w:color w:val="1D2125"/>
-                <w:sz w:val="24"/>
-                <w:szCs w:val="24"/>
-                <w:lang w:val="en-US"/>
-              </w:rPr>
-            </w:pPr>
-            <w:r>
-              <w:rPr>
-                <w:rFonts w:ascii="Roboto" w:hAnsi="Roboto" w:eastAsia="Roboto" w:cs="Roboto"/>
+                <w:rFonts w:ascii="Roboto" w:eastAsia="Roboto" w:hAnsi="Roboto" w:cs="Roboto"/>
+                <w:b/>
+                <w:bCs/>
+                <w:color w:val="1D2125"/>
+                <w:sz w:val="24"/>
+                <w:szCs w:val="24"/>
+                <w:lang w:val="en-US"/>
+              </w:rPr>
+            </w:pPr>
+            <w:r>
+              <w:rPr>
+                <w:rFonts w:ascii="Roboto" w:eastAsia="Roboto" w:hAnsi="Roboto" w:cs="Roboto"/>
                 <w:b/>
                 <w:bCs/>
                 <w:color w:val="1D2125"/>
@@ -1291,7 +1329,6 @@
         <w:tc>
           <w:tcPr>
             <w:tcW w:w="360" w:type="dxa"/>
-            <w:tcMar/>
           </w:tcPr>
           <w:p/>
         </w:tc>
@@ -1303,62 +1340,36 @@
         <w:tc>
           <w:tcPr>
             <w:tcW w:w="9360" w:type="dxa"/>
-            <w:tcMar/>
           </w:tcPr>
           <w:p>
             <w:pPr>
-              <w:pStyle w:val="Normal"/>
-              <w:rPr>
-                <w:rFonts w:ascii="Roboto" w:hAnsi="Roboto" w:eastAsia="Roboto" w:cs="Roboto"/>
-                <w:i w:val="1"/>
-                <w:iCs w:val="1"/>
-                <w:color w:val="1D2125"/>
-                <w:sz w:val="24"/>
-                <w:szCs w:val="24"/>
-                <w:lang w:val="en-US"/>
-              </w:rPr>
-            </w:pPr>
-            <w:r>
-              <w:rPr>
-                <w:rFonts w:ascii="Roboto" w:hAnsi="Roboto" w:eastAsia="Roboto" w:cs="Roboto"/>
-                <w:i w:val="1"/>
-                <w:iCs w:val="1"/>
-                <w:color w:val="1D2125"/>
-                <w:sz w:val="24"/>
-                <w:szCs w:val="24"/>
-                <w:lang w:val="en-US"/>
-              </w:rPr>
-              <w:t>List the final list of content/services you will provide on the website</w:t>
-            </w:r>
-            <w:r>
-              <w:rPr>
-                <w:rFonts w:ascii="Roboto" w:hAnsi="Roboto" w:eastAsia="Roboto" w:cs="Roboto"/>
-                <w:i w:val="1"/>
-                <w:iCs w:val="1"/>
-                <w:color w:val="1D2125"/>
-                <w:sz w:val="24"/>
-                <w:szCs w:val="24"/>
-                <w:lang w:val="en-US"/>
-              </w:rPr>
-              <w:t xml:space="preserve">.  </w:t>
-            </w:r>
-            <w:r>
-              <w:rPr>
-                <w:rFonts w:ascii="Roboto" w:hAnsi="Roboto" w:eastAsia="Roboto" w:cs="Roboto"/>
-                <w:i w:val="1"/>
-                <w:iCs w:val="1"/>
-                <w:color w:val="1D2125"/>
-                <w:sz w:val="24"/>
-                <w:szCs w:val="24"/>
-                <w:lang w:val="en-US"/>
-              </w:rPr>
-              <w:t xml:space="preserve">All </w:t>
-            </w:r>
-            <w:r>
-              <w:rPr>
-                <w:rFonts w:ascii="Roboto" w:hAnsi="Roboto" w:eastAsia="Roboto" w:cs="Roboto"/>
-                <w:i w:val="1"/>
-                <w:iCs w:val="1"/>
+              <w:rPr>
+                <w:rFonts w:ascii="Roboto" w:eastAsia="Roboto" w:hAnsi="Roboto" w:cs="Roboto"/>
+                <w:i/>
+                <w:iCs/>
+                <w:color w:val="1D2125"/>
+                <w:sz w:val="24"/>
+                <w:szCs w:val="24"/>
+                <w:lang w:val="en-US"/>
+              </w:rPr>
+            </w:pPr>
+            <w:r>
+              <w:rPr>
+                <w:rFonts w:ascii="Roboto" w:eastAsia="Roboto" w:hAnsi="Roboto" w:cs="Roboto"/>
+                <w:i/>
+                <w:iCs/>
+                <w:color w:val="1D2125"/>
+                <w:sz w:val="24"/>
+                <w:szCs w:val="24"/>
+                <w:lang w:val="en-US"/>
+              </w:rPr>
+              <w:t xml:space="preserve">List the final list of content/services you will provide on the website.  All </w:t>
+            </w:r>
+            <w:r>
+              <w:rPr>
+                <w:rFonts w:ascii="Roboto" w:eastAsia="Roboto" w:hAnsi="Roboto" w:cs="Roboto"/>
+                <w:i/>
+                <w:iCs/>
                 <w:color w:val="1D2125"/>
                 <w:sz w:val="24"/>
                 <w:szCs w:val="24"/>
@@ -1368,9 +1379,9 @@
             </w:r>
             <w:r>
               <w:rPr>
-                <w:rFonts w:ascii="Roboto" w:hAnsi="Roboto" w:eastAsia="Roboto" w:cs="Roboto"/>
-                <w:i w:val="1"/>
-                <w:iCs w:val="1"/>
+                <w:rFonts w:ascii="Roboto" w:eastAsia="Roboto" w:hAnsi="Roboto" w:cs="Roboto"/>
+                <w:i/>
+                <w:iCs/>
                 <w:color w:val="1D2125"/>
                 <w:sz w:val="24"/>
                 <w:szCs w:val="24"/>
@@ -1380,9 +1391,9 @@
             </w:r>
             <w:r>
               <w:rPr>
-                <w:rFonts w:ascii="Roboto" w:hAnsi="Roboto" w:eastAsia="Roboto" w:cs="Roboto"/>
-                <w:i w:val="1"/>
-                <w:iCs w:val="1"/>
+                <w:rFonts w:ascii="Roboto" w:eastAsia="Roboto" w:hAnsi="Roboto" w:cs="Roboto"/>
+                <w:i/>
+                <w:iCs/>
                 <w:color w:val="1D2125"/>
                 <w:sz w:val="24"/>
                 <w:szCs w:val="24"/>
@@ -1392,45 +1403,21 @@
             </w:r>
             <w:r>
               <w:rPr>
-                <w:rFonts w:ascii="Roboto" w:hAnsi="Roboto" w:eastAsia="Roboto" w:cs="Roboto"/>
-                <w:i w:val="1"/>
-                <w:iCs w:val="1"/>
-                <w:color w:val="1D2125"/>
-                <w:sz w:val="24"/>
-                <w:szCs w:val="24"/>
-                <w:lang w:val="en-US"/>
-              </w:rPr>
-              <w:t xml:space="preserve"> should discuss and generate this </w:t>
-            </w:r>
-            <w:r>
-              <w:rPr>
-                <w:rFonts w:ascii="Roboto" w:hAnsi="Roboto" w:eastAsia="Roboto" w:cs="Roboto"/>
-                <w:i w:val="1"/>
-                <w:iCs w:val="1"/>
-                <w:color w:val="1D2125"/>
-                <w:sz w:val="24"/>
-                <w:szCs w:val="24"/>
-                <w:lang w:val="en-US"/>
-              </w:rPr>
-              <w:t>list</w:t>
-            </w:r>
-            <w:r>
-              <w:rPr>
-                <w:rFonts w:ascii="Roboto" w:hAnsi="Roboto" w:eastAsia="Roboto" w:cs="Roboto"/>
-                <w:i w:val="1"/>
-                <w:iCs w:val="1"/>
-                <w:color w:val="1D2125"/>
-                <w:sz w:val="24"/>
-                <w:szCs w:val="24"/>
-                <w:lang w:val="en-US"/>
-              </w:rPr>
-              <w:t xml:space="preserve"> taking input from each member</w:t>
-            </w:r>
-            <w:r>
-              <w:rPr>
-                <w:rFonts w:ascii="Roboto" w:hAnsi="Roboto" w:eastAsia="Roboto" w:cs="Roboto"/>
-                <w:i w:val="1"/>
-                <w:iCs w:val="1"/>
+                <w:rFonts w:ascii="Roboto" w:eastAsia="Roboto" w:hAnsi="Roboto" w:cs="Roboto"/>
+                <w:i/>
+                <w:iCs/>
+                <w:color w:val="1D2125"/>
+                <w:sz w:val="24"/>
+                <w:szCs w:val="24"/>
+                <w:lang w:val="en-US"/>
+              </w:rPr>
+              <w:t xml:space="preserve"> should discuss and generate this list taking input from each member</w:t>
+            </w:r>
+            <w:r>
+              <w:rPr>
+                <w:rFonts w:ascii="Roboto" w:eastAsia="Roboto" w:hAnsi="Roboto" w:cs="Roboto"/>
+                <w:i/>
+                <w:iCs/>
                 <w:color w:val="1D2125"/>
                 <w:sz w:val="24"/>
                 <w:szCs w:val="24"/>
@@ -1440,9 +1427,9 @@
             </w:r>
             <w:r>
               <w:rPr>
-                <w:rFonts w:ascii="Roboto" w:hAnsi="Roboto" w:eastAsia="Roboto" w:cs="Roboto"/>
-                <w:i w:val="1"/>
-                <w:iCs w:val="1"/>
+                <w:rFonts w:ascii="Roboto" w:eastAsia="Roboto" w:hAnsi="Roboto" w:cs="Roboto"/>
+                <w:i/>
+                <w:iCs/>
                 <w:color w:val="1D2125"/>
                 <w:sz w:val="24"/>
                 <w:szCs w:val="24"/>
@@ -1452,9 +1439,9 @@
             </w:r>
             <w:r>
               <w:rPr>
-                <w:rFonts w:ascii="Roboto" w:hAnsi="Roboto" w:eastAsia="Roboto" w:cs="Roboto"/>
-                <w:i w:val="1"/>
-                <w:iCs w:val="1"/>
+                <w:rFonts w:ascii="Roboto" w:eastAsia="Roboto" w:hAnsi="Roboto" w:cs="Roboto"/>
+                <w:i/>
+                <w:iCs/>
                 <w:color w:val="1D2125"/>
                 <w:sz w:val="24"/>
                 <w:szCs w:val="24"/>
@@ -1467,7 +1454,6 @@
         <w:tc>
           <w:tcPr>
             <w:tcW w:w="360" w:type="dxa"/>
-            <w:tcMar/>
           </w:tcPr>
           <w:p/>
         </w:tc>
@@ -1475,29 +1461,29 @@
       <w:tr>
         <w:trPr>
           <w:gridAfter w:val="1"/>
+          <w:wAfter w:w="355" w:type="dxa"/>
           <w:trHeight w:val="300"/>
         </w:trPr>
         <w:tc>
           <w:tcPr>
             <w:tcW w:w="9360" w:type="dxa"/>
-            <w:tcMar/>
           </w:tcPr>
           <w:p>
             <w:pPr>
               <w:jc w:val="center"/>
               <w:rPr>
-                <w:rFonts w:ascii="Roboto" w:hAnsi="Roboto" w:eastAsia="Roboto" w:cs="Roboto"/>
-                <w:b/>
-                <w:bCs/>
-                <w:color w:val="1D2125"/>
-                <w:sz w:val="24"/>
-                <w:szCs w:val="24"/>
-                <w:lang w:val="en-US"/>
-              </w:rPr>
-            </w:pPr>
-            <w:r>
-              <w:rPr>
-                <w:rFonts w:ascii="Roboto" w:hAnsi="Roboto" w:eastAsia="Roboto" w:cs="Roboto"/>
+                <w:rFonts w:ascii="Roboto" w:eastAsia="Roboto" w:hAnsi="Roboto" w:cs="Roboto"/>
+                <w:b/>
+                <w:bCs/>
+                <w:color w:val="1D2125"/>
+                <w:sz w:val="24"/>
+                <w:szCs w:val="24"/>
+                <w:lang w:val="en-US"/>
+              </w:rPr>
+            </w:pPr>
+            <w:r>
+              <w:rPr>
+                <w:rFonts w:ascii="Roboto" w:eastAsia="Roboto" w:hAnsi="Roboto" w:cs="Roboto"/>
                 <w:b/>
                 <w:bCs/>
                 <w:color w:val="1D2125"/>
@@ -1509,7 +1495,7 @@
             </w:r>
             <w:r>
               <w:rPr>
-                <w:rFonts w:ascii="Roboto" w:hAnsi="Roboto" w:eastAsia="Roboto" w:cs="Roboto"/>
+                <w:rFonts w:ascii="Roboto" w:eastAsia="Roboto" w:hAnsi="Roboto" w:cs="Roboto"/>
                 <w:b/>
                 <w:bCs/>
                 <w:color w:val="1D2125"/>
@@ -1524,7 +1510,7 @@
             <w:pPr>
               <w:jc w:val="center"/>
               <w:rPr>
-                <w:rFonts w:ascii="Roboto" w:hAnsi="Roboto" w:eastAsia="Roboto" w:cs="Roboto"/>
+                <w:rFonts w:ascii="Roboto" w:eastAsia="Roboto" w:hAnsi="Roboto" w:cs="Roboto"/>
                 <w:b/>
                 <w:bCs/>
                 <w:color w:val="1D2125"/>
@@ -1539,17 +1525,17 @@
       <w:tr>
         <w:trPr>
           <w:gridAfter w:val="1"/>
+          <w:wAfter w:w="355" w:type="dxa"/>
           <w:trHeight w:val="1200"/>
         </w:trPr>
         <w:tc>
           <w:tcPr>
             <w:tcW w:w="9360" w:type="dxa"/>
-            <w:tcMar/>
           </w:tcPr>
           <w:p>
             <w:pPr>
               <w:rPr>
-                <w:rFonts w:ascii="Roboto" w:hAnsi="Roboto" w:eastAsia="Roboto" w:cs="Roboto"/>
+                <w:rFonts w:ascii="Roboto" w:eastAsia="Roboto" w:hAnsi="Roboto" w:cs="Roboto"/>
                 <w:i/>
                 <w:iCs/>
                 <w:color w:val="1D2125"/>
@@ -1560,7 +1546,7 @@
             </w:pPr>
             <w:r>
               <w:rPr>
-                <w:rFonts w:ascii="Roboto" w:hAnsi="Roboto" w:eastAsia="Roboto" w:cs="Roboto"/>
+                <w:rFonts w:ascii="Roboto" w:eastAsia="Roboto" w:hAnsi="Roboto" w:cs="Roboto"/>
                 <w:i/>
                 <w:iCs/>
                 <w:color w:val="1D2125"/>
@@ -1576,29 +1562,29 @@
       <w:tr>
         <w:trPr>
           <w:gridAfter w:val="1"/>
+          <w:wAfter w:w="355" w:type="dxa"/>
           <w:trHeight w:val="300"/>
         </w:trPr>
         <w:tc>
           <w:tcPr>
             <w:tcW w:w="9360" w:type="dxa"/>
-            <w:tcMar/>
           </w:tcPr>
           <w:p>
             <w:pPr>
               <w:jc w:val="center"/>
               <w:rPr>
-                <w:rFonts w:ascii="Roboto" w:hAnsi="Roboto" w:eastAsia="Roboto" w:cs="Roboto"/>
-                <w:b/>
-                <w:bCs/>
-                <w:color w:val="1D2125"/>
-                <w:sz w:val="24"/>
-                <w:szCs w:val="24"/>
-                <w:lang w:val="en-US"/>
-              </w:rPr>
-            </w:pPr>
-            <w:r>
-              <w:rPr>
-                <w:rFonts w:ascii="Roboto" w:hAnsi="Roboto" w:eastAsia="Roboto" w:cs="Roboto"/>
+                <w:rFonts w:ascii="Roboto" w:eastAsia="Roboto" w:hAnsi="Roboto" w:cs="Roboto"/>
+                <w:b/>
+                <w:bCs/>
+                <w:color w:val="1D2125"/>
+                <w:sz w:val="24"/>
+                <w:szCs w:val="24"/>
+                <w:lang w:val="en-US"/>
+              </w:rPr>
+            </w:pPr>
+            <w:r>
+              <w:rPr>
+                <w:rFonts w:ascii="Roboto" w:eastAsia="Roboto" w:hAnsi="Roboto" w:cs="Roboto"/>
                 <w:b/>
                 <w:bCs/>
                 <w:color w:val="1D2125"/>
@@ -1610,7 +1596,7 @@
             </w:r>
             <w:r>
               <w:rPr>
-                <w:rFonts w:ascii="Roboto" w:hAnsi="Roboto" w:eastAsia="Roboto" w:cs="Roboto"/>
+                <w:rFonts w:ascii="Roboto" w:eastAsia="Roboto" w:hAnsi="Roboto" w:cs="Roboto"/>
                 <w:b/>
                 <w:bCs/>
                 <w:color w:val="1D2125"/>
@@ -1626,17 +1612,17 @@
       <w:tr>
         <w:trPr>
           <w:gridAfter w:val="1"/>
+          <w:wAfter w:w="355" w:type="dxa"/>
           <w:trHeight w:val="1380"/>
         </w:trPr>
         <w:tc>
           <w:tcPr>
             <w:tcW w:w="9360" w:type="dxa"/>
-            <w:tcMar/>
           </w:tcPr>
           <w:p>
             <w:pPr>
               <w:rPr>
-                <w:rFonts w:ascii="Roboto" w:hAnsi="Roboto" w:eastAsia="Roboto" w:cs="Roboto"/>
+                <w:rFonts w:ascii="Roboto" w:eastAsia="Roboto" w:hAnsi="Roboto" w:cs="Roboto"/>
                 <w:i/>
                 <w:iCs/>
                 <w:color w:val="1D2125"/>
@@ -1647,7 +1633,7 @@
             </w:pPr>
             <w:r>
               <w:rPr>
-                <w:rFonts w:ascii="Roboto" w:hAnsi="Roboto" w:eastAsia="Roboto" w:cs="Roboto"/>
+                <w:rFonts w:ascii="Roboto" w:eastAsia="Roboto" w:hAnsi="Roboto" w:cs="Roboto"/>
                 <w:i/>
                 <w:iCs/>
                 <w:color w:val="1D2125"/>
@@ -1659,7 +1645,7 @@
             </w:r>
             <w:r>
               <w:rPr>
-                <w:rFonts w:ascii="Roboto" w:hAnsi="Roboto" w:eastAsia="Roboto" w:cs="Roboto"/>
+                <w:rFonts w:ascii="Roboto" w:eastAsia="Roboto" w:hAnsi="Roboto" w:cs="Roboto"/>
                 <w:i/>
                 <w:iCs/>
                 <w:color w:val="1D2125"/>
@@ -1671,7 +1657,7 @@
             </w:r>
             <w:r>
               <w:rPr>
-                <w:rFonts w:ascii="Roboto" w:hAnsi="Roboto" w:eastAsia="Roboto" w:cs="Roboto"/>
+                <w:rFonts w:ascii="Roboto" w:eastAsia="Roboto" w:hAnsi="Roboto" w:cs="Roboto"/>
                 <w:i/>
                 <w:iCs/>
                 <w:color w:val="1D2125"/>
@@ -1683,7 +1669,7 @@
             </w:r>
             <w:r>
               <w:rPr>
-                <w:rFonts w:ascii="Roboto" w:hAnsi="Roboto" w:eastAsia="Roboto" w:cs="Roboto"/>
+                <w:rFonts w:ascii="Roboto" w:eastAsia="Roboto" w:hAnsi="Roboto" w:cs="Roboto"/>
                 <w:i/>
                 <w:iCs/>
                 <w:color w:val="1D2125"/>
@@ -1695,7 +1681,7 @@
             </w:r>
             <w:r>
               <w:rPr>
-                <w:rFonts w:ascii="Roboto" w:hAnsi="Roboto" w:eastAsia="Roboto" w:cs="Roboto"/>
+                <w:rFonts w:ascii="Roboto" w:eastAsia="Roboto" w:hAnsi="Roboto" w:cs="Roboto"/>
                 <w:i/>
                 <w:iCs/>
                 <w:color w:val="1D2125"/>
@@ -1711,29 +1697,29 @@
       <w:tr>
         <w:trPr>
           <w:gridAfter w:val="1"/>
+          <w:wAfter w:w="355" w:type="dxa"/>
           <w:trHeight w:val="300"/>
         </w:trPr>
         <w:tc>
           <w:tcPr>
             <w:tcW w:w="9360" w:type="dxa"/>
-            <w:tcMar/>
           </w:tcPr>
           <w:p>
             <w:pPr>
               <w:jc w:val="center"/>
               <w:rPr>
-                <w:rFonts w:ascii="Roboto" w:hAnsi="Roboto" w:eastAsia="Roboto" w:cs="Roboto"/>
-                <w:b/>
-                <w:bCs/>
-                <w:color w:val="1D2125"/>
-                <w:sz w:val="24"/>
-                <w:szCs w:val="24"/>
-                <w:lang w:val="en-US"/>
-              </w:rPr>
-            </w:pPr>
-            <w:r>
-              <w:rPr>
-                <w:rFonts w:ascii="Roboto" w:hAnsi="Roboto" w:eastAsia="Roboto" w:cs="Roboto"/>
+                <w:rFonts w:ascii="Roboto" w:eastAsia="Roboto" w:hAnsi="Roboto" w:cs="Roboto"/>
+                <w:b/>
+                <w:bCs/>
+                <w:color w:val="1D2125"/>
+                <w:sz w:val="24"/>
+                <w:szCs w:val="24"/>
+                <w:lang w:val="en-US"/>
+              </w:rPr>
+            </w:pPr>
+            <w:r>
+              <w:rPr>
+                <w:rFonts w:ascii="Roboto" w:eastAsia="Roboto" w:hAnsi="Roboto" w:cs="Roboto"/>
                 <w:b/>
                 <w:bCs/>
                 <w:color w:val="1D2125"/>
@@ -1749,27 +1735,22 @@
       <w:tr>
         <w:trPr>
           <w:gridAfter w:val="1"/>
+          <w:wAfter w:w="355" w:type="dxa"/>
           <w:trHeight w:val="300"/>
         </w:trPr>
         <w:tc>
           <w:tcPr>
             <w:tcW w:w="9360" w:type="dxa"/>
-            <w:tcMar/>
           </w:tcPr>
           <w:p>
             <w:pPr>
-              <w:pStyle w:val="Normal"/>
-              <w:suppressLineNumbers w:val="0"/>
-              <w:bidi w:val="0"/>
-              <w:spacing w:before="0" w:beforeAutospacing="off" w:after="0" w:afterAutospacing="off" w:line="240" w:lineRule="auto"/>
-              <w:ind w:left="0" w:right="0"/>
               <w:jc w:val="center"/>
             </w:pPr>
             <w:r>
               <w:rPr>
-                <w:rFonts w:ascii="Roboto" w:hAnsi="Roboto" w:eastAsia="Roboto" w:cs="Roboto"/>
-                <w:b w:val="1"/>
-                <w:bCs w:val="1"/>
+                <w:rFonts w:ascii="Roboto" w:eastAsia="Roboto" w:hAnsi="Roboto" w:cs="Roboto"/>
+                <w:b/>
+                <w:bCs/>
                 <w:color w:val="1D2125"/>
                 <w:sz w:val="24"/>
                 <w:szCs w:val="24"/>
@@ -1783,17 +1764,17 @@
       <w:tr>
         <w:trPr>
           <w:gridAfter w:val="1"/>
+          <w:wAfter w:w="355" w:type="dxa"/>
           <w:trHeight w:val="300"/>
         </w:trPr>
         <w:tc>
           <w:tcPr>
             <w:tcW w:w="9360" w:type="dxa"/>
-            <w:tcMar/>
           </w:tcPr>
           <w:p>
             <w:pPr>
               <w:rPr>
-                <w:rFonts w:ascii="Roboto" w:hAnsi="Roboto" w:eastAsia="Roboto" w:cs="Roboto"/>
+                <w:rFonts w:ascii="Roboto" w:eastAsia="Roboto" w:hAnsi="Roboto" w:cs="Roboto"/>
                 <w:i/>
                 <w:iCs/>
                 <w:color w:val="1D2125"/>
@@ -1804,7 +1785,7 @@
             </w:pPr>
             <w:r>
               <w:rPr>
-                <w:rFonts w:ascii="Roboto" w:hAnsi="Roboto" w:eastAsia="Roboto" w:cs="Roboto"/>
+                <w:rFonts w:ascii="Roboto" w:eastAsia="Roboto" w:hAnsi="Roboto" w:cs="Roboto"/>
                 <w:i/>
                 <w:iCs/>
                 <w:color w:val="1D2125"/>
@@ -1820,27 +1801,22 @@
       <w:tr>
         <w:trPr>
           <w:gridAfter w:val="1"/>
+          <w:wAfter w:w="355" w:type="dxa"/>
           <w:trHeight w:val="300"/>
         </w:trPr>
         <w:tc>
           <w:tcPr>
             <w:tcW w:w="9360" w:type="dxa"/>
-            <w:tcMar/>
           </w:tcPr>
           <w:p>
             <w:pPr>
-              <w:pStyle w:val="Normal"/>
-              <w:suppressLineNumbers w:val="0"/>
-              <w:bidi w:val="0"/>
-              <w:spacing w:before="0" w:beforeAutospacing="off" w:after="0" w:afterAutospacing="off" w:line="240" w:lineRule="auto"/>
-              <w:ind w:left="0" w:right="0"/>
               <w:jc w:val="center"/>
             </w:pPr>
             <w:r>
               <w:rPr>
-                <w:rFonts w:ascii="Roboto" w:hAnsi="Roboto" w:eastAsia="Roboto" w:cs="Roboto"/>
-                <w:b w:val="1"/>
-                <w:bCs w:val="1"/>
+                <w:rFonts w:ascii="Roboto" w:eastAsia="Roboto" w:hAnsi="Roboto" w:cs="Roboto"/>
+                <w:b/>
+                <w:bCs/>
                 <w:color w:val="1D2125"/>
                 <w:sz w:val="24"/>
                 <w:szCs w:val="24"/>
@@ -1854,17 +1830,17 @@
       <w:tr>
         <w:trPr>
           <w:gridAfter w:val="1"/>
+          <w:wAfter w:w="355" w:type="dxa"/>
           <w:trHeight w:val="645"/>
         </w:trPr>
         <w:tc>
           <w:tcPr>
             <w:tcW w:w="9360" w:type="dxa"/>
-            <w:tcMar/>
           </w:tcPr>
           <w:p>
             <w:pPr>
               <w:rPr>
-                <w:rFonts w:ascii="Roboto" w:hAnsi="Roboto" w:eastAsia="Roboto" w:cs="Roboto"/>
+                <w:rFonts w:ascii="Roboto" w:eastAsia="Roboto" w:hAnsi="Roboto" w:cs="Roboto"/>
                 <w:i/>
                 <w:iCs/>
                 <w:color w:val="1D2125"/>
@@ -1875,7 +1851,7 @@
             </w:pPr>
             <w:r>
               <w:rPr>
-                <w:rFonts w:ascii="Roboto" w:hAnsi="Roboto" w:eastAsia="Roboto" w:cs="Roboto"/>
+                <w:rFonts w:ascii="Roboto" w:eastAsia="Roboto" w:hAnsi="Roboto" w:cs="Roboto"/>
                 <w:i/>
                 <w:iCs/>
                 <w:color w:val="1D2125"/>
@@ -1891,36 +1867,31 @@
       <w:tr>
         <w:trPr>
           <w:gridAfter w:val="1"/>
+          <w:wAfter w:w="355" w:type="dxa"/>
           <w:trHeight w:val="645"/>
         </w:trPr>
         <w:tc>
           <w:tcPr>
             <w:tcW w:w="9005" w:type="dxa"/>
-            <w:tcMar/>
           </w:tcPr>
           <w:p>
             <w:pPr>
-              <w:pStyle w:val="Normal"/>
               <w:jc w:val="center"/>
               <w:rPr>
-                <w:rFonts w:ascii="Roboto" w:hAnsi="Roboto" w:eastAsia="Roboto" w:cs="Roboto"/>
-                <w:b w:val="1"/>
-                <w:bCs w:val="1"/>
-                <w:i w:val="0"/>
-                <w:iCs w:val="0"/>
-                <w:color w:val="1D2125"/>
-                <w:sz w:val="24"/>
-                <w:szCs w:val="24"/>
-                <w:lang w:val="en-US"/>
-              </w:rPr>
-            </w:pPr>
-            <w:r>
-              <w:rPr>
-                <w:rFonts w:ascii="Roboto" w:hAnsi="Roboto" w:eastAsia="Roboto" w:cs="Roboto"/>
-                <w:b w:val="1"/>
-                <w:bCs w:val="1"/>
-                <w:i w:val="0"/>
-                <w:iCs w:val="0"/>
+                <w:rFonts w:ascii="Roboto" w:eastAsia="Roboto" w:hAnsi="Roboto" w:cs="Roboto"/>
+                <w:b/>
+                <w:bCs/>
+                <w:color w:val="1D2125"/>
+                <w:sz w:val="24"/>
+                <w:szCs w:val="24"/>
+                <w:lang w:val="en-US"/>
+              </w:rPr>
+            </w:pPr>
+            <w:r>
+              <w:rPr>
+                <w:rFonts w:ascii="Roboto" w:eastAsia="Roboto" w:hAnsi="Roboto" w:cs="Roboto"/>
+                <w:b/>
+                <w:bCs/>
                 <w:color w:val="1D2125"/>
                 <w:sz w:val="24"/>
                 <w:szCs w:val="24"/>
@@ -1934,30 +1905,30 @@
       <w:tr>
         <w:trPr>
           <w:gridAfter w:val="1"/>
+          <w:wAfter w:w="355" w:type="dxa"/>
           <w:trHeight w:val="645"/>
         </w:trPr>
         <w:tc>
           <w:tcPr>
             <w:tcW w:w="9005" w:type="dxa"/>
-            <w:tcMar/>
           </w:tcPr>
           <w:p>
             <w:pPr>
               <w:rPr>
-                <w:rFonts w:ascii="Roboto" w:hAnsi="Roboto" w:eastAsia="Roboto" w:cs="Roboto"/>
-                <w:i w:val="1"/>
-                <w:iCs w:val="1"/>
-                <w:color w:val="1D2125"/>
-                <w:sz w:val="24"/>
-                <w:szCs w:val="24"/>
-                <w:lang w:val="en-US"/>
-              </w:rPr>
-            </w:pPr>
-            <w:r>
-              <w:rPr>
-                <w:rFonts w:ascii="Roboto" w:hAnsi="Roboto" w:eastAsia="Roboto" w:cs="Roboto"/>
-                <w:i w:val="1"/>
-                <w:iCs w:val="1"/>
+                <w:rFonts w:ascii="Roboto" w:eastAsia="Roboto" w:hAnsi="Roboto" w:cs="Roboto"/>
+                <w:i/>
+                <w:iCs/>
+                <w:color w:val="1D2125"/>
+                <w:sz w:val="24"/>
+                <w:szCs w:val="24"/>
+                <w:lang w:val="en-US"/>
+              </w:rPr>
+            </w:pPr>
+            <w:r>
+              <w:rPr>
+                <w:rFonts w:ascii="Roboto" w:eastAsia="Roboto" w:hAnsi="Roboto" w:cs="Roboto"/>
+                <w:i/>
+                <w:iCs/>
                 <w:color w:val="1D2125"/>
                 <w:sz w:val="24"/>
                 <w:szCs w:val="24"/>
@@ -1971,29 +1942,29 @@
       <w:tr>
         <w:trPr>
           <w:gridAfter w:val="1"/>
+          <w:wAfter w:w="355" w:type="dxa"/>
           <w:trHeight w:val="300"/>
         </w:trPr>
         <w:tc>
           <w:tcPr>
             <w:tcW w:w="9360" w:type="dxa"/>
-            <w:tcMar/>
           </w:tcPr>
           <w:p>
             <w:pPr>
               <w:jc w:val="center"/>
               <w:rPr>
-                <w:rFonts w:ascii="Roboto" w:hAnsi="Roboto" w:eastAsia="Roboto" w:cs="Roboto"/>
-                <w:b/>
-                <w:bCs/>
-                <w:color w:val="1D2125"/>
-                <w:sz w:val="24"/>
-                <w:szCs w:val="24"/>
-                <w:lang w:val="en-US"/>
-              </w:rPr>
-            </w:pPr>
-            <w:r>
-              <w:rPr>
-                <w:rFonts w:ascii="Roboto" w:hAnsi="Roboto" w:eastAsia="Roboto" w:cs="Roboto"/>
+                <w:rFonts w:ascii="Roboto" w:eastAsia="Roboto" w:hAnsi="Roboto" w:cs="Roboto"/>
+                <w:b/>
+                <w:bCs/>
+                <w:color w:val="1D2125"/>
+                <w:sz w:val="24"/>
+                <w:szCs w:val="24"/>
+                <w:lang w:val="en-US"/>
+              </w:rPr>
+            </w:pPr>
+            <w:r>
+              <w:rPr>
+                <w:rFonts w:ascii="Roboto" w:eastAsia="Roboto" w:hAnsi="Roboto" w:cs="Roboto"/>
                 <w:b/>
                 <w:bCs/>
                 <w:color w:val="1D2125"/>
@@ -2009,27 +1980,22 @@
       <w:tr>
         <w:trPr>
           <w:gridAfter w:val="1"/>
+          <w:wAfter w:w="355" w:type="dxa"/>
           <w:trHeight w:val="300"/>
         </w:trPr>
         <w:tc>
           <w:tcPr>
             <w:tcW w:w="9360" w:type="dxa"/>
-            <w:tcMar/>
           </w:tcPr>
           <w:p>
             <w:pPr>
-              <w:pStyle w:val="Normal"/>
-              <w:suppressLineNumbers w:val="0"/>
-              <w:bidi w:val="0"/>
-              <w:spacing w:before="0" w:beforeAutospacing="off" w:after="0" w:afterAutospacing="off" w:line="240" w:lineRule="auto"/>
-              <w:ind w:left="0" w:right="0"/>
               <w:jc w:val="center"/>
             </w:pPr>
             <w:r>
               <w:rPr>
-                <w:rFonts w:ascii="Roboto" w:hAnsi="Roboto" w:eastAsia="Roboto" w:cs="Roboto"/>
-                <w:b w:val="1"/>
-                <w:bCs w:val="1"/>
+                <w:rFonts w:ascii="Roboto" w:eastAsia="Roboto" w:hAnsi="Roboto" w:cs="Roboto"/>
+                <w:b/>
+                <w:bCs/>
                 <w:color w:val="1D2125"/>
                 <w:sz w:val="24"/>
                 <w:szCs w:val="24"/>
@@ -2043,17 +2009,17 @@
       <w:tr>
         <w:trPr>
           <w:gridAfter w:val="1"/>
+          <w:wAfter w:w="355" w:type="dxa"/>
           <w:trHeight w:val="300"/>
         </w:trPr>
         <w:tc>
           <w:tcPr>
             <w:tcW w:w="9360" w:type="dxa"/>
-            <w:tcMar/>
           </w:tcPr>
           <w:p>
             <w:pPr>
               <w:rPr>
-                <w:rFonts w:ascii="Roboto" w:hAnsi="Roboto" w:eastAsia="Roboto" w:cs="Roboto"/>
+                <w:rFonts w:ascii="Roboto" w:eastAsia="Roboto" w:hAnsi="Roboto" w:cs="Roboto"/>
                 <w:i/>
                 <w:iCs/>
                 <w:color w:val="1D2125"/>
@@ -2064,7 +2030,493 @@
             </w:pPr>
             <w:r>
               <w:rPr>
-                <w:rFonts w:ascii="Roboto" w:hAnsi="Roboto" w:eastAsia="Roboto" w:cs="Roboto"/>
+                <w:rFonts w:ascii="Roboto" w:eastAsia="Roboto" w:hAnsi="Roboto" w:cs="Roboto"/>
+                <w:i/>
+                <w:iCs/>
+                <w:color w:val="1D2125"/>
+                <w:sz w:val="24"/>
+                <w:szCs w:val="24"/>
+                <w:lang w:val="en-US"/>
+              </w:rPr>
+              <w:t xml:space="preserve">List the answers you received from the user after Tree test below - </w:t>
+            </w:r>
+          </w:p>
+          <w:p>
+            <w:pPr>
+              <w:pStyle w:val="ListParagraph"/>
+              <w:numPr>
+                <w:ilvl w:val="0"/>
+                <w:numId w:val="3"/>
+              </w:numPr>
+              <w:shd w:val="clear" w:color="auto" w:fill="F8F9FA"/>
+              <w:jc w:val="both"/>
+              <w:rPr>
+                <w:rFonts w:ascii="Roboto" w:eastAsia="Roboto" w:hAnsi="Roboto" w:cs="Roboto"/>
+                <w:color w:val="1D2125"/>
+                <w:lang w:val="en-US"/>
+              </w:rPr>
+            </w:pPr>
+            <w:r>
+              <w:rPr>
+                <w:rFonts w:ascii="Roboto" w:eastAsia="Roboto" w:hAnsi="Roboto" w:cs="Roboto"/>
+                <w:color w:val="1D2125"/>
+                <w:sz w:val="24"/>
+                <w:szCs w:val="24"/>
+                <w:lang w:val="en-US"/>
+              </w:rPr>
+              <w:t xml:space="preserve">Did you find the pages where you thought they should?  If not, which pages were not where you expected them to be in the menu hierarchy?  </w:t>
+            </w:r>
+            <w:r>
+              <w:rPr>
+                <w:rFonts w:ascii="Roboto" w:eastAsia="Roboto" w:hAnsi="Roboto" w:cs="Roboto"/>
+                <w:b/>
+                <w:bCs/>
+                <w:color w:val="1D2125"/>
+                <w:sz w:val="24"/>
+                <w:szCs w:val="24"/>
+                <w:lang w:val="en-US"/>
+              </w:rPr>
+              <w:t>ANS:</w:t>
+            </w:r>
+          </w:p>
+          <w:p>
+            <w:pPr>
+              <w:pStyle w:val="ListParagraph"/>
+              <w:numPr>
+                <w:ilvl w:val="0"/>
+                <w:numId w:val="3"/>
+              </w:numPr>
+              <w:shd w:val="clear" w:color="auto" w:fill="F8F9FA"/>
+              <w:jc w:val="both"/>
+              <w:rPr>
+                <w:rFonts w:ascii="Roboto" w:eastAsia="Roboto" w:hAnsi="Roboto" w:cs="Roboto"/>
+                <w:color w:val="1D2125"/>
+                <w:lang w:val="en-US"/>
+              </w:rPr>
+            </w:pPr>
+            <w:r>
+              <w:rPr>
+                <w:rFonts w:ascii="Roboto" w:eastAsia="Roboto" w:hAnsi="Roboto" w:cs="Roboto"/>
+                <w:color w:val="1D2125"/>
+                <w:sz w:val="24"/>
+                <w:szCs w:val="24"/>
+                <w:lang w:val="en-US"/>
+              </w:rPr>
+              <w:t>Did it take more time than you thought it would take?  If so, why do you think it took longer?</w:t>
+            </w:r>
+            <w:r>
+              <w:rPr>
+                <w:rFonts w:ascii="Roboto" w:eastAsia="Roboto" w:hAnsi="Roboto" w:cs="Roboto"/>
+                <w:b/>
+                <w:bCs/>
+                <w:color w:val="1D2125"/>
+                <w:sz w:val="24"/>
+                <w:szCs w:val="24"/>
+                <w:lang w:val="en-US"/>
+              </w:rPr>
+              <w:t xml:space="preserve"> ANS:</w:t>
+            </w:r>
+          </w:p>
+          <w:p>
+            <w:pPr>
+              <w:pStyle w:val="ListParagraph"/>
+              <w:numPr>
+                <w:ilvl w:val="0"/>
+                <w:numId w:val="3"/>
+              </w:numPr>
+              <w:shd w:val="clear" w:color="auto" w:fill="F8F9FA"/>
+              <w:jc w:val="both"/>
+              <w:rPr>
+                <w:rFonts w:ascii="Roboto" w:eastAsia="Roboto" w:hAnsi="Roboto" w:cs="Roboto"/>
+                <w:color w:val="1D2125"/>
+                <w:lang w:val="en-US"/>
+              </w:rPr>
+            </w:pPr>
+            <w:r>
+              <w:rPr>
+                <w:rFonts w:ascii="Roboto" w:eastAsia="Roboto" w:hAnsi="Roboto" w:cs="Roboto"/>
+                <w:color w:val="1D2125"/>
+                <w:sz w:val="24"/>
+                <w:szCs w:val="24"/>
+                <w:lang w:val="en-US"/>
+              </w:rPr>
+              <w:t xml:space="preserve">Were menu items labeled properly to indicate relevant resources?  If not, what was </w:t>
+            </w:r>
+            <w:r>
+              <w:rPr>
+                <w:rFonts w:ascii="Roboto" w:eastAsia="Roboto" w:hAnsi="Roboto" w:cs="Roboto"/>
+                <w:color w:val="1D2125"/>
+                <w:sz w:val="24"/>
+                <w:szCs w:val="24"/>
+                <w:lang w:val="en-US"/>
+              </w:rPr>
+              <w:t>mislabeled</w:t>
+            </w:r>
+            <w:r>
+              <w:rPr>
+                <w:rFonts w:ascii="Roboto" w:eastAsia="Roboto" w:hAnsi="Roboto" w:cs="Roboto"/>
+                <w:color w:val="1D2125"/>
+                <w:sz w:val="24"/>
+                <w:szCs w:val="24"/>
+                <w:lang w:val="en-US"/>
+              </w:rPr>
+              <w:t xml:space="preserve"> and how would you correct it?</w:t>
+            </w:r>
+            <w:r>
+              <w:rPr>
+                <w:rFonts w:ascii="Roboto" w:eastAsia="Roboto" w:hAnsi="Roboto" w:cs="Roboto"/>
+                <w:b/>
+                <w:bCs/>
+                <w:color w:val="1D2125"/>
+                <w:sz w:val="24"/>
+                <w:szCs w:val="24"/>
+                <w:lang w:val="en-US"/>
+              </w:rPr>
+              <w:t xml:space="preserve"> ANS:</w:t>
+            </w:r>
+          </w:p>
+          <w:p>
+            <w:pPr>
+              <w:pStyle w:val="ListParagraph"/>
+              <w:numPr>
+                <w:ilvl w:val="0"/>
+                <w:numId w:val="3"/>
+              </w:numPr>
+              <w:shd w:val="clear" w:color="auto" w:fill="F8F9FA"/>
+              <w:jc w:val="both"/>
+              <w:rPr>
+                <w:rFonts w:ascii="Roboto" w:eastAsia="Roboto" w:hAnsi="Roboto" w:cs="Roboto"/>
+                <w:color w:val="1D2125"/>
+                <w:lang w:val="en-US"/>
+              </w:rPr>
+            </w:pPr>
+            <w:r>
+              <w:rPr>
+                <w:rFonts w:ascii="Roboto" w:eastAsia="Roboto" w:hAnsi="Roboto" w:cs="Roboto"/>
+                <w:color w:val="1D2125"/>
+                <w:sz w:val="24"/>
+                <w:szCs w:val="24"/>
+                <w:lang w:val="en-US"/>
+              </w:rPr>
+              <w:t>Do you have any suggestions to make the site navigation easier?</w:t>
+            </w:r>
+            <w:r>
+              <w:rPr>
+                <w:rFonts w:ascii="Roboto" w:eastAsia="Roboto" w:hAnsi="Roboto" w:cs="Roboto"/>
+                <w:b/>
+                <w:bCs/>
+                <w:color w:val="1D2125"/>
+                <w:sz w:val="24"/>
+                <w:szCs w:val="24"/>
+                <w:lang w:val="en-US"/>
+              </w:rPr>
+              <w:t xml:space="preserve"> ANS:</w:t>
+            </w:r>
+          </w:p>
+        </w:tc>
+      </w:tr>
+      <w:tr>
+        <w:trPr>
+          <w:gridAfter w:val="1"/>
+          <w:wAfter w:w="355" w:type="dxa"/>
+          <w:trHeight w:val="300"/>
+        </w:trPr>
+        <w:tc>
+          <w:tcPr>
+            <w:tcW w:w="9360" w:type="dxa"/>
+          </w:tcPr>
+          <w:p>
+            <w:pPr>
+              <w:jc w:val="center"/>
+            </w:pPr>
+            <w:r>
+              <w:rPr>
+                <w:rFonts w:ascii="Roboto" w:eastAsia="Roboto" w:hAnsi="Roboto" w:cs="Roboto"/>
+                <w:b/>
+                <w:bCs/>
+                <w:color w:val="1D2125"/>
+                <w:sz w:val="24"/>
+                <w:szCs w:val="24"/>
+                <w:lang w:val="en-US"/>
+              </w:rPr>
+              <w:lastRenderedPageBreak/>
+              <w:t>Noah Barcomb</w:t>
+            </w:r>
+          </w:p>
+        </w:tc>
+      </w:tr>
+      <w:tr>
+        <w:trPr>
+          <w:gridAfter w:val="1"/>
+          <w:wAfter w:w="355" w:type="dxa"/>
+          <w:trHeight w:val="300"/>
+        </w:trPr>
+        <w:tc>
+          <w:tcPr>
+            <w:tcW w:w="9360" w:type="dxa"/>
+          </w:tcPr>
+          <w:p>
+            <w:pPr>
+              <w:rPr>
+                <w:rFonts w:ascii="Roboto" w:eastAsia="Roboto" w:hAnsi="Roboto" w:cs="Roboto"/>
+                <w:i/>
+                <w:iCs/>
+                <w:color w:val="1D2125"/>
+                <w:sz w:val="24"/>
+                <w:szCs w:val="24"/>
+                <w:lang w:val="en-US"/>
+              </w:rPr>
+            </w:pPr>
+            <w:r>
+              <w:rPr>
+                <w:rFonts w:ascii="Roboto" w:eastAsia="Roboto" w:hAnsi="Roboto" w:cs="Roboto"/>
+                <w:i/>
+                <w:iCs/>
+                <w:color w:val="1D2125"/>
+                <w:sz w:val="24"/>
+                <w:szCs w:val="24"/>
+                <w:lang w:val="en-US"/>
+              </w:rPr>
+              <w:t xml:space="preserve">List the answers you received from the user after Tree test below - </w:t>
+            </w:r>
+          </w:p>
+          <w:p>
+            <w:pPr>
+              <w:pStyle w:val="ListParagraph"/>
+              <w:numPr>
+                <w:ilvl w:val="0"/>
+                <w:numId w:val="2"/>
+              </w:numPr>
+              <w:shd w:val="clear" w:color="auto" w:fill="F8F9FA"/>
+              <w:jc w:val="both"/>
+              <w:rPr>
+                <w:rFonts w:ascii="Roboto" w:eastAsia="Roboto" w:hAnsi="Roboto" w:cs="Roboto"/>
+                <w:color w:val="1D2125"/>
+                <w:lang w:val="en-US"/>
+              </w:rPr>
+            </w:pPr>
+            <w:r>
+              <w:rPr>
+                <w:rFonts w:ascii="Roboto" w:eastAsia="Roboto" w:hAnsi="Roboto" w:cs="Roboto"/>
+                <w:color w:val="1D2125"/>
+                <w:sz w:val="24"/>
+                <w:szCs w:val="24"/>
+                <w:lang w:val="en-US"/>
+              </w:rPr>
+              <w:t xml:space="preserve">Did you find the pages where you thought they should?  If not, which pages were not where you expected them to be in the menu hierarchy?  </w:t>
+            </w:r>
+            <w:r>
+              <w:rPr>
+                <w:rFonts w:ascii="Roboto" w:eastAsia="Roboto" w:hAnsi="Roboto" w:cs="Roboto"/>
+                <w:b/>
+                <w:bCs/>
+                <w:color w:val="1D2125"/>
+                <w:sz w:val="24"/>
+                <w:szCs w:val="24"/>
+                <w:lang w:val="en-US"/>
+              </w:rPr>
+              <w:t>ANS:</w:t>
+            </w:r>
+          </w:p>
+          <w:p>
+            <w:pPr>
+              <w:pStyle w:val="ListParagraph"/>
+              <w:numPr>
+                <w:ilvl w:val="0"/>
+                <w:numId w:val="2"/>
+              </w:numPr>
+              <w:shd w:val="clear" w:color="auto" w:fill="F8F9FA"/>
+              <w:jc w:val="both"/>
+              <w:rPr>
+                <w:rFonts w:ascii="Roboto" w:eastAsia="Roboto" w:hAnsi="Roboto" w:cs="Roboto"/>
+                <w:color w:val="1D2125"/>
+                <w:lang w:val="en-US"/>
+              </w:rPr>
+            </w:pPr>
+            <w:r>
+              <w:rPr>
+                <w:rFonts w:ascii="Roboto" w:eastAsia="Roboto" w:hAnsi="Roboto" w:cs="Roboto"/>
+                <w:color w:val="1D2125"/>
+                <w:sz w:val="24"/>
+                <w:szCs w:val="24"/>
+                <w:lang w:val="en-US"/>
+              </w:rPr>
+              <w:t>Did it take more time than you thought it would take?  If so, why do you think it took longer?</w:t>
+            </w:r>
+            <w:r>
+              <w:rPr>
+                <w:rFonts w:ascii="Roboto" w:eastAsia="Roboto" w:hAnsi="Roboto" w:cs="Roboto"/>
+                <w:b/>
+                <w:bCs/>
+                <w:color w:val="1D2125"/>
+                <w:sz w:val="24"/>
+                <w:szCs w:val="24"/>
+                <w:lang w:val="en-US"/>
+              </w:rPr>
+              <w:t xml:space="preserve"> ANS:</w:t>
+            </w:r>
+          </w:p>
+          <w:p>
+            <w:pPr>
+              <w:pStyle w:val="ListParagraph"/>
+              <w:numPr>
+                <w:ilvl w:val="0"/>
+                <w:numId w:val="2"/>
+              </w:numPr>
+              <w:shd w:val="clear" w:color="auto" w:fill="F8F9FA"/>
+              <w:jc w:val="both"/>
+              <w:rPr>
+                <w:rFonts w:ascii="Roboto" w:eastAsia="Roboto" w:hAnsi="Roboto" w:cs="Roboto"/>
+                <w:color w:val="1D2125"/>
+                <w:lang w:val="en-US"/>
+              </w:rPr>
+            </w:pPr>
+            <w:r>
+              <w:rPr>
+                <w:rFonts w:ascii="Roboto" w:eastAsia="Roboto" w:hAnsi="Roboto" w:cs="Roboto"/>
+                <w:color w:val="1D2125"/>
+                <w:sz w:val="24"/>
+                <w:szCs w:val="24"/>
+                <w:lang w:val="en-US"/>
+              </w:rPr>
+              <w:t xml:space="preserve">Were menu items labeled properly to indicate relevant resources?  If not, what was </w:t>
+            </w:r>
+            <w:r>
+              <w:rPr>
+                <w:rFonts w:ascii="Roboto" w:eastAsia="Roboto" w:hAnsi="Roboto" w:cs="Roboto"/>
+                <w:color w:val="1D2125"/>
+                <w:sz w:val="24"/>
+                <w:szCs w:val="24"/>
+                <w:lang w:val="en-US"/>
+              </w:rPr>
+              <w:t>mislabeled</w:t>
+            </w:r>
+            <w:r>
+              <w:rPr>
+                <w:rFonts w:ascii="Roboto" w:eastAsia="Roboto" w:hAnsi="Roboto" w:cs="Roboto"/>
+                <w:color w:val="1D2125"/>
+                <w:sz w:val="24"/>
+                <w:szCs w:val="24"/>
+                <w:lang w:val="en-US"/>
+              </w:rPr>
+              <w:t xml:space="preserve"> and how would you correct it?</w:t>
+            </w:r>
+            <w:r>
+              <w:rPr>
+                <w:rFonts w:ascii="Roboto" w:eastAsia="Roboto" w:hAnsi="Roboto" w:cs="Roboto"/>
+                <w:b/>
+                <w:bCs/>
+                <w:color w:val="1D2125"/>
+                <w:sz w:val="24"/>
+                <w:szCs w:val="24"/>
+                <w:lang w:val="en-US"/>
+              </w:rPr>
+              <w:t xml:space="preserve"> ANS:</w:t>
+            </w:r>
+          </w:p>
+          <w:p>
+            <w:pPr>
+              <w:pStyle w:val="ListParagraph"/>
+              <w:numPr>
+                <w:ilvl w:val="0"/>
+                <w:numId w:val="2"/>
+              </w:numPr>
+              <w:shd w:val="clear" w:color="auto" w:fill="F8F9FA"/>
+              <w:jc w:val="both"/>
+              <w:rPr>
+                <w:rFonts w:ascii="Roboto" w:eastAsia="Roboto" w:hAnsi="Roboto" w:cs="Roboto"/>
+                <w:color w:val="1D2125"/>
+                <w:lang w:val="en-US"/>
+              </w:rPr>
+            </w:pPr>
+            <w:r>
+              <w:rPr>
+                <w:rFonts w:ascii="Roboto" w:eastAsia="Roboto" w:hAnsi="Roboto" w:cs="Roboto"/>
+                <w:color w:val="1D2125"/>
+                <w:sz w:val="24"/>
+                <w:szCs w:val="24"/>
+                <w:lang w:val="en-US"/>
+              </w:rPr>
+              <w:t>Do you have any suggestions to make the site navigation easier?</w:t>
+            </w:r>
+            <w:r>
+              <w:rPr>
+                <w:rFonts w:ascii="Roboto" w:eastAsia="Roboto" w:hAnsi="Roboto" w:cs="Roboto"/>
+                <w:b/>
+                <w:bCs/>
+                <w:color w:val="1D2125"/>
+                <w:sz w:val="24"/>
+                <w:szCs w:val="24"/>
+                <w:lang w:val="en-US"/>
+              </w:rPr>
+              <w:t xml:space="preserve"> ANS:</w:t>
+            </w:r>
+          </w:p>
+        </w:tc>
+      </w:tr>
+      <w:tr>
+        <w:trPr>
+          <w:gridAfter w:val="1"/>
+          <w:wAfter w:w="355" w:type="dxa"/>
+          <w:trHeight w:val="300"/>
+        </w:trPr>
+        <w:tc>
+          <w:tcPr>
+            <w:tcW w:w="9005" w:type="dxa"/>
+          </w:tcPr>
+          <w:p>
+            <w:pPr>
+              <w:jc w:val="center"/>
+              <w:rPr>
+                <w:rFonts w:ascii="Roboto" w:eastAsia="Roboto" w:hAnsi="Roboto" w:cs="Roboto"/>
+                <w:b/>
+                <w:bCs/>
+                <w:color w:val="1D2125"/>
+                <w:sz w:val="24"/>
+                <w:szCs w:val="24"/>
+                <w:lang w:val="en-US"/>
+              </w:rPr>
+            </w:pPr>
+            <w:r>
+              <w:rPr>
+                <w:rFonts w:ascii="Roboto" w:eastAsia="Roboto" w:hAnsi="Roboto" w:cs="Roboto"/>
+                <w:b/>
+                <w:bCs/>
+                <w:color w:val="1D2125"/>
+                <w:sz w:val="24"/>
+                <w:szCs w:val="24"/>
+                <w:lang w:val="en-US"/>
+              </w:rPr>
+              <w:t>Bernard Bawak</w:t>
+            </w:r>
+          </w:p>
+        </w:tc>
+      </w:tr>
+      <w:tr>
+        <w:trPr>
+          <w:gridAfter w:val="1"/>
+          <w:wAfter w:w="355" w:type="dxa"/>
+          <w:trHeight w:val="300"/>
+        </w:trPr>
+        <w:tc>
+          <w:tcPr>
+            <w:tcW w:w="9005" w:type="dxa"/>
+          </w:tcPr>
+          <w:p>
+            <w:pPr>
+              <w:rPr>
+                <w:rFonts w:ascii="Roboto" w:eastAsia="Roboto" w:hAnsi="Roboto" w:cs="Roboto"/>
+                <w:i/>
+                <w:iCs/>
+                <w:color w:val="1D2125"/>
+                <w:sz w:val="24"/>
+                <w:szCs w:val="24"/>
+                <w:lang w:val="en-US"/>
+              </w:rPr>
+            </w:pPr>
+            <w:r>
+              <w:rPr>
+                <w:rFonts w:ascii="Roboto" w:eastAsia="Roboto" w:hAnsi="Roboto" w:cs="Roboto"/>
                 <w:i/>
                 <w:iCs/>
                 <w:color w:val="1D2125"/>
@@ -2085,56 +2537,26 @@
               <w:shd w:val="clear" w:color="auto" w:fill="F8F9FA"/>
               <w:jc w:val="both"/>
               <w:rPr>
-                <w:rFonts w:ascii="Roboto" w:hAnsi="Roboto" w:eastAsia="Roboto" w:cs="Roboto"/>
-                <w:color w:val="1D2125"/>
-                <w:lang w:val="en-US"/>
-              </w:rPr>
-            </w:pPr>
-            <w:r>
-              <w:rPr>
-                <w:rFonts w:ascii="Roboto" w:hAnsi="Roboto" w:eastAsia="Roboto" w:cs="Roboto"/>
-                <w:color w:val="1D2125"/>
-                <w:sz w:val="24"/>
-                <w:szCs w:val="24"/>
-                <w:lang w:val="en-US"/>
-              </w:rPr>
-              <w:t>Did you find the pages where you thought they should</w:t>
-            </w:r>
-            <w:r>
-              <w:rPr>
-                <w:rFonts w:ascii="Roboto" w:hAnsi="Roboto" w:eastAsia="Roboto" w:cs="Roboto"/>
-                <w:color w:val="1D2125"/>
-                <w:sz w:val="24"/>
-                <w:szCs w:val="24"/>
-                <w:lang w:val="en-US"/>
-              </w:rPr>
-              <w:t xml:space="preserve">?  </w:t>
-            </w:r>
-            <w:r>
-              <w:rPr>
-                <w:rFonts w:ascii="Roboto" w:hAnsi="Roboto" w:eastAsia="Roboto" w:cs="Roboto"/>
-                <w:color w:val="1D2125"/>
-                <w:sz w:val="24"/>
-                <w:szCs w:val="24"/>
-                <w:lang w:val="en-US"/>
-              </w:rPr>
-              <w:t>If not, which pages were not where you expected them to be in the menu hierarchy</w:t>
-            </w:r>
-            <w:r>
-              <w:rPr>
-                <w:rFonts w:ascii="Roboto" w:hAnsi="Roboto" w:eastAsia="Roboto" w:cs="Roboto"/>
-                <w:color w:val="1D2125"/>
-                <w:sz w:val="24"/>
-                <w:szCs w:val="24"/>
-                <w:lang w:val="en-US"/>
-              </w:rPr>
-              <w:t xml:space="preserve">?  </w:t>
-            </w:r>
-            <w:r>
-              <w:rPr>
-                <w:rFonts w:ascii="Roboto" w:hAnsi="Roboto" w:eastAsia="Roboto" w:cs="Roboto"/>
-                <w:b w:val="1"/>
-                <w:bCs w:val="1"/>
+                <w:rFonts w:ascii="Roboto" w:eastAsia="Roboto" w:hAnsi="Roboto" w:cs="Roboto"/>
+                <w:color w:val="1D2125"/>
+                <w:lang w:val="en-US"/>
+              </w:rPr>
+            </w:pPr>
+            <w:r>
+              <w:rPr>
+                <w:rFonts w:ascii="Roboto" w:eastAsia="Roboto" w:hAnsi="Roboto" w:cs="Roboto"/>
+                <w:color w:val="1D2125"/>
+                <w:sz w:val="24"/>
+                <w:szCs w:val="24"/>
+                <w:lang w:val="en-US"/>
+              </w:rPr>
+              <w:t xml:space="preserve">Did you find the pages where you thought they should?  If not, which pages were not where you expected them to be in the menu hierarchy?  </w:t>
+            </w:r>
+            <w:r>
+              <w:rPr>
+                <w:rFonts w:ascii="Roboto" w:eastAsia="Roboto" w:hAnsi="Roboto" w:cs="Roboto"/>
+                <w:b/>
+                <w:bCs/>
                 <w:color w:val="1D2125"/>
                 <w:sz w:val="24"/>
                 <w:szCs w:val="24"/>
@@ -2153,14 +2575,14 @@
               <w:shd w:val="clear" w:color="auto" w:fill="F8F9FA"/>
               <w:jc w:val="both"/>
               <w:rPr>
-                <w:rFonts w:ascii="Roboto" w:hAnsi="Roboto" w:eastAsia="Roboto" w:cs="Roboto"/>
-                <w:color w:val="1D2125"/>
-                <w:lang w:val="en-US"/>
-              </w:rPr>
-            </w:pPr>
-            <w:r>
-              <w:rPr>
-                <w:rFonts w:ascii="Roboto" w:hAnsi="Roboto" w:eastAsia="Roboto" w:cs="Roboto"/>
+                <w:rFonts w:ascii="Roboto" w:eastAsia="Roboto" w:hAnsi="Roboto" w:cs="Roboto"/>
+                <w:color w:val="1D2125"/>
+                <w:lang w:val="en-US"/>
+              </w:rPr>
+            </w:pPr>
+            <w:r>
+              <w:rPr>
+                <w:rFonts w:ascii="Roboto" w:eastAsia="Roboto" w:hAnsi="Roboto" w:cs="Roboto"/>
                 <w:color w:val="1D2125"/>
                 <w:sz w:val="24"/>
                 <w:szCs w:val="24"/>
@@ -2170,7 +2592,7 @@
             </w:r>
             <w:r>
               <w:rPr>
-                <w:rFonts w:ascii="Roboto" w:hAnsi="Roboto" w:eastAsia="Roboto" w:cs="Roboto"/>
+                <w:rFonts w:ascii="Roboto" w:eastAsia="Roboto" w:hAnsi="Roboto" w:cs="Roboto"/>
                 <w:b/>
                 <w:bCs/>
                 <w:color w:val="1D2125"/>
@@ -2191,86 +2613,26 @@
               <w:shd w:val="clear" w:color="auto" w:fill="F8F9FA"/>
               <w:jc w:val="both"/>
               <w:rPr>
-                <w:rFonts w:ascii="Roboto" w:hAnsi="Roboto" w:eastAsia="Roboto" w:cs="Roboto"/>
-                <w:color w:val="1D2125"/>
-                <w:lang w:val="en-US"/>
-              </w:rPr>
-            </w:pPr>
-            <w:r>
-              <w:rPr>
-                <w:rFonts w:ascii="Roboto" w:hAnsi="Roboto" w:eastAsia="Roboto" w:cs="Roboto"/>
-                <w:color w:val="1D2125"/>
-                <w:sz w:val="24"/>
-                <w:szCs w:val="24"/>
-                <w:lang w:val="en-US"/>
-              </w:rPr>
-              <w:t xml:space="preserve">Were menu items labeled properly to </w:t>
-            </w:r>
-            <w:r>
-              <w:rPr>
-                <w:rFonts w:ascii="Roboto" w:hAnsi="Roboto" w:eastAsia="Roboto" w:cs="Roboto"/>
-                <w:color w:val="1D2125"/>
-                <w:sz w:val="24"/>
-                <w:szCs w:val="24"/>
-                <w:lang w:val="en-US"/>
-              </w:rPr>
-              <w:t>indicate</w:t>
-            </w:r>
-            <w:r>
-              <w:rPr>
-                <w:rFonts w:ascii="Roboto" w:hAnsi="Roboto" w:eastAsia="Roboto" w:cs="Roboto"/>
-                <w:color w:val="1D2125"/>
-                <w:sz w:val="24"/>
-                <w:szCs w:val="24"/>
-                <w:lang w:val="en-US"/>
-              </w:rPr>
-              <w:t xml:space="preserve"> relevant resources</w:t>
-            </w:r>
-            <w:r>
-              <w:rPr>
-                <w:rFonts w:ascii="Roboto" w:hAnsi="Roboto" w:eastAsia="Roboto" w:cs="Roboto"/>
-                <w:color w:val="1D2125"/>
-                <w:sz w:val="24"/>
-                <w:szCs w:val="24"/>
-                <w:lang w:val="en-US"/>
-              </w:rPr>
-              <w:t xml:space="preserve">?  </w:t>
-            </w:r>
-            <w:r>
-              <w:rPr>
-                <w:rFonts w:ascii="Roboto" w:hAnsi="Roboto" w:eastAsia="Roboto" w:cs="Roboto"/>
-                <w:color w:val="1D2125"/>
-                <w:sz w:val="24"/>
-                <w:szCs w:val="24"/>
-                <w:lang w:val="en-US"/>
-              </w:rPr>
-              <w:t xml:space="preserve">If not, what was </w:t>
-            </w:r>
-            <w:r>
-              <w:rPr>
-                <w:rFonts w:ascii="Roboto" w:hAnsi="Roboto" w:eastAsia="Roboto" w:cs="Roboto"/>
-                <w:color w:val="1D2125"/>
-                <w:sz w:val="24"/>
-                <w:szCs w:val="24"/>
-                <w:lang w:val="en-US"/>
-              </w:rPr>
-              <w:t>mislabeled</w:t>
-            </w:r>
-            <w:r>
-              <w:rPr>
-                <w:rFonts w:ascii="Roboto" w:hAnsi="Roboto" w:eastAsia="Roboto" w:cs="Roboto"/>
-                <w:color w:val="1D2125"/>
-                <w:sz w:val="24"/>
-                <w:szCs w:val="24"/>
-                <w:lang w:val="en-US"/>
-              </w:rPr>
-              <w:t xml:space="preserve"> and how would you correct it?</w:t>
-            </w:r>
-            <w:r>
-              <w:rPr>
-                <w:rFonts w:ascii="Roboto" w:hAnsi="Roboto" w:eastAsia="Roboto" w:cs="Roboto"/>
-                <w:b w:val="1"/>
-                <w:bCs w:val="1"/>
+                <w:rFonts w:ascii="Roboto" w:eastAsia="Roboto" w:hAnsi="Roboto" w:cs="Roboto"/>
+                <w:color w:val="1D2125"/>
+                <w:lang w:val="en-US"/>
+              </w:rPr>
+            </w:pPr>
+            <w:r>
+              <w:rPr>
+                <w:rFonts w:ascii="Roboto" w:eastAsia="Roboto" w:hAnsi="Roboto" w:cs="Roboto"/>
+                <w:color w:val="1D2125"/>
+                <w:sz w:val="24"/>
+                <w:szCs w:val="24"/>
+                <w:lang w:val="en-US"/>
+              </w:rPr>
+              <w:t>Were menu items labeled properly to indicate relevant resources?  If not, what was mislabeled and how would you correct it?</w:t>
+            </w:r>
+            <w:r>
+              <w:rPr>
+                <w:rFonts w:ascii="Roboto" w:eastAsia="Roboto" w:hAnsi="Roboto" w:cs="Roboto"/>
+                <w:b/>
+                <w:bCs/>
                 <w:color w:val="1D2125"/>
                 <w:sz w:val="24"/>
                 <w:szCs w:val="24"/>
@@ -2289,14 +2651,14 @@
               <w:shd w:val="clear" w:color="auto" w:fill="F8F9FA"/>
               <w:jc w:val="both"/>
               <w:rPr>
-                <w:rFonts w:ascii="Roboto" w:hAnsi="Roboto" w:eastAsia="Roboto" w:cs="Roboto"/>
-                <w:color w:val="1D2125"/>
-                <w:lang w:val="en-US"/>
-              </w:rPr>
-            </w:pPr>
-            <w:r>
-              <w:rPr>
-                <w:rFonts w:ascii="Roboto" w:hAnsi="Roboto" w:eastAsia="Roboto" w:cs="Roboto"/>
+                <w:rFonts w:ascii="Roboto" w:eastAsia="Roboto" w:hAnsi="Roboto" w:cs="Roboto"/>
+                <w:color w:val="1D2125"/>
+                <w:lang w:val="en-US"/>
+              </w:rPr>
+            </w:pPr>
+            <w:r>
+              <w:rPr>
+                <w:rFonts w:ascii="Roboto" w:eastAsia="Roboto" w:hAnsi="Roboto" w:cs="Roboto"/>
                 <w:color w:val="1D2125"/>
                 <w:sz w:val="24"/>
                 <w:szCs w:val="24"/>
@@ -2306,7 +2668,7 @@
             </w:r>
             <w:r>
               <w:rPr>
-                <w:rFonts w:ascii="Roboto" w:hAnsi="Roboto" w:eastAsia="Roboto" w:cs="Roboto"/>
+                <w:rFonts w:ascii="Roboto" w:eastAsia="Roboto" w:hAnsi="Roboto" w:cs="Roboto"/>
                 <w:b/>
                 <w:bCs/>
                 <w:color w:val="1D2125"/>
@@ -2317,678 +2679,12 @@
               <w:t xml:space="preserve"> ANS:</w:t>
             </w:r>
           </w:p>
-        </w:tc>
-      </w:tr>
-      <w:tr>
-        <w:trPr>
-          <w:gridAfter w:val="1"/>
-          <w:trHeight w:val="300"/>
-        </w:trPr>
-        <w:tc>
-          <w:tcPr>
-            <w:tcW w:w="9360" w:type="dxa"/>
-            <w:tcMar/>
-          </w:tcPr>
-          <w:p>
-            <w:pPr>
-              <w:pStyle w:val="Normal"/>
-              <w:suppressLineNumbers w:val="0"/>
-              <w:bidi w:val="0"/>
-              <w:spacing w:before="0" w:beforeAutospacing="off" w:after="0" w:afterAutospacing="off" w:line="240" w:lineRule="auto"/>
-              <w:ind w:left="0" w:right="0"/>
-              <w:jc w:val="center"/>
-            </w:pPr>
-            <w:r>
-              <w:rPr>
-                <w:rFonts w:ascii="Roboto" w:hAnsi="Roboto" w:eastAsia="Roboto" w:cs="Roboto"/>
-                <w:b w:val="1"/>
-                <w:bCs w:val="1"/>
-                <w:color w:val="1D2125"/>
-                <w:sz w:val="24"/>
-                <w:szCs w:val="24"/>
-                <w:lang w:val="en-US"/>
-              </w:rPr>
-              <w:t>Noah Barcomb</w:t>
-            </w:r>
-          </w:p>
-        </w:tc>
-      </w:tr>
-      <w:tr>
-        <w:trPr>
-          <w:gridAfter w:val="1"/>
-          <w:trHeight w:val="300"/>
-        </w:trPr>
-        <w:tc>
-          <w:tcPr>
-            <w:tcW w:w="9360" w:type="dxa"/>
-            <w:tcMar/>
-          </w:tcPr>
-          <w:p>
-            <w:pPr>
-              <w:rPr>
-                <w:rFonts w:ascii="Roboto" w:hAnsi="Roboto" w:eastAsia="Roboto" w:cs="Roboto"/>
+          <w:p>
+            <w:pPr>
+              <w:rPr>
+                <w:rFonts w:ascii="Roboto" w:eastAsia="Roboto" w:hAnsi="Roboto" w:cs="Roboto"/>
                 <w:i/>
                 <w:iCs/>
-                <w:color w:val="1D2125"/>
-                <w:sz w:val="24"/>
-                <w:szCs w:val="24"/>
-                <w:lang w:val="en-US"/>
-              </w:rPr>
-            </w:pPr>
-            <w:r>
-              <w:rPr>
-                <w:rFonts w:ascii="Roboto" w:hAnsi="Roboto" w:eastAsia="Roboto" w:cs="Roboto"/>
-                <w:i/>
-                <w:iCs/>
-                <w:color w:val="1D2125"/>
-                <w:sz w:val="24"/>
-                <w:szCs w:val="24"/>
-                <w:lang w:val="en-US"/>
-              </w:rPr>
-              <w:t xml:space="preserve">List the answers you received from the user after Tree test below - </w:t>
-            </w:r>
-          </w:p>
-          <w:p>
-            <w:pPr>
-              <w:pStyle w:val="ListParagraph"/>
-              <w:numPr>
-                <w:ilvl w:val="0"/>
-                <w:numId w:val="12"/>
-              </w:numPr>
-              <w:shd w:val="clear" w:color="auto" w:fill="F8F9FA"/>
-              <w:jc w:val="both"/>
-              <w:rPr>
-                <w:rFonts w:ascii="Roboto" w:hAnsi="Roboto" w:eastAsia="Roboto" w:cs="Roboto"/>
-                <w:color w:val="1D2125"/>
-                <w:lang w:val="en-US"/>
-              </w:rPr>
-            </w:pPr>
-            <w:r>
-              <w:rPr>
-                <w:rFonts w:ascii="Roboto" w:hAnsi="Roboto" w:eastAsia="Roboto" w:cs="Roboto"/>
-                <w:color w:val="1D2125"/>
-                <w:sz w:val="24"/>
-                <w:szCs w:val="24"/>
-                <w:lang w:val="en-US"/>
-              </w:rPr>
-              <w:t xml:space="preserve">Did you find the pages where you thought they should?  If not, which pages were not where you expected them to be in the menu hierarchy?  </w:t>
-            </w:r>
-            <w:r>
-              <w:rPr>
-                <w:rFonts w:ascii="Roboto" w:hAnsi="Roboto" w:eastAsia="Roboto" w:cs="Roboto"/>
-                <w:b w:val="1"/>
-                <w:bCs w:val="1"/>
-                <w:color w:val="1D2125"/>
-                <w:sz w:val="24"/>
-                <w:szCs w:val="24"/>
-                <w:lang w:val="en-US"/>
-              </w:rPr>
-              <w:t>ANS:</w:t>
-            </w:r>
-          </w:p>
-          <w:p>
-            <w:pPr>
-              <w:pStyle w:val="ListParagraph"/>
-              <w:numPr>
-                <w:ilvl w:val="0"/>
-                <w:numId w:val="12"/>
-              </w:numPr>
-              <w:shd w:val="clear" w:color="auto" w:fill="F8F9FA"/>
-              <w:jc w:val="both"/>
-              <w:rPr>
-                <w:rFonts w:ascii="Roboto" w:hAnsi="Roboto" w:eastAsia="Roboto" w:cs="Roboto"/>
-                <w:color w:val="1D2125"/>
-                <w:lang w:val="en-US"/>
-              </w:rPr>
-            </w:pPr>
-            <w:r>
-              <w:rPr>
-                <w:rFonts w:ascii="Roboto" w:hAnsi="Roboto" w:eastAsia="Roboto" w:cs="Roboto"/>
-                <w:color w:val="1D2125"/>
-                <w:sz w:val="24"/>
-                <w:szCs w:val="24"/>
-                <w:lang w:val="en-US"/>
-              </w:rPr>
-              <w:t>Did it take more time than you thought it would take</w:t>
-            </w:r>
-            <w:r>
-              <w:rPr>
-                <w:rFonts w:ascii="Roboto" w:hAnsi="Roboto" w:eastAsia="Roboto" w:cs="Roboto"/>
-                <w:color w:val="1D2125"/>
-                <w:sz w:val="24"/>
-                <w:szCs w:val="24"/>
-                <w:lang w:val="en-US"/>
-              </w:rPr>
-              <w:t xml:space="preserve">?  </w:t>
-            </w:r>
-            <w:r>
-              <w:rPr>
-                <w:rFonts w:ascii="Roboto" w:hAnsi="Roboto" w:eastAsia="Roboto" w:cs="Roboto"/>
-                <w:color w:val="1D2125"/>
-                <w:sz w:val="24"/>
-                <w:szCs w:val="24"/>
-                <w:lang w:val="en-US"/>
-              </w:rPr>
-              <w:t>If so, why do you think it took longer?</w:t>
-            </w:r>
-            <w:r>
-              <w:rPr>
-                <w:rFonts w:ascii="Roboto" w:hAnsi="Roboto" w:eastAsia="Roboto" w:cs="Roboto"/>
-                <w:b w:val="1"/>
-                <w:bCs w:val="1"/>
-                <w:color w:val="1D2125"/>
-                <w:sz w:val="24"/>
-                <w:szCs w:val="24"/>
-                <w:lang w:val="en-US"/>
-              </w:rPr>
-              <w:t xml:space="preserve"> ANS:</w:t>
-            </w:r>
-          </w:p>
-          <w:p>
-            <w:pPr>
-              <w:pStyle w:val="ListParagraph"/>
-              <w:numPr>
-                <w:ilvl w:val="0"/>
-                <w:numId w:val="12"/>
-              </w:numPr>
-              <w:shd w:val="clear" w:color="auto" w:fill="F8F9FA"/>
-              <w:jc w:val="both"/>
-              <w:rPr>
-                <w:rFonts w:ascii="Roboto" w:hAnsi="Roboto" w:eastAsia="Roboto" w:cs="Roboto"/>
-                <w:color w:val="1D2125"/>
-                <w:lang w:val="en-US"/>
-              </w:rPr>
-            </w:pPr>
-            <w:r>
-              <w:rPr>
-                <w:rFonts w:ascii="Roboto" w:hAnsi="Roboto" w:eastAsia="Roboto" w:cs="Roboto"/>
-                <w:color w:val="1D2125"/>
-                <w:sz w:val="24"/>
-                <w:szCs w:val="24"/>
-                <w:lang w:val="en-US"/>
-              </w:rPr>
-              <w:t xml:space="preserve">Were menu items labeled properly to </w:t>
-            </w:r>
-            <w:r>
-              <w:rPr>
-                <w:rFonts w:ascii="Roboto" w:hAnsi="Roboto" w:eastAsia="Roboto" w:cs="Roboto"/>
-                <w:color w:val="1D2125"/>
-                <w:sz w:val="24"/>
-                <w:szCs w:val="24"/>
-                <w:lang w:val="en-US"/>
-              </w:rPr>
-              <w:t>indicate</w:t>
-            </w:r>
-            <w:r>
-              <w:rPr>
-                <w:rFonts w:ascii="Roboto" w:hAnsi="Roboto" w:eastAsia="Roboto" w:cs="Roboto"/>
-                <w:color w:val="1D2125"/>
-                <w:sz w:val="24"/>
-                <w:szCs w:val="24"/>
-                <w:lang w:val="en-US"/>
-              </w:rPr>
-              <w:t xml:space="preserve"> relevant resources</w:t>
-            </w:r>
-            <w:r>
-              <w:rPr>
-                <w:rFonts w:ascii="Roboto" w:hAnsi="Roboto" w:eastAsia="Roboto" w:cs="Roboto"/>
-                <w:color w:val="1D2125"/>
-                <w:sz w:val="24"/>
-                <w:szCs w:val="24"/>
-                <w:lang w:val="en-US"/>
-              </w:rPr>
-              <w:t xml:space="preserve">?  </w:t>
-            </w:r>
-            <w:r>
-              <w:rPr>
-                <w:rFonts w:ascii="Roboto" w:hAnsi="Roboto" w:eastAsia="Roboto" w:cs="Roboto"/>
-                <w:color w:val="1D2125"/>
-                <w:sz w:val="24"/>
-                <w:szCs w:val="24"/>
-                <w:lang w:val="en-US"/>
-              </w:rPr>
-              <w:t xml:space="preserve">If not, what was </w:t>
-            </w:r>
-            <w:r>
-              <w:rPr>
-                <w:rFonts w:ascii="Roboto" w:hAnsi="Roboto" w:eastAsia="Roboto" w:cs="Roboto"/>
-                <w:color w:val="1D2125"/>
-                <w:sz w:val="24"/>
-                <w:szCs w:val="24"/>
-                <w:lang w:val="en-US"/>
-              </w:rPr>
-              <w:t>mislabeled</w:t>
-            </w:r>
-            <w:r>
-              <w:rPr>
-                <w:rFonts w:ascii="Roboto" w:hAnsi="Roboto" w:eastAsia="Roboto" w:cs="Roboto"/>
-                <w:color w:val="1D2125"/>
-                <w:sz w:val="24"/>
-                <w:szCs w:val="24"/>
-                <w:lang w:val="en-US"/>
-              </w:rPr>
-              <w:t xml:space="preserve"> and how would you correct it?</w:t>
-            </w:r>
-            <w:r>
-              <w:rPr>
-                <w:rFonts w:ascii="Roboto" w:hAnsi="Roboto" w:eastAsia="Roboto" w:cs="Roboto"/>
-                <w:b w:val="1"/>
-                <w:bCs w:val="1"/>
-                <w:color w:val="1D2125"/>
-                <w:sz w:val="24"/>
-                <w:szCs w:val="24"/>
-                <w:lang w:val="en-US"/>
-              </w:rPr>
-              <w:t xml:space="preserve"> ANS:</w:t>
-            </w:r>
-          </w:p>
-          <w:p>
-            <w:pPr>
-              <w:pStyle w:val="ListParagraph"/>
-              <w:numPr>
-                <w:ilvl w:val="0"/>
-                <w:numId w:val="12"/>
-              </w:numPr>
-              <w:shd w:val="clear" w:color="auto" w:fill="F8F9FA"/>
-              <w:jc w:val="both"/>
-              <w:rPr>
-                <w:rFonts w:ascii="Roboto" w:hAnsi="Roboto" w:eastAsia="Roboto" w:cs="Roboto"/>
-                <w:color w:val="1D2125"/>
-                <w:lang w:val="en-US"/>
-              </w:rPr>
-            </w:pPr>
-            <w:r>
-              <w:rPr>
-                <w:rFonts w:ascii="Roboto" w:hAnsi="Roboto" w:eastAsia="Roboto" w:cs="Roboto"/>
-                <w:color w:val="1D2125"/>
-                <w:sz w:val="24"/>
-                <w:szCs w:val="24"/>
-                <w:lang w:val="en-US"/>
-              </w:rPr>
-              <w:t xml:space="preserve">Do you have any suggestions to make </w:t>
-            </w:r>
-            <w:r>
-              <w:rPr>
-                <w:rFonts w:ascii="Roboto" w:hAnsi="Roboto" w:eastAsia="Roboto" w:cs="Roboto"/>
-                <w:color w:val="1D2125"/>
-                <w:sz w:val="24"/>
-                <w:szCs w:val="24"/>
-                <w:lang w:val="en-US"/>
-              </w:rPr>
-              <w:t>the site</w:t>
-            </w:r>
-            <w:r>
-              <w:rPr>
-                <w:rFonts w:ascii="Roboto" w:hAnsi="Roboto" w:eastAsia="Roboto" w:cs="Roboto"/>
-                <w:color w:val="1D2125"/>
-                <w:sz w:val="24"/>
-                <w:szCs w:val="24"/>
-                <w:lang w:val="en-US"/>
-              </w:rPr>
-              <w:t xml:space="preserve"> navigation easier?</w:t>
-            </w:r>
-            <w:r>
-              <w:rPr>
-                <w:rFonts w:ascii="Roboto" w:hAnsi="Roboto" w:eastAsia="Roboto" w:cs="Roboto"/>
-                <w:b w:val="1"/>
-                <w:bCs w:val="1"/>
-                <w:color w:val="1D2125"/>
-                <w:sz w:val="24"/>
-                <w:szCs w:val="24"/>
-                <w:lang w:val="en-US"/>
-              </w:rPr>
-              <w:t xml:space="preserve"> ANS:</w:t>
-            </w:r>
-          </w:p>
-        </w:tc>
-      </w:tr>
-      <w:tr>
-        <w:trPr>
-          <w:gridAfter w:val="1"/>
-          <w:trHeight w:val="300"/>
-        </w:trPr>
-        <w:tc>
-          <w:tcPr>
-            <w:tcW w:w="9005" w:type="dxa"/>
-            <w:tcMar/>
-          </w:tcPr>
-          <w:p>
-            <w:pPr>
-              <w:pStyle w:val="Normal"/>
-              <w:jc w:val="center"/>
-              <w:rPr>
-                <w:rFonts w:ascii="Roboto" w:hAnsi="Roboto" w:eastAsia="Roboto" w:cs="Roboto"/>
-                <w:b w:val="1"/>
-                <w:bCs w:val="1"/>
-                <w:i w:val="0"/>
-                <w:iCs w:val="0"/>
-                <w:color w:val="1D2125"/>
-                <w:sz w:val="24"/>
-                <w:szCs w:val="24"/>
-                <w:lang w:val="en-US"/>
-              </w:rPr>
-            </w:pPr>
-            <w:r>
-              <w:rPr>
-                <w:rFonts w:ascii="Roboto" w:hAnsi="Roboto" w:eastAsia="Roboto" w:cs="Roboto"/>
-                <w:b w:val="1"/>
-                <w:bCs w:val="1"/>
-                <w:i w:val="0"/>
-                <w:iCs w:val="0"/>
-                <w:color w:val="1D2125"/>
-                <w:sz w:val="24"/>
-                <w:szCs w:val="24"/>
-                <w:lang w:val="en-US"/>
-              </w:rPr>
-              <w:t>Bernard Bawak</w:t>
-            </w:r>
-          </w:p>
-        </w:tc>
-      </w:tr>
-      <w:tr>
-        <w:trPr>
-          <w:gridAfter w:val="1"/>
-          <w:trHeight w:val="300"/>
-        </w:trPr>
-        <w:tc>
-          <w:tcPr>
-            <w:tcW w:w="9005" w:type="dxa"/>
-            <w:tcMar/>
-          </w:tcPr>
-          <w:p>
-            <w:pPr>
-              <w:rPr>
-                <w:rFonts w:ascii="Roboto" w:hAnsi="Roboto" w:eastAsia="Roboto" w:cs="Roboto"/>
-                <w:i w:val="1"/>
-                <w:iCs w:val="1"/>
-                <w:color w:val="1D2125"/>
-                <w:sz w:val="24"/>
-                <w:szCs w:val="24"/>
-                <w:lang w:val="en-US"/>
-              </w:rPr>
-            </w:pPr>
-            <w:r>
-              <w:rPr>
-                <w:rFonts w:ascii="Roboto" w:hAnsi="Roboto" w:eastAsia="Roboto" w:cs="Roboto"/>
-                <w:i w:val="1"/>
-                <w:iCs w:val="1"/>
-                <w:color w:val="1D2125"/>
-                <w:sz w:val="24"/>
-                <w:szCs w:val="24"/>
-                <w:lang w:val="en-US"/>
-              </w:rPr>
-              <w:t xml:space="preserve">List the answers you received from the user after Tree test below - </w:t>
-            </w:r>
-          </w:p>
-          <w:p>
-            <w:pPr>
-              <w:pStyle w:val="ListParagraph"/>
-              <w:numPr>
-                <w:ilvl w:val="0"/>
-                <w:numId w:val="13"/>
-              </w:numPr>
-              <w:shd w:val="clear" w:color="auto" w:fill="F8F9FA"/>
-              <w:jc w:val="both"/>
-              <w:rPr>
-                <w:rFonts w:ascii="Roboto" w:hAnsi="Roboto" w:eastAsia="Roboto" w:cs="Roboto"/>
-                <w:color w:val="1D2125"/>
-                <w:lang w:val="en-US"/>
-              </w:rPr>
-            </w:pPr>
-            <w:r>
-              <w:rPr>
-                <w:rFonts w:ascii="Roboto" w:hAnsi="Roboto" w:eastAsia="Roboto" w:cs="Roboto"/>
-                <w:color w:val="1D2125"/>
-                <w:sz w:val="24"/>
-                <w:szCs w:val="24"/>
-                <w:lang w:val="en-US"/>
-              </w:rPr>
-              <w:t>Did you find the pages where you thought they should</w:t>
-            </w:r>
-            <w:r>
-              <w:rPr>
-                <w:rFonts w:ascii="Roboto" w:hAnsi="Roboto" w:eastAsia="Roboto" w:cs="Roboto"/>
-                <w:color w:val="1D2125"/>
-                <w:sz w:val="24"/>
-                <w:szCs w:val="24"/>
-                <w:lang w:val="en-US"/>
-              </w:rPr>
-              <w:t xml:space="preserve">?  </w:t>
-            </w:r>
-            <w:r>
-              <w:rPr>
-                <w:rFonts w:ascii="Roboto" w:hAnsi="Roboto" w:eastAsia="Roboto" w:cs="Roboto"/>
-                <w:color w:val="1D2125"/>
-                <w:sz w:val="24"/>
-                <w:szCs w:val="24"/>
-                <w:lang w:val="en-US"/>
-              </w:rPr>
-              <w:t>If not, which pages were not where you expected them to be in the menu hierarchy</w:t>
-            </w:r>
-            <w:r>
-              <w:rPr>
-                <w:rFonts w:ascii="Roboto" w:hAnsi="Roboto" w:eastAsia="Roboto" w:cs="Roboto"/>
-                <w:color w:val="1D2125"/>
-                <w:sz w:val="24"/>
-                <w:szCs w:val="24"/>
-                <w:lang w:val="en-US"/>
-              </w:rPr>
-              <w:t xml:space="preserve">?  </w:t>
-            </w:r>
-            <w:r>
-              <w:rPr>
-                <w:rFonts w:ascii="Roboto" w:hAnsi="Roboto" w:eastAsia="Roboto" w:cs="Roboto"/>
-                <w:b w:val="1"/>
-                <w:bCs w:val="1"/>
-                <w:color w:val="1D2125"/>
-                <w:sz w:val="24"/>
-                <w:szCs w:val="24"/>
-                <w:lang w:val="en-US"/>
-              </w:rPr>
-              <w:t>ANS:</w:t>
-            </w:r>
-          </w:p>
-          <w:p>
-            <w:pPr>
-              <w:pStyle w:val="ListParagraph"/>
-              <w:numPr>
-                <w:ilvl w:val="0"/>
-                <w:numId w:val="13"/>
-              </w:numPr>
-              <w:shd w:val="clear" w:color="auto" w:fill="F8F9FA"/>
-              <w:jc w:val="both"/>
-              <w:rPr>
-                <w:rFonts w:ascii="Roboto" w:hAnsi="Roboto" w:eastAsia="Roboto" w:cs="Roboto"/>
-                <w:color w:val="1D2125"/>
-                <w:lang w:val="en-US"/>
-              </w:rPr>
-            </w:pPr>
-            <w:r>
-              <w:rPr>
-                <w:rFonts w:ascii="Roboto" w:hAnsi="Roboto" w:eastAsia="Roboto" w:cs="Roboto"/>
-                <w:color w:val="1D2125"/>
-                <w:sz w:val="24"/>
-                <w:szCs w:val="24"/>
-                <w:lang w:val="en-US"/>
-              </w:rPr>
-              <w:t>Did it take more time than you thought it would take</w:t>
-            </w:r>
-            <w:r>
-              <w:rPr>
-                <w:rFonts w:ascii="Roboto" w:hAnsi="Roboto" w:eastAsia="Roboto" w:cs="Roboto"/>
-                <w:color w:val="1D2125"/>
-                <w:sz w:val="24"/>
-                <w:szCs w:val="24"/>
-                <w:lang w:val="en-US"/>
-              </w:rPr>
-              <w:t xml:space="preserve">?  </w:t>
-            </w:r>
-            <w:r>
-              <w:rPr>
-                <w:rFonts w:ascii="Roboto" w:hAnsi="Roboto" w:eastAsia="Roboto" w:cs="Roboto"/>
-                <w:color w:val="1D2125"/>
-                <w:sz w:val="24"/>
-                <w:szCs w:val="24"/>
-                <w:lang w:val="en-US"/>
-              </w:rPr>
-              <w:t>If so, why do you think it took longer?</w:t>
-            </w:r>
-            <w:r>
-              <w:rPr>
-                <w:rFonts w:ascii="Roboto" w:hAnsi="Roboto" w:eastAsia="Roboto" w:cs="Roboto"/>
-                <w:b w:val="1"/>
-                <w:bCs w:val="1"/>
-                <w:color w:val="1D2125"/>
-                <w:sz w:val="24"/>
-                <w:szCs w:val="24"/>
-                <w:lang w:val="en-US"/>
-              </w:rPr>
-              <w:t xml:space="preserve"> ANS:</w:t>
-            </w:r>
-          </w:p>
-          <w:p>
-            <w:pPr>
-              <w:pStyle w:val="ListParagraph"/>
-              <w:numPr>
-                <w:ilvl w:val="0"/>
-                <w:numId w:val="13"/>
-              </w:numPr>
-              <w:shd w:val="clear" w:color="auto" w:fill="F8F9FA"/>
-              <w:jc w:val="both"/>
-              <w:rPr>
-                <w:rFonts w:ascii="Roboto" w:hAnsi="Roboto" w:eastAsia="Roboto" w:cs="Roboto"/>
-                <w:color w:val="1D2125"/>
-                <w:lang w:val="en-US"/>
-              </w:rPr>
-            </w:pPr>
-            <w:r>
-              <w:rPr>
-                <w:rFonts w:ascii="Roboto" w:hAnsi="Roboto" w:eastAsia="Roboto" w:cs="Roboto"/>
-                <w:color w:val="1D2125"/>
-                <w:sz w:val="24"/>
-                <w:szCs w:val="24"/>
-                <w:lang w:val="en-US"/>
-              </w:rPr>
-              <w:t xml:space="preserve">Were menu items labeled properly to </w:t>
-            </w:r>
-            <w:r>
-              <w:rPr>
-                <w:rFonts w:ascii="Roboto" w:hAnsi="Roboto" w:eastAsia="Roboto" w:cs="Roboto"/>
-                <w:color w:val="1D2125"/>
-                <w:sz w:val="24"/>
-                <w:szCs w:val="24"/>
-                <w:lang w:val="en-US"/>
-              </w:rPr>
-              <w:t>indicate</w:t>
-            </w:r>
-            <w:r>
-              <w:rPr>
-                <w:rFonts w:ascii="Roboto" w:hAnsi="Roboto" w:eastAsia="Roboto" w:cs="Roboto"/>
-                <w:color w:val="1D2125"/>
-                <w:sz w:val="24"/>
-                <w:szCs w:val="24"/>
-                <w:lang w:val="en-US"/>
-              </w:rPr>
-              <w:t xml:space="preserve"> relevant resources</w:t>
-            </w:r>
-            <w:r>
-              <w:rPr>
-                <w:rFonts w:ascii="Roboto" w:hAnsi="Roboto" w:eastAsia="Roboto" w:cs="Roboto"/>
-                <w:color w:val="1D2125"/>
-                <w:sz w:val="24"/>
-                <w:szCs w:val="24"/>
-                <w:lang w:val="en-US"/>
-              </w:rPr>
-              <w:t xml:space="preserve">?  </w:t>
-            </w:r>
-            <w:r>
-              <w:rPr>
-                <w:rFonts w:ascii="Roboto" w:hAnsi="Roboto" w:eastAsia="Roboto" w:cs="Roboto"/>
-                <w:color w:val="1D2125"/>
-                <w:sz w:val="24"/>
-                <w:szCs w:val="24"/>
-                <w:lang w:val="en-US"/>
-              </w:rPr>
-              <w:t>If not, what was mislabeled and how would you correct it?</w:t>
-            </w:r>
-            <w:r>
-              <w:rPr>
-                <w:rFonts w:ascii="Roboto" w:hAnsi="Roboto" w:eastAsia="Roboto" w:cs="Roboto"/>
-                <w:b w:val="1"/>
-                <w:bCs w:val="1"/>
-                <w:color w:val="1D2125"/>
-                <w:sz w:val="24"/>
-                <w:szCs w:val="24"/>
-                <w:lang w:val="en-US"/>
-              </w:rPr>
-              <w:t xml:space="preserve"> ANS:</w:t>
-            </w:r>
-          </w:p>
-          <w:p>
-            <w:pPr>
-              <w:pStyle w:val="ListParagraph"/>
-              <w:numPr>
-                <w:ilvl w:val="0"/>
-                <w:numId w:val="13"/>
-              </w:numPr>
-              <w:shd w:val="clear" w:color="auto" w:fill="F8F9FA"/>
-              <w:jc w:val="both"/>
-              <w:rPr>
-                <w:rFonts w:ascii="Roboto" w:hAnsi="Roboto" w:eastAsia="Roboto" w:cs="Roboto"/>
-                <w:color w:val="1D2125"/>
-                <w:lang w:val="en-US"/>
-              </w:rPr>
-            </w:pPr>
-            <w:r>
-              <w:rPr>
-                <w:rFonts w:ascii="Roboto" w:hAnsi="Roboto" w:eastAsia="Roboto" w:cs="Roboto"/>
-                <w:color w:val="1D2125"/>
-                <w:sz w:val="24"/>
-                <w:szCs w:val="24"/>
-                <w:lang w:val="en-US"/>
-              </w:rPr>
-              <w:t xml:space="preserve">Do you have any suggestions to make </w:t>
-            </w:r>
-            <w:r>
-              <w:rPr>
-                <w:rFonts w:ascii="Roboto" w:hAnsi="Roboto" w:eastAsia="Roboto" w:cs="Roboto"/>
-                <w:color w:val="1D2125"/>
-                <w:sz w:val="24"/>
-                <w:szCs w:val="24"/>
-                <w:lang w:val="en-US"/>
-              </w:rPr>
-              <w:t>the site</w:t>
-            </w:r>
-            <w:r>
-              <w:rPr>
-                <w:rFonts w:ascii="Roboto" w:hAnsi="Roboto" w:eastAsia="Roboto" w:cs="Roboto"/>
-                <w:color w:val="1D2125"/>
-                <w:sz w:val="24"/>
-                <w:szCs w:val="24"/>
-                <w:lang w:val="en-US"/>
-              </w:rPr>
-              <w:t xml:space="preserve"> navigation easier?</w:t>
-            </w:r>
-            <w:r>
-              <w:rPr>
-                <w:rFonts w:ascii="Roboto" w:hAnsi="Roboto" w:eastAsia="Roboto" w:cs="Roboto"/>
-                <w:b w:val="1"/>
-                <w:bCs w:val="1"/>
-                <w:color w:val="1D2125"/>
-                <w:sz w:val="24"/>
-                <w:szCs w:val="24"/>
-                <w:lang w:val="en-US"/>
-              </w:rPr>
-              <w:t xml:space="preserve"> ANS:</w:t>
-            </w:r>
-          </w:p>
-          <w:p>
-            <w:pPr>
-              <w:pStyle w:val="Normal"/>
-              <w:rPr>
-                <w:rFonts w:ascii="Roboto" w:hAnsi="Roboto" w:eastAsia="Roboto" w:cs="Roboto"/>
-                <w:i w:val="1"/>
-                <w:iCs w:val="1"/>
                 <w:color w:val="1D2125"/>
                 <w:sz w:val="24"/>
                 <w:szCs w:val="24"/>
@@ -3004,7 +2700,7 @@
       <w:pPr>
         <w:shd w:val="clear" w:color="auto" w:fill="F8F9FA"/>
         <w:rPr>
-          <w:rFonts w:ascii="Roboto" w:hAnsi="Roboto" w:eastAsia="Roboto" w:cs="Roboto"/>
+          <w:rFonts w:ascii="Roboto" w:eastAsia="Roboto" w:hAnsi="Roboto" w:cs="Roboto"/>
           <w:b/>
           <w:bCs/>
           <w:color w:val="1D2125"/>
@@ -3030,24 +2726,23 @@
         <w:tc>
           <w:tcPr>
             <w:tcW w:w="9360" w:type="dxa"/>
-            <w:tcMar/>
           </w:tcPr>
           <w:p>
             <w:pPr>
               <w:jc w:val="center"/>
               <w:rPr>
-                <w:rFonts w:ascii="Roboto" w:hAnsi="Roboto" w:eastAsia="Roboto" w:cs="Roboto"/>
-                <w:b/>
-                <w:bCs/>
-                <w:color w:val="1D2125"/>
-                <w:sz w:val="24"/>
-                <w:szCs w:val="24"/>
-                <w:lang w:val="en-US"/>
-              </w:rPr>
-            </w:pPr>
-            <w:r>
-              <w:rPr>
-                <w:rFonts w:ascii="Roboto" w:hAnsi="Roboto" w:eastAsia="Roboto" w:cs="Roboto"/>
+                <w:rFonts w:ascii="Roboto" w:eastAsia="Roboto" w:hAnsi="Roboto" w:cs="Roboto"/>
+                <w:b/>
+                <w:bCs/>
+                <w:color w:val="1D2125"/>
+                <w:sz w:val="24"/>
+                <w:szCs w:val="24"/>
+                <w:lang w:val="en-US"/>
+              </w:rPr>
+            </w:pPr>
+            <w:r>
+              <w:rPr>
+                <w:rFonts w:ascii="Roboto" w:eastAsia="Roboto" w:hAnsi="Roboto" w:cs="Roboto"/>
                 <w:b/>
                 <w:bCs/>
                 <w:color w:val="1D2125"/>
@@ -3059,7 +2754,7 @@
             </w:r>
             <w:r>
               <w:rPr>
-                <w:rFonts w:ascii="Roboto" w:hAnsi="Roboto" w:eastAsia="Roboto" w:cs="Roboto"/>
+                <w:rFonts w:ascii="Roboto" w:eastAsia="Roboto" w:hAnsi="Roboto" w:cs="Roboto"/>
                 <w:b/>
                 <w:bCs/>
                 <w:color w:val="1D2125"/>
@@ -3079,12 +2774,11 @@
         <w:tc>
           <w:tcPr>
             <w:tcW w:w="9360" w:type="dxa"/>
-            <w:tcMar/>
           </w:tcPr>
           <w:p>
             <w:pPr>
               <w:rPr>
-                <w:rFonts w:ascii="Roboto" w:hAnsi="Roboto" w:eastAsia="Roboto" w:cs="Roboto"/>
+                <w:rFonts w:ascii="Roboto" w:eastAsia="Roboto" w:hAnsi="Roboto" w:cs="Roboto"/>
                 <w:i/>
                 <w:iCs/>
                 <w:color w:val="1D2125"/>
@@ -3095,7 +2789,7 @@
             </w:pPr>
             <w:r>
               <w:rPr>
-                <w:rFonts w:ascii="Roboto" w:hAnsi="Roboto" w:eastAsia="Roboto" w:cs="Roboto"/>
+                <w:rFonts w:ascii="Roboto" w:eastAsia="Roboto" w:hAnsi="Roboto" w:cs="Roboto"/>
                 <w:i/>
                 <w:iCs/>
                 <w:color w:val="1D2125"/>
@@ -3115,26 +2809,25 @@
         <w:tc>
           <w:tcPr>
             <w:tcW w:w="9360" w:type="dxa"/>
-            <w:tcMar/>
           </w:tcPr>
           <w:p>
             <w:pPr>
               <w:jc w:val="center"/>
               <w:rPr>
-                <w:rFonts w:ascii="Roboto" w:hAnsi="Roboto" w:eastAsia="Roboto" w:cs="Roboto"/>
-                <w:b w:val="1"/>
-                <w:bCs w:val="1"/>
-                <w:color w:val="1D2125"/>
-                <w:sz w:val="24"/>
-                <w:szCs w:val="24"/>
-                <w:lang w:val="en-US"/>
-              </w:rPr>
-            </w:pPr>
-            <w:r>
-              <w:rPr>
-                <w:rFonts w:ascii="Roboto" w:hAnsi="Roboto" w:eastAsia="Roboto" w:cs="Roboto"/>
-                <w:b w:val="1"/>
-                <w:bCs w:val="1"/>
+                <w:rFonts w:ascii="Roboto" w:eastAsia="Roboto" w:hAnsi="Roboto" w:cs="Roboto"/>
+                <w:b/>
+                <w:bCs/>
+                <w:color w:val="1D2125"/>
+                <w:sz w:val="24"/>
+                <w:szCs w:val="24"/>
+                <w:lang w:val="en-US"/>
+              </w:rPr>
+            </w:pPr>
+            <w:r>
+              <w:rPr>
+                <w:rFonts w:ascii="Roboto" w:eastAsia="Roboto" w:hAnsi="Roboto" w:cs="Roboto"/>
+                <w:b/>
+                <w:bCs/>
                 <w:color w:val="1D2125"/>
                 <w:sz w:val="24"/>
                 <w:szCs w:val="24"/>
@@ -3144,9 +2837,9 @@
             </w:r>
             <w:r>
               <w:rPr>
-                <w:rFonts w:ascii="Roboto" w:hAnsi="Roboto" w:eastAsia="Roboto" w:cs="Roboto"/>
-                <w:b w:val="1"/>
-                <w:bCs w:val="1"/>
+                <w:rFonts w:ascii="Roboto" w:eastAsia="Roboto" w:hAnsi="Roboto" w:cs="Roboto"/>
+                <w:b/>
+                <w:bCs/>
                 <w:color w:val="1D2125"/>
                 <w:sz w:val="24"/>
                 <w:szCs w:val="24"/>
@@ -3164,22 +2857,13 @@
         <w:tc>
           <w:tcPr>
             <w:tcW w:w="9360" w:type="dxa"/>
-            <w:tcMar/>
           </w:tcPr>
           <w:p>
-            <w:pPr>
-              <w:pStyle w:val="Normal"/>
-              <w:suppressLineNumbers w:val="0"/>
-              <w:bidi w:val="0"/>
-              <w:spacing w:before="0" w:beforeAutospacing="off" w:after="0" w:afterAutospacing="off" w:line="240" w:lineRule="auto"/>
-              <w:ind w:left="0" w:right="0"/>
-              <w:jc w:val="left"/>
-            </w:pPr>
-            <w:r>
-              <w:rPr>
-                <w:rFonts w:ascii="Roboto" w:hAnsi="Roboto" w:eastAsia="Roboto" w:cs="Roboto"/>
-                <w:i w:val="1"/>
-                <w:iCs w:val="1"/>
+            <w:r>
+              <w:rPr>
+                <w:rFonts w:ascii="Roboto" w:eastAsia="Roboto" w:hAnsi="Roboto" w:cs="Roboto"/>
+                <w:i/>
+                <w:iCs/>
                 <w:color w:val="1D2125"/>
                 <w:sz w:val="24"/>
                 <w:szCs w:val="24"/>
@@ -3194,14 +2878,14 @@
     <w:p>
       <w:pPr>
         <w:rPr>
-          <w:b w:val="1"/>
-          <w:bCs w:val="1"/>
+          <w:b/>
+          <w:bCs/>
           <w:lang w:val="en-US"/>
         </w:rPr>
       </w:pPr>
     </w:p>
     <w:sectPr>
-      <w:pgSz w:w="12240" w:h="15840" w:orient="portrait"/>
+      <w:pgSz w:w="12240" w:h="15840"/>
       <w:pgMar w:top="1152" w:right="1440" w:bottom="1152" w:left="1440" w:header="720" w:footer="720" w:gutter="0"/>
       <w:pgNumType w:start="1"/>
       <w:cols w:space="720"/>
@@ -3212,176 +2896,6 @@
 
 <file path=word/numbering.xml><?xml version="1.0" encoding="utf-8"?>
 <w:numbering xmlns:wpc="http://schemas.microsoft.com/office/word/2010/wordprocessingCanvas" xmlns:cx="http://schemas.microsoft.com/office/drawing/2014/chartex" xmlns:cx1="http://schemas.microsoft.com/office/drawing/2015/9/8/chartex" xmlns:cx2="http://schemas.microsoft.com/office/drawing/2015/10/21/chartex" xmlns:cx3="http://schemas.microsoft.com/office/drawing/2016/5/9/chartex" xmlns:cx4="http://schemas.microsoft.com/office/drawing/2016/5/10/chartex" xmlns:cx5="http://schemas.microsoft.com/office/drawing/2016/5/11/chartex" xmlns:cx6="http://schemas.microsoft.com/office/drawing/2016/5/12/chartex" xmlns:cx7="http://schemas.microsoft.com/office/drawing/2016/5/13/chartex" xmlns:cx8="http://schemas.microsoft.com/office/drawing/2016/5/14/chartex" xmlns:mc="http://schemas.openxmlformats.org/markup-compatibility/2006" xmlns:aink="http://schemas.microsoft.com/office/drawing/2016/ink" xmlns:am3d="http://schemas.microsoft.com/office/drawing/2017/model3d" xmlns:o="urn:schemas-microsoft-com:office:office" xmlns:oel="http://schemas.microsoft.com/office/2019/extlst" xmlns:r="http://schemas.openxmlformats.org/officeDocument/2006/relationships" xmlns:m="http://schemas.openxmlformats.org/officeDocument/2006/math" xmlns:v="urn:schemas-microsoft-com:vml" xmlns:wp14="http://schemas.microsoft.com/office/word/2010/wordprocessingDrawing" xmlns:wp="http://schemas.openxmlformats.org/drawingml/2006/wordprocessingDrawing" xmlns:w10="urn:schemas-microsoft-com:office:word" xmlns:w="http://schemas.openxmlformats.org/wordprocessingml/2006/main" xmlns:w14="http://schemas.microsoft.com/office/word/2010/wordml" xmlns:w15="http://schemas.microsoft.com/office/word/2012/wordml" xmlns:w16cex="http://schemas.microsoft.com/office/word/2018/wordml/cex" xmlns:w16cid="http://schemas.microsoft.com/office/word/2016/wordml/cid" xmlns:w16="http://schemas.microsoft.com/office/word/2018/wordml" xmlns:w16du="http://schemas.microsoft.com/office/word/2023/wordml/word16du" xmlns:w16sdtdh="http://schemas.microsoft.com/office/word/2020/wordml/sdtdatahash" xmlns:w16sdtfl="http://schemas.microsoft.com/office/word/2024/wordml/sdtformatlock" xmlns:w16se="http://schemas.microsoft.com/office/word/2015/wordml/symex" xmlns:wpg="http://schemas.microsoft.com/office/word/2010/wordprocessingGroup" xmlns:wpi="http://schemas.microsoft.com/office/word/2010/wordprocessingInk" xmlns:wne="http://schemas.microsoft.com/office/word/2006/wordml" xmlns:wps="http://schemas.microsoft.com/office/word/2010/wordprocessingShape" mc:Ignorable="w14 w15 w16se w16cid w16 w16cex w16sdtdh w16sdtfl w16du wp14">
-  <w:abstractNum xmlns:w="http://schemas.openxmlformats.org/wordprocessingml/2006/main" w:abstractNumId="12">
-    <w:nsid w:val="65972449"/>
-    <w:multiLevelType xmlns:w="http://schemas.openxmlformats.org/wordprocessingml/2006/main" w:val="hybridMultilevel"/>
-    <w:lvl xmlns:w="http://schemas.openxmlformats.org/wordprocessingml/2006/main" w:ilvl="0">
-      <w:start w:val="1"/>
-      <w:numFmt w:val="decimal"/>
-      <w:lvlText w:val="%1."/>
-      <w:lvlJc w:val="left"/>
-      <w:pPr>
-        <w:ind w:left="1080" w:hanging="360"/>
-      </w:pPr>
-    </w:lvl>
-    <w:lvl xmlns:w="http://schemas.openxmlformats.org/wordprocessingml/2006/main" w:ilvl="1">
-      <w:start w:val="1"/>
-      <w:numFmt w:val="lowerLetter"/>
-      <w:lvlText w:val="%2."/>
-      <w:lvlJc w:val="left"/>
-      <w:pPr>
-        <w:ind w:left="1800" w:hanging="360"/>
-      </w:pPr>
-    </w:lvl>
-    <w:lvl xmlns:w="http://schemas.openxmlformats.org/wordprocessingml/2006/main" w:ilvl="2">
-      <w:start w:val="1"/>
-      <w:numFmt w:val="lowerRoman"/>
-      <w:lvlText w:val="%3."/>
-      <w:lvlJc w:val="right"/>
-      <w:pPr>
-        <w:ind w:left="2520" w:hanging="180"/>
-      </w:pPr>
-    </w:lvl>
-    <w:lvl xmlns:w="http://schemas.openxmlformats.org/wordprocessingml/2006/main" w:ilvl="3">
-      <w:start w:val="1"/>
-      <w:numFmt w:val="decimal"/>
-      <w:lvlText w:val="%4."/>
-      <w:lvlJc w:val="left"/>
-      <w:pPr>
-        <w:ind w:left="3240" w:hanging="360"/>
-      </w:pPr>
-    </w:lvl>
-    <w:lvl xmlns:w="http://schemas.openxmlformats.org/wordprocessingml/2006/main" w:ilvl="4">
-      <w:start w:val="1"/>
-      <w:numFmt w:val="lowerLetter"/>
-      <w:lvlText w:val="%5."/>
-      <w:lvlJc w:val="left"/>
-      <w:pPr>
-        <w:ind w:left="3960" w:hanging="360"/>
-      </w:pPr>
-    </w:lvl>
-    <w:lvl xmlns:w="http://schemas.openxmlformats.org/wordprocessingml/2006/main" w:ilvl="5">
-      <w:start w:val="1"/>
-      <w:numFmt w:val="lowerRoman"/>
-      <w:lvlText w:val="%6."/>
-      <w:lvlJc w:val="right"/>
-      <w:pPr>
-        <w:ind w:left="4680" w:hanging="180"/>
-      </w:pPr>
-    </w:lvl>
-    <w:lvl xmlns:w="http://schemas.openxmlformats.org/wordprocessingml/2006/main" w:ilvl="6">
-      <w:start w:val="1"/>
-      <w:numFmt w:val="decimal"/>
-      <w:lvlText w:val="%7."/>
-      <w:lvlJc w:val="left"/>
-      <w:pPr>
-        <w:ind w:left="5400" w:hanging="360"/>
-      </w:pPr>
-    </w:lvl>
-    <w:lvl xmlns:w="http://schemas.openxmlformats.org/wordprocessingml/2006/main" w:ilvl="7">
-      <w:start w:val="1"/>
-      <w:numFmt w:val="lowerLetter"/>
-      <w:lvlText w:val="%8."/>
-      <w:lvlJc w:val="left"/>
-      <w:pPr>
-        <w:ind w:left="6120" w:hanging="360"/>
-      </w:pPr>
-    </w:lvl>
-    <w:lvl xmlns:w="http://schemas.openxmlformats.org/wordprocessingml/2006/main" w:ilvl="8">
-      <w:start w:val="1"/>
-      <w:numFmt w:val="lowerRoman"/>
-      <w:lvlText w:val="%9."/>
-      <w:lvlJc w:val="right"/>
-      <w:pPr>
-        <w:ind w:left="6840" w:hanging="180"/>
-      </w:pPr>
-    </w:lvl>
-  </w:abstractNum>
-  <w:abstractNum xmlns:w="http://schemas.openxmlformats.org/wordprocessingml/2006/main" w:abstractNumId="11">
-    <w:nsid w:val="2716ada2"/>
-    <w:multiLevelType xmlns:w="http://schemas.openxmlformats.org/wordprocessingml/2006/main" w:val="hybridMultilevel"/>
-    <w:lvl xmlns:w="http://schemas.openxmlformats.org/wordprocessingml/2006/main" w:ilvl="0">
-      <w:start w:val="1"/>
-      <w:numFmt w:val="decimal"/>
-      <w:lvlText w:val="%1."/>
-      <w:lvlJc w:val="left"/>
-      <w:pPr>
-        <w:ind w:left="1080" w:hanging="360"/>
-      </w:pPr>
-    </w:lvl>
-    <w:lvl xmlns:w="http://schemas.openxmlformats.org/wordprocessingml/2006/main" w:ilvl="1">
-      <w:start w:val="1"/>
-      <w:numFmt w:val="lowerLetter"/>
-      <w:lvlText w:val="%2."/>
-      <w:lvlJc w:val="left"/>
-      <w:pPr>
-        <w:ind w:left="1800" w:hanging="360"/>
-      </w:pPr>
-    </w:lvl>
-    <w:lvl xmlns:w="http://schemas.openxmlformats.org/wordprocessingml/2006/main" w:ilvl="2">
-      <w:start w:val="1"/>
-      <w:numFmt w:val="lowerRoman"/>
-      <w:lvlText w:val="%3."/>
-      <w:lvlJc w:val="right"/>
-      <w:pPr>
-        <w:ind w:left="2520" w:hanging="180"/>
-      </w:pPr>
-    </w:lvl>
-    <w:lvl xmlns:w="http://schemas.openxmlformats.org/wordprocessingml/2006/main" w:ilvl="3">
-      <w:start w:val="1"/>
-      <w:numFmt w:val="decimal"/>
-      <w:lvlText w:val="%4."/>
-      <w:lvlJc w:val="left"/>
-      <w:pPr>
-        <w:ind w:left="3240" w:hanging="360"/>
-      </w:pPr>
-    </w:lvl>
-    <w:lvl xmlns:w="http://schemas.openxmlformats.org/wordprocessingml/2006/main" w:ilvl="4">
-      <w:start w:val="1"/>
-      <w:numFmt w:val="lowerLetter"/>
-      <w:lvlText w:val="%5."/>
-      <w:lvlJc w:val="left"/>
-      <w:pPr>
-        <w:ind w:left="3960" w:hanging="360"/>
-      </w:pPr>
-    </w:lvl>
-    <w:lvl xmlns:w="http://schemas.openxmlformats.org/wordprocessingml/2006/main" w:ilvl="5">
-      <w:start w:val="1"/>
-      <w:numFmt w:val="lowerRoman"/>
-      <w:lvlText w:val="%6."/>
-      <w:lvlJc w:val="right"/>
-      <w:pPr>
-        <w:ind w:left="4680" w:hanging="180"/>
-      </w:pPr>
-    </w:lvl>
-    <w:lvl xmlns:w="http://schemas.openxmlformats.org/wordprocessingml/2006/main" w:ilvl="6">
-      <w:start w:val="1"/>
-      <w:numFmt w:val="decimal"/>
-      <w:lvlText w:val="%7."/>
-      <w:lvlJc w:val="left"/>
-      <w:pPr>
-        <w:ind w:left="5400" w:hanging="360"/>
-      </w:pPr>
-    </w:lvl>
-    <w:lvl xmlns:w="http://schemas.openxmlformats.org/wordprocessingml/2006/main" w:ilvl="7">
-      <w:start w:val="1"/>
-      <w:numFmt w:val="lowerLetter"/>
-      <w:lvlText w:val="%8."/>
-      <w:lvlJc w:val="left"/>
-      <w:pPr>
-        <w:ind w:left="6120" w:hanging="360"/>
-      </w:pPr>
-    </w:lvl>
-    <w:lvl xmlns:w="http://schemas.openxmlformats.org/wordprocessingml/2006/main" w:ilvl="8">
-      <w:start w:val="1"/>
-      <w:numFmt w:val="lowerRoman"/>
-      <w:lvlText w:val="%9."/>
-      <w:lvlJc w:val="right"/>
-      <w:pPr>
-        <w:ind w:left="6840" w:hanging="180"/>
-      </w:pPr>
-    </w:lvl>
-  </w:abstractNum>
   <w:abstractNum w:abstractNumId="0" w15:restartNumberingAfterBreak="0">
     <w:nsid w:val="07573F9B"/>
     <w:multiLevelType w:val="multilevel"/>
@@ -3695,6 +3209,92 @@
     </w:lvl>
   </w:abstractNum>
   <w:abstractNum w:abstractNumId="3" w15:restartNumberingAfterBreak="0">
+    <w:nsid w:val="2716ADA2"/>
+    <w:multiLevelType w:val="hybridMultilevel"/>
+    <w:tmpl w:val="42A0807E"/>
+    <w:lvl w:ilvl="0" w:tplc="F3A838A8">
+      <w:start w:val="1"/>
+      <w:numFmt w:val="decimal"/>
+      <w:lvlText w:val="%1."/>
+      <w:lvlJc w:val="left"/>
+      <w:pPr>
+        <w:ind w:left="1080" w:hanging="360"/>
+      </w:pPr>
+    </w:lvl>
+    <w:lvl w:ilvl="1" w:tplc="F7A2A4DA">
+      <w:start w:val="1"/>
+      <w:numFmt w:val="lowerLetter"/>
+      <w:lvlText w:val="%2."/>
+      <w:lvlJc w:val="left"/>
+      <w:pPr>
+        <w:ind w:left="1800" w:hanging="360"/>
+      </w:pPr>
+    </w:lvl>
+    <w:lvl w:ilvl="2" w:tplc="C6404308">
+      <w:start w:val="1"/>
+      <w:numFmt w:val="lowerRoman"/>
+      <w:lvlText w:val="%3."/>
+      <w:lvlJc w:val="right"/>
+      <w:pPr>
+        <w:ind w:left="2520" w:hanging="180"/>
+      </w:pPr>
+    </w:lvl>
+    <w:lvl w:ilvl="3" w:tplc="D6CE153E">
+      <w:start w:val="1"/>
+      <w:numFmt w:val="decimal"/>
+      <w:lvlText w:val="%4."/>
+      <w:lvlJc w:val="left"/>
+      <w:pPr>
+        <w:ind w:left="3240" w:hanging="360"/>
+      </w:pPr>
+    </w:lvl>
+    <w:lvl w:ilvl="4" w:tplc="67F6E896">
+      <w:start w:val="1"/>
+      <w:numFmt w:val="lowerLetter"/>
+      <w:lvlText w:val="%5."/>
+      <w:lvlJc w:val="left"/>
+      <w:pPr>
+        <w:ind w:left="3960" w:hanging="360"/>
+      </w:pPr>
+    </w:lvl>
+    <w:lvl w:ilvl="5" w:tplc="4C32A976">
+      <w:start w:val="1"/>
+      <w:numFmt w:val="lowerRoman"/>
+      <w:lvlText w:val="%6."/>
+      <w:lvlJc w:val="right"/>
+      <w:pPr>
+        <w:ind w:left="4680" w:hanging="180"/>
+      </w:pPr>
+    </w:lvl>
+    <w:lvl w:ilvl="6" w:tplc="BB8EE8E4">
+      <w:start w:val="1"/>
+      <w:numFmt w:val="decimal"/>
+      <w:lvlText w:val="%7."/>
+      <w:lvlJc w:val="left"/>
+      <w:pPr>
+        <w:ind w:left="5400" w:hanging="360"/>
+      </w:pPr>
+    </w:lvl>
+    <w:lvl w:ilvl="7" w:tplc="18024D48">
+      <w:start w:val="1"/>
+      <w:numFmt w:val="lowerLetter"/>
+      <w:lvlText w:val="%8."/>
+      <w:lvlJc w:val="left"/>
+      <w:pPr>
+        <w:ind w:left="6120" w:hanging="360"/>
+      </w:pPr>
+    </w:lvl>
+    <w:lvl w:ilvl="8" w:tplc="28F8FA7E">
+      <w:start w:val="1"/>
+      <w:numFmt w:val="lowerRoman"/>
+      <w:lvlText w:val="%9."/>
+      <w:lvlJc w:val="right"/>
+      <w:pPr>
+        <w:ind w:left="6840" w:hanging="180"/>
+      </w:pPr>
+    </w:lvl>
+  </w:abstractNum>
+  <w:abstractNum w:abstractNumId="4" w15:restartNumberingAfterBreak="0">
     <w:nsid w:val="2F66AA80"/>
     <w:multiLevelType w:val="hybridMultilevel"/>
     <w:tmpl w:val="FFFFFFFF"/>
@@ -3707,7 +3307,7 @@
         <w:ind w:left="720" w:hanging="360"/>
       </w:pPr>
       <w:rPr>
-        <w:rFonts w:hint="default" w:ascii="Symbol" w:hAnsi="Symbol"/>
+        <w:rFonts w:ascii="Symbol" w:hAnsi="Symbol" w:hint="default"/>
       </w:rPr>
     </w:lvl>
     <w:lvl w:ilvl="1" w:tplc="A21EF524">
@@ -3719,7 +3319,7 @@
         <w:ind w:left="1440" w:hanging="360"/>
       </w:pPr>
       <w:rPr>
-        <w:rFonts w:hint="default" w:ascii="Courier New" w:hAnsi="Courier New"/>
+        <w:rFonts w:ascii="Courier New" w:hAnsi="Courier New" w:hint="default"/>
       </w:rPr>
     </w:lvl>
     <w:lvl w:ilvl="2" w:tplc="EA8464C4">
@@ -3731,7 +3331,7 @@
         <w:ind w:left="2160" w:hanging="360"/>
       </w:pPr>
       <w:rPr>
-        <w:rFonts w:hint="default" w:ascii="Wingdings" w:hAnsi="Wingdings"/>
+        <w:rFonts w:ascii="Wingdings" w:hAnsi="Wingdings" w:hint="default"/>
       </w:rPr>
     </w:lvl>
     <w:lvl w:ilvl="3" w:tplc="3948EF6E">
@@ -3743,7 +3343,7 @@
         <w:ind w:left="2880" w:hanging="360"/>
       </w:pPr>
       <w:rPr>
-        <w:rFonts w:hint="default" w:ascii="Symbol" w:hAnsi="Symbol"/>
+        <w:rFonts w:ascii="Symbol" w:hAnsi="Symbol" w:hint="default"/>
       </w:rPr>
     </w:lvl>
     <w:lvl w:ilvl="4" w:tplc="FB36CEB6">
@@ -3755,7 +3355,7 @@
         <w:ind w:left="3600" w:hanging="360"/>
       </w:pPr>
       <w:rPr>
-        <w:rFonts w:hint="default" w:ascii="Courier New" w:hAnsi="Courier New"/>
+        <w:rFonts w:ascii="Courier New" w:hAnsi="Courier New" w:hint="default"/>
       </w:rPr>
     </w:lvl>
     <w:lvl w:ilvl="5" w:tplc="C878308C">
@@ -3767,7 +3367,7 @@
         <w:ind w:left="4320" w:hanging="360"/>
       </w:pPr>
       <w:rPr>
-        <w:rFonts w:hint="default" w:ascii="Wingdings" w:hAnsi="Wingdings"/>
+        <w:rFonts w:ascii="Wingdings" w:hAnsi="Wingdings" w:hint="default"/>
       </w:rPr>
     </w:lvl>
     <w:lvl w:ilvl="6" w:tplc="ED34973E">
@@ -3779,7 +3379,7 @@
         <w:ind w:left="5040" w:hanging="360"/>
       </w:pPr>
       <w:rPr>
-        <w:rFonts w:hint="default" w:ascii="Symbol" w:hAnsi="Symbol"/>
+        <w:rFonts w:ascii="Symbol" w:hAnsi="Symbol" w:hint="default"/>
       </w:rPr>
     </w:lvl>
     <w:lvl w:ilvl="7" w:tplc="D3109AAE">
@@ -3791,7 +3391,7 @@
         <w:ind w:left="5760" w:hanging="360"/>
       </w:pPr>
       <w:rPr>
-        <w:rFonts w:hint="default" w:ascii="Courier New" w:hAnsi="Courier New"/>
+        <w:rFonts w:ascii="Courier New" w:hAnsi="Courier New" w:hint="default"/>
       </w:rPr>
     </w:lvl>
     <w:lvl w:ilvl="8" w:tplc="916429DA">
@@ -3803,11 +3403,11 @@
         <w:ind w:left="6480" w:hanging="360"/>
       </w:pPr>
       <w:rPr>
-        <w:rFonts w:hint="default" w:ascii="Wingdings" w:hAnsi="Wingdings"/>
+        <w:rFonts w:ascii="Wingdings" w:hAnsi="Wingdings" w:hint="default"/>
       </w:rPr>
     </w:lvl>
   </w:abstractNum>
-  <w:abstractNum w:abstractNumId="4" w15:restartNumberingAfterBreak="0">
+  <w:abstractNum w:abstractNumId="5" w15:restartNumberingAfterBreak="0">
     <w:nsid w:val="3198573E"/>
     <w:multiLevelType w:val="hybridMultilevel"/>
     <w:tmpl w:val="FFFFFFFF"/>
@@ -3838,7 +3438,7 @@
         <w:ind w:left="2160" w:hanging="360"/>
       </w:pPr>
       <w:rPr>
-        <w:rFonts w:hint="default" w:ascii="Roboto" w:hAnsi="Roboto"/>
+        <w:rFonts w:ascii="Roboto" w:hAnsi="Roboto" w:hint="default"/>
       </w:rPr>
     </w:lvl>
     <w:lvl w:ilvl="3" w:tplc="BA2CC6CA">
@@ -3896,7 +3496,7 @@
       </w:pPr>
     </w:lvl>
   </w:abstractNum>
-  <w:abstractNum w:abstractNumId="5" w15:restartNumberingAfterBreak="0">
+  <w:abstractNum w:abstractNumId="6" w15:restartNumberingAfterBreak="0">
     <w:nsid w:val="46B88349"/>
     <w:multiLevelType w:val="hybridMultilevel"/>
     <w:tmpl w:val="FFFFFFFF"/>
@@ -3982,7 +3582,7 @@
       </w:pPr>
     </w:lvl>
   </w:abstractNum>
-  <w:abstractNum w:abstractNumId="6" w15:restartNumberingAfterBreak="0">
+  <w:abstractNum w:abstractNumId="7" w15:restartNumberingAfterBreak="0">
     <w:nsid w:val="57B25464"/>
     <w:multiLevelType w:val="hybridMultilevel"/>
     <w:tmpl w:val="FFFFFFFF"/>
@@ -4068,7 +3668,7 @@
       </w:pPr>
     </w:lvl>
   </w:abstractNum>
-  <w:abstractNum w:abstractNumId="7" w15:restartNumberingAfterBreak="0">
+  <w:abstractNum w:abstractNumId="8" w15:restartNumberingAfterBreak="0">
     <w:nsid w:val="5BD951F2"/>
     <w:multiLevelType w:val="hybridMultilevel"/>
     <w:tmpl w:val="FFFFFFFF"/>
@@ -4154,7 +3754,7 @@
       </w:pPr>
     </w:lvl>
   </w:abstractNum>
-  <w:abstractNum w:abstractNumId="8" w15:restartNumberingAfterBreak="0">
+  <w:abstractNum w:abstractNumId="9" w15:restartNumberingAfterBreak="0">
     <w:nsid w:val="5CF90773"/>
     <w:multiLevelType w:val="multilevel"/>
     <w:tmpl w:val="FFFFFFFF"/>
@@ -4267,7 +3867,93 @@
       </w:rPr>
     </w:lvl>
   </w:abstractNum>
-  <w:abstractNum w:abstractNumId="9" w15:restartNumberingAfterBreak="0">
+  <w:abstractNum w:abstractNumId="10" w15:restartNumberingAfterBreak="0">
+    <w:nsid w:val="65972449"/>
+    <w:multiLevelType w:val="hybridMultilevel"/>
+    <w:tmpl w:val="A148CF12"/>
+    <w:lvl w:ilvl="0" w:tplc="81005CBA">
+      <w:start w:val="1"/>
+      <w:numFmt w:val="decimal"/>
+      <w:lvlText w:val="%1."/>
+      <w:lvlJc w:val="left"/>
+      <w:pPr>
+        <w:ind w:left="1080" w:hanging="360"/>
+      </w:pPr>
+    </w:lvl>
+    <w:lvl w:ilvl="1" w:tplc="BC9C5664">
+      <w:start w:val="1"/>
+      <w:numFmt w:val="lowerLetter"/>
+      <w:lvlText w:val="%2."/>
+      <w:lvlJc w:val="left"/>
+      <w:pPr>
+        <w:ind w:left="1800" w:hanging="360"/>
+      </w:pPr>
+    </w:lvl>
+    <w:lvl w:ilvl="2" w:tplc="A84CF632">
+      <w:start w:val="1"/>
+      <w:numFmt w:val="lowerRoman"/>
+      <w:lvlText w:val="%3."/>
+      <w:lvlJc w:val="right"/>
+      <w:pPr>
+        <w:ind w:left="2520" w:hanging="180"/>
+      </w:pPr>
+    </w:lvl>
+    <w:lvl w:ilvl="3" w:tplc="84F050D8">
+      <w:start w:val="1"/>
+      <w:numFmt w:val="decimal"/>
+      <w:lvlText w:val="%4."/>
+      <w:lvlJc w:val="left"/>
+      <w:pPr>
+        <w:ind w:left="3240" w:hanging="360"/>
+      </w:pPr>
+    </w:lvl>
+    <w:lvl w:ilvl="4" w:tplc="CBA40374">
+      <w:start w:val="1"/>
+      <w:numFmt w:val="lowerLetter"/>
+      <w:lvlText w:val="%5."/>
+      <w:lvlJc w:val="left"/>
+      <w:pPr>
+        <w:ind w:left="3960" w:hanging="360"/>
+      </w:pPr>
+    </w:lvl>
+    <w:lvl w:ilvl="5" w:tplc="EA9266C2">
+      <w:start w:val="1"/>
+      <w:numFmt w:val="lowerRoman"/>
+      <w:lvlText w:val="%6."/>
+      <w:lvlJc w:val="right"/>
+      <w:pPr>
+        <w:ind w:left="4680" w:hanging="180"/>
+      </w:pPr>
+    </w:lvl>
+    <w:lvl w:ilvl="6" w:tplc="A5DA049E">
+      <w:start w:val="1"/>
+      <w:numFmt w:val="decimal"/>
+      <w:lvlText w:val="%7."/>
+      <w:lvlJc w:val="left"/>
+      <w:pPr>
+        <w:ind w:left="5400" w:hanging="360"/>
+      </w:pPr>
+    </w:lvl>
+    <w:lvl w:ilvl="7" w:tplc="822E993A">
+      <w:start w:val="1"/>
+      <w:numFmt w:val="lowerLetter"/>
+      <w:lvlText w:val="%8."/>
+      <w:lvlJc w:val="left"/>
+      <w:pPr>
+        <w:ind w:left="6120" w:hanging="360"/>
+      </w:pPr>
+    </w:lvl>
+    <w:lvl w:ilvl="8" w:tplc="EC46F6EC">
+      <w:start w:val="1"/>
+      <w:numFmt w:val="lowerRoman"/>
+      <w:lvlText w:val="%9."/>
+      <w:lvlJc w:val="right"/>
+      <w:pPr>
+        <w:ind w:left="6840" w:hanging="180"/>
+      </w:pPr>
+    </w:lvl>
+  </w:abstractNum>
+  <w:abstractNum w:abstractNumId="11" w15:restartNumberingAfterBreak="0">
     <w:nsid w:val="70FD5B51"/>
     <w:multiLevelType w:val="multilevel"/>
     <w:tmpl w:val="FFFFFFFF"/>
@@ -4380,7 +4066,7 @@
       </w:rPr>
     </w:lvl>
   </w:abstractNum>
-  <w:abstractNum w:abstractNumId="10" w15:restartNumberingAfterBreak="0">
+  <w:abstractNum w:abstractNumId="12" w15:restartNumberingAfterBreak="0">
     <w:nsid w:val="77F253E1"/>
     <w:multiLevelType w:val="multilevel"/>
     <w:tmpl w:val="FFFFFFFF"/>
@@ -4493,43 +4179,43 @@
       </w:rPr>
     </w:lvl>
   </w:abstractNum>
-  <w:num w:numId="13">
+  <w:num w:numId="1" w16cid:durableId="1452090235">
+    <w:abstractNumId w:val="10"/>
+  </w:num>
+  <w:num w:numId="2" w16cid:durableId="413478266">
+    <w:abstractNumId w:val="3"/>
+  </w:num>
+  <w:num w:numId="3" w16cid:durableId="2121561117">
+    <w:abstractNumId w:val="6"/>
+  </w:num>
+  <w:num w:numId="4" w16cid:durableId="1775982006">
+    <w:abstractNumId w:val="5"/>
+  </w:num>
+  <w:num w:numId="5" w16cid:durableId="1443573560">
+    <w:abstractNumId w:val="7"/>
+  </w:num>
+  <w:num w:numId="6" w16cid:durableId="1108696659">
+    <w:abstractNumId w:val="4"/>
+  </w:num>
+  <w:num w:numId="7" w16cid:durableId="96756315">
+    <w:abstractNumId w:val="8"/>
+  </w:num>
+  <w:num w:numId="8" w16cid:durableId="671109140">
+    <w:abstractNumId w:val="1"/>
+  </w:num>
+  <w:num w:numId="9" w16cid:durableId="133067795">
+    <w:abstractNumId w:val="9"/>
+  </w:num>
+  <w:num w:numId="10" w16cid:durableId="1752700313">
     <w:abstractNumId w:val="12"/>
   </w:num>
-  <w:num w:numId="12">
+  <w:num w:numId="11" w16cid:durableId="1045103047">
     <w:abstractNumId w:val="11"/>
   </w:num>
-  <w:num w:numId="1" w16cid:durableId="2121561117">
-    <w:abstractNumId w:val="5"/>
-  </w:num>
-  <w:num w:numId="2" w16cid:durableId="1775982006">
-    <w:abstractNumId w:val="4"/>
-  </w:num>
-  <w:num w:numId="3" w16cid:durableId="1443573560">
-    <w:abstractNumId w:val="6"/>
-  </w:num>
-  <w:num w:numId="4" w16cid:durableId="1108696659">
-    <w:abstractNumId w:val="3"/>
-  </w:num>
-  <w:num w:numId="5" w16cid:durableId="96756315">
-    <w:abstractNumId w:val="7"/>
-  </w:num>
-  <w:num w:numId="6" w16cid:durableId="671109140">
-    <w:abstractNumId w:val="1"/>
-  </w:num>
-  <w:num w:numId="7" w16cid:durableId="133067795">
-    <w:abstractNumId w:val="8"/>
-  </w:num>
-  <w:num w:numId="8" w16cid:durableId="1752700313">
-    <w:abstractNumId w:val="10"/>
-  </w:num>
-  <w:num w:numId="9" w16cid:durableId="1045103047">
-    <w:abstractNumId w:val="9"/>
-  </w:num>
-  <w:num w:numId="10" w16cid:durableId="1465003280">
+  <w:num w:numId="12" w16cid:durableId="1465003280">
     <w:abstractNumId w:val="2"/>
   </w:num>
-  <w:num w:numId="11" w16cid:durableId="2115055904">
+  <w:num w:numId="13" w16cid:durableId="2115055904">
     <w:abstractNumId w:val="0"/>
   </w:num>
 </w:numbering>
@@ -4540,7 +4226,7 @@
   <w:docDefaults>
     <w:rPrDefault>
       <w:rPr>
-        <w:rFonts w:ascii="Arial" w:hAnsi="Arial" w:eastAsia="Arial" w:cs="Arial"/>
+        <w:rFonts w:ascii="Arial" w:eastAsia="Arial" w:hAnsi="Arial" w:cs="Arial"/>
         <w:sz w:val="22"/>
         <w:szCs w:val="22"/>
         <w:lang w:val="en" w:eastAsia="ja-JP" w:bidi="ar-SA"/>
@@ -4555,14 +4241,14 @@
   <w:latentStyles w:defLockedState="0" w:defUIPriority="99" w:defSemiHidden="0" w:defUnhideWhenUsed="0" w:defQFormat="0" w:count="376">
     <w:lsdException w:name="Normal" w:uiPriority="0" w:qFormat="1"/>
     <w:lsdException w:name="heading 1" w:uiPriority="9" w:qFormat="1"/>
-    <w:lsdException w:name="heading 2" w:uiPriority="9" w:semiHidden="1" w:unhideWhenUsed="1" w:qFormat="1"/>
-    <w:lsdException w:name="heading 3" w:uiPriority="9" w:semiHidden="1" w:unhideWhenUsed="1" w:qFormat="1"/>
-    <w:lsdException w:name="heading 4" w:uiPriority="9" w:semiHidden="1" w:unhideWhenUsed="1" w:qFormat="1"/>
-    <w:lsdException w:name="heading 5" w:uiPriority="9" w:semiHidden="1" w:unhideWhenUsed="1" w:qFormat="1"/>
-    <w:lsdException w:name="heading 6" w:uiPriority="9" w:semiHidden="1" w:unhideWhenUsed="1" w:qFormat="1"/>
-    <w:lsdException w:name="heading 7" w:uiPriority="9" w:semiHidden="1" w:unhideWhenUsed="1" w:qFormat="1"/>
-    <w:lsdException w:name="heading 8" w:uiPriority="9" w:semiHidden="1" w:unhideWhenUsed="1" w:qFormat="1"/>
-    <w:lsdException w:name="heading 9" w:uiPriority="9" w:semiHidden="1" w:unhideWhenUsed="1" w:qFormat="1"/>
+    <w:lsdException w:name="heading 2" w:semiHidden="1" w:uiPriority="9" w:unhideWhenUsed="1" w:qFormat="1"/>
+    <w:lsdException w:name="heading 3" w:semiHidden="1" w:uiPriority="9" w:unhideWhenUsed="1" w:qFormat="1"/>
+    <w:lsdException w:name="heading 4" w:semiHidden="1" w:uiPriority="9" w:unhideWhenUsed="1" w:qFormat="1"/>
+    <w:lsdException w:name="heading 5" w:semiHidden="1" w:uiPriority="9" w:unhideWhenUsed="1" w:qFormat="1"/>
+    <w:lsdException w:name="heading 6" w:semiHidden="1" w:uiPriority="9" w:unhideWhenUsed="1" w:qFormat="1"/>
+    <w:lsdException w:name="heading 7" w:semiHidden="1" w:uiPriority="9" w:unhideWhenUsed="1" w:qFormat="1"/>
+    <w:lsdException w:name="heading 8" w:semiHidden="1" w:uiPriority="9" w:unhideWhenUsed="1" w:qFormat="1"/>
+    <w:lsdException w:name="heading 9" w:semiHidden="1" w:uiPriority="9" w:unhideWhenUsed="1" w:qFormat="1"/>
     <w:lsdException w:name="index 1" w:semiHidden="1" w:unhideWhenUsed="1"/>
     <w:lsdException w:name="index 2" w:semiHidden="1" w:unhideWhenUsed="1"/>
     <w:lsdException w:name="index 3" w:semiHidden="1" w:unhideWhenUsed="1"/>
@@ -4572,22 +4258,22 @@
     <w:lsdException w:name="index 7" w:semiHidden="1" w:unhideWhenUsed="1"/>
     <w:lsdException w:name="index 8" w:semiHidden="1" w:unhideWhenUsed="1"/>
     <w:lsdException w:name="index 9" w:semiHidden="1" w:unhideWhenUsed="1"/>
-    <w:lsdException w:name="toc 1" w:uiPriority="39" w:semiHidden="1" w:unhideWhenUsed="1"/>
-    <w:lsdException w:name="toc 2" w:uiPriority="39" w:semiHidden="1" w:unhideWhenUsed="1"/>
-    <w:lsdException w:name="toc 3" w:uiPriority="39" w:semiHidden="1" w:unhideWhenUsed="1"/>
-    <w:lsdException w:name="toc 4" w:uiPriority="39" w:semiHidden="1" w:unhideWhenUsed="1"/>
-    <w:lsdException w:name="toc 5" w:uiPriority="39" w:semiHidden="1" w:unhideWhenUsed="1"/>
-    <w:lsdException w:name="toc 6" w:uiPriority="39" w:semiHidden="1" w:unhideWhenUsed="1"/>
-    <w:lsdException w:name="toc 7" w:uiPriority="39" w:semiHidden="1" w:unhideWhenUsed="1"/>
-    <w:lsdException w:name="toc 8" w:uiPriority="39" w:semiHidden="1" w:unhideWhenUsed="1"/>
-    <w:lsdException w:name="toc 9" w:uiPriority="39" w:semiHidden="1" w:unhideWhenUsed="1"/>
+    <w:lsdException w:name="toc 1" w:semiHidden="1" w:uiPriority="39" w:unhideWhenUsed="1"/>
+    <w:lsdException w:name="toc 2" w:semiHidden="1" w:uiPriority="39" w:unhideWhenUsed="1"/>
+    <w:lsdException w:name="toc 3" w:semiHidden="1" w:uiPriority="39" w:unhideWhenUsed="1"/>
+    <w:lsdException w:name="toc 4" w:semiHidden="1" w:uiPriority="39" w:unhideWhenUsed="1"/>
+    <w:lsdException w:name="toc 5" w:semiHidden="1" w:uiPriority="39" w:unhideWhenUsed="1"/>
+    <w:lsdException w:name="toc 6" w:semiHidden="1" w:uiPriority="39" w:unhideWhenUsed="1"/>
+    <w:lsdException w:name="toc 7" w:semiHidden="1" w:uiPriority="39" w:unhideWhenUsed="1"/>
+    <w:lsdException w:name="toc 8" w:semiHidden="1" w:uiPriority="39" w:unhideWhenUsed="1"/>
+    <w:lsdException w:name="toc 9" w:semiHidden="1" w:uiPriority="39" w:unhideWhenUsed="1"/>
     <w:lsdException w:name="Normal Indent" w:semiHidden="1" w:unhideWhenUsed="1"/>
     <w:lsdException w:name="footnote text" w:semiHidden="1" w:unhideWhenUsed="1"/>
     <w:lsdException w:name="annotation text" w:semiHidden="1" w:unhideWhenUsed="1"/>
     <w:lsdException w:name="header" w:semiHidden="1" w:unhideWhenUsed="1"/>
     <w:lsdException w:name="footer" w:semiHidden="1" w:unhideWhenUsed="1"/>
     <w:lsdException w:name="index heading" w:semiHidden="1" w:unhideWhenUsed="1"/>
-    <w:lsdException w:name="caption" w:uiPriority="35" w:semiHidden="1" w:unhideWhenUsed="1" w:qFormat="1"/>
+    <w:lsdException w:name="caption" w:semiHidden="1" w:uiPriority="35" w:unhideWhenUsed="1" w:qFormat="1"/>
     <w:lsdException w:name="table of figures" w:semiHidden="1" w:unhideWhenUsed="1"/>
     <w:lsdException w:name="envelope address" w:semiHidden="1" w:unhideWhenUsed="1"/>
     <w:lsdException w:name="envelope return" w:semiHidden="1" w:unhideWhenUsed="1"/>
@@ -4618,7 +4304,7 @@
     <w:lsdException w:name="Title" w:uiPriority="10" w:qFormat="1"/>
     <w:lsdException w:name="Closing" w:semiHidden="1" w:unhideWhenUsed="1"/>
     <w:lsdException w:name="Signature" w:semiHidden="1" w:unhideWhenUsed="1"/>
-    <w:lsdException w:name="Default Paragraph Font" w:uiPriority="1" w:semiHidden="1" w:unhideWhenUsed="1"/>
+    <w:lsdException w:name="Default Paragraph Font" w:semiHidden="1" w:uiPriority="1" w:unhideWhenUsed="1"/>
     <w:lsdException w:name="Body Text" w:semiHidden="1" w:unhideWhenUsed="1"/>
     <w:lsdException w:name="Body Text Indent" w:semiHidden="1" w:unhideWhenUsed="1"/>
     <w:lsdException w:name="List Continue" w:semiHidden="1" w:unhideWhenUsed="1"/>
@@ -4818,8 +4504,8 @@
     <w:lsdException w:name="Subtle Reference" w:uiPriority="31" w:qFormat="1"/>
     <w:lsdException w:name="Intense Reference" w:uiPriority="32" w:qFormat="1"/>
     <w:lsdException w:name="Book Title" w:uiPriority="33" w:qFormat="1"/>
-    <w:lsdException w:name="Bibliography" w:uiPriority="37" w:semiHidden="1" w:unhideWhenUsed="1"/>
-    <w:lsdException w:name="TOC Heading" w:uiPriority="39" w:semiHidden="1" w:unhideWhenUsed="1" w:qFormat="1"/>
+    <w:lsdException w:name="Bibliography" w:semiHidden="1" w:uiPriority="37" w:unhideWhenUsed="1"/>
+    <w:lsdException w:name="TOC Heading" w:semiHidden="1" w:uiPriority="39" w:unhideWhenUsed="1" w:qFormat="1"/>
     <w:lsdException w:name="Plain Table 1" w:uiPriority="41"/>
     <w:lsdException w:name="Plain Table 2" w:uiPriority="42"/>
     <w:lsdException w:name="Plain Table 3" w:uiPriority="43"/>
@@ -4930,7 +4616,7 @@
     <w:lsdException w:name="Unresolved Mention" w:semiHidden="1" w:unhideWhenUsed="1"/>
     <w:lsdException w:name="Smart Link" w:semiHidden="1" w:unhideWhenUsed="1"/>
   </w:latentStyles>
-  <w:style w:type="paragraph" w:styleId="Normal" w:default="1">
+  <w:style w:type="paragraph" w:default="1" w:styleId="Normal">
     <w:name w:val="Normal"/>
     <w:qFormat/>
   </w:style>
@@ -5047,13 +4733,13 @@
       <w:color w:val="666666"/>
     </w:rPr>
   </w:style>
-  <w:style w:type="character" w:styleId="DefaultParagraphFont" w:default="1">
+  <w:style w:type="character" w:default="1" w:styleId="DefaultParagraphFont">
     <w:name w:val="Default Paragraph Font"/>
     <w:uiPriority w:val="1"/>
     <w:semiHidden/>
     <w:unhideWhenUsed/>
   </w:style>
-  <w:style w:type="table" w:styleId="TableNormal" w:default="1">
+  <w:style w:type="table" w:default="1" w:styleId="TableNormal">
     <w:name w:val="Normal Table"/>
     <w:uiPriority w:val="99"/>
     <w:semiHidden/>
@@ -5068,7 +4754,7 @@
       </w:tblCellMar>
     </w:tblPr>
   </w:style>
-  <w:style w:type="numbering" w:styleId="NoList" w:default="1">
+  <w:style w:type="numbering" w:default="1" w:styleId="NoList">
     <w:name w:val="No List"/>
     <w:uiPriority w:val="99"/>
     <w:semiHidden/>
@@ -5139,14 +4825,59 @@
     </w:pPr>
     <w:tblPr>
       <w:tblBorders>
-        <w:top w:val="single" w:color="000000" w:themeColor="text1" w:sz="4" w:space="0"/>
-        <w:left w:val="single" w:color="000000" w:themeColor="text1" w:sz="4" w:space="0"/>
-        <w:bottom w:val="single" w:color="000000" w:themeColor="text1" w:sz="4" w:space="0"/>
-        <w:right w:val="single" w:color="000000" w:themeColor="text1" w:sz="4" w:space="0"/>
-        <w:insideH w:val="single" w:color="000000" w:themeColor="text1" w:sz="4" w:space="0"/>
-        <w:insideV w:val="single" w:color="000000" w:themeColor="text1" w:sz="4" w:space="0"/>
+        <w:top w:val="single" w:sz="4" w:space="0" w:color="000000" w:themeColor="text1"/>
+        <w:left w:val="single" w:sz="4" w:space="0" w:color="000000" w:themeColor="text1"/>
+        <w:bottom w:val="single" w:sz="4" w:space="0" w:color="000000" w:themeColor="text1"/>
+        <w:right w:val="single" w:sz="4" w:space="0" w:color="000000" w:themeColor="text1"/>
+        <w:insideH w:val="single" w:sz="4" w:space="0" w:color="000000" w:themeColor="text1"/>
+        <w:insideV w:val="single" w:sz="4" w:space="0" w:color="000000" w:themeColor="text1"/>
       </w:tblBorders>
     </w:tblPr>
+  </w:style>
+  <w:style w:type="paragraph" w:customStyle="1" w:styleId="BodyA">
+    <w:name w:val="Body A"/>
+    <w:rsid w:val="00F2795C"/>
+    <w:pPr>
+      <w:pBdr>
+        <w:top w:val="nil"/>
+        <w:left w:val="nil"/>
+        <w:bottom w:val="nil"/>
+        <w:right w:val="nil"/>
+        <w:between w:val="nil"/>
+        <w:bar w:val="nil"/>
+      </w:pBdr>
+    </w:pPr>
+    <w:rPr>
+      <w:rFonts w:eastAsia="Arial Unicode MS" w:cs="Arial Unicode MS"/>
+      <w:color w:val="000000"/>
+      <w:u w:color="000000"/>
+      <w:bdr w:val="nil"/>
+      <w:lang w:val="en-US" w:eastAsia="en-US"/>
+      <w14:textOutline w14:w="12700" w14:cap="flat" w14:cmpd="sng" w14:algn="ctr">
+        <w14:noFill/>
+        <w14:prstDash w14:val="solid"/>
+        <w14:miter w14:lim="400000"/>
+      </w14:textOutline>
+    </w:rPr>
+  </w:style>
+  <w:style w:type="character" w:customStyle="1" w:styleId="None">
+    <w:name w:val="None"/>
+    <w:rsid w:val="00F2795C"/>
+  </w:style>
+  <w:style w:type="character" w:customStyle="1" w:styleId="Hyperlink0">
+    <w:name w:val="Hyperlink.0"/>
+    <w:basedOn w:val="None"/>
+    <w:rsid w:val="00F2795C"/>
+    <w:rPr>
+      <w:rFonts w:ascii="Roboto" w:eastAsia="Roboto" w:hAnsi="Roboto" w:cs="Roboto"/>
+      <w:b/>
+      <w:bCs/>
+      <w:outline w:val="0"/>
+      <w:color w:val="0000FF"/>
+      <w:sz w:val="24"/>
+      <w:szCs w:val="24"/>
+      <w:u w:val="single" w:color="0000FF"/>
+    </w:rPr>
   </w:style>
 </w:styles>
 </file>

</xml_diff>

<commit_message>
added team content inventory
</commit_message>
<xml_diff>
--- a/documents/IA_ID.docx
+++ b/documents/IA_ID.docx
@@ -1,6 +1,6 @@
 
 <file path=word/document.xml><?xml version="1.0" encoding="utf-8"?>
-<w:document xmlns:wpc="http://schemas.microsoft.com/office/word/2010/wordprocessingCanvas" xmlns:cx="http://schemas.microsoft.com/office/drawing/2014/chartex" xmlns:cx1="http://schemas.microsoft.com/office/drawing/2015/9/8/chartex" xmlns:cx2="http://schemas.microsoft.com/office/drawing/2015/10/21/chartex" xmlns:cx3="http://schemas.microsoft.com/office/drawing/2016/5/9/chartex" xmlns:cx4="http://schemas.microsoft.com/office/drawing/2016/5/10/chartex" xmlns:cx5="http://schemas.microsoft.com/office/drawing/2016/5/11/chartex" xmlns:cx6="http://schemas.microsoft.com/office/drawing/2016/5/12/chartex" xmlns:cx7="http://schemas.microsoft.com/office/drawing/2016/5/13/chartex" xmlns:cx8="http://schemas.microsoft.com/office/drawing/2016/5/14/chartex" xmlns:mc="http://schemas.openxmlformats.org/markup-compatibility/2006" xmlns:aink="http://schemas.microsoft.com/office/drawing/2016/ink" xmlns:am3d="http://schemas.microsoft.com/office/drawing/2017/model3d" xmlns:o="urn:schemas-microsoft-com:office:office" xmlns:oel="http://schemas.microsoft.com/office/2019/extlst" xmlns:r="http://schemas.openxmlformats.org/officeDocument/2006/relationships" xmlns:m="http://schemas.openxmlformats.org/officeDocument/2006/math" xmlns:v="urn:schemas-microsoft-com:vml" xmlns:wp14="http://schemas.microsoft.com/office/word/2010/wordprocessingDrawing" xmlns:wp="http://schemas.openxmlformats.org/drawingml/2006/wordprocessingDrawing" xmlns:w10="urn:schemas-microsoft-com:office:word" xmlns:w="http://schemas.openxmlformats.org/wordprocessingml/2006/main" xmlns:w14="http://schemas.microsoft.com/office/word/2010/wordml" xmlns:w15="http://schemas.microsoft.com/office/word/2012/wordml" xmlns:w16cex="http://schemas.microsoft.com/office/word/2018/wordml/cex" xmlns:w16cid="http://schemas.microsoft.com/office/word/2016/wordml/cid" xmlns:w16="http://schemas.microsoft.com/office/word/2018/wordml" xmlns:w16du="http://schemas.microsoft.com/office/word/2023/wordml/word16du" xmlns:w16sdtdh="http://schemas.microsoft.com/office/word/2020/wordml/sdtdatahash" xmlns:w16sdtfl="http://schemas.microsoft.com/office/word/2024/wordml/sdtformatlock" xmlns:w16se="http://schemas.microsoft.com/office/word/2015/wordml/symex" xmlns:wpg="http://schemas.microsoft.com/office/word/2010/wordprocessingGroup" xmlns:wpi="http://schemas.microsoft.com/office/word/2010/wordprocessingInk" xmlns:wne="http://schemas.microsoft.com/office/word/2006/wordml" xmlns:wps="http://schemas.microsoft.com/office/word/2010/wordprocessingShape" xmlns:a="http://schemas.openxmlformats.org/drawingml/2006/main" xmlns:pic="http://schemas.openxmlformats.org/drawingml/2006/picture" xmlns:a14="http://schemas.microsoft.com/office/drawing/2010/main" mc:Ignorable="w14 w15 w16se w16cid w16 w16cex w16sdtdh w16sdtfl w16du wp14">
+<w:document xmlns:wpc="http://schemas.microsoft.com/office/word/2010/wordprocessingCanvas" xmlns:cx="http://schemas.microsoft.com/office/drawing/2014/chartex" xmlns:cx1="http://schemas.microsoft.com/office/drawing/2015/9/8/chartex" xmlns:cx2="http://schemas.microsoft.com/office/drawing/2015/10/21/chartex" xmlns:cx3="http://schemas.microsoft.com/office/drawing/2016/5/9/chartex" xmlns:cx4="http://schemas.microsoft.com/office/drawing/2016/5/10/chartex" xmlns:cx5="http://schemas.microsoft.com/office/drawing/2016/5/11/chartex" xmlns:cx6="http://schemas.microsoft.com/office/drawing/2016/5/12/chartex" xmlns:cx7="http://schemas.microsoft.com/office/drawing/2016/5/13/chartex" xmlns:cx8="http://schemas.microsoft.com/office/drawing/2016/5/14/chartex" xmlns:mc="http://schemas.openxmlformats.org/markup-compatibility/2006" xmlns:aink="http://schemas.microsoft.com/office/drawing/2016/ink" xmlns:am3d="http://schemas.microsoft.com/office/drawing/2017/model3d" xmlns:o="urn:schemas-microsoft-com:office:office" xmlns:oel="http://schemas.microsoft.com/office/2019/extlst" xmlns:r="http://schemas.openxmlformats.org/officeDocument/2006/relationships" xmlns:m="http://schemas.openxmlformats.org/officeDocument/2006/math" xmlns:v="urn:schemas-microsoft-com:vml" xmlns:wp14="http://schemas.microsoft.com/office/word/2010/wordprocessingDrawing" xmlns:wp="http://schemas.openxmlformats.org/drawingml/2006/wordprocessingDrawing" xmlns:w10="urn:schemas-microsoft-com:office:word" xmlns:w="http://schemas.openxmlformats.org/wordprocessingml/2006/main" xmlns:w14="http://schemas.microsoft.com/office/word/2010/wordml" xmlns:w15="http://schemas.microsoft.com/office/word/2012/wordml" xmlns:w16cex="http://schemas.microsoft.com/office/word/2018/wordml/cex" xmlns:w16cid="http://schemas.microsoft.com/office/word/2016/wordml/cid" xmlns:w16="http://schemas.microsoft.com/office/word/2018/wordml" xmlns:w16du="http://schemas.microsoft.com/office/word/2023/wordml/word16du" xmlns:w16sdtdh="http://schemas.microsoft.com/office/word/2020/wordml/sdtdatahash" xmlns:w16sdtfl="http://schemas.microsoft.com/office/word/2024/wordml/sdtformatlock" xmlns:w16se="http://schemas.microsoft.com/office/word/2015/wordml/symex" xmlns:wpg="http://schemas.microsoft.com/office/word/2010/wordprocessingGroup" xmlns:wpi="http://schemas.microsoft.com/office/word/2010/wordprocessingInk" xmlns:wne="http://schemas.microsoft.com/office/word/2006/wordml" xmlns:wps="http://schemas.microsoft.com/office/word/2010/wordprocessingShape" mc:Ignorable="w14 w15 w16se w16cid w16 w16cex w16sdtdh w16sdtfl w16du wp14">
   <w:body>
     <w:p>
       <w:pPr>
@@ -8,7 +8,7 @@
         <w:shd w:val="clear" w:color="auto" w:fill="F8F9FA"/>
         <w:jc w:val="center"/>
         <w:rPr>
-          <w:rFonts w:ascii="Roboto" w:hAnsi="Roboto" w:eastAsia="Roboto" w:cs="Roboto"/>
+          <w:rFonts w:ascii="Roboto" w:eastAsia="Roboto" w:hAnsi="Roboto" w:cs="Roboto"/>
           <w:color w:val="1D2125"/>
           <w:sz w:val="24"/>
           <w:szCs w:val="24"/>
@@ -17,7 +17,7 @@
       </w:pPr>
       <w:r>
         <w:rPr>
-          <w:rFonts w:ascii="Roboto" w:hAnsi="Roboto" w:eastAsia="Roboto" w:cs="Roboto"/>
+          <w:rFonts w:ascii="Roboto" w:eastAsia="Roboto" w:hAnsi="Roboto" w:cs="Roboto"/>
           <w:b/>
           <w:bCs/>
           <w:color w:val="1D2125"/>
@@ -34,7 +34,7 @@
         <w:shd w:val="clear" w:color="auto" w:fill="F8F9FA"/>
         <w:jc w:val="center"/>
         <w:rPr>
-          <w:rFonts w:ascii="Roboto" w:hAnsi="Roboto" w:eastAsia="Roboto" w:cs="Roboto"/>
+          <w:rFonts w:ascii="Roboto" w:eastAsia="Roboto" w:hAnsi="Roboto" w:cs="Roboto"/>
           <w:b/>
           <w:bCs/>
           <w:color w:val="1D2125"/>
@@ -45,7 +45,7 @@
       </w:pPr>
       <w:r>
         <w:rPr>
-          <w:rFonts w:ascii="Roboto" w:hAnsi="Roboto" w:eastAsia="Roboto" w:cs="Roboto"/>
+          <w:rFonts w:ascii="Roboto" w:eastAsia="Roboto" w:hAnsi="Roboto" w:cs="Roboto"/>
           <w:b/>
           <w:bCs/>
           <w:color w:val="1D2125"/>
@@ -62,7 +62,7 @@
         <w:shd w:val="clear" w:color="auto" w:fill="F8F9FA"/>
         <w:jc w:val="center"/>
         <w:rPr>
-          <w:rFonts w:ascii="Roboto" w:hAnsi="Roboto" w:eastAsia="Roboto" w:cs="Roboto"/>
+          <w:rFonts w:ascii="Roboto" w:eastAsia="Roboto" w:hAnsi="Roboto" w:cs="Roboto"/>
           <w:b/>
           <w:bCs/>
           <w:color w:val="1D2125"/>
@@ -73,7 +73,7 @@
       </w:pPr>
       <w:r>
         <w:rPr>
-          <w:rFonts w:ascii="Roboto" w:hAnsi="Roboto" w:eastAsia="Roboto" w:cs="Roboto"/>
+          <w:rFonts w:ascii="Roboto" w:eastAsia="Roboto" w:hAnsi="Roboto" w:cs="Roboto"/>
           <w:b/>
           <w:bCs/>
           <w:color w:val="1D2125"/>
@@ -90,7 +90,7 @@
         <w:shd w:val="clear" w:color="auto" w:fill="F8F9FA"/>
         <w:jc w:val="center"/>
         <w:rPr>
-          <w:rFonts w:ascii="Roboto" w:hAnsi="Roboto" w:eastAsia="Roboto" w:cs="Roboto"/>
+          <w:rFonts w:ascii="Roboto" w:eastAsia="Roboto" w:hAnsi="Roboto" w:cs="Roboto"/>
           <w:b/>
           <w:bCs/>
           <w:color w:val="1D2125"/>
@@ -101,7 +101,7 @@
       </w:pPr>
       <w:r>
         <w:rPr>
-          <w:rFonts w:ascii="Roboto" w:hAnsi="Roboto" w:eastAsia="Roboto" w:cs="Roboto"/>
+          <w:rFonts w:ascii="Roboto" w:eastAsia="Roboto" w:hAnsi="Roboto" w:cs="Roboto"/>
           <w:b/>
           <w:bCs/>
           <w:color w:val="1D2125"/>
@@ -119,7 +119,7 @@
         <w:shd w:val="clear" w:color="auto" w:fill="F8F9FA"/>
         <w:jc w:val="center"/>
         <w:rPr>
-          <w:rFonts w:ascii="Roboto" w:hAnsi="Roboto" w:eastAsia="Roboto" w:cs="Roboto"/>
+          <w:rFonts w:ascii="Roboto" w:eastAsia="Roboto" w:hAnsi="Roboto" w:cs="Roboto"/>
           <w:b/>
           <w:bCs/>
           <w:color w:val="1D2125"/>
@@ -130,7 +130,7 @@
       </w:pPr>
       <w:r>
         <w:rPr>
-          <w:rFonts w:ascii="Roboto" w:hAnsi="Roboto" w:eastAsia="Roboto" w:cs="Roboto"/>
+          <w:rFonts w:ascii="Roboto" w:eastAsia="Roboto" w:hAnsi="Roboto" w:cs="Roboto"/>
           <w:b/>
           <w:bCs/>
           <w:color w:val="1D2125"/>
@@ -147,7 +147,7 @@
         <w:shd w:val="clear" w:color="auto" w:fill="F8F9FA"/>
         <w:jc w:val="center"/>
         <w:rPr>
-          <w:rFonts w:ascii="Roboto" w:hAnsi="Roboto" w:eastAsia="Roboto" w:cs="Roboto"/>
+          <w:rFonts w:ascii="Roboto" w:eastAsia="Roboto" w:hAnsi="Roboto" w:cs="Roboto"/>
           <w:b/>
           <w:bCs/>
           <w:color w:val="1D2125"/>
@@ -158,7 +158,7 @@
       </w:pPr>
       <w:r>
         <w:rPr>
-          <w:rFonts w:ascii="Roboto" w:hAnsi="Roboto" w:eastAsia="Roboto" w:cs="Roboto"/>
+          <w:rFonts w:ascii="Roboto" w:eastAsia="Roboto" w:hAnsi="Roboto" w:cs="Roboto"/>
           <w:b/>
           <w:bCs/>
           <w:color w:val="1D2125"/>
@@ -174,7 +174,7 @@
         <w:pStyle w:val="Body"/>
         <w:shd w:val="clear" w:color="auto" w:fill="F8F9FA"/>
         <w:rPr>
-          <w:rFonts w:ascii="Roboto" w:hAnsi="Roboto" w:eastAsia="Roboto" w:cs="Roboto"/>
+          <w:rFonts w:ascii="Roboto" w:eastAsia="Roboto" w:hAnsi="Roboto" w:cs="Roboto"/>
           <w:b/>
           <w:bCs/>
           <w:color w:val="1D2125"/>
@@ -185,7 +185,7 @@
       </w:pPr>
       <w:r>
         <w:rPr>
-          <w:rFonts w:ascii="Roboto" w:hAnsi="Roboto" w:eastAsia="Roboto" w:cs="Roboto"/>
+          <w:rFonts w:ascii="Roboto" w:eastAsia="Roboto" w:hAnsi="Roboto" w:cs="Roboto"/>
           <w:b/>
           <w:bCs/>
           <w:color w:val="1D2125"/>
@@ -201,7 +201,7 @@
         <w:pStyle w:val="Body"/>
         <w:shd w:val="clear" w:color="auto" w:fill="F8F9FA"/>
         <w:rPr>
-          <w:rFonts w:ascii="Roboto" w:hAnsi="Roboto" w:eastAsia="Roboto" w:cs="Roboto"/>
+          <w:rFonts w:ascii="Roboto" w:eastAsia="Roboto" w:hAnsi="Roboto" w:cs="Roboto"/>
           <w:b/>
           <w:bCs/>
           <w:color w:val="1D2125"/>
@@ -212,7 +212,7 @@
       </w:pPr>
       <w:r>
         <w:rPr>
-          <w:rFonts w:ascii="Roboto" w:hAnsi="Roboto" w:eastAsia="Roboto" w:cs="Roboto"/>
+          <w:rFonts w:ascii="Roboto" w:eastAsia="Roboto" w:hAnsi="Roboto" w:cs="Roboto"/>
           <w:b/>
           <w:bCs/>
           <w:color w:val="1D2125"/>
@@ -229,7 +229,7 @@
         <w:pStyle w:val="BodyA"/>
         <w:rPr>
           <w:rStyle w:val="None"/>
-          <w:rFonts w:ascii="Roboto" w:hAnsi="Roboto" w:eastAsia="Roboto" w:cs="Roboto"/>
+          <w:rFonts w:ascii="Roboto" w:eastAsia="Roboto" w:hAnsi="Roboto" w:cs="Roboto"/>
           <w:b/>
           <w:bCs/>
           <w:color w:val="1D2125"/>
@@ -240,7 +240,7 @@
       </w:pPr>
       <w:r>
         <w:rPr>
-          <w:rFonts w:ascii="Roboto" w:hAnsi="Roboto" w:eastAsia="Roboto" w:cs="Roboto"/>
+          <w:rFonts w:ascii="Roboto" w:eastAsia="Roboto" w:hAnsi="Roboto" w:cs="Roboto"/>
           <w:b/>
           <w:bCs/>
           <w:color w:val="1D2125"/>
@@ -250,7 +250,7 @@
         </w:rPr>
         <w:t xml:space="preserve">Trello board URL: : </w:t>
       </w:r>
-      <w:hyperlink w:history="1" r:id="rId7">
+      <w:hyperlink r:id="rId7" w:history="1">
         <w:r>
           <w:rPr>
             <w:rStyle w:val="Hyperlink0"/>
@@ -265,7 +265,7 @@
         <w:shd w:val="clear" w:color="auto" w:fill="F8F9FA"/>
         <w:rPr>
           <w:rStyle w:val="None"/>
-          <w:rFonts w:ascii="Roboto" w:hAnsi="Roboto" w:eastAsia="Roboto" w:cs="Roboto"/>
+          <w:rFonts w:ascii="Roboto" w:eastAsia="Roboto" w:hAnsi="Roboto" w:cs="Roboto"/>
           <w:b/>
           <w:bCs/>
           <w:color w:val="1D2125"/>
@@ -277,7 +277,7 @@
       <w:r>
         <w:rPr>
           <w:rStyle w:val="None"/>
-          <w:rFonts w:ascii="Roboto" w:hAnsi="Roboto" w:eastAsia="Roboto" w:cs="Roboto"/>
+          <w:rFonts w:ascii="Roboto" w:eastAsia="Roboto" w:hAnsi="Roboto" w:cs="Roboto"/>
           <w:b/>
           <w:bCs/>
           <w:color w:val="1D2125"/>
@@ -287,7 +287,7 @@
         </w:rPr>
         <w:t xml:space="preserve">Github repo URL: </w:t>
       </w:r>
-      <w:hyperlink w:history="1" r:id="rId8">
+      <w:hyperlink r:id="rId8" w:history="1">
         <w:r>
           <w:rPr>
             <w:rStyle w:val="Hyperlink0"/>
@@ -317,12 +317,12 @@
         <w:tblW w:w="3585" w:type="dxa"/>
         <w:tblInd w:w="108" w:type="dxa"/>
         <w:tblBorders>
-          <w:top w:val="single" w:color="FFFFFF" w:sz="8" w:space="0"/>
-          <w:left w:val="single" w:color="FFFFFF" w:sz="8" w:space="0"/>
-          <w:bottom w:val="single" w:color="FFFFFF" w:sz="8" w:space="0"/>
-          <w:right w:val="single" w:color="FFFFFF" w:sz="8" w:space="0"/>
-          <w:insideH w:val="single" w:color="FFFFFF" w:sz="8" w:space="0"/>
-          <w:insideV w:val="single" w:color="FFFFFF" w:sz="8" w:space="0"/>
+          <w:top w:val="single" w:sz="8" w:space="0" w:color="FFFFFF"/>
+          <w:left w:val="single" w:sz="8" w:space="0" w:color="FFFFFF"/>
+          <w:bottom w:val="single" w:sz="8" w:space="0" w:color="FFFFFF"/>
+          <w:right w:val="single" w:sz="8" w:space="0" w:color="FFFFFF"/>
+          <w:insideH w:val="single" w:sz="8" w:space="0" w:color="FFFFFF"/>
+          <w:insideV w:val="single" w:sz="8" w:space="0" w:color="FFFFFF"/>
         </w:tblBorders>
         <w:shd w:val="clear" w:color="auto" w:fill="CED7E7"/>
         <w:tblLayout w:type="fixed"/>
@@ -340,10 +340,10 @@
           <w:tcPr>
             <w:tcW w:w="525" w:type="dxa"/>
             <w:tcBorders>
-              <w:top w:val="single" w:color="000000" w:sz="6" w:space="0"/>
-              <w:left w:val="single" w:color="000000" w:sz="6" w:space="0"/>
-              <w:bottom w:val="single" w:color="000000" w:sz="4" w:space="0"/>
-              <w:right w:val="single" w:color="000000" w:sz="4" w:space="0"/>
+              <w:top w:val="single" w:sz="6" w:space="0" w:color="000000"/>
+              <w:left w:val="single" w:sz="6" w:space="0" w:color="000000"/>
+              <w:bottom w:val="single" w:sz="4" w:space="0" w:color="000000"/>
+              <w:right w:val="single" w:sz="4" w:space="0" w:color="000000"/>
             </w:tcBorders>
             <w:tcMar>
               <w:top w:w="80" w:type="dxa"/>
@@ -370,10 +370,10 @@
           <w:tcPr>
             <w:tcW w:w="3060" w:type="dxa"/>
             <w:tcBorders>
-              <w:top w:val="single" w:color="000000" w:sz="6" w:space="0"/>
-              <w:left w:val="single" w:color="000000" w:sz="4" w:space="0"/>
-              <w:bottom w:val="single" w:color="000000" w:sz="4" w:space="0"/>
-              <w:right w:val="single" w:color="000000" w:sz="6" w:space="0"/>
+              <w:top w:val="single" w:sz="6" w:space="0" w:color="000000"/>
+              <w:left w:val="single" w:sz="4" w:space="0" w:color="000000"/>
+              <w:bottom w:val="single" w:sz="4" w:space="0" w:color="000000"/>
+              <w:right w:val="single" w:sz="6" w:space="0" w:color="000000"/>
             </w:tcBorders>
             <w:tcMar>
               <w:top w:w="80" w:type="dxa"/>
@@ -406,10 +406,10 @@
           <w:tcPr>
             <w:tcW w:w="525" w:type="dxa"/>
             <w:tcBorders>
-              <w:top w:val="single" w:color="000000" w:sz="4" w:space="0"/>
-              <w:left w:val="single" w:color="000000" w:sz="6" w:space="0"/>
-              <w:bottom w:val="single" w:color="000000" w:sz="4" w:space="0"/>
-              <w:right w:val="single" w:color="000000" w:sz="4" w:space="0"/>
+              <w:top w:val="single" w:sz="4" w:space="0" w:color="000000"/>
+              <w:left w:val="single" w:sz="6" w:space="0" w:color="000000"/>
+              <w:bottom w:val="single" w:sz="4" w:space="0" w:color="000000"/>
+              <w:right w:val="single" w:sz="4" w:space="0" w:color="000000"/>
             </w:tcBorders>
             <w:tcMar>
               <w:top w:w="80" w:type="dxa"/>
@@ -435,10 +435,10 @@
           <w:tcPr>
             <w:tcW w:w="3060" w:type="dxa"/>
             <w:tcBorders>
-              <w:top w:val="single" w:color="000000" w:sz="4" w:space="0"/>
-              <w:left w:val="single" w:color="000000" w:sz="4" w:space="0"/>
-              <w:bottom w:val="single" w:color="000000" w:sz="4" w:space="0"/>
-              <w:right w:val="single" w:color="000000" w:sz="6" w:space="0"/>
+              <w:top w:val="single" w:sz="4" w:space="0" w:color="000000"/>
+              <w:left w:val="single" w:sz="4" w:space="0" w:color="000000"/>
+              <w:bottom w:val="single" w:sz="4" w:space="0" w:color="000000"/>
+              <w:right w:val="single" w:sz="6" w:space="0" w:color="000000"/>
             </w:tcBorders>
             <w:tcMar>
               <w:top w:w="80" w:type="dxa"/>
@@ -469,10 +469,10 @@
           <w:tcPr>
             <w:tcW w:w="525" w:type="dxa"/>
             <w:tcBorders>
-              <w:top w:val="single" w:color="000000" w:sz="4" w:space="0"/>
-              <w:left w:val="single" w:color="000000" w:sz="6" w:space="0"/>
-              <w:bottom w:val="single" w:color="000000" w:sz="4" w:space="0"/>
-              <w:right w:val="single" w:color="000000" w:sz="4" w:space="0"/>
+              <w:top w:val="single" w:sz="4" w:space="0" w:color="000000"/>
+              <w:left w:val="single" w:sz="6" w:space="0" w:color="000000"/>
+              <w:bottom w:val="single" w:sz="4" w:space="0" w:color="000000"/>
+              <w:right w:val="single" w:sz="4" w:space="0" w:color="000000"/>
             </w:tcBorders>
             <w:tcMar>
               <w:top w:w="80" w:type="dxa"/>
@@ -498,10 +498,10 @@
           <w:tcPr>
             <w:tcW w:w="3060" w:type="dxa"/>
             <w:tcBorders>
-              <w:top w:val="single" w:color="000000" w:sz="4" w:space="0"/>
-              <w:left w:val="single" w:color="000000" w:sz="4" w:space="0"/>
-              <w:bottom w:val="single" w:color="000000" w:sz="4" w:space="0"/>
-              <w:right w:val="single" w:color="000000" w:sz="6" w:space="0"/>
+              <w:top w:val="single" w:sz="4" w:space="0" w:color="000000"/>
+              <w:left w:val="single" w:sz="4" w:space="0" w:color="000000"/>
+              <w:bottom w:val="single" w:sz="4" w:space="0" w:color="000000"/>
+              <w:right w:val="single" w:sz="6" w:space="0" w:color="000000"/>
             </w:tcBorders>
             <w:tcMar>
               <w:top w:w="80" w:type="dxa"/>
@@ -532,10 +532,10 @@
           <w:tcPr>
             <w:tcW w:w="525" w:type="dxa"/>
             <w:tcBorders>
-              <w:top w:val="single" w:color="000000" w:sz="4" w:space="0"/>
-              <w:left w:val="single" w:color="000000" w:sz="6" w:space="0"/>
-              <w:bottom w:val="single" w:color="000000" w:sz="4" w:space="0"/>
-              <w:right w:val="single" w:color="000000" w:sz="4" w:space="0"/>
+              <w:top w:val="single" w:sz="4" w:space="0" w:color="000000"/>
+              <w:left w:val="single" w:sz="6" w:space="0" w:color="000000"/>
+              <w:bottom w:val="single" w:sz="4" w:space="0" w:color="000000"/>
+              <w:right w:val="single" w:sz="4" w:space="0" w:color="000000"/>
             </w:tcBorders>
             <w:tcMar>
               <w:top w:w="80" w:type="dxa"/>
@@ -561,10 +561,10 @@
           <w:tcPr>
             <w:tcW w:w="3060" w:type="dxa"/>
             <w:tcBorders>
-              <w:top w:val="single" w:color="000000" w:sz="4" w:space="0"/>
-              <w:left w:val="single" w:color="000000" w:sz="4" w:space="0"/>
-              <w:bottom w:val="single" w:color="000000" w:sz="4" w:space="0"/>
-              <w:right w:val="single" w:color="000000" w:sz="6" w:space="0"/>
+              <w:top w:val="single" w:sz="4" w:space="0" w:color="000000"/>
+              <w:left w:val="single" w:sz="4" w:space="0" w:color="000000"/>
+              <w:bottom w:val="single" w:sz="4" w:space="0" w:color="000000"/>
+              <w:right w:val="single" w:sz="6" w:space="0" w:color="000000"/>
             </w:tcBorders>
             <w:tcMar>
               <w:top w:w="80" w:type="dxa"/>
@@ -600,10 +600,10 @@
           <w:tcPr>
             <w:tcW w:w="525" w:type="dxa"/>
             <w:tcBorders>
-              <w:top w:val="single" w:color="000000" w:sz="4" w:space="0"/>
-              <w:left w:val="single" w:color="000000" w:sz="6" w:space="0"/>
-              <w:bottom w:val="single" w:color="000000" w:sz="6" w:space="0"/>
-              <w:right w:val="single" w:color="000000" w:sz="4" w:space="0"/>
+              <w:top w:val="single" w:sz="4" w:space="0" w:color="000000"/>
+              <w:left w:val="single" w:sz="6" w:space="0" w:color="000000"/>
+              <w:bottom w:val="single" w:sz="6" w:space="0" w:color="000000"/>
+              <w:right w:val="single" w:sz="4" w:space="0" w:color="000000"/>
             </w:tcBorders>
             <w:tcMar>
               <w:top w:w="80" w:type="dxa"/>
@@ -629,10 +629,10 @@
           <w:tcPr>
             <w:tcW w:w="3060" w:type="dxa"/>
             <w:tcBorders>
-              <w:top w:val="single" w:color="000000" w:sz="4" w:space="0"/>
-              <w:left w:val="single" w:color="000000" w:sz="4" w:space="0"/>
-              <w:bottom w:val="single" w:color="000000" w:sz="6" w:space="0"/>
-              <w:right w:val="single" w:color="000000" w:sz="6" w:space="0"/>
+              <w:top w:val="single" w:sz="4" w:space="0" w:color="000000"/>
+              <w:left w:val="single" w:sz="4" w:space="0" w:color="000000"/>
+              <w:bottom w:val="single" w:sz="6" w:space="0" w:color="000000"/>
+              <w:right w:val="single" w:sz="6" w:space="0" w:color="000000"/>
             </w:tcBorders>
             <w:tcMar>
               <w:top w:w="80" w:type="dxa"/>
@@ -670,7 +670,7 @@
         <w:shd w:val="clear" w:color="auto" w:fill="F8F9FA"/>
         <w:rPr>
           <w:rStyle w:val="None"/>
-          <w:rFonts w:ascii="Roboto" w:hAnsi="Roboto" w:eastAsia="Roboto" w:cs="Roboto"/>
+          <w:rFonts w:ascii="Roboto" w:eastAsia="Roboto" w:hAnsi="Roboto" w:cs="Roboto"/>
           <w:b/>
           <w:bCs/>
           <w:color w:val="1D2125"/>
@@ -682,7 +682,7 @@
       <w:r>
         <w:rPr>
           <w:rStyle w:val="None"/>
-          <w:rFonts w:ascii="Roboto" w:hAnsi="Roboto" w:eastAsia="Roboto" w:cs="Roboto"/>
+          <w:rFonts w:ascii="Roboto" w:eastAsia="Roboto" w:hAnsi="Roboto" w:cs="Roboto"/>
           <w:b/>
           <w:bCs/>
           <w:color w:val="1D2125"/>
@@ -698,12 +698,12 @@
         <w:tblW w:w="9360" w:type="dxa"/>
         <w:tblInd w:w="108" w:type="dxa"/>
         <w:tblBorders>
-          <w:top w:val="single" w:color="FFFFFF" w:sz="8" w:space="0"/>
-          <w:left w:val="single" w:color="FFFFFF" w:sz="8" w:space="0"/>
-          <w:bottom w:val="single" w:color="FFFFFF" w:sz="8" w:space="0"/>
-          <w:right w:val="single" w:color="FFFFFF" w:sz="8" w:space="0"/>
-          <w:insideH w:val="single" w:color="FFFFFF" w:sz="8" w:space="0"/>
-          <w:insideV w:val="single" w:color="FFFFFF" w:sz="8" w:space="0"/>
+          <w:top w:val="single" w:sz="8" w:space="0" w:color="FFFFFF"/>
+          <w:left w:val="single" w:sz="8" w:space="0" w:color="FFFFFF"/>
+          <w:bottom w:val="single" w:sz="8" w:space="0" w:color="FFFFFF"/>
+          <w:right w:val="single" w:sz="8" w:space="0" w:color="FFFFFF"/>
+          <w:insideH w:val="single" w:sz="8" w:space="0" w:color="FFFFFF"/>
+          <w:insideV w:val="single" w:sz="8" w:space="0" w:color="FFFFFF"/>
         </w:tblBorders>
         <w:shd w:val="clear" w:color="auto" w:fill="CED7E7"/>
         <w:tblLayout w:type="fixed"/>
@@ -721,10 +721,10 @@
           <w:tcPr>
             <w:tcW w:w="9005" w:type="dxa"/>
             <w:tcBorders>
-              <w:top w:val="single" w:color="000000" w:themeColor="text1" w:sz="4" w:space="0"/>
-              <w:left w:val="single" w:color="000000" w:themeColor="text1" w:sz="4" w:space="0"/>
-              <w:bottom w:val="single" w:color="000000" w:themeColor="text1" w:sz="4" w:space="0"/>
-              <w:right w:val="single" w:color="000000" w:themeColor="text1" w:sz="4" w:space="0"/>
+              <w:top w:val="single" w:sz="4" w:space="0" w:color="000000" w:themeColor="text1"/>
+              <w:left w:val="single" w:sz="4" w:space="0" w:color="000000" w:themeColor="text1"/>
+              <w:bottom w:val="single" w:sz="4" w:space="0" w:color="000000" w:themeColor="text1"/>
+              <w:right w:val="single" w:sz="4" w:space="0" w:color="000000" w:themeColor="text1"/>
             </w:tcBorders>
             <w:tcMar>
               <w:top w:w="80" w:type="dxa"/>
@@ -741,7 +741,7 @@
             <w:r>
               <w:rPr>
                 <w:rStyle w:val="None"/>
-                <w:rFonts w:ascii="Roboto" w:hAnsi="Roboto" w:eastAsia="Roboto" w:cs="Roboto"/>
+                <w:rFonts w:ascii="Roboto" w:eastAsia="Roboto" w:hAnsi="Roboto" w:cs="Roboto"/>
                 <w:b/>
                 <w:bCs/>
                 <w:color w:val="1D2125"/>
@@ -757,10 +757,10 @@
           <w:tcPr>
             <w:tcW w:w="355" w:type="dxa"/>
             <w:tcBorders>
-              <w:top w:val="single" w:color="000000" w:themeColor="text1" w:sz="4" w:space="0"/>
-              <w:left w:val="single" w:color="000000" w:themeColor="text1" w:sz="4" w:space="0"/>
-              <w:bottom w:val="single" w:color="000000" w:themeColor="text1" w:sz="4" w:space="0"/>
-              <w:right w:val="single" w:color="000000" w:themeColor="text1" w:sz="4" w:space="0"/>
+              <w:top w:val="single" w:sz="4" w:space="0" w:color="000000" w:themeColor="text1"/>
+              <w:left w:val="single" w:sz="4" w:space="0" w:color="000000" w:themeColor="text1"/>
+              <w:bottom w:val="single" w:sz="4" w:space="0" w:color="000000" w:themeColor="text1"/>
+              <w:right w:val="single" w:sz="4" w:space="0" w:color="000000" w:themeColor="text1"/>
             </w:tcBorders>
             <w:tcMar>
               <w:top w:w="80" w:type="dxa"/>
@@ -780,10 +780,10 @@
           <w:tcPr>
             <w:tcW w:w="9005" w:type="dxa"/>
             <w:tcBorders>
-              <w:top w:val="single" w:color="000000" w:themeColor="text1" w:sz="4" w:space="0"/>
-              <w:left w:val="single" w:color="000000" w:themeColor="text1" w:sz="4" w:space="0"/>
-              <w:bottom w:val="single" w:color="000000" w:themeColor="text1" w:sz="4" w:space="0"/>
-              <w:right w:val="single" w:color="000000" w:themeColor="text1" w:sz="4" w:space="0"/>
+              <w:top w:val="single" w:sz="4" w:space="0" w:color="000000" w:themeColor="text1"/>
+              <w:left w:val="single" w:sz="4" w:space="0" w:color="000000" w:themeColor="text1"/>
+              <w:bottom w:val="single" w:sz="4" w:space="0" w:color="000000" w:themeColor="text1"/>
+              <w:right w:val="single" w:sz="4" w:space="0" w:color="000000" w:themeColor="text1"/>
             </w:tcBorders>
             <w:tcMar>
               <w:top w:w="80" w:type="dxa"/>
@@ -801,7 +801,7 @@
             <w:r>
               <w:rPr>
                 <w:rStyle w:val="None"/>
-                <w:rFonts w:ascii="Roboto" w:hAnsi="Roboto" w:eastAsia="Roboto" w:cs="Roboto"/>
+                <w:rFonts w:ascii="Roboto" w:eastAsia="Roboto" w:hAnsi="Roboto" w:cs="Roboto"/>
                 <w:b/>
                 <w:bCs/>
                 <w:color w:val="1D2125"/>
@@ -817,8 +817,8 @@
           <w:tcPr>
             <w:tcW w:w="355" w:type="dxa"/>
             <w:tcBorders>
-              <w:top w:val="single" w:color="000000" w:themeColor="text1" w:sz="4" w:space="0"/>
-              <w:left w:val="single" w:color="000000" w:themeColor="text1" w:sz="4" w:space="0"/>
+              <w:top w:val="single" w:sz="4" w:space="0" w:color="000000" w:themeColor="text1"/>
+              <w:left w:val="single" w:sz="4" w:space="0" w:color="000000" w:themeColor="text1"/>
               <w:bottom w:val="nil"/>
               <w:right w:val="nil"/>
             </w:tcBorders>
@@ -840,10 +840,10 @@
           <w:tcPr>
             <w:tcW w:w="9005" w:type="dxa"/>
             <w:tcBorders>
-              <w:top w:val="single" w:color="000000" w:themeColor="text1" w:sz="4" w:space="0"/>
-              <w:left w:val="single" w:color="000000" w:themeColor="text1" w:sz="4" w:space="0"/>
-              <w:bottom w:val="single" w:color="000000" w:themeColor="text1" w:sz="4" w:space="0"/>
-              <w:right w:val="single" w:color="000000" w:themeColor="text1" w:sz="4" w:space="0"/>
+              <w:top w:val="single" w:sz="4" w:space="0" w:color="000000" w:themeColor="text1"/>
+              <w:left w:val="single" w:sz="4" w:space="0" w:color="000000" w:themeColor="text1"/>
+              <w:bottom w:val="single" w:sz="4" w:space="0" w:color="000000" w:themeColor="text1"/>
+              <w:right w:val="single" w:sz="4" w:space="0" w:color="000000" w:themeColor="text1"/>
             </w:tcBorders>
             <w:tcMar>
               <w:top w:w="80" w:type="dxa"/>
@@ -858,7 +858,7 @@
               <w:spacing w:line="240" w:lineRule="auto"/>
               <w:rPr>
                 <w:rStyle w:val="None"/>
-                <w:rFonts w:ascii="Roboto" w:hAnsi="Roboto" w:eastAsia="Roboto" w:cs="Roboto"/>
+                <w:rFonts w:ascii="Roboto" w:eastAsia="Roboto" w:hAnsi="Roboto" w:cs="Roboto"/>
                 <w:b/>
                 <w:bCs/>
                 <w:color w:val="1D2125"/>
@@ -870,7 +870,7 @@
             <w:r>
               <w:rPr>
                 <w:rStyle w:val="None"/>
-                <w:rFonts w:ascii="Roboto" w:hAnsi="Roboto" w:eastAsia="Roboto" w:cs="Roboto"/>
+                <w:rFonts w:ascii="Roboto" w:eastAsia="Roboto" w:hAnsi="Roboto" w:cs="Roboto"/>
                 <w:b/>
                 <w:bCs/>
                 <w:color w:val="1D2125"/>
@@ -887,17 +887,17 @@
               <w:spacing w:line="240" w:lineRule="auto"/>
               <w:rPr>
                 <w:rStyle w:val="None"/>
-                <w:rFonts w:ascii="Roboto" w:hAnsi="Roboto" w:eastAsia="Roboto" w:cs="Roboto"/>
-                <w:color w:val="1D2125"/>
-                <w:sz w:val="24"/>
-                <w:szCs w:val="24"/>
-                <w:u w:color="1D2125"/>
-              </w:rPr>
-            </w:pPr>
-            <w:r>
-              <w:rPr>
-                <w:rStyle w:val="None"/>
-                <w:rFonts w:ascii="Roboto" w:hAnsi="Roboto" w:eastAsia="Roboto" w:cs="Roboto"/>
+                <w:rFonts w:ascii="Roboto" w:eastAsia="Roboto" w:hAnsi="Roboto" w:cs="Roboto"/>
+                <w:color w:val="1D2125"/>
+                <w:sz w:val="24"/>
+                <w:szCs w:val="24"/>
+                <w:u w:color="1D2125"/>
+              </w:rPr>
+            </w:pPr>
+            <w:r>
+              <w:rPr>
+                <w:rStyle w:val="None"/>
+                <w:rFonts w:ascii="Roboto" w:eastAsia="Roboto" w:hAnsi="Roboto" w:cs="Roboto"/>
                 <w:color w:val="1D2125"/>
                 <w:sz w:val="24"/>
                 <w:szCs w:val="24"/>
@@ -915,7 +915,7 @@
             <w:r>
               <w:rPr>
                 <w:rStyle w:val="None"/>
-                <w:rFonts w:ascii="Roboto" w:hAnsi="Roboto" w:eastAsia="Roboto" w:cs="Roboto"/>
+                <w:rFonts w:ascii="Roboto" w:eastAsia="Roboto" w:hAnsi="Roboto" w:cs="Roboto"/>
                 <w:b/>
                 <w:bCs/>
                 <w:color w:val="1D2125"/>
@@ -935,7 +935,7 @@
             <w:r>
               <w:rPr>
                 <w:rStyle w:val="None"/>
-                <w:rFonts w:ascii="Roboto" w:hAnsi="Roboto" w:eastAsia="Roboto" w:cs="Roboto"/>
+                <w:rFonts w:ascii="Roboto" w:eastAsia="Roboto" w:hAnsi="Roboto" w:cs="Roboto"/>
                 <w:color w:val="1D2125"/>
                 <w:sz w:val="24"/>
                 <w:szCs w:val="24"/>
@@ -953,7 +953,7 @@
             <w:r>
               <w:rPr>
                 <w:rStyle w:val="None"/>
-                <w:rFonts w:ascii="Roboto" w:hAnsi="Roboto" w:eastAsia="Roboto" w:cs="Roboto"/>
+                <w:rFonts w:ascii="Roboto" w:eastAsia="Roboto" w:hAnsi="Roboto" w:cs="Roboto"/>
                 <w:b/>
                 <w:bCs/>
                 <w:color w:val="1D2125"/>
@@ -970,17 +970,17 @@
               <w:spacing w:line="240" w:lineRule="auto"/>
               <w:rPr>
                 <w:rStyle w:val="None"/>
-                <w:rFonts w:ascii="Roboto" w:hAnsi="Roboto" w:eastAsia="Roboto" w:cs="Roboto"/>
-                <w:color w:val="1D2125"/>
-                <w:sz w:val="24"/>
-                <w:szCs w:val="24"/>
-                <w:u w:color="1D2125"/>
-              </w:rPr>
-            </w:pPr>
-            <w:r>
-              <w:rPr>
-                <w:rStyle w:val="None"/>
-                <w:rFonts w:ascii="Roboto" w:hAnsi="Roboto" w:eastAsia="Roboto" w:cs="Roboto"/>
+                <w:rFonts w:ascii="Roboto" w:eastAsia="Roboto" w:hAnsi="Roboto" w:cs="Roboto"/>
+                <w:color w:val="1D2125"/>
+                <w:sz w:val="24"/>
+                <w:szCs w:val="24"/>
+                <w:u w:color="1D2125"/>
+              </w:rPr>
+            </w:pPr>
+            <w:r>
+              <w:rPr>
+                <w:rStyle w:val="None"/>
+                <w:rFonts w:ascii="Roboto" w:eastAsia="Roboto" w:hAnsi="Roboto" w:cs="Roboto"/>
                 <w:color w:val="1D2125"/>
                 <w:sz w:val="24"/>
                 <w:szCs w:val="24"/>
@@ -995,7 +995,7 @@
               <w:spacing w:line="240" w:lineRule="auto"/>
               <w:rPr>
                 <w:rStyle w:val="None"/>
-                <w:rFonts w:ascii="Roboto" w:hAnsi="Roboto" w:eastAsia="Roboto" w:cs="Roboto"/>
+                <w:rFonts w:ascii="Roboto" w:eastAsia="Roboto" w:hAnsi="Roboto" w:cs="Roboto"/>
                 <w:b/>
                 <w:bCs/>
                 <w:color w:val="1D2125"/>
@@ -1007,7 +1007,7 @@
             <w:r>
               <w:rPr>
                 <w:rStyle w:val="None"/>
-                <w:rFonts w:ascii="Roboto" w:hAnsi="Roboto" w:eastAsia="Roboto" w:cs="Roboto"/>
+                <w:rFonts w:ascii="Roboto" w:eastAsia="Roboto" w:hAnsi="Roboto" w:cs="Roboto"/>
                 <w:b/>
                 <w:bCs/>
                 <w:color w:val="1D2125"/>
@@ -1024,7 +1024,7 @@
               <w:spacing w:line="240" w:lineRule="auto"/>
               <w:rPr>
                 <w:rStyle w:val="None"/>
-                <w:rFonts w:ascii="Roboto" w:hAnsi="Roboto" w:eastAsia="Roboto" w:cs="Roboto"/>
+                <w:rFonts w:ascii="Roboto" w:eastAsia="Roboto" w:hAnsi="Roboto" w:cs="Roboto"/>
                 <w:b/>
                 <w:bCs/>
                 <w:color w:val="1D2125"/>
@@ -1036,7 +1036,7 @@
             <w:r>
               <w:rPr>
                 <w:rStyle w:val="None"/>
-                <w:rFonts w:ascii="Roboto" w:hAnsi="Roboto" w:eastAsia="Roboto" w:cs="Roboto"/>
+                <w:rFonts w:ascii="Roboto" w:eastAsia="Roboto" w:hAnsi="Roboto" w:cs="Roboto"/>
                 <w:color w:val="1D2125"/>
                 <w:sz w:val="24"/>
                 <w:szCs w:val="24"/>
@@ -1054,7 +1054,7 @@
             <w:r>
               <w:rPr>
                 <w:rStyle w:val="None"/>
-                <w:rFonts w:ascii="Roboto" w:hAnsi="Roboto" w:eastAsia="Roboto" w:cs="Roboto"/>
+                <w:rFonts w:ascii="Roboto" w:eastAsia="Roboto" w:hAnsi="Roboto" w:cs="Roboto"/>
                 <w:b/>
                 <w:bCs/>
                 <w:color w:val="1D2125"/>
@@ -1073,7 +1073,7 @@
             <w:r>
               <w:rPr>
                 <w:rStyle w:val="None"/>
-                <w:rFonts w:ascii="Roboto" w:hAnsi="Roboto" w:eastAsia="Roboto" w:cs="Roboto"/>
+                <w:rFonts w:ascii="Roboto" w:eastAsia="Roboto" w:hAnsi="Roboto" w:cs="Roboto"/>
                 <w:color w:val="1D2125"/>
                 <w:sz w:val="24"/>
                 <w:szCs w:val="24"/>
@@ -1088,7 +1088,7 @@
             <w:tcW w:w="355" w:type="dxa"/>
             <w:tcBorders>
               <w:top w:val="nil"/>
-              <w:left w:val="single" w:color="000000" w:themeColor="text1" w:sz="4" w:space="0"/>
+              <w:left w:val="single" w:sz="4" w:space="0" w:color="000000" w:themeColor="text1"/>
               <w:bottom w:val="nil"/>
               <w:right w:val="nil"/>
             </w:tcBorders>
@@ -1110,10 +1110,10 @@
           <w:tcPr>
             <w:tcW w:w="9005" w:type="dxa"/>
             <w:tcBorders>
-              <w:top w:val="single" w:color="000000" w:themeColor="text1" w:sz="4" w:space="0"/>
-              <w:left w:val="single" w:color="000000" w:themeColor="text1" w:sz="4" w:space="0"/>
-              <w:bottom w:val="single" w:color="000000" w:themeColor="text1" w:sz="4" w:space="0"/>
-              <w:right w:val="single" w:color="000000" w:themeColor="text1" w:sz="4" w:space="0"/>
+              <w:top w:val="single" w:sz="4" w:space="0" w:color="000000" w:themeColor="text1"/>
+              <w:left w:val="single" w:sz="4" w:space="0" w:color="000000" w:themeColor="text1"/>
+              <w:bottom w:val="single" w:sz="4" w:space="0" w:color="000000" w:themeColor="text1"/>
+              <w:right w:val="single" w:sz="4" w:space="0" w:color="000000" w:themeColor="text1"/>
             </w:tcBorders>
             <w:tcMar>
               <w:top w:w="80" w:type="dxa"/>
@@ -1131,7 +1131,7 @@
             <w:r>
               <w:rPr>
                 <w:rStyle w:val="None"/>
-                <w:rFonts w:ascii="Roboto" w:hAnsi="Roboto" w:eastAsia="Roboto" w:cs="Roboto"/>
+                <w:rFonts w:ascii="Roboto" w:eastAsia="Roboto" w:hAnsi="Roboto" w:cs="Roboto"/>
                 <w:b/>
                 <w:bCs/>
                 <w:color w:val="1D2125"/>
@@ -1148,8 +1148,8 @@
             <w:tcW w:w="355" w:type="dxa"/>
             <w:tcBorders>
               <w:top w:val="nil"/>
-              <w:left w:val="single" w:color="000000" w:themeColor="text1" w:sz="4" w:space="0"/>
-              <w:bottom w:val="single" w:color="000000" w:themeColor="text1" w:sz="4" w:space="0"/>
+              <w:left w:val="single" w:sz="4" w:space="0" w:color="000000" w:themeColor="text1"/>
+              <w:bottom w:val="single" w:sz="4" w:space="0" w:color="000000" w:themeColor="text1"/>
               <w:right w:val="nil"/>
             </w:tcBorders>
             <w:tcMar>
@@ -1170,10 +1170,10 @@
           <w:tcPr>
             <w:tcW w:w="9005" w:type="dxa"/>
             <w:tcBorders>
-              <w:top w:val="single" w:color="000000" w:themeColor="text1" w:sz="4" w:space="0"/>
-              <w:left w:val="single" w:color="000000" w:themeColor="text1" w:sz="4" w:space="0"/>
-              <w:bottom w:val="single" w:color="000000" w:themeColor="text1" w:sz="4" w:space="0"/>
-              <w:right w:val="single" w:color="000000" w:themeColor="text1" w:sz="4" w:space="0"/>
+              <w:top w:val="single" w:sz="4" w:space="0" w:color="000000" w:themeColor="text1"/>
+              <w:left w:val="single" w:sz="4" w:space="0" w:color="000000" w:themeColor="text1"/>
+              <w:bottom w:val="single" w:sz="4" w:space="0" w:color="000000" w:themeColor="text1"/>
+              <w:right w:val="single" w:sz="4" w:space="0" w:color="000000" w:themeColor="text1"/>
             </w:tcBorders>
             <w:tcMar>
               <w:top w:w="80" w:type="dxa"/>
@@ -1188,7 +1188,7 @@
               <w:spacing w:line="240" w:lineRule="auto"/>
               <w:rPr>
                 <w:rStyle w:val="None"/>
-                <w:rFonts w:ascii="Roboto" w:hAnsi="Roboto" w:eastAsia="Roboto" w:cs="Roboto"/>
+                <w:rFonts w:ascii="Roboto" w:eastAsia="Roboto" w:hAnsi="Roboto" w:cs="Roboto"/>
                 <w:i/>
                 <w:iCs/>
                 <w:color w:val="1D2125"/>
@@ -1200,7 +1200,7 @@
             <w:r>
               <w:rPr>
                 <w:rStyle w:val="None"/>
-                <w:rFonts w:ascii="Roboto" w:hAnsi="Roboto" w:eastAsia="Roboto" w:cs="Roboto"/>
+                <w:rFonts w:ascii="Roboto" w:eastAsia="Roboto" w:hAnsi="Roboto" w:cs="Roboto"/>
                 <w:i/>
                 <w:iCs/>
                 <w:color w:val="1D2125"/>
@@ -1208,6 +1208,7 @@
                 <w:szCs w:val="24"/>
                 <w:u w:color="1D2125"/>
               </w:rPr>
+              <w:lastRenderedPageBreak/>
               <w:t>Pages:</w:t>
             </w:r>
           </w:p>
@@ -1217,7 +1218,7 @@
               <w:spacing w:line="240" w:lineRule="auto"/>
               <w:rPr>
                 <w:rStyle w:val="None"/>
-                <w:rFonts w:ascii="Roboto" w:hAnsi="Roboto" w:eastAsia="Roboto" w:cs="Roboto"/>
+                <w:rFonts w:ascii="Roboto" w:eastAsia="Roboto" w:hAnsi="Roboto" w:cs="Roboto"/>
                 <w:i/>
                 <w:iCs/>
                 <w:color w:val="1D2125"/>
@@ -1229,7 +1230,7 @@
             <w:r>
               <w:rPr>
                 <w:rStyle w:val="None"/>
-                <w:rFonts w:ascii="Roboto" w:hAnsi="Roboto" w:eastAsia="Roboto" w:cs="Roboto"/>
+                <w:rFonts w:ascii="Roboto" w:eastAsia="Roboto" w:hAnsi="Roboto" w:cs="Roboto"/>
                 <w:i/>
                 <w:iCs/>
                 <w:color w:val="1D2125"/>
@@ -1242,7 +1243,7 @@
             <w:r>
               <w:rPr>
                 <w:rStyle w:val="None"/>
-                <w:rFonts w:ascii="Roboto" w:hAnsi="Roboto" w:eastAsia="Roboto" w:cs="Roboto"/>
+                <w:rFonts w:ascii="Roboto" w:eastAsia="Roboto" w:hAnsi="Roboto" w:cs="Roboto"/>
                 <w:i/>
                 <w:iCs/>
                 <w:color w:val="1D2125"/>
@@ -1251,11 +1252,12 @@
                 <w:u w:color="1D2125"/>
               </w:rPr>
               <w:br/>
-            </w:r>
-            <w:r>
-              <w:rPr>
-                <w:rStyle w:val="None"/>
-                <w:rFonts w:ascii="Roboto" w:hAnsi="Roboto" w:eastAsia="Roboto" w:cs="Roboto"/>
+              <w:t>Provider Search</w:t>
+            </w:r>
+            <w:r>
+              <w:rPr>
+                <w:rStyle w:val="None"/>
+                <w:rFonts w:ascii="Roboto" w:eastAsia="Roboto" w:hAnsi="Roboto" w:cs="Roboto"/>
                 <w:i/>
                 <w:iCs/>
                 <w:color w:val="1D2125"/>
@@ -1263,12 +1265,17 @@
                 <w:szCs w:val="24"/>
                 <w:u w:color="1D2125"/>
               </w:rPr>
-              <w:t>Provider Search</w:t>
-            </w:r>
-            <w:r>
-              <w:rPr>
-                <w:rStyle w:val="None"/>
-                <w:rFonts w:ascii="Roboto" w:hAnsi="Roboto" w:eastAsia="Roboto" w:cs="Roboto"/>
+              <w:br/>
+              <w:t xml:space="preserve">Search Bar, Filter by Primary Care Physician, Specialty, distance, ratings  </w:t>
+            </w:r>
+          </w:p>
+          <w:p>
+            <w:pPr>
+              <w:pStyle w:val="Body"/>
+              <w:spacing w:line="240" w:lineRule="auto"/>
+              <w:rPr>
+                <w:rStyle w:val="None"/>
+                <w:rFonts w:ascii="Roboto" w:eastAsia="Roboto" w:hAnsi="Roboto" w:cs="Roboto"/>
                 <w:i/>
                 <w:iCs/>
                 <w:color w:val="1D2125"/>
@@ -1276,12 +1283,11 @@
                 <w:szCs w:val="24"/>
                 <w:u w:color="1D2125"/>
               </w:rPr>
-              <w:br/>
-            </w:r>
-            <w:r>
-              <w:rPr>
-                <w:rStyle w:val="None"/>
-                <w:rFonts w:ascii="Roboto" w:hAnsi="Roboto" w:eastAsia="Roboto" w:cs="Roboto"/>
+            </w:pPr>
+            <w:r>
+              <w:rPr>
+                <w:rStyle w:val="None"/>
+                <w:rFonts w:ascii="Roboto" w:eastAsia="Roboto" w:hAnsi="Roboto" w:cs="Roboto"/>
                 <w:i/>
                 <w:iCs/>
                 <w:color w:val="1D2125"/>
@@ -1289,7 +1295,7 @@
                 <w:szCs w:val="24"/>
                 <w:u w:color="1D2125"/>
               </w:rPr>
-              <w:t xml:space="preserve">Search Bar, Filter by Primary Care Physician, Specialty, distance, ratings  </w:t>
+              <w:t>Accessibility Features:</w:t>
             </w:r>
           </w:p>
           <w:p>
@@ -1298,7 +1304,7 @@
               <w:spacing w:line="240" w:lineRule="auto"/>
               <w:rPr>
                 <w:rStyle w:val="None"/>
-                <w:rFonts w:ascii="Roboto" w:hAnsi="Roboto" w:eastAsia="Roboto" w:cs="Roboto"/>
+                <w:rFonts w:ascii="Roboto" w:eastAsia="Roboto" w:hAnsi="Roboto" w:cs="Roboto"/>
                 <w:i/>
                 <w:iCs/>
                 <w:color w:val="1D2125"/>
@@ -1310,7 +1316,7 @@
             <w:r>
               <w:rPr>
                 <w:rStyle w:val="None"/>
-                <w:rFonts w:ascii="Roboto" w:hAnsi="Roboto" w:eastAsia="Roboto" w:cs="Roboto"/>
+                <w:rFonts w:ascii="Roboto" w:eastAsia="Roboto" w:hAnsi="Roboto" w:cs="Roboto"/>
                 <w:i/>
                 <w:iCs/>
                 <w:color w:val="1D2125"/>
@@ -1318,7 +1324,7 @@
                 <w:szCs w:val="24"/>
                 <w:u w:color="1D2125"/>
               </w:rPr>
-              <w:t>Accessibility Features:</w:t>
+              <w:t>Adjustable text size, different color modes, keyboard navigation, screen reader</w:t>
             </w:r>
           </w:p>
           <w:p>
@@ -1327,7 +1333,7 @@
               <w:spacing w:line="240" w:lineRule="auto"/>
               <w:rPr>
                 <w:rStyle w:val="None"/>
-                <w:rFonts w:ascii="Roboto" w:hAnsi="Roboto" w:eastAsia="Roboto" w:cs="Roboto"/>
+                <w:rFonts w:ascii="Roboto" w:eastAsia="Roboto" w:hAnsi="Roboto" w:cs="Roboto"/>
                 <w:i/>
                 <w:iCs/>
                 <w:color w:val="1D2125"/>
@@ -1339,7 +1345,7 @@
             <w:r>
               <w:rPr>
                 <w:rStyle w:val="None"/>
-                <w:rFonts w:ascii="Roboto" w:hAnsi="Roboto" w:eastAsia="Roboto" w:cs="Roboto"/>
+                <w:rFonts w:ascii="Roboto" w:eastAsia="Roboto" w:hAnsi="Roboto" w:cs="Roboto"/>
                 <w:i/>
                 <w:iCs/>
                 <w:color w:val="1D2125"/>
@@ -1347,16 +1353,18 @@
                 <w:szCs w:val="24"/>
                 <w:u w:color="1D2125"/>
               </w:rPr>
-              <w:t>Adjustable text size, different color modes, keyboard navigation, screen reader</w:t>
+              <w:t>Emergency Services:</w:t>
             </w:r>
           </w:p>
           <w:p>
             <w:pPr>
               <w:pStyle w:val="Body"/>
               <w:spacing w:line="240" w:lineRule="auto"/>
-              <w:rPr>
-                <w:rStyle w:val="None"/>
-                <w:rFonts w:ascii="Roboto" w:hAnsi="Roboto" w:eastAsia="Roboto" w:cs="Roboto"/>
+            </w:pPr>
+            <w:r>
+              <w:rPr>
+                <w:rStyle w:val="None"/>
+                <w:rFonts w:ascii="Roboto" w:eastAsia="Roboto" w:hAnsi="Roboto" w:cs="Roboto"/>
                 <w:i/>
                 <w:iCs/>
                 <w:color w:val="1D2125"/>
@@ -1364,37 +1372,6 @@
                 <w:szCs w:val="24"/>
                 <w:u w:color="1D2125"/>
               </w:rPr>
-            </w:pPr>
-            <w:r>
-              <w:rPr>
-                <w:rStyle w:val="None"/>
-                <w:rFonts w:ascii="Roboto" w:hAnsi="Roboto" w:eastAsia="Roboto" w:cs="Roboto"/>
-                <w:i/>
-                <w:iCs/>
-                <w:color w:val="1D2125"/>
-                <w:sz w:val="24"/>
-                <w:szCs w:val="24"/>
-                <w:u w:color="1D2125"/>
-              </w:rPr>
-              <w:t>Emergency Services:</w:t>
-            </w:r>
-          </w:p>
-          <w:p>
-            <w:pPr>
-              <w:pStyle w:val="Body"/>
-              <w:spacing w:line="240" w:lineRule="auto"/>
-            </w:pPr>
-            <w:r>
-              <w:rPr>
-                <w:rStyle w:val="None"/>
-                <w:rFonts w:ascii="Roboto" w:hAnsi="Roboto" w:eastAsia="Roboto" w:cs="Roboto"/>
-                <w:i/>
-                <w:iCs/>
-                <w:color w:val="1D2125"/>
-                <w:sz w:val="24"/>
-                <w:szCs w:val="24"/>
-                <w:u w:color="1D2125"/>
-              </w:rPr>
               <w:t>911 guidance</w:t>
             </w:r>
           </w:p>
@@ -1403,10 +1380,10 @@
           <w:tcPr>
             <w:tcW w:w="355" w:type="dxa"/>
             <w:tcBorders>
-              <w:top w:val="single" w:color="000000" w:themeColor="text1" w:sz="4" w:space="0"/>
-              <w:left w:val="single" w:color="000000" w:themeColor="text1" w:sz="4" w:space="0"/>
-              <w:bottom w:val="single" w:color="000000" w:themeColor="text1" w:sz="4" w:space="0"/>
-              <w:right w:val="single" w:color="000000" w:themeColor="text1" w:sz="4" w:space="0"/>
+              <w:top w:val="single" w:sz="4" w:space="0" w:color="000000" w:themeColor="text1"/>
+              <w:left w:val="single" w:sz="4" w:space="0" w:color="000000" w:themeColor="text1"/>
+              <w:bottom w:val="single" w:sz="4" w:space="0" w:color="000000" w:themeColor="text1"/>
+              <w:right w:val="single" w:sz="4" w:space="0" w:color="000000" w:themeColor="text1"/>
             </w:tcBorders>
             <w:tcMar>
               <w:top w:w="80" w:type="dxa"/>
@@ -1426,10 +1403,10 @@
           <w:tcPr>
             <w:tcW w:w="9005" w:type="dxa"/>
             <w:tcBorders>
-              <w:top w:val="single" w:color="000000" w:themeColor="text1" w:sz="4" w:space="0"/>
-              <w:left w:val="single" w:color="000000" w:themeColor="text1" w:sz="4" w:space="0"/>
-              <w:bottom w:val="single" w:color="000000" w:themeColor="text1" w:sz="4" w:space="0"/>
-              <w:right w:val="single" w:color="000000" w:themeColor="text1" w:sz="4" w:space="0"/>
+              <w:top w:val="single" w:sz="4" w:space="0" w:color="000000" w:themeColor="text1"/>
+              <w:left w:val="single" w:sz="4" w:space="0" w:color="000000" w:themeColor="text1"/>
+              <w:bottom w:val="single" w:sz="4" w:space="0" w:color="000000" w:themeColor="text1"/>
+              <w:right w:val="single" w:sz="4" w:space="0" w:color="000000" w:themeColor="text1"/>
             </w:tcBorders>
             <w:tcMar>
               <w:top w:w="80" w:type="dxa"/>
@@ -1447,7 +1424,7 @@
             <w:r>
               <w:rPr>
                 <w:rStyle w:val="None"/>
-                <w:rFonts w:ascii="Roboto" w:hAnsi="Roboto" w:eastAsia="Roboto" w:cs="Roboto"/>
+                <w:rFonts w:ascii="Roboto" w:eastAsia="Roboto" w:hAnsi="Roboto" w:cs="Roboto"/>
                 <w:b/>
                 <w:bCs/>
                 <w:color w:val="1D2125"/>
@@ -1463,10 +1440,10 @@
           <w:tcPr>
             <w:tcW w:w="355" w:type="dxa"/>
             <w:tcBorders>
-              <w:top w:val="single" w:color="000000" w:themeColor="text1" w:sz="4" w:space="0"/>
-              <w:left w:val="single" w:color="000000" w:themeColor="text1" w:sz="4" w:space="0"/>
-              <w:bottom w:val="single" w:color="000000" w:themeColor="text1" w:sz="4" w:space="0"/>
-              <w:right w:val="single" w:color="000000" w:themeColor="text1" w:sz="4" w:space="0"/>
+              <w:top w:val="single" w:sz="4" w:space="0" w:color="000000" w:themeColor="text1"/>
+              <w:left w:val="single" w:sz="4" w:space="0" w:color="000000" w:themeColor="text1"/>
+              <w:bottom w:val="single" w:sz="4" w:space="0" w:color="000000" w:themeColor="text1"/>
+              <w:right w:val="single" w:sz="4" w:space="0" w:color="000000" w:themeColor="text1"/>
             </w:tcBorders>
             <w:tcMar>
               <w:top w:w="80" w:type="dxa"/>
@@ -1486,10 +1463,10 @@
           <w:tcPr>
             <w:tcW w:w="9005" w:type="dxa"/>
             <w:tcBorders>
-              <w:top w:val="single" w:color="000000" w:themeColor="text1" w:sz="4" w:space="0"/>
-              <w:left w:val="single" w:color="000000" w:themeColor="text1" w:sz="4" w:space="0"/>
-              <w:bottom w:val="single" w:color="000000" w:themeColor="text1" w:sz="4" w:space="0"/>
-              <w:right w:val="single" w:color="000000" w:themeColor="text1" w:sz="4" w:space="0"/>
+              <w:top w:val="single" w:sz="4" w:space="0" w:color="000000" w:themeColor="text1"/>
+              <w:left w:val="single" w:sz="4" w:space="0" w:color="000000" w:themeColor="text1"/>
+              <w:bottom w:val="single" w:sz="4" w:space="0" w:color="000000" w:themeColor="text1"/>
+              <w:right w:val="single" w:sz="4" w:space="0" w:color="000000" w:themeColor="text1"/>
             </w:tcBorders>
             <w:tcMar>
               <w:top w:w="80" w:type="dxa"/>
@@ -1503,7 +1480,7 @@
               <w:pStyle w:val="Default"/>
               <w:spacing w:before="0" w:after="281" w:line="240" w:lineRule="auto"/>
               <w:rPr>
-                <w:rFonts w:ascii="Helvetica" w:hAnsi="Helvetica" w:eastAsia="Helvetica" w:cs="Helvetica"/>
+                <w:rFonts w:ascii="Helvetica" w:eastAsia="Helvetica" w:hAnsi="Helvetica" w:cs="Helvetica"/>
                 <w:b/>
                 <w:bCs/>
               </w:rPr>
@@ -1514,6 +1491,7 @@
                 <w:b/>
                 <w:bCs/>
               </w:rPr>
+              <w:lastRenderedPageBreak/>
               <w:t>Pages</w:t>
             </w:r>
           </w:p>
@@ -1522,32 +1500,14 @@
               <w:pStyle w:val="Default"/>
               <w:spacing w:before="0" w:after="240" w:line="240" w:lineRule="auto"/>
               <w:rPr>
-                <w:rFonts w:ascii="Helvetica" w:hAnsi="Helvetica" w:eastAsia="Helvetica" w:cs="Helvetica"/>
+                <w:rFonts w:ascii="Helvetica" w:eastAsia="Helvetica" w:hAnsi="Helvetica" w:cs="Helvetica"/>
               </w:rPr>
             </w:pPr>
             <w:r>
               <w:rPr>
                 <w:rFonts w:ascii="Helvetica" w:hAnsi="Helvetica"/>
               </w:rPr>
-              <w:t>Home, About, Contact, FAQ, Accessibility Statement, Community Health Resources</w:t>
-            </w:r>
-            <w:r>
-              <w:rPr>
-                <w:rFonts w:ascii="Helvetica" w:hAnsi="Helvetica"/>
-              </w:rPr>
-              <w:t>,</w:t>
-            </w:r>
-            <w:r>
-              <w:rPr>
-                <w:rFonts w:ascii="Helvetica" w:hAnsi="Helvetica"/>
-              </w:rPr>
-              <w:t xml:space="preserve"> </w:t>
-            </w:r>
-            <w:r>
-              <w:rPr>
-                <w:rFonts w:ascii="Helvetica" w:hAnsi="Helvetica"/>
-              </w:rPr>
-              <w:t>Insurance Information</w:t>
+              <w:t>Home, About, Contact, FAQ, Accessibility Statement, Community Health Resources, Insurance Information</w:t>
             </w:r>
           </w:p>
           <w:p>
@@ -1555,7 +1515,7 @@
               <w:pStyle w:val="Default"/>
               <w:spacing w:before="0" w:after="281" w:line="240" w:lineRule="auto"/>
               <w:rPr>
-                <w:rFonts w:ascii="Helvetica" w:hAnsi="Helvetica" w:eastAsia="Helvetica" w:cs="Helvetica"/>
+                <w:rFonts w:ascii="Helvetica" w:eastAsia="Helvetica" w:hAnsi="Helvetica" w:cs="Helvetica"/>
                 <w:b/>
                 <w:bCs/>
               </w:rPr>
@@ -1574,7 +1534,7 @@
               <w:pStyle w:val="Default"/>
               <w:spacing w:before="0" w:after="240" w:line="240" w:lineRule="auto"/>
               <w:rPr>
-                <w:rFonts w:ascii="Helvetica" w:hAnsi="Helvetica" w:eastAsia="Helvetica" w:cs="Helvetica"/>
+                <w:rFonts w:ascii="Helvetica" w:eastAsia="Helvetica" w:hAnsi="Helvetica" w:cs="Helvetica"/>
               </w:rPr>
             </w:pPr>
             <w:r>
@@ -1589,7 +1549,7 @@
               <w:pStyle w:val="Default"/>
               <w:spacing w:before="0" w:after="281" w:line="240" w:lineRule="auto"/>
               <w:rPr>
-                <w:rFonts w:ascii="Helvetica" w:hAnsi="Helvetica" w:eastAsia="Helvetica" w:cs="Helvetica"/>
+                <w:rFonts w:ascii="Helvetica" w:eastAsia="Helvetica" w:hAnsi="Helvetica" w:cs="Helvetica"/>
                 <w:b/>
                 <w:bCs/>
               </w:rPr>
@@ -1609,7 +1569,7 @@
               <w:pStyle w:val="Default"/>
               <w:spacing w:before="0" w:after="240" w:line="240" w:lineRule="auto"/>
               <w:rPr>
-                <w:rFonts w:ascii="Helvetica" w:hAnsi="Helvetica" w:eastAsia="Helvetica" w:cs="Helvetica"/>
+                <w:rFonts w:ascii="Helvetica" w:eastAsia="Helvetica" w:hAnsi="Helvetica" w:cs="Helvetica"/>
               </w:rPr>
             </w:pPr>
             <w:r>
@@ -1624,7 +1584,7 @@
               <w:pStyle w:val="Default"/>
               <w:spacing w:before="0" w:after="281" w:line="240" w:lineRule="auto"/>
               <w:rPr>
-                <w:rFonts w:ascii="Helvetica" w:hAnsi="Helvetica" w:eastAsia="Helvetica" w:cs="Helvetica"/>
+                <w:rFonts w:ascii="Helvetica" w:eastAsia="Helvetica" w:hAnsi="Helvetica" w:cs="Helvetica"/>
                 <w:b/>
                 <w:bCs/>
               </w:rPr>
@@ -1643,7 +1603,7 @@
               <w:pStyle w:val="Default"/>
               <w:spacing w:before="0" w:after="240" w:line="240" w:lineRule="auto"/>
               <w:rPr>
-                <w:rFonts w:ascii="Helvetica" w:hAnsi="Helvetica" w:eastAsia="Helvetica" w:cs="Helvetica"/>
+                <w:rFonts w:ascii="Helvetica" w:eastAsia="Helvetica" w:hAnsi="Helvetica" w:cs="Helvetica"/>
               </w:rPr>
             </w:pPr>
             <w:r>
@@ -1658,7 +1618,7 @@
               <w:pStyle w:val="Default"/>
               <w:spacing w:before="0" w:after="281" w:line="240" w:lineRule="auto"/>
               <w:rPr>
-                <w:rFonts w:ascii="Helvetica" w:hAnsi="Helvetica" w:eastAsia="Helvetica" w:cs="Helvetica"/>
+                <w:rFonts w:ascii="Helvetica" w:eastAsia="Helvetica" w:hAnsi="Helvetica" w:cs="Helvetica"/>
                 <w:b/>
                 <w:bCs/>
               </w:rPr>
@@ -1677,7 +1637,7 @@
               <w:pStyle w:val="Default"/>
               <w:spacing w:before="0" w:after="240" w:line="240" w:lineRule="auto"/>
               <w:rPr>
-                <w:rFonts w:ascii="Helvetica" w:hAnsi="Helvetica" w:eastAsia="Helvetica" w:cs="Helvetica"/>
+                <w:rFonts w:ascii="Helvetica" w:eastAsia="Helvetica" w:hAnsi="Helvetica" w:cs="Helvetica"/>
               </w:rPr>
             </w:pPr>
             <w:r>
@@ -1692,7 +1652,7 @@
               <w:pStyle w:val="Default"/>
               <w:spacing w:before="0" w:after="281" w:line="240" w:lineRule="auto"/>
               <w:rPr>
-                <w:rFonts w:ascii="Helvetica" w:hAnsi="Helvetica" w:eastAsia="Helvetica" w:cs="Helvetica"/>
+                <w:rFonts w:ascii="Helvetica" w:eastAsia="Helvetica" w:hAnsi="Helvetica" w:cs="Helvetica"/>
                 <w:b/>
                 <w:bCs/>
               </w:rPr>
@@ -1711,7 +1671,7 @@
               <w:pStyle w:val="Default"/>
               <w:spacing w:before="0" w:after="240" w:line="240" w:lineRule="auto"/>
               <w:rPr>
-                <w:rFonts w:ascii="Helvetica" w:hAnsi="Helvetica" w:eastAsia="Helvetica" w:cs="Helvetica"/>
+                <w:rFonts w:ascii="Helvetica" w:eastAsia="Helvetica" w:hAnsi="Helvetica" w:cs="Helvetica"/>
               </w:rPr>
             </w:pPr>
             <w:r>
@@ -1726,7 +1686,7 @@
               <w:pStyle w:val="Default"/>
               <w:spacing w:before="0" w:after="281" w:line="240" w:lineRule="auto"/>
               <w:rPr>
-                <w:rFonts w:ascii="Helvetica" w:hAnsi="Helvetica" w:eastAsia="Helvetica" w:cs="Helvetica"/>
+                <w:rFonts w:ascii="Helvetica" w:eastAsia="Helvetica" w:hAnsi="Helvetica" w:cs="Helvetica"/>
                 <w:b/>
                 <w:bCs/>
               </w:rPr>
@@ -1744,6 +1704,9 @@
             <w:pPr>
               <w:pStyle w:val="Default"/>
               <w:spacing w:before="0" w:after="240" w:line="240" w:lineRule="auto"/>
+              <w:rPr>
+                <w:rFonts w:hint="eastAsia"/>
+              </w:rPr>
             </w:pPr>
             <w:r>
               <w:rPr>
@@ -1757,10 +1720,10 @@
           <w:tcPr>
             <w:tcW w:w="355" w:type="dxa"/>
             <w:tcBorders>
-              <w:top w:val="single" w:color="000000" w:themeColor="text1" w:sz="4" w:space="0"/>
-              <w:left w:val="single" w:color="000000" w:themeColor="text1" w:sz="4" w:space="0"/>
-              <w:bottom w:val="single" w:color="000000" w:themeColor="text1" w:sz="4" w:space="0"/>
-              <w:right w:val="single" w:color="000000" w:themeColor="text1" w:sz="4" w:space="0"/>
+              <w:top w:val="single" w:sz="4" w:space="0" w:color="000000" w:themeColor="text1"/>
+              <w:left w:val="single" w:sz="4" w:space="0" w:color="000000" w:themeColor="text1"/>
+              <w:bottom w:val="single" w:sz="4" w:space="0" w:color="000000" w:themeColor="text1"/>
+              <w:right w:val="single" w:sz="4" w:space="0" w:color="000000" w:themeColor="text1"/>
             </w:tcBorders>
             <w:tcMar>
               <w:top w:w="80" w:type="dxa"/>
@@ -1780,10 +1743,10 @@
           <w:tcPr>
             <w:tcW w:w="9005" w:type="dxa"/>
             <w:tcBorders>
-              <w:top w:val="single" w:color="000000" w:themeColor="text1" w:sz="4" w:space="0"/>
-              <w:left w:val="single" w:color="000000" w:themeColor="text1" w:sz="4" w:space="0"/>
-              <w:bottom w:val="single" w:color="000000" w:themeColor="text1" w:sz="4" w:space="0"/>
-              <w:right w:val="single" w:color="000000" w:themeColor="text1" w:sz="4" w:space="0"/>
+              <w:top w:val="single" w:sz="4" w:space="0" w:color="000000" w:themeColor="text1"/>
+              <w:left w:val="single" w:sz="4" w:space="0" w:color="000000" w:themeColor="text1"/>
+              <w:bottom w:val="single" w:sz="4" w:space="0" w:color="000000" w:themeColor="text1"/>
+              <w:right w:val="single" w:sz="4" w:space="0" w:color="000000" w:themeColor="text1"/>
             </w:tcBorders>
             <w:tcMar>
               <w:top w:w="80" w:type="dxa"/>
@@ -1801,7 +1764,7 @@
             <w:r>
               <w:rPr>
                 <w:rStyle w:val="None"/>
-                <w:rFonts w:ascii="Roboto" w:hAnsi="Roboto" w:eastAsia="Roboto" w:cs="Roboto"/>
+                <w:rFonts w:ascii="Roboto" w:eastAsia="Roboto" w:hAnsi="Roboto" w:cs="Roboto"/>
                 <w:b/>
                 <w:bCs/>
                 <w:color w:val="1D2125"/>
@@ -1817,10 +1780,10 @@
           <w:tcPr>
             <w:tcW w:w="355" w:type="dxa"/>
             <w:tcBorders>
-              <w:top w:val="single" w:color="000000" w:themeColor="text1" w:sz="4" w:space="0"/>
-              <w:left w:val="single" w:color="000000" w:themeColor="text1" w:sz="4" w:space="0"/>
-              <w:bottom w:val="single" w:color="000000" w:themeColor="text1" w:sz="4" w:space="0"/>
-              <w:right w:val="single" w:color="000000" w:themeColor="text1" w:sz="4" w:space="0"/>
+              <w:top w:val="single" w:sz="4" w:space="0" w:color="000000" w:themeColor="text1"/>
+              <w:left w:val="single" w:sz="4" w:space="0" w:color="000000" w:themeColor="text1"/>
+              <w:bottom w:val="single" w:sz="4" w:space="0" w:color="000000" w:themeColor="text1"/>
+              <w:right w:val="single" w:sz="4" w:space="0" w:color="000000" w:themeColor="text1"/>
             </w:tcBorders>
             <w:tcMar>
               <w:top w:w="80" w:type="dxa"/>
@@ -1840,10 +1803,10 @@
           <w:tcPr>
             <w:tcW w:w="9005" w:type="dxa"/>
             <w:tcBorders>
-              <w:top w:val="single" w:color="000000" w:themeColor="text1" w:sz="4" w:space="0"/>
-              <w:left w:val="single" w:color="000000" w:themeColor="text1" w:sz="4" w:space="0"/>
-              <w:bottom w:val="single" w:color="000000" w:themeColor="text1" w:sz="4" w:space="0"/>
-              <w:right w:val="single" w:color="000000" w:themeColor="text1" w:sz="4" w:space="0"/>
+              <w:top w:val="single" w:sz="4" w:space="0" w:color="000000" w:themeColor="text1"/>
+              <w:left w:val="single" w:sz="4" w:space="0" w:color="000000" w:themeColor="text1"/>
+              <w:bottom w:val="single" w:sz="4" w:space="0" w:color="000000" w:themeColor="text1"/>
+              <w:right w:val="single" w:sz="4" w:space="0" w:color="000000" w:themeColor="text1"/>
             </w:tcBorders>
             <w:tcMar>
               <w:top w:w="80" w:type="dxa"/>
@@ -1858,7 +1821,7 @@
               <w:spacing w:line="240" w:lineRule="auto"/>
               <w:rPr>
                 <w:rStyle w:val="None"/>
-                <w:rFonts w:ascii="Roboto" w:hAnsi="Roboto" w:eastAsia="Roboto" w:cs="Roboto"/>
+                <w:rFonts w:ascii="Roboto" w:eastAsia="Roboto" w:hAnsi="Roboto" w:cs="Roboto"/>
                 <w:i/>
                 <w:iCs/>
                 <w:color w:val="1D2125"/>
@@ -1870,7 +1833,7 @@
             <w:r>
               <w:rPr>
                 <w:rStyle w:val="None"/>
-                <w:rFonts w:ascii="Roboto" w:hAnsi="Roboto" w:eastAsia="Roboto" w:cs="Roboto"/>
+                <w:rFonts w:ascii="Roboto" w:eastAsia="Roboto" w:hAnsi="Roboto" w:cs="Roboto"/>
                 <w:i/>
                 <w:iCs/>
                 <w:color w:val="1D2125"/>
@@ -1887,7 +1850,7 @@
               <w:spacing w:line="240" w:lineRule="auto"/>
               <w:rPr>
                 <w:rStyle w:val="None"/>
-                <w:rFonts w:ascii="Roboto" w:hAnsi="Roboto" w:eastAsia="Roboto" w:cs="Roboto"/>
+                <w:rFonts w:ascii="Roboto" w:eastAsia="Roboto" w:hAnsi="Roboto" w:cs="Roboto"/>
                 <w:i/>
                 <w:iCs/>
                 <w:color w:val="1D2125"/>
@@ -1899,7 +1862,7 @@
             <w:r>
               <w:rPr>
                 <w:rStyle w:val="None"/>
-                <w:rFonts w:ascii="Roboto" w:hAnsi="Roboto" w:eastAsia="Roboto" w:cs="Roboto"/>
+                <w:rFonts w:ascii="Roboto" w:eastAsia="Roboto" w:hAnsi="Roboto" w:cs="Roboto"/>
                 <w:i/>
                 <w:iCs/>
                 <w:color w:val="1D2125"/>
@@ -1912,7 +1875,7 @@
             <w:r>
               <w:rPr>
                 <w:rStyle w:val="None"/>
-                <w:rFonts w:ascii="Roboto" w:hAnsi="Roboto" w:eastAsia="Roboto" w:cs="Roboto"/>
+                <w:rFonts w:ascii="Roboto" w:eastAsia="Roboto" w:hAnsi="Roboto" w:cs="Roboto"/>
                 <w:i/>
                 <w:iCs/>
                 <w:color w:val="1D2125"/>
@@ -1925,7 +1888,7 @@
             <w:r>
               <w:rPr>
                 <w:rStyle w:val="None"/>
-                <w:rFonts w:ascii="Roboto" w:hAnsi="Roboto" w:eastAsia="Roboto" w:cs="Roboto"/>
+                <w:rFonts w:ascii="Roboto" w:eastAsia="Roboto" w:hAnsi="Roboto" w:cs="Roboto"/>
                 <w:i/>
                 <w:iCs/>
                 <w:color w:val="1D2125"/>
@@ -1942,7 +1905,7 @@
               <w:spacing w:line="240" w:lineRule="auto"/>
               <w:rPr>
                 <w:rStyle w:val="None"/>
-                <w:rFonts w:ascii="Roboto" w:hAnsi="Roboto" w:eastAsia="Roboto" w:cs="Roboto"/>
+                <w:rFonts w:ascii="Roboto" w:eastAsia="Roboto" w:hAnsi="Roboto" w:cs="Roboto"/>
                 <w:i/>
                 <w:iCs/>
                 <w:color w:val="1D2125"/>
@@ -1954,7 +1917,7 @@
             <w:r>
               <w:rPr>
                 <w:rStyle w:val="None"/>
-                <w:rFonts w:ascii="Roboto" w:hAnsi="Roboto" w:eastAsia="Roboto" w:cs="Roboto"/>
+                <w:rFonts w:ascii="Roboto" w:eastAsia="Roboto" w:hAnsi="Roboto" w:cs="Roboto"/>
                 <w:i/>
                 <w:iCs/>
                 <w:color w:val="1D2125"/>
@@ -1963,11 +1926,12 @@
                 <w:u w:color="1D2125"/>
               </w:rPr>
               <w:br/>
-            </w:r>
-            <w:r>
-              <w:rPr>
-                <w:rStyle w:val="None"/>
-                <w:rFonts w:ascii="Roboto" w:hAnsi="Roboto" w:eastAsia="Roboto" w:cs="Roboto"/>
+              <w:t>Provider Categories</w:t>
+            </w:r>
+            <w:r>
+              <w:rPr>
+                <w:rStyle w:val="None"/>
+                <w:rFonts w:ascii="Roboto" w:eastAsia="Roboto" w:hAnsi="Roboto" w:cs="Roboto"/>
                 <w:i/>
                 <w:iCs/>
                 <w:color w:val="1D2125"/>
@@ -1975,12 +1939,12 @@
                 <w:szCs w:val="24"/>
                 <w:u w:color="1D2125"/>
               </w:rPr>
-              <w:t>Provider Categories</w:t>
-            </w:r>
-            <w:r>
-              <w:rPr>
-                <w:rStyle w:val="None"/>
-                <w:rFonts w:ascii="Roboto" w:hAnsi="Roboto" w:eastAsia="Roboto" w:cs="Roboto"/>
+              <w:br/>
+            </w:r>
+            <w:r>
+              <w:rPr>
+                <w:rStyle w:val="None"/>
+                <w:rFonts w:ascii="Roboto" w:eastAsia="Roboto" w:hAnsi="Roboto" w:cs="Roboto"/>
                 <w:i/>
                 <w:iCs/>
                 <w:color w:val="1D2125"/>
@@ -1988,12 +1952,12 @@
                 <w:szCs w:val="24"/>
                 <w:u w:color="1D2125"/>
               </w:rPr>
-              <w:br/>
-            </w:r>
-            <w:r>
-              <w:rPr>
-                <w:rStyle w:val="None"/>
-                <w:rFonts w:ascii="Roboto" w:hAnsi="Roboto" w:eastAsia="Roboto" w:cs="Roboto"/>
+              <w:t>Primary Care Physicians, Hospitals, Urgent Care Centers, Specialties</w:t>
+            </w:r>
+            <w:r>
+              <w:rPr>
+                <w:rStyle w:val="None"/>
+                <w:rFonts w:ascii="Roboto" w:eastAsia="Roboto" w:hAnsi="Roboto" w:cs="Roboto"/>
                 <w:i/>
                 <w:iCs/>
                 <w:color w:val="1D2125"/>
@@ -2001,12 +1965,12 @@
                 <w:szCs w:val="24"/>
                 <w:u w:color="1D2125"/>
               </w:rPr>
-              <w:t xml:space="preserve">Primary Care Physicians, Hospitals, Urgent Care Centers, Specialties, </w:t>
-            </w:r>
-            <w:r>
-              <w:rPr>
-                <w:rStyle w:val="None"/>
-                <w:rFonts w:ascii="Roboto" w:hAnsi="Roboto" w:eastAsia="Roboto" w:cs="Roboto"/>
+              <w:t xml:space="preserve">, Providers, </w:t>
+            </w:r>
+            <w:r>
+              <w:rPr>
+                <w:rStyle w:val="None"/>
+                <w:rFonts w:ascii="Roboto" w:eastAsia="Roboto" w:hAnsi="Roboto" w:cs="Roboto"/>
                 <w:i/>
                 <w:iCs/>
                 <w:color w:val="1D2125"/>
@@ -2014,12 +1978,16 @@
                 <w:szCs w:val="24"/>
                 <w:u w:color="1D2125"/>
               </w:rPr>
-              <w:t xml:space="preserve">, Providers, </w:t>
-            </w:r>
-            <w:r>
-              <w:rPr>
-                <w:rStyle w:val="None"/>
-                <w:rFonts w:ascii="Roboto" w:hAnsi="Roboto" w:eastAsia="Roboto" w:cs="Roboto"/>
+              <w:t>Mental health Services</w:t>
+            </w:r>
+          </w:p>
+          <w:p>
+            <w:pPr>
+              <w:pStyle w:val="Body"/>
+              <w:spacing w:line="240" w:lineRule="auto"/>
+              <w:rPr>
+                <w:rStyle w:val="None"/>
+                <w:rFonts w:ascii="Roboto" w:eastAsia="Roboto" w:hAnsi="Roboto" w:cs="Roboto"/>
                 <w:i/>
                 <w:iCs/>
                 <w:color w:val="1D2125"/>
@@ -2027,7 +1995,47 @@
                 <w:szCs w:val="24"/>
                 <w:u w:color="1D2125"/>
               </w:rPr>
-              <w:t>Mental health Services</w:t>
+            </w:pPr>
+            <w:r>
+              <w:rPr>
+                <w:rStyle w:val="None"/>
+                <w:rFonts w:ascii="Roboto" w:eastAsia="Roboto" w:hAnsi="Roboto" w:cs="Roboto"/>
+                <w:i/>
+                <w:iCs/>
+                <w:color w:val="1D2125"/>
+                <w:sz w:val="24"/>
+                <w:szCs w:val="24"/>
+                <w:u w:color="1D2125"/>
+              </w:rPr>
+              <w:lastRenderedPageBreak/>
+              <w:br/>
+              <w:t>Provider Information</w:t>
+            </w:r>
+            <w:r>
+              <w:rPr>
+                <w:rStyle w:val="None"/>
+                <w:rFonts w:ascii="Roboto" w:eastAsia="Roboto" w:hAnsi="Roboto" w:cs="Roboto"/>
+                <w:i/>
+                <w:iCs/>
+                <w:color w:val="1D2125"/>
+                <w:sz w:val="24"/>
+                <w:szCs w:val="24"/>
+                <w:u w:color="1D2125"/>
+              </w:rPr>
+              <w:br/>
+            </w:r>
+            <w:r>
+              <w:rPr>
+                <w:rStyle w:val="None"/>
+                <w:rFonts w:ascii="Roboto" w:eastAsia="Roboto" w:hAnsi="Roboto" w:cs="Roboto"/>
+                <w:i/>
+                <w:iCs/>
+                <w:color w:val="1D2125"/>
+                <w:sz w:val="24"/>
+                <w:szCs w:val="24"/>
+                <w:u w:color="1D2125"/>
+              </w:rPr>
+              <w:t>Provider profile page, services offered, office hours, accepted insurance, provider credentials, phone number and contact information, location and directions</w:t>
             </w:r>
           </w:p>
           <w:p>
@@ -2036,7 +2044,7 @@
               <w:spacing w:line="240" w:lineRule="auto"/>
               <w:rPr>
                 <w:rStyle w:val="None"/>
-                <w:rFonts w:ascii="Roboto" w:hAnsi="Roboto" w:eastAsia="Roboto" w:cs="Roboto"/>
+                <w:rFonts w:ascii="Roboto" w:eastAsia="Roboto" w:hAnsi="Roboto" w:cs="Roboto"/>
                 <w:i/>
                 <w:iCs/>
                 <w:color w:val="1D2125"/>
@@ -2048,7 +2056,7 @@
             <w:r>
               <w:rPr>
                 <w:rStyle w:val="None"/>
-                <w:rFonts w:ascii="Roboto" w:hAnsi="Roboto" w:eastAsia="Roboto" w:cs="Roboto"/>
+                <w:rFonts w:ascii="Roboto" w:eastAsia="Roboto" w:hAnsi="Roboto" w:cs="Roboto"/>
                 <w:i/>
                 <w:iCs/>
                 <w:color w:val="1D2125"/>
@@ -2057,11 +2065,12 @@
                 <w:u w:color="1D2125"/>
               </w:rPr>
               <w:br/>
-            </w:r>
-            <w:r>
-              <w:rPr>
-                <w:rStyle w:val="None"/>
-                <w:rFonts w:ascii="Roboto" w:hAnsi="Roboto" w:eastAsia="Roboto" w:cs="Roboto"/>
+              <w:t>Search</w:t>
+            </w:r>
+            <w:r>
+              <w:rPr>
+                <w:rStyle w:val="None"/>
+                <w:rFonts w:ascii="Roboto" w:eastAsia="Roboto" w:hAnsi="Roboto" w:cs="Roboto"/>
                 <w:i/>
                 <w:iCs/>
                 <w:color w:val="1D2125"/>
@@ -2069,12 +2078,12 @@
                 <w:szCs w:val="24"/>
                 <w:u w:color="1D2125"/>
               </w:rPr>
-              <w:t>Provider Information</w:t>
-            </w:r>
-            <w:r>
-              <w:rPr>
-                <w:rStyle w:val="None"/>
-                <w:rFonts w:ascii="Roboto" w:hAnsi="Roboto" w:eastAsia="Roboto" w:cs="Roboto"/>
+              <w:t xml:space="preserve"> / Find a Provider</w:t>
+            </w:r>
+            <w:r>
+              <w:rPr>
+                <w:rStyle w:val="None"/>
+                <w:rFonts w:ascii="Roboto" w:eastAsia="Roboto" w:hAnsi="Roboto" w:cs="Roboto"/>
                 <w:i/>
                 <w:iCs/>
                 <w:color w:val="1D2125"/>
@@ -2087,7 +2096,7 @@
             <w:r>
               <w:rPr>
                 <w:rStyle w:val="None"/>
-                <w:rFonts w:ascii="Roboto" w:hAnsi="Roboto" w:eastAsia="Roboto" w:cs="Roboto"/>
+                <w:rFonts w:ascii="Roboto" w:eastAsia="Roboto" w:hAnsi="Roboto" w:cs="Roboto"/>
                 <w:i/>
                 <w:iCs/>
                 <w:color w:val="1D2125"/>
@@ -2095,318 +2104,80 @@
                 <w:szCs w:val="24"/>
                 <w:u w:color="1D2125"/>
               </w:rPr>
-              <w:t>Provider profile page, services offered, office hours, accepted insurance, provider credentials, phone number and contact information, location and directions</w:t>
+              <w:t>Search bar</w:t>
+            </w:r>
+            <w:r>
+              <w:rPr>
+                <w:rStyle w:val="None"/>
+                <w:rFonts w:ascii="Roboto" w:eastAsia="Roboto" w:hAnsi="Roboto" w:cs="Roboto"/>
+                <w:i/>
+                <w:iCs/>
+                <w:color w:val="1D2125"/>
+                <w:sz w:val="24"/>
+                <w:szCs w:val="24"/>
+                <w:u w:color="1D2125"/>
+              </w:rPr>
+              <w:t xml:space="preserve">, filter by specialty, filter by insurance accepted, </w:t>
+            </w:r>
+            <w:r>
+              <w:rPr>
+                <w:rStyle w:val="None"/>
+                <w:rFonts w:ascii="Roboto" w:eastAsia="Roboto" w:hAnsi="Roboto" w:cs="Roboto"/>
+                <w:i/>
+                <w:iCs/>
+                <w:color w:val="1D2125"/>
+                <w:sz w:val="24"/>
+                <w:szCs w:val="24"/>
+                <w:u w:color="1D2125"/>
+              </w:rPr>
+              <w:t>filter by ratings, filter by location, map</w:t>
+            </w:r>
+            <w:r>
+              <w:rPr>
+                <w:rStyle w:val="None"/>
+                <w:rFonts w:ascii="Roboto" w:eastAsia="Roboto" w:hAnsi="Roboto" w:cs="Roboto"/>
+                <w:i/>
+                <w:iCs/>
+                <w:color w:val="1D2125"/>
+                <w:sz w:val="24"/>
+                <w:szCs w:val="24"/>
+                <w:u w:color="1D2125"/>
+              </w:rPr>
+              <w:br/>
+            </w:r>
+            <w:r>
+              <w:rPr>
+                <w:rStyle w:val="None"/>
+                <w:rFonts w:ascii="Roboto" w:eastAsia="Roboto" w:hAnsi="Roboto" w:cs="Roboto"/>
+                <w:i/>
+                <w:iCs/>
+                <w:color w:val="1D2125"/>
+                <w:sz w:val="24"/>
+                <w:szCs w:val="24"/>
+                <w:u w:color="1D2125"/>
+              </w:rPr>
+              <w:br/>
+              <w:t>Emergency Services</w:t>
+            </w:r>
+            <w:r>
+              <w:rPr>
+                <w:rStyle w:val="None"/>
+                <w:rFonts w:ascii="Roboto" w:eastAsia="Roboto" w:hAnsi="Roboto" w:cs="Roboto"/>
+                <w:i/>
+                <w:iCs/>
+                <w:color w:val="1D2125"/>
+                <w:sz w:val="24"/>
+                <w:szCs w:val="24"/>
+                <w:u w:color="1D2125"/>
+              </w:rPr>
+              <w:br/>
+              <w:t>911 guidance, nearest emergency rooms</w:t>
             </w:r>
           </w:p>
           <w:p>
             <w:pPr>
               <w:pStyle w:val="Body"/>
               <w:spacing w:line="240" w:lineRule="auto"/>
-              <w:rPr>
-                <w:rStyle w:val="None"/>
-                <w:rFonts w:ascii="Roboto" w:hAnsi="Roboto" w:eastAsia="Roboto" w:cs="Roboto"/>
-                <w:i/>
-                <w:iCs/>
-                <w:color w:val="1D2125"/>
-                <w:sz w:val="24"/>
-                <w:szCs w:val="24"/>
-                <w:u w:color="1D2125"/>
-              </w:rPr>
-            </w:pPr>
-            <w:r>
-              <w:rPr>
-                <w:rStyle w:val="None"/>
-                <w:rFonts w:ascii="Roboto" w:hAnsi="Roboto" w:eastAsia="Roboto" w:cs="Roboto"/>
-                <w:i/>
-                <w:iCs/>
-                <w:color w:val="1D2125"/>
-                <w:sz w:val="24"/>
-                <w:szCs w:val="24"/>
-                <w:u w:color="1D2125"/>
-              </w:rPr>
-              <w:br/>
-            </w:r>
-            <w:r>
-              <w:rPr>
-                <w:rStyle w:val="None"/>
-                <w:rFonts w:ascii="Roboto" w:hAnsi="Roboto" w:eastAsia="Roboto" w:cs="Roboto"/>
-                <w:i/>
-                <w:iCs/>
-                <w:color w:val="1D2125"/>
-                <w:sz w:val="24"/>
-                <w:szCs w:val="24"/>
-                <w:u w:color="1D2125"/>
-              </w:rPr>
-              <w:t>Search</w:t>
-            </w:r>
-            <w:r>
-              <w:rPr>
-                <w:rStyle w:val="None"/>
-                <w:rFonts w:ascii="Roboto" w:hAnsi="Roboto" w:eastAsia="Roboto" w:cs="Roboto"/>
-                <w:i/>
-                <w:iCs/>
-                <w:color w:val="1D2125"/>
-                <w:sz w:val="24"/>
-                <w:szCs w:val="24"/>
-                <w:u w:color="1D2125"/>
-              </w:rPr>
-              <w:br/>
-            </w:r>
-            <w:r>
-              <w:rPr>
-                <w:rStyle w:val="None"/>
-                <w:rFonts w:ascii="Roboto" w:hAnsi="Roboto" w:eastAsia="Roboto" w:cs="Roboto"/>
-                <w:i/>
-                <w:iCs/>
-                <w:color w:val="1D2125"/>
-                <w:sz w:val="24"/>
-                <w:szCs w:val="24"/>
-                <w:u w:color="1D2125"/>
-              </w:rPr>
-              <w:t>Search bar</w:t>
-            </w:r>
-            <w:r>
-              <w:rPr>
-                <w:rStyle w:val="None"/>
-                <w:rFonts w:ascii="Roboto" w:hAnsi="Roboto" w:eastAsia="Roboto" w:cs="Roboto"/>
-                <w:i/>
-                <w:iCs/>
-                <w:color w:val="1D2125"/>
-                <w:sz w:val="24"/>
-                <w:szCs w:val="24"/>
-                <w:u w:color="1D2125"/>
-              </w:rPr>
-              <w:t xml:space="preserve">, filter by specialty, filter by insurance accepted, </w:t>
-            </w:r>
-            <w:r>
-              <w:rPr>
-                <w:rStyle w:val="None"/>
-                <w:rFonts w:ascii="Roboto" w:hAnsi="Roboto" w:eastAsia="Roboto" w:cs="Roboto"/>
-                <w:i/>
-                <w:iCs/>
-                <w:color w:val="1D2125"/>
-                <w:sz w:val="24"/>
-                <w:szCs w:val="24"/>
-                <w:u w:color="1D2125"/>
-              </w:rPr>
-              <w:t>filter by ratings, filter by location, map</w:t>
-            </w:r>
-          </w:p>
-          <w:p>
-            <w:pPr>
-              <w:pStyle w:val="Body"/>
-              <w:spacing w:line="240" w:lineRule="auto"/>
-              <w:rPr>
-                <w:rStyle w:val="None"/>
-                <w:rFonts w:ascii="Roboto" w:hAnsi="Roboto" w:eastAsia="Roboto" w:cs="Roboto"/>
-                <w:i/>
-                <w:iCs/>
-                <w:color w:val="1D2125"/>
-                <w:sz w:val="24"/>
-                <w:szCs w:val="24"/>
-                <w:u w:color="1D2125"/>
-              </w:rPr>
-            </w:pPr>
-            <w:r>
-              <w:rPr>
-                <w:rStyle w:val="None"/>
-                <w:rFonts w:ascii="Roboto" w:hAnsi="Roboto" w:eastAsia="Roboto" w:cs="Roboto"/>
-                <w:i/>
-                <w:iCs/>
-                <w:color w:val="1D2125"/>
-                <w:sz w:val="24"/>
-                <w:szCs w:val="24"/>
-                <w:u w:color="1D2125"/>
-              </w:rPr>
-              <w:br/>
-            </w:r>
-            <w:r>
-              <w:rPr>
-                <w:rStyle w:val="None"/>
-                <w:rFonts w:ascii="Roboto" w:hAnsi="Roboto" w:eastAsia="Roboto" w:cs="Roboto"/>
-                <w:i/>
-                <w:iCs/>
-                <w:color w:val="1D2125"/>
-                <w:sz w:val="24"/>
-                <w:szCs w:val="24"/>
-                <w:u w:color="1D2125"/>
-              </w:rPr>
-              <w:t>Patient Support Features</w:t>
-            </w:r>
-            <w:r>
-              <w:rPr>
-                <w:rStyle w:val="None"/>
-                <w:rFonts w:ascii="Roboto" w:hAnsi="Roboto" w:eastAsia="Roboto" w:cs="Roboto"/>
-                <w:i/>
-                <w:iCs/>
-                <w:color w:val="1D2125"/>
-                <w:sz w:val="24"/>
-                <w:szCs w:val="24"/>
-                <w:u w:color="1D2125"/>
-              </w:rPr>
-              <w:br/>
-            </w:r>
-            <w:r>
-              <w:rPr>
-                <w:rStyle w:val="None"/>
-                <w:rFonts w:ascii="Roboto" w:hAnsi="Roboto" w:eastAsia="Roboto" w:cs="Roboto"/>
-                <w:i/>
-                <w:iCs/>
-                <w:color w:val="1D2125"/>
-                <w:sz w:val="24"/>
-                <w:szCs w:val="24"/>
-                <w:u w:color="1D2125"/>
-              </w:rPr>
-              <w:t>Appointment scheduling links, telehealth availability information, patient reviews and ratings</w:t>
-            </w:r>
-            <w:r>
-              <w:rPr>
-                <w:rStyle w:val="None"/>
-                <w:rFonts w:ascii="Roboto" w:hAnsi="Roboto" w:eastAsia="Roboto" w:cs="Roboto"/>
-                <w:i/>
-                <w:iCs/>
-                <w:color w:val="1D2125"/>
-                <w:sz w:val="24"/>
-                <w:szCs w:val="24"/>
-                <w:u w:color="1D2125"/>
-              </w:rPr>
-              <w:br/>
-            </w:r>
-            <w:r>
-              <w:rPr>
-                <w:rStyle w:val="None"/>
-                <w:rFonts w:ascii="Roboto" w:hAnsi="Roboto" w:eastAsia="Roboto" w:cs="Roboto"/>
-                <w:i/>
-                <w:iCs/>
-                <w:color w:val="1D2125"/>
-                <w:sz w:val="24"/>
-                <w:szCs w:val="24"/>
-                <w:u w:color="1D2125"/>
-              </w:rPr>
-              <w:br/>
-            </w:r>
-            <w:r>
-              <w:rPr>
-                <w:rStyle w:val="None"/>
-                <w:rFonts w:ascii="Roboto" w:hAnsi="Roboto" w:eastAsia="Roboto" w:cs="Roboto"/>
-                <w:i/>
-                <w:iCs/>
-                <w:color w:val="1D2125"/>
-                <w:sz w:val="24"/>
-                <w:szCs w:val="24"/>
-                <w:u w:color="1D2125"/>
-              </w:rPr>
-              <w:t>Accessibility Features</w:t>
-            </w:r>
-            <w:r>
-              <w:rPr>
-                <w:rStyle w:val="None"/>
-                <w:rFonts w:ascii="Roboto" w:hAnsi="Roboto" w:eastAsia="Roboto" w:cs="Roboto"/>
-                <w:i/>
-                <w:iCs/>
-                <w:color w:val="1D2125"/>
-                <w:sz w:val="24"/>
-                <w:szCs w:val="24"/>
-                <w:u w:color="1D2125"/>
-              </w:rPr>
-              <w:br/>
-            </w:r>
-            <w:r>
-              <w:rPr>
-                <w:rStyle w:val="None"/>
-                <w:rFonts w:ascii="Roboto" w:hAnsi="Roboto" w:eastAsia="Roboto" w:cs="Roboto"/>
-                <w:i/>
-                <w:iCs/>
-                <w:color w:val="1D2125"/>
-                <w:sz w:val="24"/>
-                <w:szCs w:val="24"/>
-                <w:u w:color="1D2125"/>
-              </w:rPr>
-              <w:t>Adjustable text size, high contrast mode, screen reader compatibility</w:t>
-            </w:r>
-            <w:r>
-              <w:rPr>
-                <w:rStyle w:val="None"/>
-                <w:rFonts w:ascii="Roboto" w:hAnsi="Roboto" w:eastAsia="Roboto" w:cs="Roboto"/>
-                <w:i/>
-                <w:iCs/>
-                <w:color w:val="1D2125"/>
-                <w:sz w:val="24"/>
-                <w:szCs w:val="24"/>
-                <w:u w:color="1D2125"/>
-              </w:rPr>
-              <w:t>, keyboard navigation support</w:t>
-            </w:r>
-            <w:r>
-              <w:rPr>
-                <w:rStyle w:val="None"/>
-                <w:rFonts w:ascii="Roboto" w:hAnsi="Roboto" w:eastAsia="Roboto" w:cs="Roboto"/>
-                <w:i/>
-                <w:iCs/>
-                <w:color w:val="1D2125"/>
-                <w:sz w:val="24"/>
-                <w:szCs w:val="24"/>
-                <w:u w:color="1D2125"/>
-              </w:rPr>
-              <w:br/>
-            </w:r>
-            <w:r>
-              <w:rPr>
-                <w:rStyle w:val="None"/>
-                <w:rFonts w:ascii="Roboto" w:hAnsi="Roboto" w:eastAsia="Roboto" w:cs="Roboto"/>
-                <w:i/>
-                <w:iCs/>
-                <w:color w:val="1D2125"/>
-                <w:sz w:val="24"/>
-                <w:szCs w:val="24"/>
-                <w:u w:color="1D2125"/>
-              </w:rPr>
-              <w:br/>
-            </w:r>
-            <w:r>
-              <w:rPr>
-                <w:rStyle w:val="None"/>
-                <w:rFonts w:ascii="Roboto" w:hAnsi="Roboto" w:eastAsia="Roboto" w:cs="Roboto"/>
-                <w:i/>
-                <w:iCs/>
-                <w:color w:val="1D2125"/>
-                <w:sz w:val="24"/>
-                <w:szCs w:val="24"/>
-                <w:u w:color="1D2125"/>
-              </w:rPr>
-              <w:t>Emergency Services</w:t>
-            </w:r>
-            <w:r>
-              <w:rPr>
-                <w:rStyle w:val="None"/>
-                <w:rFonts w:ascii="Roboto" w:hAnsi="Roboto" w:eastAsia="Roboto" w:cs="Roboto"/>
-                <w:i/>
-                <w:iCs/>
-                <w:color w:val="1D2125"/>
-                <w:sz w:val="24"/>
-                <w:szCs w:val="24"/>
-                <w:u w:color="1D2125"/>
-              </w:rPr>
-              <w:br/>
-            </w:r>
-            <w:r>
-              <w:rPr>
-                <w:rStyle w:val="None"/>
-                <w:rFonts w:ascii="Roboto" w:hAnsi="Roboto" w:eastAsia="Roboto" w:cs="Roboto"/>
-                <w:i/>
-                <w:iCs/>
-                <w:color w:val="1D2125"/>
-                <w:sz w:val="24"/>
-                <w:szCs w:val="24"/>
-                <w:u w:color="1D2125"/>
-              </w:rPr>
-              <w:t>911 guidance, nearest emergency rooms, nearest urgent care centers</w:t>
-            </w:r>
-          </w:p>
-          <w:p>
-            <w:pPr>
-              <w:pStyle w:val="Body"/>
-              <w:spacing w:line="240" w:lineRule="auto"/>
             </w:pPr>
           </w:p>
         </w:tc>
@@ -2414,10 +2185,10 @@
           <w:tcPr>
             <w:tcW w:w="355" w:type="dxa"/>
             <w:tcBorders>
-              <w:top w:val="single" w:color="000000" w:themeColor="text1" w:sz="4" w:space="0"/>
-              <w:left w:val="single" w:color="000000" w:themeColor="text1" w:sz="4" w:space="0"/>
-              <w:bottom w:val="single" w:color="000000" w:themeColor="text1" w:sz="4" w:space="0"/>
-              <w:right w:val="single" w:color="000000" w:themeColor="text1" w:sz="4" w:space="0"/>
+              <w:top w:val="single" w:sz="4" w:space="0" w:color="000000" w:themeColor="text1"/>
+              <w:left w:val="single" w:sz="4" w:space="0" w:color="000000" w:themeColor="text1"/>
+              <w:bottom w:val="single" w:sz="4" w:space="0" w:color="000000" w:themeColor="text1"/>
+              <w:right w:val="single" w:sz="4" w:space="0" w:color="000000" w:themeColor="text1"/>
             </w:tcBorders>
             <w:tcMar>
               <w:top w:w="80" w:type="dxa"/>
@@ -2437,10 +2208,10 @@
           <w:tcPr>
             <w:tcW w:w="9005" w:type="dxa"/>
             <w:tcBorders>
-              <w:top w:val="single" w:color="000000" w:themeColor="text1" w:sz="4" w:space="0"/>
-              <w:left w:val="single" w:color="000000" w:themeColor="text1" w:sz="4" w:space="0"/>
-              <w:bottom w:val="single" w:color="000000" w:themeColor="text1" w:sz="4" w:space="0"/>
-              <w:right w:val="single" w:color="000000" w:themeColor="text1" w:sz="4" w:space="0"/>
+              <w:top w:val="single" w:sz="4" w:space="0" w:color="000000" w:themeColor="text1"/>
+              <w:left w:val="single" w:sz="4" w:space="0" w:color="000000" w:themeColor="text1"/>
+              <w:bottom w:val="single" w:sz="4" w:space="0" w:color="000000" w:themeColor="text1"/>
+              <w:right w:val="single" w:sz="4" w:space="0" w:color="000000" w:themeColor="text1"/>
             </w:tcBorders>
             <w:tcMar>
               <w:top w:w="80" w:type="dxa"/>
@@ -2458,7 +2229,7 @@
             <w:r>
               <w:rPr>
                 <w:rStyle w:val="None"/>
-                <w:rFonts w:ascii="Roboto" w:hAnsi="Roboto" w:eastAsia="Roboto" w:cs="Roboto"/>
+                <w:rFonts w:ascii="Roboto" w:eastAsia="Roboto" w:hAnsi="Roboto" w:cs="Roboto"/>
                 <w:b/>
                 <w:bCs/>
                 <w:color w:val="1D2125"/>
@@ -2474,8 +2245,8 @@
           <w:tcPr>
             <w:tcW w:w="355" w:type="dxa"/>
             <w:tcBorders>
-              <w:top w:val="single" w:color="000000" w:themeColor="text1" w:sz="4" w:space="0"/>
-              <w:left w:val="single" w:color="000000" w:themeColor="text1" w:sz="4" w:space="0"/>
+              <w:top w:val="single" w:sz="4" w:space="0" w:color="000000" w:themeColor="text1"/>
+              <w:left w:val="single" w:sz="4" w:space="0" w:color="000000" w:themeColor="text1"/>
               <w:bottom w:val="nil"/>
               <w:right w:val="nil"/>
             </w:tcBorders>
@@ -2497,10 +2268,10 @@
           <w:tcPr>
             <w:tcW w:w="9005" w:type="dxa"/>
             <w:tcBorders>
-              <w:top w:val="single" w:color="000000" w:themeColor="text1" w:sz="4" w:space="0"/>
-              <w:left w:val="single" w:color="000000" w:themeColor="text1" w:sz="4" w:space="0"/>
-              <w:bottom w:val="single" w:color="000000" w:themeColor="text1" w:sz="4" w:space="0"/>
-              <w:right w:val="single" w:color="000000" w:themeColor="text1" w:sz="4" w:space="0"/>
+              <w:top w:val="single" w:sz="4" w:space="0" w:color="000000" w:themeColor="text1"/>
+              <w:left w:val="single" w:sz="4" w:space="0" w:color="000000" w:themeColor="text1"/>
+              <w:bottom w:val="single" w:sz="4" w:space="0" w:color="000000" w:themeColor="text1"/>
+              <w:right w:val="single" w:sz="4" w:space="0" w:color="000000" w:themeColor="text1"/>
             </w:tcBorders>
             <w:tcMar>
               <w:top w:w="80" w:type="dxa"/>
@@ -2516,32 +2287,35 @@
               <w:ind w:left="720"/>
               <w:rPr>
                 <w:rStyle w:val="None"/>
-                <w:rFonts w:ascii="Roboto" w:hAnsi="Roboto" w:eastAsia="Roboto" w:cs="Roboto"/>
-                <w:i w:val="1"/>
-                <w:iCs w:val="1"/>
-                <w:color w:val="1D2125"/>
-                <w:sz w:val="24"/>
-                <w:szCs w:val="24"/>
-              </w:rPr>
-            </w:pPr>
-            <w:r>
+                <w:rFonts w:ascii="Roboto" w:eastAsia="Roboto" w:hAnsi="Roboto" w:cs="Roboto"/>
+                <w:i/>
+                <w:iCs/>
+                <w:color w:val="1D2125"/>
+                <w:sz w:val="24"/>
+                <w:szCs w:val="24"/>
+              </w:rPr>
+            </w:pPr>
+            <w:r>
+              <w:rPr>
+                <w:noProof/>
+              </w:rPr>
               <w:drawing>
-                <wp:inline wp14:editId="5F8AAB4B" wp14:anchorId="5C774D70">
+                <wp:inline distT="0" distB="0" distL="0" distR="0" wp14:anchorId="5C774D70" wp14:editId="5F8AAB4B">
                   <wp:extent cx="5076825" cy="2089701"/>
                   <wp:effectExtent l="0" t="0" r="0" b="0"/>
                   <wp:docPr id="2017956888" name="drawing"/>
                   <wp:cNvGraphicFramePr>
-                    <a:graphicFrameLocks noChangeAspect="1"/>
+                    <a:graphicFrameLocks xmlns:a="http://schemas.openxmlformats.org/drawingml/2006/main" noChangeAspect="1"/>
                   </wp:cNvGraphicFramePr>
-                  <a:graphic>
-                    <a:graphicData xmlns:a="http://schemas.openxmlformats.org/drawingml/2006/main" uri="http://schemas.openxmlformats.org/drawingml/2006/picture">
+                  <a:graphic xmlns:a="http://schemas.openxmlformats.org/drawingml/2006/main">
+                    <a:graphicData uri="http://schemas.openxmlformats.org/drawingml/2006/picture">
                       <pic:pic xmlns:pic="http://schemas.openxmlformats.org/drawingml/2006/picture">
                         <pic:nvPicPr>
                           <pic:cNvPr id="2017956888" name="Picture 2017956888"/>
                           <pic:cNvPicPr/>
                         </pic:nvPicPr>
                         <pic:blipFill>
-                          <a:blip xmlns:r="http://schemas.openxmlformats.org/officeDocument/2006/relationships" r:embed="rId699412828">
+                          <a:blip r:embed="rId9">
                             <a:extLst>
                               <a:ext uri="{28A0092B-C50C-407E-A947-70E740481C1C}">
                                 <a14:useLocalDpi xmlns:a14="http://schemas.microsoft.com/office/drawing/2010/main"/>
@@ -2553,7 +2327,7 @@
                           </a:stretch>
                         </pic:blipFill>
                         <pic:spPr>
-                          <a:xfrm rot="0">
+                          <a:xfrm>
                             <a:off x="0" y="0"/>
                             <a:ext cx="5076825" cy="2089701"/>
                           </a:xfrm>
@@ -2574,7 +2348,7 @@
             <w:tcW w:w="355" w:type="dxa"/>
             <w:tcBorders>
               <w:top w:val="nil"/>
-              <w:left w:val="single" w:color="000000" w:themeColor="text1" w:sz="4" w:space="0"/>
+              <w:left w:val="single" w:sz="4" w:space="0" w:color="000000" w:themeColor="text1"/>
               <w:bottom w:val="nil"/>
               <w:right w:val="nil"/>
             </w:tcBorders>
@@ -2596,10 +2370,10 @@
           <w:tcPr>
             <w:tcW w:w="9005" w:type="dxa"/>
             <w:tcBorders>
-              <w:top w:val="single" w:color="000000" w:themeColor="text1" w:sz="4" w:space="0"/>
-              <w:left w:val="single" w:color="000000" w:themeColor="text1" w:sz="4" w:space="0"/>
-              <w:bottom w:val="single" w:color="000000" w:themeColor="text1" w:sz="4" w:space="0"/>
-              <w:right w:val="single" w:color="000000" w:themeColor="text1" w:sz="4" w:space="0"/>
+              <w:top w:val="single" w:sz="4" w:space="0" w:color="000000" w:themeColor="text1"/>
+              <w:left w:val="single" w:sz="4" w:space="0" w:color="000000" w:themeColor="text1"/>
+              <w:bottom w:val="single" w:sz="4" w:space="0" w:color="000000" w:themeColor="text1"/>
+              <w:right w:val="single" w:sz="4" w:space="0" w:color="000000" w:themeColor="text1"/>
             </w:tcBorders>
             <w:tcMar>
               <w:top w:w="80" w:type="dxa"/>
@@ -2617,7 +2391,7 @@
             <w:r>
               <w:rPr>
                 <w:rStyle w:val="None"/>
-                <w:rFonts w:ascii="Roboto" w:hAnsi="Roboto" w:eastAsia="Roboto" w:cs="Roboto"/>
+                <w:rFonts w:ascii="Roboto" w:eastAsia="Roboto" w:hAnsi="Roboto" w:cs="Roboto"/>
                 <w:b/>
                 <w:bCs/>
                 <w:color w:val="1D2125"/>
@@ -2634,7 +2408,7 @@
             <w:tcW w:w="355" w:type="dxa"/>
             <w:tcBorders>
               <w:top w:val="nil"/>
-              <w:left w:val="single" w:color="000000" w:themeColor="text1" w:sz="4" w:space="0"/>
+              <w:left w:val="single" w:sz="4" w:space="0" w:color="000000" w:themeColor="text1"/>
               <w:bottom w:val="nil"/>
               <w:right w:val="nil"/>
             </w:tcBorders>
@@ -2656,10 +2430,10 @@
           <w:tcPr>
             <w:tcW w:w="9005" w:type="dxa"/>
             <w:tcBorders>
-              <w:top w:val="single" w:color="000000" w:themeColor="text1" w:sz="4" w:space="0"/>
-              <w:left w:val="single" w:color="000000" w:themeColor="text1" w:sz="4" w:space="0"/>
-              <w:bottom w:val="single" w:color="000000" w:themeColor="text1" w:sz="4" w:space="0"/>
-              <w:right w:val="single" w:color="000000" w:themeColor="text1" w:sz="4" w:space="0"/>
+              <w:top w:val="single" w:sz="4" w:space="0" w:color="000000" w:themeColor="text1"/>
+              <w:left w:val="single" w:sz="4" w:space="0" w:color="000000" w:themeColor="text1"/>
+              <w:bottom w:val="single" w:sz="4" w:space="0" w:color="000000" w:themeColor="text1"/>
+              <w:right w:val="single" w:sz="4" w:space="0" w:color="000000" w:themeColor="text1"/>
             </w:tcBorders>
             <w:tcMar>
               <w:top w:w="80" w:type="dxa"/>
@@ -2676,7 +2450,7 @@
             <w:r>
               <w:rPr>
                 <w:rStyle w:val="None"/>
-                <w:rFonts w:ascii="Roboto" w:hAnsi="Roboto" w:eastAsia="Roboto" w:cs="Roboto"/>
+                <w:rFonts w:ascii="Roboto" w:eastAsia="Roboto" w:hAnsi="Roboto" w:cs="Roboto"/>
                 <w:i/>
                 <w:iCs/>
                 <w:color w:val="1D2125"/>
@@ -2693,7 +2467,7 @@
             <w:tcW w:w="355" w:type="dxa"/>
             <w:tcBorders>
               <w:top w:val="nil"/>
-              <w:left w:val="single" w:color="000000" w:themeColor="text1" w:sz="4" w:space="0"/>
+              <w:left w:val="single" w:sz="4" w:space="0" w:color="000000" w:themeColor="text1"/>
               <w:bottom w:val="nil"/>
               <w:right w:val="nil"/>
             </w:tcBorders>
@@ -2715,10 +2489,10 @@
           <w:tcPr>
             <w:tcW w:w="9005" w:type="dxa"/>
             <w:tcBorders>
-              <w:top w:val="single" w:color="000000" w:themeColor="text1" w:sz="4" w:space="0"/>
-              <w:left w:val="single" w:color="000000" w:themeColor="text1" w:sz="4" w:space="0"/>
-              <w:bottom w:val="single" w:color="000000" w:themeColor="text1" w:sz="4" w:space="0"/>
-              <w:right w:val="single" w:color="000000" w:themeColor="text1" w:sz="4" w:space="0"/>
+              <w:top w:val="single" w:sz="4" w:space="0" w:color="000000" w:themeColor="text1"/>
+              <w:left w:val="single" w:sz="4" w:space="0" w:color="000000" w:themeColor="text1"/>
+              <w:bottom w:val="single" w:sz="4" w:space="0" w:color="000000" w:themeColor="text1"/>
+              <w:right w:val="single" w:sz="4" w:space="0" w:color="000000" w:themeColor="text1"/>
             </w:tcBorders>
             <w:tcMar>
               <w:top w:w="80" w:type="dxa"/>
@@ -2736,7 +2510,7 @@
             <w:r>
               <w:rPr>
                 <w:rStyle w:val="None"/>
-                <w:rFonts w:ascii="Roboto" w:hAnsi="Roboto" w:eastAsia="Roboto" w:cs="Roboto"/>
+                <w:rFonts w:ascii="Roboto" w:eastAsia="Roboto" w:hAnsi="Roboto" w:cs="Roboto"/>
                 <w:b/>
                 <w:bCs/>
                 <w:color w:val="1D2125"/>
@@ -2753,7 +2527,7 @@
             <w:tcW w:w="355" w:type="dxa"/>
             <w:tcBorders>
               <w:top w:val="nil"/>
-              <w:left w:val="single" w:color="000000" w:themeColor="text1" w:sz="4" w:space="0"/>
+              <w:left w:val="single" w:sz="4" w:space="0" w:color="000000" w:themeColor="text1"/>
               <w:bottom w:val="nil"/>
               <w:right w:val="nil"/>
             </w:tcBorders>
@@ -2775,10 +2549,10 @@
           <w:tcPr>
             <w:tcW w:w="9005" w:type="dxa"/>
             <w:tcBorders>
-              <w:top w:val="single" w:color="000000" w:themeColor="text1" w:sz="4" w:space="0"/>
-              <w:left w:val="single" w:color="000000" w:themeColor="text1" w:sz="4" w:space="0"/>
-              <w:bottom w:val="single" w:color="000000" w:themeColor="text1" w:sz="4" w:space="0"/>
-              <w:right w:val="single" w:color="000000" w:themeColor="text1" w:sz="4" w:space="0"/>
+              <w:top w:val="single" w:sz="4" w:space="0" w:color="000000" w:themeColor="text1"/>
+              <w:left w:val="single" w:sz="4" w:space="0" w:color="000000" w:themeColor="text1"/>
+              <w:bottom w:val="single" w:sz="4" w:space="0" w:color="000000" w:themeColor="text1"/>
+              <w:right w:val="single" w:sz="4" w:space="0" w:color="000000" w:themeColor="text1"/>
             </w:tcBorders>
             <w:tcMar>
               <w:top w:w="80" w:type="dxa"/>
@@ -2796,7 +2570,7 @@
             <w:r>
               <w:rPr>
                 <w:rStyle w:val="None"/>
-                <w:rFonts w:ascii="Roboto" w:hAnsi="Roboto" w:eastAsia="Roboto" w:cs="Roboto"/>
+                <w:rFonts w:ascii="Roboto" w:eastAsia="Roboto" w:hAnsi="Roboto" w:cs="Roboto"/>
                 <w:b/>
                 <w:bCs/>
                 <w:color w:val="1D2125"/>
@@ -2813,7 +2587,7 @@
             <w:tcW w:w="355" w:type="dxa"/>
             <w:tcBorders>
               <w:top w:val="nil"/>
-              <w:left w:val="single" w:color="000000" w:themeColor="text1" w:sz="4" w:space="0"/>
+              <w:left w:val="single" w:sz="4" w:space="0" w:color="000000" w:themeColor="text1"/>
               <w:bottom w:val="nil"/>
               <w:right w:val="nil"/>
             </w:tcBorders>
@@ -2835,10 +2609,10 @@
           <w:tcPr>
             <w:tcW w:w="9005" w:type="dxa"/>
             <w:tcBorders>
-              <w:top w:val="single" w:color="000000" w:themeColor="text1" w:sz="4" w:space="0"/>
-              <w:left w:val="single" w:color="000000" w:themeColor="text1" w:sz="4" w:space="0"/>
-              <w:bottom w:val="single" w:color="000000" w:themeColor="text1" w:sz="4" w:space="0"/>
-              <w:right w:val="single" w:color="000000" w:themeColor="text1" w:sz="4" w:space="0"/>
+              <w:top w:val="single" w:sz="4" w:space="0" w:color="000000" w:themeColor="text1"/>
+              <w:left w:val="single" w:sz="4" w:space="0" w:color="000000" w:themeColor="text1"/>
+              <w:bottom w:val="single" w:sz="4" w:space="0" w:color="000000" w:themeColor="text1"/>
+              <w:right w:val="single" w:sz="4" w:space="0" w:color="000000" w:themeColor="text1"/>
             </w:tcBorders>
             <w:tcMar>
               <w:top w:w="80" w:type="dxa"/>
@@ -2855,7 +2629,7 @@
             <w:r>
               <w:rPr>
                 <w:rStyle w:val="None"/>
-                <w:rFonts w:ascii="Roboto" w:hAnsi="Roboto" w:eastAsia="Roboto" w:cs="Roboto"/>
+                <w:rFonts w:ascii="Roboto" w:eastAsia="Roboto" w:hAnsi="Roboto" w:cs="Roboto"/>
                 <w:i/>
                 <w:iCs/>
                 <w:color w:val="1D2125"/>
@@ -2872,7 +2646,7 @@
             <w:tcW w:w="355" w:type="dxa"/>
             <w:tcBorders>
               <w:top w:val="nil"/>
-              <w:left w:val="single" w:color="000000" w:themeColor="text1" w:sz="4" w:space="0"/>
+              <w:left w:val="single" w:sz="4" w:space="0" w:color="000000" w:themeColor="text1"/>
               <w:bottom w:val="nil"/>
               <w:right w:val="nil"/>
             </w:tcBorders>
@@ -2894,10 +2668,10 @@
           <w:tcPr>
             <w:tcW w:w="9005" w:type="dxa"/>
             <w:tcBorders>
-              <w:top w:val="single" w:color="000000" w:themeColor="text1" w:sz="4" w:space="0"/>
-              <w:left w:val="single" w:color="000000" w:themeColor="text1" w:sz="4" w:space="0"/>
-              <w:bottom w:val="single" w:color="000000" w:themeColor="text1" w:sz="4" w:space="0"/>
-              <w:right w:val="single" w:color="000000" w:themeColor="text1" w:sz="4" w:space="0"/>
+              <w:top w:val="single" w:sz="4" w:space="0" w:color="000000" w:themeColor="text1"/>
+              <w:left w:val="single" w:sz="4" w:space="0" w:color="000000" w:themeColor="text1"/>
+              <w:bottom w:val="single" w:sz="4" w:space="0" w:color="000000" w:themeColor="text1"/>
+              <w:right w:val="single" w:sz="4" w:space="0" w:color="000000" w:themeColor="text1"/>
             </w:tcBorders>
             <w:tcMar>
               <w:top w:w="80" w:type="dxa"/>
@@ -2915,7 +2689,7 @@
             <w:r>
               <w:rPr>
                 <w:rStyle w:val="None"/>
-                <w:rFonts w:ascii="Roboto" w:hAnsi="Roboto" w:eastAsia="Roboto" w:cs="Roboto"/>
+                <w:rFonts w:ascii="Roboto" w:eastAsia="Roboto" w:hAnsi="Roboto" w:cs="Roboto"/>
                 <w:b/>
                 <w:bCs/>
                 <w:color w:val="1D2125"/>
@@ -2932,7 +2706,7 @@
             <w:tcW w:w="355" w:type="dxa"/>
             <w:tcBorders>
               <w:top w:val="nil"/>
-              <w:left w:val="single" w:color="000000" w:themeColor="text1" w:sz="4" w:space="0"/>
+              <w:left w:val="single" w:sz="4" w:space="0" w:color="000000" w:themeColor="text1"/>
               <w:bottom w:val="nil"/>
               <w:right w:val="nil"/>
             </w:tcBorders>
@@ -2954,10 +2728,10 @@
           <w:tcPr>
             <w:tcW w:w="9005" w:type="dxa"/>
             <w:tcBorders>
-              <w:top w:val="single" w:color="000000" w:themeColor="text1" w:sz="4" w:space="0"/>
-              <w:left w:val="single" w:color="000000" w:themeColor="text1" w:sz="4" w:space="0"/>
-              <w:bottom w:val="single" w:color="000000" w:themeColor="text1" w:sz="4" w:space="0"/>
-              <w:right w:val="single" w:color="000000" w:themeColor="text1" w:sz="4" w:space="0"/>
+              <w:top w:val="single" w:sz="4" w:space="0" w:color="000000" w:themeColor="text1"/>
+              <w:left w:val="single" w:sz="4" w:space="0" w:color="000000" w:themeColor="text1"/>
+              <w:bottom w:val="single" w:sz="4" w:space="0" w:color="000000" w:themeColor="text1"/>
+              <w:right w:val="single" w:sz="4" w:space="0" w:color="000000" w:themeColor="text1"/>
             </w:tcBorders>
             <w:tcMar>
               <w:top w:w="80" w:type="dxa"/>
@@ -2974,7 +2748,7 @@
             <w:r>
               <w:rPr>
                 <w:rStyle w:val="None"/>
-                <w:rFonts w:ascii="Roboto" w:hAnsi="Roboto" w:eastAsia="Roboto" w:cs="Roboto"/>
+                <w:rFonts w:ascii="Roboto" w:eastAsia="Roboto" w:hAnsi="Roboto" w:cs="Roboto"/>
                 <w:i/>
                 <w:iCs/>
                 <w:color w:val="1D2125"/>
@@ -2991,7 +2765,7 @@
             <w:tcW w:w="355" w:type="dxa"/>
             <w:tcBorders>
               <w:top w:val="nil"/>
-              <w:left w:val="single" w:color="000000" w:themeColor="text1" w:sz="4" w:space="0"/>
+              <w:left w:val="single" w:sz="4" w:space="0" w:color="000000" w:themeColor="text1"/>
               <w:bottom w:val="nil"/>
               <w:right w:val="nil"/>
             </w:tcBorders>
@@ -3013,10 +2787,10 @@
           <w:tcPr>
             <w:tcW w:w="9005" w:type="dxa"/>
             <w:tcBorders>
-              <w:top w:val="single" w:color="000000" w:themeColor="text1" w:sz="4" w:space="0"/>
-              <w:left w:val="single" w:color="000000" w:themeColor="text1" w:sz="4" w:space="0"/>
-              <w:bottom w:val="single" w:color="000000" w:themeColor="text1" w:sz="4" w:space="0"/>
-              <w:right w:val="single" w:color="000000" w:themeColor="text1" w:sz="4" w:space="0"/>
+              <w:top w:val="single" w:sz="4" w:space="0" w:color="000000" w:themeColor="text1"/>
+              <w:left w:val="single" w:sz="4" w:space="0" w:color="000000" w:themeColor="text1"/>
+              <w:bottom w:val="single" w:sz="4" w:space="0" w:color="000000" w:themeColor="text1"/>
+              <w:right w:val="single" w:sz="4" w:space="0" w:color="000000" w:themeColor="text1"/>
             </w:tcBorders>
             <w:tcMar>
               <w:top w:w="80" w:type="dxa"/>
@@ -3034,7 +2808,7 @@
             <w:r>
               <w:rPr>
                 <w:rStyle w:val="None"/>
-                <w:rFonts w:ascii="Roboto" w:hAnsi="Roboto" w:eastAsia="Roboto" w:cs="Roboto"/>
+                <w:rFonts w:ascii="Roboto" w:eastAsia="Roboto" w:hAnsi="Roboto" w:cs="Roboto"/>
                 <w:b/>
                 <w:bCs/>
                 <w:color w:val="1D2125"/>
@@ -3051,7 +2825,7 @@
             <w:tcW w:w="355" w:type="dxa"/>
             <w:tcBorders>
               <w:top w:val="nil"/>
-              <w:left w:val="single" w:color="000000" w:themeColor="text1" w:sz="4" w:space="0"/>
+              <w:left w:val="single" w:sz="4" w:space="0" w:color="000000" w:themeColor="text1"/>
               <w:bottom w:val="nil"/>
               <w:right w:val="nil"/>
             </w:tcBorders>
@@ -3073,10 +2847,10 @@
           <w:tcPr>
             <w:tcW w:w="9005" w:type="dxa"/>
             <w:tcBorders>
-              <w:top w:val="single" w:color="000000" w:themeColor="text1" w:sz="4" w:space="0"/>
-              <w:left w:val="single" w:color="000000" w:themeColor="text1" w:sz="4" w:space="0"/>
-              <w:bottom w:val="single" w:color="000000" w:themeColor="text1" w:sz="4" w:space="0"/>
-              <w:right w:val="single" w:color="000000" w:themeColor="text1" w:sz="4" w:space="0"/>
+              <w:top w:val="single" w:sz="4" w:space="0" w:color="000000" w:themeColor="text1"/>
+              <w:left w:val="single" w:sz="4" w:space="0" w:color="000000" w:themeColor="text1"/>
+              <w:bottom w:val="single" w:sz="4" w:space="0" w:color="000000" w:themeColor="text1"/>
+              <w:right w:val="single" w:sz="4" w:space="0" w:color="000000" w:themeColor="text1"/>
             </w:tcBorders>
             <w:tcMar>
               <w:top w:w="80" w:type="dxa"/>
@@ -3093,7 +2867,7 @@
             <w:r>
               <w:rPr>
                 <w:rStyle w:val="None"/>
-                <w:rFonts w:ascii="Roboto" w:hAnsi="Roboto" w:eastAsia="Roboto" w:cs="Roboto"/>
+                <w:rFonts w:ascii="Roboto" w:eastAsia="Roboto" w:hAnsi="Roboto" w:cs="Roboto"/>
                 <w:i/>
                 <w:iCs/>
                 <w:color w:val="1D2125"/>
@@ -3101,6 +2875,7 @@
                 <w:szCs w:val="24"/>
                 <w:u w:color="1D2125"/>
               </w:rPr>
+              <w:lastRenderedPageBreak/>
               <w:t>Insert the time taken for each of the 5 tasks here</w:t>
             </w:r>
           </w:p>
@@ -3110,7 +2885,7 @@
             <w:tcW w:w="355" w:type="dxa"/>
             <w:tcBorders>
               <w:top w:val="nil"/>
-              <w:left w:val="single" w:color="000000" w:themeColor="text1" w:sz="4" w:space="0"/>
+              <w:left w:val="single" w:sz="4" w:space="0" w:color="000000" w:themeColor="text1"/>
               <w:bottom w:val="nil"/>
               <w:right w:val="nil"/>
             </w:tcBorders>
@@ -3132,10 +2907,10 @@
           <w:tcPr>
             <w:tcW w:w="9005" w:type="dxa"/>
             <w:tcBorders>
-              <w:top w:val="single" w:color="000000" w:themeColor="text1" w:sz="4" w:space="0"/>
-              <w:left w:val="single" w:color="000000" w:themeColor="text1" w:sz="4" w:space="0"/>
-              <w:bottom w:val="single" w:color="000000" w:themeColor="text1" w:sz="4" w:space="0"/>
-              <w:right w:val="single" w:color="000000" w:themeColor="text1" w:sz="4" w:space="0"/>
+              <w:top w:val="single" w:sz="4" w:space="0" w:color="000000" w:themeColor="text1"/>
+              <w:left w:val="single" w:sz="4" w:space="0" w:color="000000" w:themeColor="text1"/>
+              <w:bottom w:val="single" w:sz="4" w:space="0" w:color="000000" w:themeColor="text1"/>
+              <w:right w:val="single" w:sz="4" w:space="0" w:color="000000" w:themeColor="text1"/>
             </w:tcBorders>
             <w:tcMar>
               <w:top w:w="80" w:type="dxa"/>
@@ -3153,7 +2928,7 @@
             <w:r>
               <w:rPr>
                 <w:rStyle w:val="None"/>
-                <w:rFonts w:ascii="Roboto" w:hAnsi="Roboto" w:eastAsia="Roboto" w:cs="Roboto"/>
+                <w:rFonts w:ascii="Roboto" w:eastAsia="Roboto" w:hAnsi="Roboto" w:cs="Roboto"/>
                 <w:b/>
                 <w:bCs/>
                 <w:color w:val="1D2125"/>
@@ -3170,7 +2945,7 @@
             <w:tcW w:w="355" w:type="dxa"/>
             <w:tcBorders>
               <w:top w:val="nil"/>
-              <w:left w:val="single" w:color="000000" w:themeColor="text1" w:sz="4" w:space="0"/>
+              <w:left w:val="single" w:sz="4" w:space="0" w:color="000000" w:themeColor="text1"/>
               <w:bottom w:val="nil"/>
               <w:right w:val="nil"/>
             </w:tcBorders>
@@ -3192,10 +2967,10 @@
           <w:tcPr>
             <w:tcW w:w="9005" w:type="dxa"/>
             <w:tcBorders>
-              <w:top w:val="single" w:color="000000" w:themeColor="text1" w:sz="4" w:space="0"/>
-              <w:left w:val="single" w:color="000000" w:themeColor="text1" w:sz="4" w:space="0"/>
-              <w:bottom w:val="single" w:color="000000" w:themeColor="text1" w:sz="4" w:space="0"/>
-              <w:right w:val="single" w:color="000000" w:themeColor="text1" w:sz="4" w:space="0"/>
+              <w:top w:val="single" w:sz="4" w:space="0" w:color="000000" w:themeColor="text1"/>
+              <w:left w:val="single" w:sz="4" w:space="0" w:color="000000" w:themeColor="text1"/>
+              <w:bottom w:val="single" w:sz="4" w:space="0" w:color="000000" w:themeColor="text1"/>
+              <w:right w:val="single" w:sz="4" w:space="0" w:color="000000" w:themeColor="text1"/>
             </w:tcBorders>
             <w:tcMar>
               <w:top w:w="80" w:type="dxa"/>
@@ -3213,7 +2988,7 @@
             <w:r>
               <w:rPr>
                 <w:rStyle w:val="None"/>
-                <w:rFonts w:ascii="Roboto" w:hAnsi="Roboto" w:eastAsia="Roboto" w:cs="Roboto"/>
+                <w:rFonts w:ascii="Roboto" w:eastAsia="Roboto" w:hAnsi="Roboto" w:cs="Roboto"/>
                 <w:b/>
                 <w:bCs/>
                 <w:color w:val="1D2125"/>
@@ -3230,7 +3005,7 @@
             <w:tcW w:w="355" w:type="dxa"/>
             <w:tcBorders>
               <w:top w:val="nil"/>
-              <w:left w:val="single" w:color="000000" w:themeColor="text1" w:sz="4" w:space="0"/>
+              <w:left w:val="single" w:sz="4" w:space="0" w:color="000000" w:themeColor="text1"/>
               <w:bottom w:val="nil"/>
               <w:right w:val="nil"/>
             </w:tcBorders>
@@ -3252,10 +3027,10 @@
           <w:tcPr>
             <w:tcW w:w="9005" w:type="dxa"/>
             <w:tcBorders>
-              <w:top w:val="single" w:color="000000" w:themeColor="text1" w:sz="4" w:space="0"/>
-              <w:left w:val="single" w:color="000000" w:themeColor="text1" w:sz="4" w:space="0"/>
-              <w:bottom w:val="single" w:color="000000" w:themeColor="text1" w:sz="4" w:space="0"/>
-              <w:right w:val="single" w:color="000000" w:themeColor="text1" w:sz="4" w:space="0"/>
+              <w:top w:val="single" w:sz="4" w:space="0" w:color="000000" w:themeColor="text1"/>
+              <w:left w:val="single" w:sz="4" w:space="0" w:color="000000" w:themeColor="text1"/>
+              <w:bottom w:val="single" w:sz="4" w:space="0" w:color="000000" w:themeColor="text1"/>
+              <w:right w:val="single" w:sz="4" w:space="0" w:color="000000" w:themeColor="text1"/>
             </w:tcBorders>
             <w:tcMar>
               <w:top w:w="80" w:type="dxa"/>
@@ -3270,7 +3045,7 @@
               <w:spacing w:line="240" w:lineRule="auto"/>
               <w:rPr>
                 <w:rStyle w:val="None"/>
-                <w:rFonts w:ascii="Roboto" w:hAnsi="Roboto" w:eastAsia="Roboto" w:cs="Roboto"/>
+                <w:rFonts w:ascii="Roboto" w:eastAsia="Roboto" w:hAnsi="Roboto" w:cs="Roboto"/>
                 <w:i/>
                 <w:iCs/>
                 <w:color w:val="1D2125"/>
@@ -3282,308 +3057,7 @@
             <w:r>
               <w:rPr>
                 <w:rStyle w:val="None"/>
-                <w:rFonts w:ascii="Roboto" w:hAnsi="Roboto" w:eastAsia="Roboto" w:cs="Roboto"/>
-                <w:i/>
-                <w:iCs/>
-                <w:color w:val="1D2125"/>
-                <w:sz w:val="24"/>
-                <w:szCs w:val="24"/>
-                <w:u w:color="1D2125"/>
-              </w:rPr>
-              <w:t xml:space="preserve">List the answers you received from the user after Tree test below - </w:t>
-            </w:r>
-          </w:p>
-          <w:p>
-            <w:pPr>
-              <w:pStyle w:val="ListParagraph"/>
-              <w:numPr>
-                <w:ilvl w:val="0"/>
-                <w:numId w:val="1"/>
-              </w:numPr>
-              <w:shd w:val="clear" w:color="auto" w:fill="F8F9FA"/>
-              <w:spacing w:line="240" w:lineRule="auto"/>
-              <w:jc w:val="both"/>
-              <w:rPr>
-                <w:rFonts w:ascii="Roboto" w:hAnsi="Roboto" w:eastAsia="Roboto" w:cs="Roboto"/>
-                <w:color w:val="1D2125"/>
-                <w:sz w:val="24"/>
-                <w:szCs w:val="24"/>
-                <w:u w:color="1D2125"/>
-              </w:rPr>
-            </w:pPr>
-            <w:r>
-              <w:rPr>
-                <w:rStyle w:val="None"/>
-                <w:rFonts w:ascii="Roboto" w:hAnsi="Roboto" w:eastAsia="Roboto" w:cs="Roboto"/>
-                <w:color w:val="1D2125"/>
-                <w:sz w:val="24"/>
-                <w:szCs w:val="24"/>
-                <w:u w:color="1D2125"/>
-              </w:rPr>
-              <w:t xml:space="preserve">Did you find the pages where you thought they should?  If not, which pages were not where you expected them to be in the menu hierarchy?  </w:t>
-            </w:r>
-            <w:r>
-              <w:rPr>
-                <w:rStyle w:val="None"/>
-                <w:rFonts w:ascii="Roboto" w:hAnsi="Roboto" w:eastAsia="Roboto" w:cs="Roboto"/>
-                <w:b/>
-                <w:bCs/>
-                <w:color w:val="1D2125"/>
-                <w:sz w:val="24"/>
-                <w:szCs w:val="24"/>
-                <w:u w:color="1D2125"/>
-              </w:rPr>
-              <w:t>ANS:</w:t>
-            </w:r>
-          </w:p>
-          <w:p>
-            <w:pPr>
-              <w:pStyle w:val="ListParagraph"/>
-              <w:numPr>
-                <w:ilvl w:val="0"/>
-                <w:numId w:val="1"/>
-              </w:numPr>
-              <w:shd w:val="clear" w:color="auto" w:fill="F8F9FA"/>
-              <w:spacing w:line="240" w:lineRule="auto"/>
-              <w:jc w:val="both"/>
-              <w:rPr>
-                <w:rFonts w:ascii="Roboto" w:hAnsi="Roboto" w:eastAsia="Roboto" w:cs="Roboto"/>
-                <w:color w:val="1D2125"/>
-                <w:sz w:val="24"/>
-                <w:szCs w:val="24"/>
-                <w:u w:color="1D2125"/>
-              </w:rPr>
-            </w:pPr>
-            <w:r>
-              <w:rPr>
-                <w:rStyle w:val="None"/>
-                <w:rFonts w:ascii="Roboto" w:hAnsi="Roboto" w:eastAsia="Roboto" w:cs="Roboto"/>
-                <w:color w:val="1D2125"/>
-                <w:sz w:val="24"/>
-                <w:szCs w:val="24"/>
-                <w:u w:color="1D2125"/>
-              </w:rPr>
-              <w:t>Did it take more time than you thought it would take?  If so, why do you think it took longer?</w:t>
-            </w:r>
-            <w:r>
-              <w:rPr>
-                <w:rStyle w:val="None"/>
-                <w:rFonts w:ascii="Roboto" w:hAnsi="Roboto" w:eastAsia="Roboto" w:cs="Roboto"/>
-                <w:b/>
-                <w:bCs/>
-                <w:color w:val="1D2125"/>
-                <w:sz w:val="24"/>
-                <w:szCs w:val="24"/>
-                <w:u w:color="1D2125"/>
-              </w:rPr>
-              <w:t xml:space="preserve"> ANS:</w:t>
-            </w:r>
-          </w:p>
-          <w:p>
-            <w:pPr>
-              <w:pStyle w:val="ListParagraph"/>
-              <w:numPr>
-                <w:ilvl w:val="0"/>
-                <w:numId w:val="1"/>
-              </w:numPr>
-              <w:shd w:val="clear" w:color="auto" w:fill="F8F9FA"/>
-              <w:spacing w:line="240" w:lineRule="auto"/>
-              <w:jc w:val="both"/>
-              <w:rPr>
-                <w:rFonts w:ascii="Roboto" w:hAnsi="Roboto" w:eastAsia="Roboto" w:cs="Roboto"/>
-                <w:color w:val="1D2125"/>
-                <w:sz w:val="24"/>
-                <w:szCs w:val="24"/>
-                <w:u w:color="1D2125"/>
-              </w:rPr>
-            </w:pPr>
-            <w:r>
-              <w:rPr>
-                <w:rStyle w:val="None"/>
-                <w:rFonts w:ascii="Roboto" w:hAnsi="Roboto" w:eastAsia="Roboto" w:cs="Roboto"/>
-                <w:color w:val="1D2125"/>
-                <w:sz w:val="24"/>
-                <w:szCs w:val="24"/>
-                <w:u w:color="1D2125"/>
-              </w:rPr>
-              <w:t>Were menu items labeled properly to indicate relevant resources?  If not, what was mislabeled and how would you correct it?</w:t>
-            </w:r>
-            <w:r>
-              <w:rPr>
-                <w:rStyle w:val="None"/>
-                <w:rFonts w:ascii="Roboto" w:hAnsi="Roboto" w:eastAsia="Roboto" w:cs="Roboto"/>
-                <w:b/>
-                <w:bCs/>
-                <w:color w:val="1D2125"/>
-                <w:sz w:val="24"/>
-                <w:szCs w:val="24"/>
-                <w:u w:color="1D2125"/>
-              </w:rPr>
-              <w:t xml:space="preserve"> ANS:</w:t>
-            </w:r>
-          </w:p>
-          <w:p>
-            <w:pPr>
-              <w:pStyle w:val="ListParagraph"/>
-              <w:numPr>
-                <w:ilvl w:val="0"/>
-                <w:numId w:val="1"/>
-              </w:numPr>
-              <w:shd w:val="clear" w:color="auto" w:fill="F8F9FA"/>
-              <w:spacing w:line="240" w:lineRule="auto"/>
-              <w:jc w:val="both"/>
-              <w:rPr>
-                <w:rFonts w:ascii="Roboto" w:hAnsi="Roboto" w:eastAsia="Roboto" w:cs="Roboto"/>
-                <w:color w:val="1D2125"/>
-                <w:sz w:val="24"/>
-                <w:szCs w:val="24"/>
-                <w:u w:color="1D2125"/>
-              </w:rPr>
-            </w:pPr>
-            <w:r>
-              <w:rPr>
-                <w:rStyle w:val="None"/>
-                <w:rFonts w:ascii="Roboto" w:hAnsi="Roboto" w:eastAsia="Roboto" w:cs="Roboto"/>
-                <w:color w:val="1D2125"/>
-                <w:sz w:val="24"/>
-                <w:szCs w:val="24"/>
-                <w:u w:color="1D2125"/>
-              </w:rPr>
-              <w:t>Do you have any suggestions to make the site navigation easier?</w:t>
-            </w:r>
-            <w:r>
-              <w:rPr>
-                <w:rStyle w:val="None"/>
-                <w:rFonts w:ascii="Roboto" w:hAnsi="Roboto" w:eastAsia="Roboto" w:cs="Roboto"/>
-                <w:b/>
-                <w:bCs/>
-                <w:color w:val="1D2125"/>
-                <w:sz w:val="24"/>
-                <w:szCs w:val="24"/>
-                <w:u w:color="1D2125"/>
-              </w:rPr>
-              <w:t xml:space="preserve"> ANS:</w:t>
-            </w:r>
-          </w:p>
-        </w:tc>
-        <w:tc>
-          <w:tcPr>
-            <w:tcW w:w="355" w:type="dxa"/>
-            <w:tcBorders>
-              <w:top w:val="nil"/>
-              <w:left w:val="single" w:color="000000" w:themeColor="text1" w:sz="4" w:space="0"/>
-              <w:bottom w:val="nil"/>
-              <w:right w:val="nil"/>
-            </w:tcBorders>
-            <w:tcMar>
-              <w:top w:w="80" w:type="dxa"/>
-              <w:left w:w="80" w:type="dxa"/>
-              <w:bottom w:w="80" w:type="dxa"/>
-              <w:right w:w="80" w:type="dxa"/>
-            </w:tcMar>
-          </w:tcPr>
-          <w:p/>
-        </w:tc>
-      </w:tr>
-      <w:tr>
-        <w:trPr>
-          <w:trHeight w:val="290"/>
-        </w:trPr>
-        <w:tc>
-          <w:tcPr>
-            <w:tcW w:w="9005" w:type="dxa"/>
-            <w:tcBorders>
-              <w:top w:val="single" w:color="000000" w:themeColor="text1" w:sz="4" w:space="0"/>
-              <w:left w:val="single" w:color="000000" w:themeColor="text1" w:sz="4" w:space="0"/>
-              <w:bottom w:val="single" w:color="000000" w:themeColor="text1" w:sz="4" w:space="0"/>
-              <w:right w:val="single" w:color="000000" w:themeColor="text1" w:sz="4" w:space="0"/>
-            </w:tcBorders>
-            <w:tcMar>
-              <w:top w:w="80" w:type="dxa"/>
-              <w:left w:w="80" w:type="dxa"/>
-              <w:bottom w:w="80" w:type="dxa"/>
-              <w:right w:w="80" w:type="dxa"/>
-            </w:tcMar>
-          </w:tcPr>
-          <w:p>
-            <w:pPr>
-              <w:pStyle w:val="Body"/>
-              <w:spacing w:line="240" w:lineRule="auto"/>
-              <w:jc w:val="center"/>
-            </w:pPr>
-            <w:r>
-              <w:rPr>
-                <w:rStyle w:val="None"/>
-                <w:rFonts w:ascii="Roboto" w:hAnsi="Roboto" w:eastAsia="Roboto" w:cs="Roboto"/>
-                <w:b/>
-                <w:bCs/>
-                <w:color w:val="1D2125"/>
-                <w:sz w:val="24"/>
-                <w:szCs w:val="24"/>
-                <w:u w:color="1D2125"/>
-              </w:rPr>
-              <w:t>Noah Barcomb</w:t>
-            </w:r>
-          </w:p>
-        </w:tc>
-        <w:tc>
-          <w:tcPr>
-            <w:tcW w:w="355" w:type="dxa"/>
-            <w:tcBorders>
-              <w:top w:val="nil"/>
-              <w:left w:val="single" w:color="000000" w:themeColor="text1" w:sz="4" w:space="0"/>
-              <w:bottom w:val="nil"/>
-              <w:right w:val="nil"/>
-            </w:tcBorders>
-            <w:tcMar>
-              <w:top w:w="80" w:type="dxa"/>
-              <w:left w:w="80" w:type="dxa"/>
-              <w:bottom w:w="80" w:type="dxa"/>
-              <w:right w:w="80" w:type="dxa"/>
-            </w:tcMar>
-          </w:tcPr>
-          <w:p/>
-        </w:tc>
-      </w:tr>
-      <w:tr>
-        <w:trPr>
-          <w:trHeight w:val="2530"/>
-        </w:trPr>
-        <w:tc>
-          <w:tcPr>
-            <w:tcW w:w="9005" w:type="dxa"/>
-            <w:tcBorders>
-              <w:top w:val="single" w:color="000000" w:themeColor="text1" w:sz="4" w:space="0"/>
-              <w:left w:val="single" w:color="000000" w:themeColor="text1" w:sz="4" w:space="0"/>
-              <w:bottom w:val="single" w:color="000000" w:themeColor="text1" w:sz="4" w:space="0"/>
-              <w:right w:val="single" w:color="000000" w:themeColor="text1" w:sz="4" w:space="0"/>
-            </w:tcBorders>
-            <w:tcMar>
-              <w:top w:w="80" w:type="dxa"/>
-              <w:left w:w="80" w:type="dxa"/>
-              <w:bottom w:w="80" w:type="dxa"/>
-              <w:right w:w="80" w:type="dxa"/>
-            </w:tcMar>
-          </w:tcPr>
-          <w:p>
-            <w:pPr>
-              <w:pStyle w:val="Body"/>
-              <w:spacing w:line="240" w:lineRule="auto"/>
-              <w:rPr>
-                <w:rStyle w:val="None"/>
-                <w:rFonts w:ascii="Roboto" w:hAnsi="Roboto" w:eastAsia="Roboto" w:cs="Roboto"/>
-                <w:i/>
-                <w:iCs/>
-                <w:color w:val="1D2125"/>
-                <w:sz w:val="24"/>
-                <w:szCs w:val="24"/>
-                <w:u w:color="1D2125"/>
-              </w:rPr>
-            </w:pPr>
-            <w:r>
-              <w:rPr>
-                <w:rStyle w:val="None"/>
-                <w:rFonts w:ascii="Roboto" w:hAnsi="Roboto" w:eastAsia="Roboto" w:cs="Roboto"/>
+                <w:rFonts w:ascii="Roboto" w:eastAsia="Roboto" w:hAnsi="Roboto" w:cs="Roboto"/>
                 <w:i/>
                 <w:iCs/>
                 <w:color w:val="1D2125"/>
@@ -3605,17 +3079,17 @@
               <w:spacing w:line="240" w:lineRule="auto"/>
               <w:jc w:val="both"/>
               <w:rPr>
-                <w:rFonts w:ascii="Roboto" w:hAnsi="Roboto" w:eastAsia="Roboto" w:cs="Roboto"/>
-                <w:color w:val="1D2125"/>
-                <w:sz w:val="24"/>
-                <w:szCs w:val="24"/>
-                <w:u w:color="1D2125"/>
-              </w:rPr>
-            </w:pPr>
-            <w:r>
-              <w:rPr>
-                <w:rStyle w:val="None"/>
-                <w:rFonts w:ascii="Roboto" w:hAnsi="Roboto" w:eastAsia="Roboto" w:cs="Roboto"/>
+                <w:rFonts w:ascii="Roboto" w:eastAsia="Roboto" w:hAnsi="Roboto" w:cs="Roboto"/>
+                <w:color w:val="1D2125"/>
+                <w:sz w:val="24"/>
+                <w:szCs w:val="24"/>
+                <w:u w:color="1D2125"/>
+              </w:rPr>
+            </w:pPr>
+            <w:r>
+              <w:rPr>
+                <w:rStyle w:val="None"/>
+                <w:rFonts w:ascii="Roboto" w:eastAsia="Roboto" w:hAnsi="Roboto" w:cs="Roboto"/>
                 <w:color w:val="1D2125"/>
                 <w:sz w:val="24"/>
                 <w:szCs w:val="24"/>
@@ -3626,7 +3100,7 @@
             <w:r>
               <w:rPr>
                 <w:rStyle w:val="None"/>
-                <w:rFonts w:ascii="Roboto" w:hAnsi="Roboto" w:eastAsia="Roboto" w:cs="Roboto"/>
+                <w:rFonts w:ascii="Roboto" w:eastAsia="Roboto" w:hAnsi="Roboto" w:cs="Roboto"/>
                 <w:b/>
                 <w:bCs/>
                 <w:color w:val="1D2125"/>
@@ -3648,17 +3122,17 @@
               <w:spacing w:line="240" w:lineRule="auto"/>
               <w:jc w:val="both"/>
               <w:rPr>
-                <w:rFonts w:ascii="Roboto" w:hAnsi="Roboto" w:eastAsia="Roboto" w:cs="Roboto"/>
-                <w:color w:val="1D2125"/>
-                <w:sz w:val="24"/>
-                <w:szCs w:val="24"/>
-                <w:u w:color="1D2125"/>
-              </w:rPr>
-            </w:pPr>
-            <w:r>
-              <w:rPr>
-                <w:rStyle w:val="None"/>
-                <w:rFonts w:ascii="Roboto" w:hAnsi="Roboto" w:eastAsia="Roboto" w:cs="Roboto"/>
+                <w:rFonts w:ascii="Roboto" w:eastAsia="Roboto" w:hAnsi="Roboto" w:cs="Roboto"/>
+                <w:color w:val="1D2125"/>
+                <w:sz w:val="24"/>
+                <w:szCs w:val="24"/>
+                <w:u w:color="1D2125"/>
+              </w:rPr>
+            </w:pPr>
+            <w:r>
+              <w:rPr>
+                <w:rStyle w:val="None"/>
+                <w:rFonts w:ascii="Roboto" w:eastAsia="Roboto" w:hAnsi="Roboto" w:cs="Roboto"/>
                 <w:color w:val="1D2125"/>
                 <w:sz w:val="24"/>
                 <w:szCs w:val="24"/>
@@ -3669,7 +3143,7 @@
             <w:r>
               <w:rPr>
                 <w:rStyle w:val="None"/>
-                <w:rFonts w:ascii="Roboto" w:hAnsi="Roboto" w:eastAsia="Roboto" w:cs="Roboto"/>
+                <w:rFonts w:ascii="Roboto" w:eastAsia="Roboto" w:hAnsi="Roboto" w:cs="Roboto"/>
                 <w:b/>
                 <w:bCs/>
                 <w:color w:val="1D2125"/>
@@ -3691,17 +3165,17 @@
               <w:spacing w:line="240" w:lineRule="auto"/>
               <w:jc w:val="both"/>
               <w:rPr>
-                <w:rFonts w:ascii="Roboto" w:hAnsi="Roboto" w:eastAsia="Roboto" w:cs="Roboto"/>
-                <w:color w:val="1D2125"/>
-                <w:sz w:val="24"/>
-                <w:szCs w:val="24"/>
-                <w:u w:color="1D2125"/>
-              </w:rPr>
-            </w:pPr>
-            <w:r>
-              <w:rPr>
-                <w:rStyle w:val="None"/>
-                <w:rFonts w:ascii="Roboto" w:hAnsi="Roboto" w:eastAsia="Roboto" w:cs="Roboto"/>
+                <w:rFonts w:ascii="Roboto" w:eastAsia="Roboto" w:hAnsi="Roboto" w:cs="Roboto"/>
+                <w:color w:val="1D2125"/>
+                <w:sz w:val="24"/>
+                <w:szCs w:val="24"/>
+                <w:u w:color="1D2125"/>
+              </w:rPr>
+            </w:pPr>
+            <w:r>
+              <w:rPr>
+                <w:rStyle w:val="None"/>
+                <w:rFonts w:ascii="Roboto" w:eastAsia="Roboto" w:hAnsi="Roboto" w:cs="Roboto"/>
                 <w:color w:val="1D2125"/>
                 <w:sz w:val="24"/>
                 <w:szCs w:val="24"/>
@@ -3712,7 +3186,7 @@
             <w:r>
               <w:rPr>
                 <w:rStyle w:val="None"/>
-                <w:rFonts w:ascii="Roboto" w:hAnsi="Roboto" w:eastAsia="Roboto" w:cs="Roboto"/>
+                <w:rFonts w:ascii="Roboto" w:eastAsia="Roboto" w:hAnsi="Roboto" w:cs="Roboto"/>
                 <w:b/>
                 <w:bCs/>
                 <w:color w:val="1D2125"/>
@@ -3734,17 +3208,17 @@
               <w:spacing w:line="240" w:lineRule="auto"/>
               <w:jc w:val="both"/>
               <w:rPr>
-                <w:rFonts w:ascii="Roboto" w:hAnsi="Roboto" w:eastAsia="Roboto" w:cs="Roboto"/>
-                <w:color w:val="1D2125"/>
-                <w:sz w:val="24"/>
-                <w:szCs w:val="24"/>
-                <w:u w:color="1D2125"/>
-              </w:rPr>
-            </w:pPr>
-            <w:r>
-              <w:rPr>
-                <w:rStyle w:val="None"/>
-                <w:rFonts w:ascii="Roboto" w:hAnsi="Roboto" w:eastAsia="Roboto" w:cs="Roboto"/>
+                <w:rFonts w:ascii="Roboto" w:eastAsia="Roboto" w:hAnsi="Roboto" w:cs="Roboto"/>
+                <w:color w:val="1D2125"/>
+                <w:sz w:val="24"/>
+                <w:szCs w:val="24"/>
+                <w:u w:color="1D2125"/>
+              </w:rPr>
+            </w:pPr>
+            <w:r>
+              <w:rPr>
+                <w:rStyle w:val="None"/>
+                <w:rFonts w:ascii="Roboto" w:eastAsia="Roboto" w:hAnsi="Roboto" w:cs="Roboto"/>
                 <w:color w:val="1D2125"/>
                 <w:sz w:val="24"/>
                 <w:szCs w:val="24"/>
@@ -3755,7 +3229,7 @@
             <w:r>
               <w:rPr>
                 <w:rStyle w:val="None"/>
-                <w:rFonts w:ascii="Roboto" w:hAnsi="Roboto" w:eastAsia="Roboto" w:cs="Roboto"/>
+                <w:rFonts w:ascii="Roboto" w:eastAsia="Roboto" w:hAnsi="Roboto" w:cs="Roboto"/>
                 <w:b/>
                 <w:bCs/>
                 <w:color w:val="1D2125"/>
@@ -3772,7 +3246,7 @@
             <w:tcW w:w="355" w:type="dxa"/>
             <w:tcBorders>
               <w:top w:val="nil"/>
-              <w:left w:val="single" w:color="000000" w:themeColor="text1" w:sz="4" w:space="0"/>
+              <w:left w:val="single" w:sz="4" w:space="0" w:color="000000" w:themeColor="text1"/>
               <w:bottom w:val="nil"/>
               <w:right w:val="nil"/>
             </w:tcBorders>
@@ -3794,10 +3268,10 @@
           <w:tcPr>
             <w:tcW w:w="9005" w:type="dxa"/>
             <w:tcBorders>
-              <w:top w:val="single" w:color="000000" w:themeColor="text1" w:sz="4" w:space="0"/>
-              <w:left w:val="single" w:color="000000" w:themeColor="text1" w:sz="4" w:space="0"/>
-              <w:bottom w:val="single" w:color="000000" w:themeColor="text1" w:sz="4" w:space="0"/>
-              <w:right w:val="single" w:color="000000" w:themeColor="text1" w:sz="4" w:space="0"/>
+              <w:top w:val="single" w:sz="4" w:space="0" w:color="000000" w:themeColor="text1"/>
+              <w:left w:val="single" w:sz="4" w:space="0" w:color="000000" w:themeColor="text1"/>
+              <w:bottom w:val="single" w:sz="4" w:space="0" w:color="000000" w:themeColor="text1"/>
+              <w:right w:val="single" w:sz="4" w:space="0" w:color="000000" w:themeColor="text1"/>
             </w:tcBorders>
             <w:tcMar>
               <w:top w:w="80" w:type="dxa"/>
@@ -3815,7 +3289,7 @@
             <w:r>
               <w:rPr>
                 <w:rStyle w:val="None"/>
-                <w:rFonts w:ascii="Roboto" w:hAnsi="Roboto" w:eastAsia="Roboto" w:cs="Roboto"/>
+                <w:rFonts w:ascii="Roboto" w:eastAsia="Roboto" w:hAnsi="Roboto" w:cs="Roboto"/>
                 <w:b/>
                 <w:bCs/>
                 <w:color w:val="1D2125"/>
@@ -3823,7 +3297,7 @@
                 <w:szCs w:val="24"/>
                 <w:u w:color="1D2125"/>
               </w:rPr>
-              <w:t>Bernard Bawak</w:t>
+              <w:t>Noah Barcomb</w:t>
             </w:r>
           </w:p>
         </w:tc>
@@ -3832,7 +3306,7 @@
             <w:tcW w:w="355" w:type="dxa"/>
             <w:tcBorders>
               <w:top w:val="nil"/>
-              <w:left w:val="single" w:color="000000" w:themeColor="text1" w:sz="4" w:space="0"/>
+              <w:left w:val="single" w:sz="4" w:space="0" w:color="000000" w:themeColor="text1"/>
               <w:bottom w:val="nil"/>
               <w:right w:val="nil"/>
             </w:tcBorders>
@@ -3848,16 +3322,16 @@
       </w:tr>
       <w:tr>
         <w:trPr>
-          <w:trHeight w:val="2810"/>
+          <w:trHeight w:val="2530"/>
         </w:trPr>
         <w:tc>
           <w:tcPr>
             <w:tcW w:w="9005" w:type="dxa"/>
             <w:tcBorders>
-              <w:top w:val="single" w:color="000000" w:themeColor="text1" w:sz="4" w:space="0"/>
-              <w:left w:val="single" w:color="000000" w:themeColor="text1" w:sz="4" w:space="0"/>
-              <w:bottom w:val="single" w:color="000000" w:themeColor="text1" w:sz="4" w:space="0"/>
-              <w:right w:val="single" w:color="000000" w:themeColor="text1" w:sz="4" w:space="0"/>
+              <w:top w:val="single" w:sz="4" w:space="0" w:color="000000" w:themeColor="text1"/>
+              <w:left w:val="single" w:sz="4" w:space="0" w:color="000000" w:themeColor="text1"/>
+              <w:bottom w:val="single" w:sz="4" w:space="0" w:color="000000" w:themeColor="text1"/>
+              <w:right w:val="single" w:sz="4" w:space="0" w:color="000000" w:themeColor="text1"/>
             </w:tcBorders>
             <w:tcMar>
               <w:top w:w="80" w:type="dxa"/>
@@ -3872,7 +3346,7 @@
               <w:spacing w:line="240" w:lineRule="auto"/>
               <w:rPr>
                 <w:rStyle w:val="None"/>
-                <w:rFonts w:ascii="Roboto" w:hAnsi="Roboto" w:eastAsia="Roboto" w:cs="Roboto"/>
+                <w:rFonts w:ascii="Roboto" w:eastAsia="Roboto" w:hAnsi="Roboto" w:cs="Roboto"/>
                 <w:i/>
                 <w:iCs/>
                 <w:color w:val="1D2125"/>
@@ -3884,7 +3358,7 @@
             <w:r>
               <w:rPr>
                 <w:rStyle w:val="None"/>
-                <w:rFonts w:ascii="Roboto" w:hAnsi="Roboto" w:eastAsia="Roboto" w:cs="Roboto"/>
+                <w:rFonts w:ascii="Roboto" w:eastAsia="Roboto" w:hAnsi="Roboto" w:cs="Roboto"/>
                 <w:i/>
                 <w:iCs/>
                 <w:color w:val="1D2125"/>
@@ -3906,17 +3380,17 @@
               <w:spacing w:line="240" w:lineRule="auto"/>
               <w:jc w:val="both"/>
               <w:rPr>
-                <w:rFonts w:ascii="Roboto" w:hAnsi="Roboto" w:eastAsia="Roboto" w:cs="Roboto"/>
-                <w:color w:val="1D2125"/>
-                <w:sz w:val="24"/>
-                <w:szCs w:val="24"/>
-                <w:u w:color="1D2125"/>
-              </w:rPr>
-            </w:pPr>
-            <w:r>
-              <w:rPr>
-                <w:rStyle w:val="None"/>
-                <w:rFonts w:ascii="Roboto" w:hAnsi="Roboto" w:eastAsia="Roboto" w:cs="Roboto"/>
+                <w:rFonts w:ascii="Roboto" w:eastAsia="Roboto" w:hAnsi="Roboto" w:cs="Roboto"/>
+                <w:color w:val="1D2125"/>
+                <w:sz w:val="24"/>
+                <w:szCs w:val="24"/>
+                <w:u w:color="1D2125"/>
+              </w:rPr>
+            </w:pPr>
+            <w:r>
+              <w:rPr>
+                <w:rStyle w:val="None"/>
+                <w:rFonts w:ascii="Roboto" w:eastAsia="Roboto" w:hAnsi="Roboto" w:cs="Roboto"/>
                 <w:color w:val="1D2125"/>
                 <w:sz w:val="24"/>
                 <w:szCs w:val="24"/>
@@ -3927,7 +3401,7 @@
             <w:r>
               <w:rPr>
                 <w:rStyle w:val="None"/>
-                <w:rFonts w:ascii="Roboto" w:hAnsi="Roboto" w:eastAsia="Roboto" w:cs="Roboto"/>
+                <w:rFonts w:ascii="Roboto" w:eastAsia="Roboto" w:hAnsi="Roboto" w:cs="Roboto"/>
                 <w:b/>
                 <w:bCs/>
                 <w:color w:val="1D2125"/>
@@ -3949,17 +3423,17 @@
               <w:spacing w:line="240" w:lineRule="auto"/>
               <w:jc w:val="both"/>
               <w:rPr>
-                <w:rFonts w:ascii="Roboto" w:hAnsi="Roboto" w:eastAsia="Roboto" w:cs="Roboto"/>
-                <w:color w:val="1D2125"/>
-                <w:sz w:val="24"/>
-                <w:szCs w:val="24"/>
-                <w:u w:color="1D2125"/>
-              </w:rPr>
-            </w:pPr>
-            <w:r>
-              <w:rPr>
-                <w:rStyle w:val="None"/>
-                <w:rFonts w:ascii="Roboto" w:hAnsi="Roboto" w:eastAsia="Roboto" w:cs="Roboto"/>
+                <w:rFonts w:ascii="Roboto" w:eastAsia="Roboto" w:hAnsi="Roboto" w:cs="Roboto"/>
+                <w:color w:val="1D2125"/>
+                <w:sz w:val="24"/>
+                <w:szCs w:val="24"/>
+                <w:u w:color="1D2125"/>
+              </w:rPr>
+            </w:pPr>
+            <w:r>
+              <w:rPr>
+                <w:rStyle w:val="None"/>
+                <w:rFonts w:ascii="Roboto" w:eastAsia="Roboto" w:hAnsi="Roboto" w:cs="Roboto"/>
                 <w:color w:val="1D2125"/>
                 <w:sz w:val="24"/>
                 <w:szCs w:val="24"/>
@@ -3970,7 +3444,7 @@
             <w:r>
               <w:rPr>
                 <w:rStyle w:val="None"/>
-                <w:rFonts w:ascii="Roboto" w:hAnsi="Roboto" w:eastAsia="Roboto" w:cs="Roboto"/>
+                <w:rFonts w:ascii="Roboto" w:eastAsia="Roboto" w:hAnsi="Roboto" w:cs="Roboto"/>
                 <w:b/>
                 <w:bCs/>
                 <w:color w:val="1D2125"/>
@@ -3992,17 +3466,17 @@
               <w:spacing w:line="240" w:lineRule="auto"/>
               <w:jc w:val="both"/>
               <w:rPr>
-                <w:rFonts w:ascii="Roboto" w:hAnsi="Roboto" w:eastAsia="Roboto" w:cs="Roboto"/>
-                <w:color w:val="1D2125"/>
-                <w:sz w:val="24"/>
-                <w:szCs w:val="24"/>
-                <w:u w:color="1D2125"/>
-              </w:rPr>
-            </w:pPr>
-            <w:r>
-              <w:rPr>
-                <w:rStyle w:val="None"/>
-                <w:rFonts w:ascii="Roboto" w:hAnsi="Roboto" w:eastAsia="Roboto" w:cs="Roboto"/>
+                <w:rFonts w:ascii="Roboto" w:eastAsia="Roboto" w:hAnsi="Roboto" w:cs="Roboto"/>
+                <w:color w:val="1D2125"/>
+                <w:sz w:val="24"/>
+                <w:szCs w:val="24"/>
+                <w:u w:color="1D2125"/>
+              </w:rPr>
+            </w:pPr>
+            <w:r>
+              <w:rPr>
+                <w:rStyle w:val="None"/>
+                <w:rFonts w:ascii="Roboto" w:eastAsia="Roboto" w:hAnsi="Roboto" w:cs="Roboto"/>
                 <w:color w:val="1D2125"/>
                 <w:sz w:val="24"/>
                 <w:szCs w:val="24"/>
@@ -4013,7 +3487,7 @@
             <w:r>
               <w:rPr>
                 <w:rStyle w:val="None"/>
-                <w:rFonts w:ascii="Roboto" w:hAnsi="Roboto" w:eastAsia="Roboto" w:cs="Roboto"/>
+                <w:rFonts w:ascii="Roboto" w:eastAsia="Roboto" w:hAnsi="Roboto" w:cs="Roboto"/>
                 <w:b/>
                 <w:bCs/>
                 <w:color w:val="1D2125"/>
@@ -4035,17 +3509,17 @@
               <w:spacing w:line="240" w:lineRule="auto"/>
               <w:jc w:val="both"/>
               <w:rPr>
-                <w:rFonts w:ascii="Roboto" w:hAnsi="Roboto" w:eastAsia="Roboto" w:cs="Roboto"/>
-                <w:color w:val="1D2125"/>
-                <w:sz w:val="24"/>
-                <w:szCs w:val="24"/>
-                <w:u w:color="1D2125"/>
-              </w:rPr>
-            </w:pPr>
-            <w:r>
-              <w:rPr>
-                <w:rStyle w:val="None"/>
-                <w:rFonts w:ascii="Roboto" w:hAnsi="Roboto" w:eastAsia="Roboto" w:cs="Roboto"/>
+                <w:rFonts w:ascii="Roboto" w:eastAsia="Roboto" w:hAnsi="Roboto" w:cs="Roboto"/>
+                <w:color w:val="1D2125"/>
+                <w:sz w:val="24"/>
+                <w:szCs w:val="24"/>
+                <w:u w:color="1D2125"/>
+              </w:rPr>
+            </w:pPr>
+            <w:r>
+              <w:rPr>
+                <w:rStyle w:val="None"/>
+                <w:rFonts w:ascii="Roboto" w:eastAsia="Roboto" w:hAnsi="Roboto" w:cs="Roboto"/>
                 <w:color w:val="1D2125"/>
                 <w:sz w:val="24"/>
                 <w:szCs w:val="24"/>
@@ -4056,7 +3530,7 @@
             <w:r>
               <w:rPr>
                 <w:rStyle w:val="None"/>
-                <w:rFonts w:ascii="Roboto" w:hAnsi="Roboto" w:eastAsia="Roboto" w:cs="Roboto"/>
+                <w:rFonts w:ascii="Roboto" w:eastAsia="Roboto" w:hAnsi="Roboto" w:cs="Roboto"/>
                 <w:b/>
                 <w:bCs/>
                 <w:color w:val="1D2125"/>
@@ -4073,7 +3547,308 @@
             <w:tcW w:w="355" w:type="dxa"/>
             <w:tcBorders>
               <w:top w:val="nil"/>
-              <w:left w:val="single" w:color="000000" w:themeColor="text1" w:sz="4" w:space="0"/>
+              <w:left w:val="single" w:sz="4" w:space="0" w:color="000000" w:themeColor="text1"/>
+              <w:bottom w:val="nil"/>
+              <w:right w:val="nil"/>
+            </w:tcBorders>
+            <w:tcMar>
+              <w:top w:w="80" w:type="dxa"/>
+              <w:left w:w="80" w:type="dxa"/>
+              <w:bottom w:w="80" w:type="dxa"/>
+              <w:right w:w="80" w:type="dxa"/>
+            </w:tcMar>
+          </w:tcPr>
+          <w:p/>
+        </w:tc>
+      </w:tr>
+      <w:tr>
+        <w:trPr>
+          <w:trHeight w:val="290"/>
+        </w:trPr>
+        <w:tc>
+          <w:tcPr>
+            <w:tcW w:w="9005" w:type="dxa"/>
+            <w:tcBorders>
+              <w:top w:val="single" w:sz="4" w:space="0" w:color="000000" w:themeColor="text1"/>
+              <w:left w:val="single" w:sz="4" w:space="0" w:color="000000" w:themeColor="text1"/>
+              <w:bottom w:val="single" w:sz="4" w:space="0" w:color="000000" w:themeColor="text1"/>
+              <w:right w:val="single" w:sz="4" w:space="0" w:color="000000" w:themeColor="text1"/>
+            </w:tcBorders>
+            <w:tcMar>
+              <w:top w:w="80" w:type="dxa"/>
+              <w:left w:w="80" w:type="dxa"/>
+              <w:bottom w:w="80" w:type="dxa"/>
+              <w:right w:w="80" w:type="dxa"/>
+            </w:tcMar>
+          </w:tcPr>
+          <w:p>
+            <w:pPr>
+              <w:pStyle w:val="Body"/>
+              <w:spacing w:line="240" w:lineRule="auto"/>
+              <w:jc w:val="center"/>
+            </w:pPr>
+            <w:r>
+              <w:rPr>
+                <w:rStyle w:val="None"/>
+                <w:rFonts w:ascii="Roboto" w:eastAsia="Roboto" w:hAnsi="Roboto" w:cs="Roboto"/>
+                <w:b/>
+                <w:bCs/>
+                <w:color w:val="1D2125"/>
+                <w:sz w:val="24"/>
+                <w:szCs w:val="24"/>
+                <w:u w:color="1D2125"/>
+              </w:rPr>
+              <w:t>Bernard Bawak</w:t>
+            </w:r>
+          </w:p>
+        </w:tc>
+        <w:tc>
+          <w:tcPr>
+            <w:tcW w:w="355" w:type="dxa"/>
+            <w:tcBorders>
+              <w:top w:val="nil"/>
+              <w:left w:val="single" w:sz="4" w:space="0" w:color="000000" w:themeColor="text1"/>
+              <w:bottom w:val="nil"/>
+              <w:right w:val="nil"/>
+            </w:tcBorders>
+            <w:tcMar>
+              <w:top w:w="80" w:type="dxa"/>
+              <w:left w:w="80" w:type="dxa"/>
+              <w:bottom w:w="80" w:type="dxa"/>
+              <w:right w:w="80" w:type="dxa"/>
+            </w:tcMar>
+          </w:tcPr>
+          <w:p/>
+        </w:tc>
+      </w:tr>
+      <w:tr>
+        <w:trPr>
+          <w:trHeight w:val="2810"/>
+        </w:trPr>
+        <w:tc>
+          <w:tcPr>
+            <w:tcW w:w="9005" w:type="dxa"/>
+            <w:tcBorders>
+              <w:top w:val="single" w:sz="4" w:space="0" w:color="000000" w:themeColor="text1"/>
+              <w:left w:val="single" w:sz="4" w:space="0" w:color="000000" w:themeColor="text1"/>
+              <w:bottom w:val="single" w:sz="4" w:space="0" w:color="000000" w:themeColor="text1"/>
+              <w:right w:val="single" w:sz="4" w:space="0" w:color="000000" w:themeColor="text1"/>
+            </w:tcBorders>
+            <w:tcMar>
+              <w:top w:w="80" w:type="dxa"/>
+              <w:left w:w="80" w:type="dxa"/>
+              <w:bottom w:w="80" w:type="dxa"/>
+              <w:right w:w="80" w:type="dxa"/>
+            </w:tcMar>
+          </w:tcPr>
+          <w:p>
+            <w:pPr>
+              <w:pStyle w:val="Body"/>
+              <w:spacing w:line="240" w:lineRule="auto"/>
+              <w:rPr>
+                <w:rStyle w:val="None"/>
+                <w:rFonts w:ascii="Roboto" w:eastAsia="Roboto" w:hAnsi="Roboto" w:cs="Roboto"/>
+                <w:i/>
+                <w:iCs/>
+                <w:color w:val="1D2125"/>
+                <w:sz w:val="24"/>
+                <w:szCs w:val="24"/>
+                <w:u w:color="1D2125"/>
+              </w:rPr>
+            </w:pPr>
+            <w:r>
+              <w:rPr>
+                <w:rStyle w:val="None"/>
+                <w:rFonts w:ascii="Roboto" w:eastAsia="Roboto" w:hAnsi="Roboto" w:cs="Roboto"/>
+                <w:i/>
+                <w:iCs/>
+                <w:color w:val="1D2125"/>
+                <w:sz w:val="24"/>
+                <w:szCs w:val="24"/>
+                <w:u w:color="1D2125"/>
+              </w:rPr>
+              <w:t xml:space="preserve">List the answers you received from the user after Tree test below - </w:t>
+            </w:r>
+          </w:p>
+          <w:p>
+            <w:pPr>
+              <w:pStyle w:val="ListParagraph"/>
+              <w:numPr>
+                <w:ilvl w:val="0"/>
+                <w:numId w:val="4"/>
+              </w:numPr>
+              <w:shd w:val="clear" w:color="auto" w:fill="F8F9FA"/>
+              <w:spacing w:line="240" w:lineRule="auto"/>
+              <w:jc w:val="both"/>
+              <w:rPr>
+                <w:rFonts w:ascii="Roboto" w:eastAsia="Roboto" w:hAnsi="Roboto" w:cs="Roboto"/>
+                <w:color w:val="1D2125"/>
+                <w:sz w:val="24"/>
+                <w:szCs w:val="24"/>
+                <w:u w:color="1D2125"/>
+              </w:rPr>
+            </w:pPr>
+            <w:r>
+              <w:rPr>
+                <w:rStyle w:val="None"/>
+                <w:rFonts w:ascii="Roboto" w:eastAsia="Roboto" w:hAnsi="Roboto" w:cs="Roboto"/>
+                <w:color w:val="1D2125"/>
+                <w:sz w:val="24"/>
+                <w:szCs w:val="24"/>
+                <w:u w:color="1D2125"/>
+              </w:rPr>
+              <w:t xml:space="preserve">Did you find the pages where you thought they should?  If not, which pages were not where you expected them to be in the menu hierarchy?  </w:t>
+            </w:r>
+            <w:r>
+              <w:rPr>
+                <w:rStyle w:val="None"/>
+                <w:rFonts w:ascii="Roboto" w:eastAsia="Roboto" w:hAnsi="Roboto" w:cs="Roboto"/>
+                <w:b/>
+                <w:bCs/>
+                <w:color w:val="1D2125"/>
+                <w:sz w:val="24"/>
+                <w:szCs w:val="24"/>
+                <w:u w:color="1D2125"/>
+              </w:rPr>
+              <w:t>ANS:</w:t>
+            </w:r>
+          </w:p>
+          <w:p>
+            <w:pPr>
+              <w:pStyle w:val="ListParagraph"/>
+              <w:numPr>
+                <w:ilvl w:val="0"/>
+                <w:numId w:val="4"/>
+              </w:numPr>
+              <w:shd w:val="clear" w:color="auto" w:fill="F8F9FA"/>
+              <w:spacing w:line="240" w:lineRule="auto"/>
+              <w:jc w:val="both"/>
+              <w:rPr>
+                <w:rFonts w:ascii="Roboto" w:eastAsia="Roboto" w:hAnsi="Roboto" w:cs="Roboto"/>
+                <w:color w:val="1D2125"/>
+                <w:sz w:val="24"/>
+                <w:szCs w:val="24"/>
+                <w:u w:color="1D2125"/>
+              </w:rPr>
+            </w:pPr>
+            <w:r>
+              <w:rPr>
+                <w:rStyle w:val="None"/>
+                <w:rFonts w:ascii="Roboto" w:eastAsia="Roboto" w:hAnsi="Roboto" w:cs="Roboto"/>
+                <w:color w:val="1D2125"/>
+                <w:sz w:val="24"/>
+                <w:szCs w:val="24"/>
+                <w:u w:color="1D2125"/>
+              </w:rPr>
+              <w:t>Did it take more time than you thought it would take?  If so, why do you think it took longer?</w:t>
+            </w:r>
+            <w:r>
+              <w:rPr>
+                <w:rStyle w:val="None"/>
+                <w:rFonts w:ascii="Roboto" w:eastAsia="Roboto" w:hAnsi="Roboto" w:cs="Roboto"/>
+                <w:b/>
+                <w:bCs/>
+                <w:color w:val="1D2125"/>
+                <w:sz w:val="24"/>
+                <w:szCs w:val="24"/>
+                <w:u w:color="1D2125"/>
+              </w:rPr>
+              <w:t xml:space="preserve"> ANS:</w:t>
+            </w:r>
+          </w:p>
+          <w:p>
+            <w:pPr>
+              <w:pStyle w:val="ListParagraph"/>
+              <w:numPr>
+                <w:ilvl w:val="0"/>
+                <w:numId w:val="4"/>
+              </w:numPr>
+              <w:shd w:val="clear" w:color="auto" w:fill="F8F9FA"/>
+              <w:spacing w:line="240" w:lineRule="auto"/>
+              <w:jc w:val="both"/>
+              <w:rPr>
+                <w:rFonts w:ascii="Roboto" w:eastAsia="Roboto" w:hAnsi="Roboto" w:cs="Roboto"/>
+                <w:color w:val="1D2125"/>
+                <w:sz w:val="24"/>
+                <w:szCs w:val="24"/>
+                <w:u w:color="1D2125"/>
+              </w:rPr>
+            </w:pPr>
+            <w:r>
+              <w:rPr>
+                <w:rStyle w:val="None"/>
+                <w:rFonts w:ascii="Roboto" w:eastAsia="Roboto" w:hAnsi="Roboto" w:cs="Roboto"/>
+                <w:color w:val="1D2125"/>
+                <w:sz w:val="24"/>
+                <w:szCs w:val="24"/>
+                <w:u w:color="1D2125"/>
+              </w:rPr>
+              <w:t>Were menu items labeled properly to indicate relevant resources?  If not, what was mislabeled and how would you correct it?</w:t>
+            </w:r>
+            <w:r>
+              <w:rPr>
+                <w:rStyle w:val="None"/>
+                <w:rFonts w:ascii="Roboto" w:eastAsia="Roboto" w:hAnsi="Roboto" w:cs="Roboto"/>
+                <w:b/>
+                <w:bCs/>
+                <w:color w:val="1D2125"/>
+                <w:sz w:val="24"/>
+                <w:szCs w:val="24"/>
+                <w:u w:color="1D2125"/>
+              </w:rPr>
+              <w:t xml:space="preserve"> ANS:</w:t>
+            </w:r>
+          </w:p>
+          <w:p>
+            <w:pPr>
+              <w:pStyle w:val="ListParagraph"/>
+              <w:numPr>
+                <w:ilvl w:val="0"/>
+                <w:numId w:val="4"/>
+              </w:numPr>
+              <w:shd w:val="clear" w:color="auto" w:fill="F8F9FA"/>
+              <w:spacing w:line="240" w:lineRule="auto"/>
+              <w:jc w:val="both"/>
+              <w:rPr>
+                <w:rFonts w:ascii="Roboto" w:eastAsia="Roboto" w:hAnsi="Roboto" w:cs="Roboto"/>
+                <w:color w:val="1D2125"/>
+                <w:sz w:val="24"/>
+                <w:szCs w:val="24"/>
+                <w:u w:color="1D2125"/>
+              </w:rPr>
+            </w:pPr>
+            <w:r>
+              <w:rPr>
+                <w:rStyle w:val="None"/>
+                <w:rFonts w:ascii="Roboto" w:eastAsia="Roboto" w:hAnsi="Roboto" w:cs="Roboto"/>
+                <w:color w:val="1D2125"/>
+                <w:sz w:val="24"/>
+                <w:szCs w:val="24"/>
+                <w:u w:color="1D2125"/>
+              </w:rPr>
+              <w:t>Do you have any suggestions to make the site navigation easier?</w:t>
+            </w:r>
+            <w:r>
+              <w:rPr>
+                <w:rStyle w:val="None"/>
+                <w:rFonts w:ascii="Roboto" w:eastAsia="Roboto" w:hAnsi="Roboto" w:cs="Roboto"/>
+                <w:b/>
+                <w:bCs/>
+                <w:color w:val="1D2125"/>
+                <w:sz w:val="24"/>
+                <w:szCs w:val="24"/>
+                <w:u w:color="1D2125"/>
+              </w:rPr>
+              <w:t xml:space="preserve"> ANS:</w:t>
+            </w:r>
+          </w:p>
+        </w:tc>
+        <w:tc>
+          <w:tcPr>
+            <w:tcW w:w="355" w:type="dxa"/>
+            <w:tcBorders>
+              <w:top w:val="nil"/>
+              <w:left w:val="single" w:sz="4" w:space="0" w:color="000000" w:themeColor="text1"/>
               <w:bottom w:val="nil"/>
               <w:right w:val="nil"/>
             </w:tcBorders>
@@ -4095,7 +3870,7 @@
         <w:spacing w:line="240" w:lineRule="auto"/>
         <w:rPr>
           <w:rStyle w:val="None"/>
-          <w:rFonts w:ascii="Roboto" w:hAnsi="Roboto" w:eastAsia="Roboto" w:cs="Roboto"/>
+          <w:rFonts w:ascii="Roboto" w:eastAsia="Roboto" w:hAnsi="Roboto" w:cs="Roboto"/>
           <w:b/>
           <w:bCs/>
           <w:color w:val="1D2125"/>
@@ -4116,7 +3891,7 @@
         <w:shd w:val="clear" w:color="auto" w:fill="F8F9FA"/>
         <w:rPr>
           <w:rStyle w:val="None"/>
-          <w:rFonts w:ascii="Roboto" w:hAnsi="Roboto" w:eastAsia="Roboto" w:cs="Roboto"/>
+          <w:rFonts w:ascii="Roboto" w:eastAsia="Roboto" w:hAnsi="Roboto" w:cs="Roboto"/>
           <w:b/>
           <w:bCs/>
           <w:color w:val="1D2125"/>
@@ -4131,12 +3906,12 @@
         <w:tblW w:w="9360" w:type="dxa"/>
         <w:tblInd w:w="108" w:type="dxa"/>
         <w:tblBorders>
-          <w:top w:val="single" w:color="FFFFFF" w:sz="8" w:space="0"/>
-          <w:left w:val="single" w:color="FFFFFF" w:sz="8" w:space="0"/>
-          <w:bottom w:val="single" w:color="FFFFFF" w:sz="8" w:space="0"/>
-          <w:right w:val="single" w:color="FFFFFF" w:sz="8" w:space="0"/>
-          <w:insideH w:val="single" w:color="FFFFFF" w:sz="8" w:space="0"/>
-          <w:insideV w:val="single" w:color="FFFFFF" w:sz="8" w:space="0"/>
+          <w:top w:val="single" w:sz="8" w:space="0" w:color="FFFFFF"/>
+          <w:left w:val="single" w:sz="8" w:space="0" w:color="FFFFFF"/>
+          <w:bottom w:val="single" w:sz="8" w:space="0" w:color="FFFFFF"/>
+          <w:right w:val="single" w:sz="8" w:space="0" w:color="FFFFFF"/>
+          <w:insideH w:val="single" w:sz="8" w:space="0" w:color="FFFFFF"/>
+          <w:insideV w:val="single" w:sz="8" w:space="0" w:color="FFFFFF"/>
         </w:tblBorders>
         <w:shd w:val="clear" w:color="auto" w:fill="CED7E7"/>
         <w:tblLayout w:type="fixed"/>
@@ -4153,10 +3928,10 @@
           <w:tcPr>
             <w:tcW w:w="9360" w:type="dxa"/>
             <w:tcBorders>
-              <w:top w:val="single" w:color="000000" w:sz="4" w:space="0"/>
-              <w:left w:val="single" w:color="000000" w:sz="4" w:space="0"/>
-              <w:bottom w:val="single" w:color="000000" w:sz="4" w:space="0"/>
-              <w:right w:val="single" w:color="000000" w:sz="4" w:space="0"/>
+              <w:top w:val="single" w:sz="4" w:space="0" w:color="000000"/>
+              <w:left w:val="single" w:sz="4" w:space="0" w:color="000000"/>
+              <w:bottom w:val="single" w:sz="4" w:space="0" w:color="000000"/>
+              <w:right w:val="single" w:sz="4" w:space="0" w:color="000000"/>
             </w:tcBorders>
             <w:tcMar>
               <w:top w:w="80" w:type="dxa"/>
@@ -4173,7 +3948,7 @@
             <w:r>
               <w:rPr>
                 <w:rStyle w:val="None"/>
-                <w:rFonts w:ascii="Roboto" w:hAnsi="Roboto" w:eastAsia="Roboto" w:cs="Roboto"/>
+                <w:rFonts w:ascii="Roboto" w:eastAsia="Roboto" w:hAnsi="Roboto" w:cs="Roboto"/>
                 <w:b/>
                 <w:bCs/>
                 <w:color w:val="1D2125"/>
@@ -4194,10 +3969,10 @@
           <w:tcPr>
             <w:tcW w:w="9360" w:type="dxa"/>
             <w:tcBorders>
-              <w:top w:val="single" w:color="000000" w:sz="4" w:space="0"/>
-              <w:left w:val="single" w:color="000000" w:sz="4" w:space="0"/>
-              <w:bottom w:val="single" w:color="000000" w:sz="4" w:space="0"/>
-              <w:right w:val="single" w:color="000000" w:sz="4" w:space="0"/>
+              <w:top w:val="single" w:sz="4" w:space="0" w:color="000000"/>
+              <w:left w:val="single" w:sz="4" w:space="0" w:color="000000"/>
+              <w:bottom w:val="single" w:sz="4" w:space="0" w:color="000000"/>
+              <w:right w:val="single" w:sz="4" w:space="0" w:color="000000"/>
             </w:tcBorders>
             <w:tcMar>
               <w:top w:w="80" w:type="dxa"/>
@@ -4214,7 +3989,7 @@
             <w:r>
               <w:rPr>
                 <w:rStyle w:val="None"/>
-                <w:rFonts w:ascii="Roboto" w:hAnsi="Roboto" w:eastAsia="Roboto" w:cs="Roboto"/>
+                <w:rFonts w:ascii="Roboto" w:eastAsia="Roboto" w:hAnsi="Roboto" w:cs="Roboto"/>
                 <w:i/>
                 <w:iCs/>
                 <w:color w:val="1D2125"/>
@@ -4222,20 +3997,8 @@
                 <w:szCs w:val="24"/>
                 <w:u w:color="1D2125"/>
               </w:rPr>
-              <w:t>Insert the team’</w:t>
-            </w:r>
-            <w:r>
-              <w:rPr>
-                <w:rStyle w:val="None"/>
-                <w:rFonts w:ascii="Roboto" w:hAnsi="Roboto" w:eastAsia="Roboto" w:cs="Roboto"/>
-                <w:i/>
-                <w:iCs/>
-                <w:color w:val="1D2125"/>
-                <w:sz w:val="24"/>
-                <w:szCs w:val="24"/>
-                <w:u w:color="1D2125"/>
-              </w:rPr>
-              <w:t>s assessment of the sitemap generated based on the Tree Testing.  Include any weaknesses, strengths, and any possible modifications here.</w:t>
+              <w:lastRenderedPageBreak/>
+              <w:t>Insert the team’s assessment of the sitemap generated based on the Tree Testing.  Include any weaknesses, strengths, and any possible modifications here.</w:t>
             </w:r>
           </w:p>
         </w:tc>
@@ -4248,10 +4011,10 @@
           <w:tcPr>
             <w:tcW w:w="9360" w:type="dxa"/>
             <w:tcBorders>
-              <w:top w:val="single" w:color="000000" w:sz="4" w:space="0"/>
-              <w:left w:val="single" w:color="000000" w:sz="4" w:space="0"/>
-              <w:bottom w:val="single" w:color="000000" w:sz="4" w:space="0"/>
-              <w:right w:val="single" w:color="000000" w:sz="4" w:space="0"/>
+              <w:top w:val="single" w:sz="4" w:space="0" w:color="000000"/>
+              <w:left w:val="single" w:sz="4" w:space="0" w:color="000000"/>
+              <w:bottom w:val="single" w:sz="4" w:space="0" w:color="000000"/>
+              <w:right w:val="single" w:sz="4" w:space="0" w:color="000000"/>
             </w:tcBorders>
             <w:tcMar>
               <w:top w:w="80" w:type="dxa"/>
@@ -4269,7 +4032,7 @@
             <w:r>
               <w:rPr>
                 <w:rStyle w:val="None"/>
-                <w:rFonts w:ascii="Roboto" w:hAnsi="Roboto" w:eastAsia="Roboto" w:cs="Roboto"/>
+                <w:rFonts w:ascii="Roboto" w:eastAsia="Roboto" w:hAnsi="Roboto" w:cs="Roboto"/>
                 <w:b/>
                 <w:bCs/>
                 <w:color w:val="1D2125"/>
@@ -4290,10 +4053,10 @@
           <w:tcPr>
             <w:tcW w:w="9360" w:type="dxa"/>
             <w:tcBorders>
-              <w:top w:val="single" w:color="000000" w:sz="4" w:space="0"/>
-              <w:left w:val="single" w:color="000000" w:sz="4" w:space="0"/>
-              <w:bottom w:val="single" w:color="000000" w:sz="4" w:space="0"/>
-              <w:right w:val="single" w:color="000000" w:sz="4" w:space="0"/>
+              <w:top w:val="single" w:sz="4" w:space="0" w:color="000000"/>
+              <w:left w:val="single" w:sz="4" w:space="0" w:color="000000"/>
+              <w:bottom w:val="single" w:sz="4" w:space="0" w:color="000000"/>
+              <w:right w:val="single" w:sz="4" w:space="0" w:color="000000"/>
             </w:tcBorders>
             <w:tcMar>
               <w:top w:w="80" w:type="dxa"/>
@@ -4310,7 +4073,7 @@
             <w:r>
               <w:rPr>
                 <w:rStyle w:val="None"/>
-                <w:rFonts w:ascii="Roboto" w:hAnsi="Roboto" w:eastAsia="Roboto" w:cs="Roboto"/>
+                <w:rFonts w:ascii="Roboto" w:eastAsia="Roboto" w:hAnsi="Roboto" w:cs="Roboto"/>
                 <w:i/>
                 <w:iCs/>
                 <w:color w:val="1D2125"/>
@@ -4332,9 +4095,9 @@
       </w:pPr>
     </w:p>
     <w:sectPr>
-      <w:headerReference w:type="default" r:id="rId9"/>
-      <w:footerReference w:type="default" r:id="rId10"/>
-      <w:pgSz w:w="12240" w:h="15840" w:orient="portrait"/>
+      <w:headerReference w:type="default" r:id="rId10"/>
+      <w:footerReference w:type="default" r:id="rId11"/>
+      <w:pgSz w:w="12240" w:h="15840"/>
       <w:pgMar w:top="1152" w:right="1440" w:bottom="1152" w:left="1440" w:header="720" w:footer="720" w:gutter="0"/>
       <w:pgNumType w:start="1"/>
       <w:cols w:space="720"/>
@@ -4367,6 +4130,9 @@
   <w:p>
     <w:pPr>
       <w:pStyle w:val="HeaderFooter"/>
+      <w:rPr>
+        <w:rFonts w:hint="eastAsia"/>
+      </w:rPr>
     </w:pPr>
   </w:p>
 </w:ftr>
@@ -4396,6 +4162,9 @@
   <w:p>
     <w:pPr>
       <w:pStyle w:val="HeaderFooter"/>
+      <w:rPr>
+        <w:rFonts w:hint="eastAsia"/>
+      </w:rPr>
     </w:pPr>
   </w:p>
 </w:hdr>
@@ -4403,10 +4172,11 @@
 
 <file path=word/numbering.xml><?xml version="1.0" encoding="utf-8"?>
 <w:numbering xmlns:wpc="http://schemas.microsoft.com/office/word/2010/wordprocessingCanvas" xmlns:cx="http://schemas.microsoft.com/office/drawing/2014/chartex" xmlns:cx1="http://schemas.microsoft.com/office/drawing/2015/9/8/chartex" xmlns:cx2="http://schemas.microsoft.com/office/drawing/2015/10/21/chartex" xmlns:cx3="http://schemas.microsoft.com/office/drawing/2016/5/9/chartex" xmlns:cx4="http://schemas.microsoft.com/office/drawing/2016/5/10/chartex" xmlns:cx5="http://schemas.microsoft.com/office/drawing/2016/5/11/chartex" xmlns:cx6="http://schemas.microsoft.com/office/drawing/2016/5/12/chartex" xmlns:cx7="http://schemas.microsoft.com/office/drawing/2016/5/13/chartex" xmlns:cx8="http://schemas.microsoft.com/office/drawing/2016/5/14/chartex" xmlns:mc="http://schemas.openxmlformats.org/markup-compatibility/2006" xmlns:aink="http://schemas.microsoft.com/office/drawing/2016/ink" xmlns:am3d="http://schemas.microsoft.com/office/drawing/2017/model3d" xmlns:o="urn:schemas-microsoft-com:office:office" xmlns:oel="http://schemas.microsoft.com/office/2019/extlst" xmlns:r="http://schemas.openxmlformats.org/officeDocument/2006/relationships" xmlns:m="http://schemas.openxmlformats.org/officeDocument/2006/math" xmlns:v="urn:schemas-microsoft-com:vml" xmlns:wp14="http://schemas.microsoft.com/office/word/2010/wordprocessingDrawing" xmlns:wp="http://schemas.openxmlformats.org/drawingml/2006/wordprocessingDrawing" xmlns:w10="urn:schemas-microsoft-com:office:word" xmlns:w="http://schemas.openxmlformats.org/wordprocessingml/2006/main" xmlns:w14="http://schemas.microsoft.com/office/word/2010/wordml" xmlns:w15="http://schemas.microsoft.com/office/word/2012/wordml" xmlns:w16cex="http://schemas.microsoft.com/office/word/2018/wordml/cex" xmlns:w16cid="http://schemas.microsoft.com/office/word/2016/wordml/cid" xmlns:w16="http://schemas.microsoft.com/office/word/2018/wordml" xmlns:w16du="http://schemas.microsoft.com/office/word/2023/wordml/word16du" xmlns:w16sdtdh="http://schemas.microsoft.com/office/word/2020/wordml/sdtdatahash" xmlns:w16sdtfl="http://schemas.microsoft.com/office/word/2024/wordml/sdtformatlock" xmlns:w16se="http://schemas.microsoft.com/office/word/2015/wordml/symex" xmlns:wpg="http://schemas.microsoft.com/office/word/2010/wordprocessingGroup" xmlns:wpi="http://schemas.microsoft.com/office/word/2010/wordprocessingInk" xmlns:wne="http://schemas.microsoft.com/office/word/2006/wordml" xmlns:wps="http://schemas.microsoft.com/office/word/2010/wordprocessingShape" mc:Ignorable="w14 w15 w16se w16cid w16 w16cex w16sdtdh w16sdtfl w16du wp14">
-  <w:abstractNum xmlns:w="http://schemas.openxmlformats.org/wordprocessingml/2006/main" w:abstractNumId="3">
-    <w:nsid w:val="3093254e"/>
-    <w:multiLevelType xmlns:w="http://schemas.openxmlformats.org/wordprocessingml/2006/main" w:val="hybridMultilevel"/>
-    <w:lvl xmlns:w="http://schemas.openxmlformats.org/wordprocessingml/2006/main" w:ilvl="0">
+  <w:abstractNum w:abstractNumId="0" w15:restartNumberingAfterBreak="0">
+    <w:nsid w:val="3093254E"/>
+    <w:multiLevelType w:val="hybridMultilevel"/>
+    <w:tmpl w:val="D8D02090"/>
+    <w:lvl w:ilvl="0" w:tplc="9612D7AE">
       <w:start w:val="1"/>
       <w:numFmt w:val="bullet"/>
       <w:lvlText w:val="-"/>
@@ -4415,10 +4185,10 @@
         <w:ind w:left="720" w:hanging="360"/>
       </w:pPr>
       <w:rPr>
-        <w:rFonts w:hint="default" w:ascii="Aptos" w:hAnsi="Aptos"/>
+        <w:rFonts w:ascii="Aptos" w:hAnsi="Aptos" w:hint="default"/>
       </w:rPr>
     </w:lvl>
-    <w:lvl xmlns:w="http://schemas.openxmlformats.org/wordprocessingml/2006/main" w:ilvl="1">
+    <w:lvl w:ilvl="1" w:tplc="ADD08054">
       <w:start w:val="1"/>
       <w:numFmt w:val="bullet"/>
       <w:lvlText w:val="o"/>
@@ -4427,10 +4197,10 @@
         <w:ind w:left="1440" w:hanging="360"/>
       </w:pPr>
       <w:rPr>
-        <w:rFonts w:hint="default" w:ascii="Courier New" w:hAnsi="Courier New"/>
+        <w:rFonts w:ascii="Courier New" w:hAnsi="Courier New" w:hint="default"/>
       </w:rPr>
     </w:lvl>
-    <w:lvl xmlns:w="http://schemas.openxmlformats.org/wordprocessingml/2006/main" w:ilvl="2">
+    <w:lvl w:ilvl="2" w:tplc="B6A21026">
       <w:start w:val="1"/>
       <w:numFmt w:val="bullet"/>
       <w:lvlText w:val=""/>
@@ -4439,10 +4209,10 @@
         <w:ind w:left="2160" w:hanging="360"/>
       </w:pPr>
       <w:rPr>
-        <w:rFonts w:hint="default" w:ascii="Wingdings" w:hAnsi="Wingdings"/>
+        <w:rFonts w:ascii="Wingdings" w:hAnsi="Wingdings" w:hint="default"/>
       </w:rPr>
     </w:lvl>
-    <w:lvl xmlns:w="http://schemas.openxmlformats.org/wordprocessingml/2006/main" w:ilvl="3">
+    <w:lvl w:ilvl="3" w:tplc="F8BA8D7A">
       <w:start w:val="1"/>
       <w:numFmt w:val="bullet"/>
       <w:lvlText w:val=""/>
@@ -4451,10 +4221,10 @@
         <w:ind w:left="2880" w:hanging="360"/>
       </w:pPr>
       <w:rPr>
-        <w:rFonts w:hint="default" w:ascii="Symbol" w:hAnsi="Symbol"/>
+        <w:rFonts w:ascii="Symbol" w:hAnsi="Symbol" w:hint="default"/>
       </w:rPr>
     </w:lvl>
-    <w:lvl xmlns:w="http://schemas.openxmlformats.org/wordprocessingml/2006/main" w:ilvl="4">
+    <w:lvl w:ilvl="4" w:tplc="1746611A">
       <w:start w:val="1"/>
       <w:numFmt w:val="bullet"/>
       <w:lvlText w:val="o"/>
@@ -4463,10 +4233,10 @@
         <w:ind w:left="3600" w:hanging="360"/>
       </w:pPr>
       <w:rPr>
-        <w:rFonts w:hint="default" w:ascii="Courier New" w:hAnsi="Courier New"/>
+        <w:rFonts w:ascii="Courier New" w:hAnsi="Courier New" w:hint="default"/>
       </w:rPr>
     </w:lvl>
-    <w:lvl xmlns:w="http://schemas.openxmlformats.org/wordprocessingml/2006/main" w:ilvl="5">
+    <w:lvl w:ilvl="5" w:tplc="805849A6">
       <w:start w:val="1"/>
       <w:numFmt w:val="bullet"/>
       <w:lvlText w:val=""/>
@@ -4475,10 +4245,10 @@
         <w:ind w:left="4320" w:hanging="360"/>
       </w:pPr>
       <w:rPr>
-        <w:rFonts w:hint="default" w:ascii="Wingdings" w:hAnsi="Wingdings"/>
+        <w:rFonts w:ascii="Wingdings" w:hAnsi="Wingdings" w:hint="default"/>
       </w:rPr>
     </w:lvl>
-    <w:lvl xmlns:w="http://schemas.openxmlformats.org/wordprocessingml/2006/main" w:ilvl="6">
+    <w:lvl w:ilvl="6" w:tplc="E0A6BAFA">
       <w:start w:val="1"/>
       <w:numFmt w:val="bullet"/>
       <w:lvlText w:val=""/>
@@ -4487,10 +4257,10 @@
         <w:ind w:left="5040" w:hanging="360"/>
       </w:pPr>
       <w:rPr>
-        <w:rFonts w:hint="default" w:ascii="Symbol" w:hAnsi="Symbol"/>
+        <w:rFonts w:ascii="Symbol" w:hAnsi="Symbol" w:hint="default"/>
       </w:rPr>
     </w:lvl>
-    <w:lvl xmlns:w="http://schemas.openxmlformats.org/wordprocessingml/2006/main" w:ilvl="7">
+    <w:lvl w:ilvl="7" w:tplc="914C85F4">
       <w:start w:val="1"/>
       <w:numFmt w:val="bullet"/>
       <w:lvlText w:val="o"/>
@@ -4499,10 +4269,10 @@
         <w:ind w:left="5760" w:hanging="360"/>
       </w:pPr>
       <w:rPr>
-        <w:rFonts w:hint="default" w:ascii="Courier New" w:hAnsi="Courier New"/>
+        <w:rFonts w:ascii="Courier New" w:hAnsi="Courier New" w:hint="default"/>
       </w:rPr>
     </w:lvl>
-    <w:lvl xmlns:w="http://schemas.openxmlformats.org/wordprocessingml/2006/main" w:ilvl="8">
+    <w:lvl w:ilvl="8" w:tplc="7B2002D2">
       <w:start w:val="1"/>
       <w:numFmt w:val="bullet"/>
       <w:lvlText w:val=""/>
@@ -4511,11 +4281,11 @@
         <w:ind w:left="6480" w:hanging="360"/>
       </w:pPr>
       <w:rPr>
-        <w:rFonts w:hint="default" w:ascii="Wingdings" w:hAnsi="Wingdings"/>
+        <w:rFonts w:ascii="Wingdings" w:hAnsi="Wingdings" w:hint="default"/>
       </w:rPr>
     </w:lvl>
   </w:abstractNum>
-  <w:abstractNum w:abstractNumId="0" w15:restartNumberingAfterBreak="0">
+  <w:abstractNum w:abstractNumId="1" w15:restartNumberingAfterBreak="0">
     <w:nsid w:val="36E51F96"/>
     <w:multiLevelType w:val="hybridMultilevel"/>
     <w:tmpl w:val="F1C24DFC"/>
@@ -4763,7 +4533,7 @@
       </w:rPr>
     </w:lvl>
   </w:abstractNum>
-  <w:abstractNum w:abstractNumId="1" w15:restartNumberingAfterBreak="0">
+  <w:abstractNum w:abstractNumId="2" w15:restartNumberingAfterBreak="0">
     <w:nsid w:val="441408EE"/>
     <w:multiLevelType w:val="hybridMultilevel"/>
     <w:tmpl w:val="76BCAE12"/>
@@ -5011,7 +4781,7 @@
       </w:rPr>
     </w:lvl>
   </w:abstractNum>
-  <w:abstractNum w:abstractNumId="2" w15:restartNumberingAfterBreak="0">
+  <w:abstractNum w:abstractNumId="3" w15:restartNumberingAfterBreak="0">
     <w:nsid w:val="7E3F0F25"/>
     <w:multiLevelType w:val="hybridMultilevel"/>
     <w:tmpl w:val="4AE4828E"/>
@@ -5259,27 +5029,27 @@
       </w:rPr>
     </w:lvl>
   </w:abstractNum>
-  <w:num w:numId="4">
-    <w:abstractNumId w:val="3"/>
+  <w:num w:numId="1" w16cid:durableId="53817211">
+    <w:abstractNumId w:val="0"/>
   </w:num>
-  <w:num w:numId="1" w16cid:durableId="2095740817">
+  <w:num w:numId="2" w16cid:durableId="2095740817">
+    <w:abstractNumId w:val="2"/>
+  </w:num>
+  <w:num w:numId="3" w16cid:durableId="982277395">
     <w:abstractNumId w:val="1"/>
   </w:num>
-  <w:num w:numId="2" w16cid:durableId="982277395">
-    <w:abstractNumId w:val="0"/>
-  </w:num>
-  <w:num w:numId="3" w16cid:durableId="1521890691">
-    <w:abstractNumId w:val="2"/>
+  <w:num w:numId="4" w16cid:durableId="1521890691">
+    <w:abstractNumId w:val="3"/>
   </w:num>
 </w:numbering>
 </file>
 
 <file path=word/styles.xml><?xml version="1.0" encoding="utf-8"?>
-<w:styles xmlns:wp14="http://schemas.microsoft.com/office/word/2010/wordprocessingDrawing" xmlns:mc="http://schemas.openxmlformats.org/markup-compatibility/2006" xmlns:r="http://schemas.openxmlformats.org/officeDocument/2006/relationships" xmlns:w="http://schemas.openxmlformats.org/wordprocessingml/2006/main" xmlns:w14="http://schemas.microsoft.com/office/word/2010/wordml" xmlns:w15="http://schemas.microsoft.com/office/word/2012/wordml" xmlns:w16cex="http://schemas.microsoft.com/office/word/2018/wordml/cex" xmlns:w16cid="http://schemas.microsoft.com/office/word/2016/wordml/cid" xmlns:w16="http://schemas.microsoft.com/office/word/2018/wordml" xmlns:w16du="http://schemas.microsoft.com/office/word/2023/wordml/word16du" xmlns:w16sdtdh="http://schemas.microsoft.com/office/word/2020/wordml/sdtdatahash" xmlns:w16sdtfl="http://schemas.microsoft.com/office/word/2024/wordml/sdtformatlock" xmlns:w16se="http://schemas.microsoft.com/office/word/2015/wordml/symex" mc:Ignorable="w14 w15 w16se w16cid w16 w16cex w16sdtdh w16sdtfl w16du wp14">
+<w:styles xmlns:mc="http://schemas.openxmlformats.org/markup-compatibility/2006" xmlns:r="http://schemas.openxmlformats.org/officeDocument/2006/relationships" xmlns:w="http://schemas.openxmlformats.org/wordprocessingml/2006/main" xmlns:w14="http://schemas.microsoft.com/office/word/2010/wordml" xmlns:w15="http://schemas.microsoft.com/office/word/2012/wordml" xmlns:w16cex="http://schemas.microsoft.com/office/word/2018/wordml/cex" xmlns:w16cid="http://schemas.microsoft.com/office/word/2016/wordml/cid" xmlns:w16="http://schemas.microsoft.com/office/word/2018/wordml" xmlns:w16du="http://schemas.microsoft.com/office/word/2023/wordml/word16du" xmlns:w16sdtdh="http://schemas.microsoft.com/office/word/2020/wordml/sdtdatahash" xmlns:w16sdtfl="http://schemas.microsoft.com/office/word/2024/wordml/sdtformatlock" xmlns:w16se="http://schemas.microsoft.com/office/word/2015/wordml/symex" mc:Ignorable="w14 w15 w16se w16cid w16 w16cex w16sdtdh w16sdtfl w16du">
   <w:docDefaults>
     <w:rPrDefault>
       <w:rPr>
-        <w:rFonts w:ascii="Times New Roman" w:hAnsi="Times New Roman" w:eastAsia="Arial Unicode MS" w:cs="Times New Roman"/>
+        <w:rFonts w:ascii="Times New Roman" w:eastAsia="Arial Unicode MS" w:hAnsi="Times New Roman" w:cs="Times New Roman"/>
         <w:bdr w:val="nil"/>
         <w:lang w:val="en-US" w:eastAsia="en-US" w:bidi="ar-SA"/>
       </w:rPr>
@@ -5300,14 +5070,14 @@
   <w:latentStyles w:defLockedState="0" w:defUIPriority="99" w:defSemiHidden="0" w:defUnhideWhenUsed="0" w:defQFormat="0" w:count="376">
     <w:lsdException w:name="Normal" w:uiPriority="0" w:qFormat="1"/>
     <w:lsdException w:name="heading 1" w:uiPriority="9" w:qFormat="1"/>
-    <w:lsdException w:name="heading 2" w:uiPriority="9" w:semiHidden="1" w:unhideWhenUsed="1" w:qFormat="1"/>
-    <w:lsdException w:name="heading 3" w:uiPriority="9" w:semiHidden="1" w:unhideWhenUsed="1" w:qFormat="1"/>
-    <w:lsdException w:name="heading 4" w:uiPriority="9" w:semiHidden="1" w:unhideWhenUsed="1" w:qFormat="1"/>
-    <w:lsdException w:name="heading 5" w:uiPriority="9" w:semiHidden="1" w:unhideWhenUsed="1" w:qFormat="1"/>
-    <w:lsdException w:name="heading 6" w:uiPriority="9" w:semiHidden="1" w:unhideWhenUsed="1" w:qFormat="1"/>
-    <w:lsdException w:name="heading 7" w:uiPriority="9" w:semiHidden="1" w:unhideWhenUsed="1" w:qFormat="1"/>
-    <w:lsdException w:name="heading 8" w:uiPriority="9" w:semiHidden="1" w:unhideWhenUsed="1" w:qFormat="1"/>
-    <w:lsdException w:name="heading 9" w:uiPriority="9" w:semiHidden="1" w:unhideWhenUsed="1" w:qFormat="1"/>
+    <w:lsdException w:name="heading 2" w:semiHidden="1" w:uiPriority="9" w:unhideWhenUsed="1" w:qFormat="1"/>
+    <w:lsdException w:name="heading 3" w:semiHidden="1" w:uiPriority="9" w:unhideWhenUsed="1" w:qFormat="1"/>
+    <w:lsdException w:name="heading 4" w:semiHidden="1" w:uiPriority="9" w:unhideWhenUsed="1" w:qFormat="1"/>
+    <w:lsdException w:name="heading 5" w:semiHidden="1" w:uiPriority="9" w:unhideWhenUsed="1" w:qFormat="1"/>
+    <w:lsdException w:name="heading 6" w:semiHidden="1" w:uiPriority="9" w:unhideWhenUsed="1" w:qFormat="1"/>
+    <w:lsdException w:name="heading 7" w:semiHidden="1" w:uiPriority="9" w:unhideWhenUsed="1" w:qFormat="1"/>
+    <w:lsdException w:name="heading 8" w:semiHidden="1" w:uiPriority="9" w:unhideWhenUsed="1" w:qFormat="1"/>
+    <w:lsdException w:name="heading 9" w:semiHidden="1" w:uiPriority="9" w:unhideWhenUsed="1" w:qFormat="1"/>
     <w:lsdException w:name="index 1" w:semiHidden="1" w:unhideWhenUsed="1"/>
     <w:lsdException w:name="index 2" w:semiHidden="1" w:unhideWhenUsed="1"/>
     <w:lsdException w:name="index 3" w:semiHidden="1" w:unhideWhenUsed="1"/>
@@ -5317,22 +5087,22 @@
     <w:lsdException w:name="index 7" w:semiHidden="1" w:unhideWhenUsed="1"/>
     <w:lsdException w:name="index 8" w:semiHidden="1" w:unhideWhenUsed="1"/>
     <w:lsdException w:name="index 9" w:semiHidden="1" w:unhideWhenUsed="1"/>
-    <w:lsdException w:name="toc 1" w:uiPriority="39" w:semiHidden="1" w:unhideWhenUsed="1"/>
-    <w:lsdException w:name="toc 2" w:uiPriority="39" w:semiHidden="1" w:unhideWhenUsed="1"/>
-    <w:lsdException w:name="toc 3" w:uiPriority="39" w:semiHidden="1" w:unhideWhenUsed="1"/>
-    <w:lsdException w:name="toc 4" w:uiPriority="39" w:semiHidden="1" w:unhideWhenUsed="1"/>
-    <w:lsdException w:name="toc 5" w:uiPriority="39" w:semiHidden="1" w:unhideWhenUsed="1"/>
-    <w:lsdException w:name="toc 6" w:uiPriority="39" w:semiHidden="1" w:unhideWhenUsed="1"/>
-    <w:lsdException w:name="toc 7" w:uiPriority="39" w:semiHidden="1" w:unhideWhenUsed="1"/>
-    <w:lsdException w:name="toc 8" w:uiPriority="39" w:semiHidden="1" w:unhideWhenUsed="1"/>
-    <w:lsdException w:name="toc 9" w:uiPriority="39" w:semiHidden="1" w:unhideWhenUsed="1"/>
+    <w:lsdException w:name="toc 1" w:semiHidden="1" w:uiPriority="39" w:unhideWhenUsed="1"/>
+    <w:lsdException w:name="toc 2" w:semiHidden="1" w:uiPriority="39" w:unhideWhenUsed="1"/>
+    <w:lsdException w:name="toc 3" w:semiHidden="1" w:uiPriority="39" w:unhideWhenUsed="1"/>
+    <w:lsdException w:name="toc 4" w:semiHidden="1" w:uiPriority="39" w:unhideWhenUsed="1"/>
+    <w:lsdException w:name="toc 5" w:semiHidden="1" w:uiPriority="39" w:unhideWhenUsed="1"/>
+    <w:lsdException w:name="toc 6" w:semiHidden="1" w:uiPriority="39" w:unhideWhenUsed="1"/>
+    <w:lsdException w:name="toc 7" w:semiHidden="1" w:uiPriority="39" w:unhideWhenUsed="1"/>
+    <w:lsdException w:name="toc 8" w:semiHidden="1" w:uiPriority="39" w:unhideWhenUsed="1"/>
+    <w:lsdException w:name="toc 9" w:semiHidden="1" w:uiPriority="39" w:unhideWhenUsed="1"/>
     <w:lsdException w:name="Normal Indent" w:semiHidden="1" w:unhideWhenUsed="1"/>
     <w:lsdException w:name="footnote text" w:semiHidden="1" w:unhideWhenUsed="1"/>
     <w:lsdException w:name="annotation text" w:semiHidden="1" w:unhideWhenUsed="1"/>
     <w:lsdException w:name="header" w:semiHidden="1" w:unhideWhenUsed="1"/>
     <w:lsdException w:name="footer" w:semiHidden="1" w:unhideWhenUsed="1"/>
     <w:lsdException w:name="index heading" w:semiHidden="1" w:unhideWhenUsed="1"/>
-    <w:lsdException w:name="caption" w:uiPriority="35" w:semiHidden="1" w:unhideWhenUsed="1" w:qFormat="1"/>
+    <w:lsdException w:name="caption" w:semiHidden="1" w:uiPriority="35" w:unhideWhenUsed="1" w:qFormat="1"/>
     <w:lsdException w:name="table of figures" w:semiHidden="1" w:unhideWhenUsed="1"/>
     <w:lsdException w:name="envelope address" w:semiHidden="1" w:unhideWhenUsed="1"/>
     <w:lsdException w:name="envelope return" w:semiHidden="1" w:unhideWhenUsed="1"/>
@@ -5363,7 +5133,7 @@
     <w:lsdException w:name="Title" w:uiPriority="10" w:qFormat="1"/>
     <w:lsdException w:name="Closing" w:semiHidden="1" w:unhideWhenUsed="1"/>
     <w:lsdException w:name="Signature" w:semiHidden="1" w:unhideWhenUsed="1"/>
-    <w:lsdException w:name="Default Paragraph Font" w:uiPriority="1" w:semiHidden="1" w:unhideWhenUsed="1"/>
+    <w:lsdException w:name="Default Paragraph Font" w:semiHidden="1" w:uiPriority="1" w:unhideWhenUsed="1"/>
     <w:lsdException w:name="Body Text" w:semiHidden="1" w:unhideWhenUsed="1"/>
     <w:lsdException w:name="Body Text Indent" w:semiHidden="1" w:unhideWhenUsed="1"/>
     <w:lsdException w:name="List Continue" w:semiHidden="1" w:unhideWhenUsed="1"/>
@@ -5563,8 +5333,8 @@
     <w:lsdException w:name="Subtle Reference" w:uiPriority="31" w:qFormat="1"/>
     <w:lsdException w:name="Intense Reference" w:uiPriority="32" w:qFormat="1"/>
     <w:lsdException w:name="Book Title" w:uiPriority="33" w:qFormat="1"/>
-    <w:lsdException w:name="Bibliography" w:uiPriority="37" w:semiHidden="1" w:unhideWhenUsed="1"/>
-    <w:lsdException w:name="TOC Heading" w:uiPriority="39" w:semiHidden="1" w:unhideWhenUsed="1" w:qFormat="1"/>
+    <w:lsdException w:name="Bibliography" w:semiHidden="1" w:uiPriority="37" w:unhideWhenUsed="1"/>
+    <w:lsdException w:name="TOC Heading" w:semiHidden="1" w:uiPriority="39" w:unhideWhenUsed="1" w:qFormat="1"/>
     <w:lsdException w:name="Plain Table 1" w:uiPriority="41"/>
     <w:lsdException w:name="Plain Table 2" w:uiPriority="42"/>
     <w:lsdException w:name="Plain Table 3" w:uiPriority="43"/>
@@ -5675,7 +5445,7 @@
     <w:lsdException w:name="Unresolved Mention" w:semiHidden="1" w:unhideWhenUsed="1"/>
     <w:lsdException w:name="Smart Link" w:semiHidden="1" w:unhideWhenUsed="1"/>
   </w:latentStyles>
-  <w:style w:type="paragraph" w:styleId="Normal" w:default="1">
+  <w:style w:type="paragraph" w:default="1" w:styleId="Normal">
     <w:name w:val="Normal"/>
     <w:qFormat/>
     <w:rPr>
@@ -5683,13 +5453,13 @@
       <w:szCs w:val="24"/>
     </w:rPr>
   </w:style>
-  <w:style w:type="character" w:styleId="DefaultParagraphFont" w:default="1">
+  <w:style w:type="character" w:default="1" w:styleId="DefaultParagraphFont">
     <w:name w:val="Default Paragraph Font"/>
     <w:uiPriority w:val="1"/>
     <w:semiHidden/>
     <w:unhideWhenUsed/>
   </w:style>
-  <w:style w:type="table" w:styleId="TableNormal" w:default="1">
+  <w:style w:type="table" w:default="1" w:styleId="TableNormal">
     <w:name w:val="Normal Table"/>
     <w:uiPriority w:val="99"/>
     <w:semiHidden/>
@@ -5704,7 +5474,7 @@
       </w:tblCellMar>
     </w:tblPr>
   </w:style>
-  <w:style w:type="numbering" w:styleId="NoList" w:default="1">
+  <w:style w:type="numbering" w:default="1" w:styleId="NoList">
     <w:name w:val="No List"/>
     <w:uiPriority w:val="99"/>
     <w:semiHidden/>
@@ -5716,7 +5486,7 @@
       <w:u w:val="single"/>
     </w:rPr>
   </w:style>
-  <w:style w:type="paragraph" w:styleId="HeaderFooter" w:customStyle="1">
+  <w:style w:type="paragraph" w:customStyle="1" w:styleId="HeaderFooter">
     <w:name w:val="Header &amp; Footer"/>
     <w:pPr>
       <w:tabs>
@@ -5735,7 +5505,7 @@
       </w14:textOutline>
     </w:rPr>
   </w:style>
-  <w:style w:type="paragraph" w:styleId="Body" w:customStyle="1">
+  <w:style w:type="paragraph" w:customStyle="1" w:styleId="Body">
     <w:name w:val="Body"/>
     <w:pPr>
       <w:spacing w:line="276" w:lineRule="auto"/>
@@ -5753,7 +5523,7 @@
       </w14:textOutline>
     </w:rPr>
   </w:style>
-  <w:style w:type="paragraph" w:styleId="BodyA" w:customStyle="1">
+  <w:style w:type="paragraph" w:customStyle="1" w:styleId="BodyA">
     <w:name w:val="Body A"/>
     <w:pPr>
       <w:spacing w:line="276" w:lineRule="auto"/>
@@ -5771,14 +5541,14 @@
       </w14:textOutline>
     </w:rPr>
   </w:style>
-  <w:style w:type="character" w:styleId="None" w:customStyle="1">
+  <w:style w:type="character" w:customStyle="1" w:styleId="None">
     <w:name w:val="None"/>
   </w:style>
-  <w:style w:type="character" w:styleId="Hyperlink0" w:customStyle="1">
+  <w:style w:type="character" w:customStyle="1" w:styleId="Hyperlink0">
     <w:name w:val="Hyperlink.0"/>
     <w:basedOn w:val="None"/>
     <w:rPr>
-      <w:rFonts w:ascii="Roboto" w:hAnsi="Roboto" w:eastAsia="Roboto" w:cs="Roboto"/>
+      <w:rFonts w:ascii="Roboto" w:eastAsia="Roboto" w:hAnsi="Roboto" w:cs="Roboto"/>
       <w:b/>
       <w:bCs/>
       <w:outline w:val="0"/>
@@ -5788,7 +5558,7 @@
       <w:u w:val="single" w:color="0000FF"/>
     </w:rPr>
   </w:style>
-  <w:style w:type="paragraph" w:styleId="Default" w:customStyle="1">
+  <w:style w:type="paragraph" w:customStyle="1" w:styleId="Default">
     <w:name w:val="Default"/>
     <w:pPr>
       <w:spacing w:before="160" w:line="288" w:lineRule="auto"/>

</xml_diff>